<commit_message>
Added open-source contributions of Catima
</commit_message>
<xml_diff>
--- a/Resume_latest - Copy.docx
+++ b/Resume_latest - Copy.docx
@@ -2,25 +2,6 @@
 <file path=word/document.xml><?xml version="1.0" encoding="utf-8"?>
 <w:document xmlns:wpc="http://schemas.microsoft.com/office/word/2010/wordprocessingCanvas" xmlns:cx="http://schemas.microsoft.com/office/drawing/2014/chartex" xmlns:cx1="http://schemas.microsoft.com/office/drawing/2015/9/8/chartex" xmlns:cx2="http://schemas.microsoft.com/office/drawing/2015/10/21/chartex" xmlns:cx3="http://schemas.microsoft.com/office/drawing/2016/5/9/chartex" xmlns:cx4="http://schemas.microsoft.com/office/drawing/2016/5/10/chartex" xmlns:cx5="http://schemas.microsoft.com/office/drawing/2016/5/11/chartex" xmlns:cx6="http://schemas.microsoft.com/office/drawing/2016/5/12/chartex" xmlns:cx7="http://schemas.microsoft.com/office/drawing/2016/5/13/chartex" xmlns:cx8="http://schemas.microsoft.com/office/drawing/2016/5/14/chartex" xmlns:mc="http://schemas.openxmlformats.org/markup-compatibility/2006" xmlns:aink="http://schemas.microsoft.com/office/drawing/2016/ink" xmlns:am3d="http://schemas.microsoft.com/office/drawing/2017/model3d" xmlns:o="urn:schemas-microsoft-com:office:office" xmlns:r="http://schemas.openxmlformats.org/officeDocument/2006/relationships" xmlns:m="http://schemas.openxmlformats.org/officeDocument/2006/math" xmlns:v="urn:schemas-microsoft-com:vml" xmlns:wp14="http://schemas.microsoft.com/office/word/2010/wordprocessingDrawing" xmlns:wp="http://schemas.openxmlformats.org/drawingml/2006/wordprocessingDrawing" xmlns:w10="urn:schemas-microsoft-com:office:word" xmlns:w="http://schemas.openxmlformats.org/wordprocessingml/2006/main" xmlns:w14="http://schemas.microsoft.com/office/word/2010/wordml" xmlns:w15="http://schemas.microsoft.com/office/word/2012/wordml" xmlns:w16cex="http://schemas.microsoft.com/office/word/2018/wordml/cex" xmlns:w16cid="http://schemas.microsoft.com/office/word/2016/wordml/cid" xmlns:w16="http://schemas.microsoft.com/office/word/2018/wordml" xmlns:w16sdtdh="http://schemas.microsoft.com/office/word/2020/wordml/sdtdatahash" xmlns:w16se="http://schemas.microsoft.com/office/word/2015/wordml/symex" xmlns:wpg="http://schemas.microsoft.com/office/word/2010/wordprocessingGroup" xmlns:wpi="http://schemas.microsoft.com/office/word/2010/wordprocessingInk" xmlns:wne="http://schemas.microsoft.com/office/word/2006/wordml" xmlns:wps="http://schemas.microsoft.com/office/word/2010/wordprocessingShape" mc:Ignorable="w14 w15 w16se w16cid w16 w16cex w16sdtdh wp14">
   <w:body>
-    <w:p>
-      <w:pPr>
-        <w:pBdr>
-          <w:bottom w:val="single" w:sz="6" w:space="1" w:color="auto"/>
-        </w:pBdr>
-        <w:tabs>
-          <w:tab w:val="right" w:pos="10490"/>
-        </w:tabs>
-        <w:spacing w:line="240" w:lineRule="auto"/>
-        <w:ind w:right="0"/>
-        <w:rPr>
-          <w:b/>
-          <w:bCs/>
-          <w:color w:val="auto"/>
-          <w:sz w:val="28"/>
-          <w:szCs w:val="28"/>
-        </w:rPr>
-      </w:pPr>
-    </w:p>
     <w:p>
       <w:pPr>
         <w:pBdr>
@@ -808,8 +789,7 @@
           <w:bottom w:val="single" w:sz="6" w:space="1" w:color="auto"/>
         </w:pBdr>
         <w:spacing w:line="240" w:lineRule="auto"/>
-        <w:ind w:left="0" w:right="0" w:firstLine="10"/>
-        <w:jc w:val="center"/>
+        <w:ind w:left="0" w:right="0" w:firstLine="0"/>
         <w:rPr>
           <w:b/>
           <w:bCs/>
@@ -2633,12 +2613,23 @@
       </w:pPr>
       <w:r>
         <w:rPr>
-          <w:color w:val="auto"/>
-        </w:rPr>
-        <w:t>Incorporated</w:t>
-      </w:r>
-      <w:r>
-        <w:rPr>
+          <w:rFonts w:cstheme="minorBidi"/>
+          <w:color w:val="auto"/>
+          <w:szCs w:val="20"/>
+        </w:rPr>
+        <w:t>R</w:t>
+      </w:r>
+      <w:r>
+        <w:rPr>
+          <w:rFonts w:cstheme="minorBidi"/>
+          <w:color w:val="auto"/>
+          <w:szCs w:val="20"/>
+        </w:rPr>
+        <w:t>educed</w:t>
+      </w:r>
+      <w:r>
+        <w:rPr>
+          <w:rFonts w:cstheme="minorBidi"/>
           <w:color w:val="auto"/>
           <w:szCs w:val="20"/>
         </w:rPr>
@@ -2646,69 +2637,23 @@
       </w:r>
       <w:r>
         <w:rPr>
-          <w:color w:val="auto"/>
-          <w:szCs w:val="20"/>
-        </w:rPr>
-        <w:t xml:space="preserve">email </w:t>
-      </w:r>
-      <w:r>
-        <w:rPr>
-          <w:color w:val="auto"/>
-          <w:szCs w:val="20"/>
-        </w:rPr>
-        <w:t>authentica</w:t>
-      </w:r>
-      <w:r>
-        <w:rPr>
-          <w:color w:val="auto"/>
-          <w:szCs w:val="20"/>
-        </w:rPr>
-        <w:t>tion</w:t>
-      </w:r>
-      <w:r>
-        <w:rPr>
-          <w:color w:val="auto"/>
-          <w:szCs w:val="20"/>
-        </w:rPr>
-        <w:t xml:space="preserve"> and </w:t>
-      </w:r>
-      <w:r>
-        <w:rPr>
-          <w:color w:val="auto"/>
-          <w:szCs w:val="20"/>
-        </w:rPr>
-        <w:t>log</w:t>
-      </w:r>
-      <w:r>
-        <w:rPr>
-          <w:color w:val="auto"/>
-          <w:szCs w:val="20"/>
-        </w:rPr>
-        <w:t>-</w:t>
-      </w:r>
-      <w:r>
-        <w:rPr>
-          <w:color w:val="auto"/>
-          <w:szCs w:val="20"/>
-        </w:rPr>
-        <w:t>in</w:t>
-      </w:r>
-      <w:r>
-        <w:rPr>
-          <w:color w:val="auto"/>
-          <w:szCs w:val="20"/>
-        </w:rPr>
-        <w:t xml:space="preserve"> feature</w:t>
-      </w:r>
-      <w:r>
-        <w:rPr>
-          <w:color w:val="auto"/>
-          <w:szCs w:val="20"/>
-        </w:rPr>
-        <w:t>s</w:t>
-      </w:r>
-      <w:r>
-        <w:rPr>
+          <w:rFonts w:cstheme="minorBidi"/>
+          <w:color w:val="auto"/>
+          <w:szCs w:val="20"/>
+        </w:rPr>
+        <w:t xml:space="preserve">the </w:t>
+      </w:r>
+      <w:r>
+        <w:rPr>
+          <w:rFonts w:cstheme="minorBidi"/>
+          <w:color w:val="auto"/>
+          <w:szCs w:val="20"/>
+        </w:rPr>
+        <w:t>number of clicks required before reaching</w:t>
+      </w:r>
+      <w:r>
+        <w:rPr>
+          <w:rFonts w:cstheme="minorBidi"/>
           <w:color w:val="auto"/>
           <w:szCs w:val="20"/>
         </w:rPr>
@@ -2716,18 +2661,11 @@
       </w:r>
       <w:r>
         <w:rPr>
-          <w:color w:val="auto"/>
-          <w:szCs w:val="20"/>
-        </w:rPr>
-        <w:t>and r</w:t>
-      </w:r>
-      <w:r>
-        <w:rPr>
           <w:rFonts w:cstheme="minorBidi"/>
           <w:color w:val="auto"/>
           <w:szCs w:val="20"/>
         </w:rPr>
-        <w:t>educed</w:t>
+        <w:t xml:space="preserve">the </w:t>
       </w:r>
       <w:r>
         <w:rPr>
@@ -2735,6 +2673,14 @@
           <w:color w:val="auto"/>
           <w:szCs w:val="20"/>
         </w:rPr>
+        <w:t>home page</w:t>
+      </w:r>
+      <w:r>
+        <w:rPr>
+          <w:rFonts w:cstheme="minorBidi"/>
+          <w:color w:val="auto"/>
+          <w:szCs w:val="20"/>
+        </w:rPr>
         <w:t xml:space="preserve"> </w:t>
       </w:r>
       <w:r>
@@ -2743,7 +2689,7 @@
           <w:color w:val="auto"/>
           <w:szCs w:val="20"/>
         </w:rPr>
-        <w:t xml:space="preserve">the </w:t>
+        <w:t>by</w:t>
       </w:r>
       <w:r>
         <w:rPr>
@@ -2751,7 +2697,7 @@
           <w:color w:val="auto"/>
           <w:szCs w:val="20"/>
         </w:rPr>
-        <w:t xml:space="preserve">number of clicks required before reaching </w:t>
+        <w:t xml:space="preserve"> </w:t>
       </w:r>
       <w:r>
         <w:rPr>
@@ -2759,39 +2705,7 @@
           <w:color w:val="auto"/>
           <w:szCs w:val="20"/>
         </w:rPr>
-        <w:t xml:space="preserve">the </w:t>
-      </w:r>
-      <w:r>
-        <w:rPr>
-          <w:rFonts w:cstheme="minorBidi"/>
-          <w:color w:val="auto"/>
-          <w:szCs w:val="20"/>
-        </w:rPr>
-        <w:t>home page</w:t>
-      </w:r>
-      <w:r>
-        <w:rPr>
-          <w:rFonts w:cstheme="minorBidi"/>
-          <w:color w:val="auto"/>
-          <w:szCs w:val="20"/>
-        </w:rPr>
-        <w:t xml:space="preserve"> </w:t>
-      </w:r>
-      <w:r>
-        <w:rPr>
-          <w:rFonts w:cstheme="minorBidi"/>
-          <w:color w:val="auto"/>
-          <w:szCs w:val="20"/>
-        </w:rPr>
-        <w:t>by</w:t>
-      </w:r>
-      <w:r>
-        <w:rPr>
-          <w:rFonts w:cstheme="minorBidi"/>
-          <w:color w:val="auto"/>
-          <w:szCs w:val="20"/>
-        </w:rPr>
-        <w:t xml:space="preserve"> about </w:t>
+        <w:t>~</w:t>
       </w:r>
       <w:r>
         <w:rPr>
@@ -3072,7 +2986,31 @@
         <w:rPr>
           <w:color w:val="auto"/>
         </w:rPr>
-        <w:t xml:space="preserve">increase salaries by &gt; </w:t>
+        <w:t xml:space="preserve">increase </w:t>
+      </w:r>
+      <w:r>
+        <w:rPr>
+          <w:color w:val="auto"/>
+        </w:rPr>
+        <w:t>earnings</w:t>
+      </w:r>
+      <w:r>
+        <w:rPr>
+          <w:color w:val="auto"/>
+        </w:rPr>
+        <w:t xml:space="preserve"> </w:t>
+      </w:r>
+      <w:r>
+        <w:rPr>
+          <w:color w:val="auto"/>
+        </w:rPr>
+        <w:t xml:space="preserve">by </w:t>
+      </w:r>
+      <w:r>
+        <w:rPr>
+          <w:color w:val="auto"/>
+        </w:rPr>
+        <w:t xml:space="preserve">more than </w:t>
       </w:r>
       <w:r>
         <w:rPr>
@@ -3089,56 +3027,6 @@
           <w:color w:val="auto"/>
         </w:rPr>
         <w:t>0%</w:t>
-      </w:r>
-      <w:r>
-        <w:rPr>
-          <w:b/>
-          <w:bCs/>
-          <w:color w:val="auto"/>
-        </w:rPr>
-        <w:t xml:space="preserve"> </w:t>
-      </w:r>
-      <w:r>
-        <w:rPr>
-          <w:color w:val="auto"/>
-        </w:rPr>
-        <w:t xml:space="preserve">by </w:t>
-      </w:r>
-      <w:r>
-        <w:rPr>
-          <w:color w:val="auto"/>
-        </w:rPr>
-        <w:t xml:space="preserve">enabling </w:t>
-      </w:r>
-      <w:r>
-        <w:rPr>
-          <w:color w:val="auto"/>
-        </w:rPr>
-        <w:t>the non-English</w:t>
-      </w:r>
-      <w:r>
-        <w:rPr>
-          <w:color w:val="auto"/>
-        </w:rPr>
-        <w:t>-</w:t>
-      </w:r>
-      <w:r>
-        <w:rPr>
-          <w:color w:val="auto"/>
-        </w:rPr>
-        <w:t xml:space="preserve">speaking population </w:t>
-      </w:r>
-      <w:r>
-        <w:rPr>
-          <w:color w:val="auto"/>
-        </w:rPr>
-        <w:t xml:space="preserve">to </w:t>
-      </w:r>
-      <w:r>
-        <w:rPr>
-          <w:color w:val="auto"/>
-        </w:rPr>
-        <w:t>enter the world of programming and technological advancements</w:t>
       </w:r>
       <w:r>
         <w:rPr>
@@ -4138,6 +4026,520 @@
           <w:b/>
           <w:bCs/>
           <w:color w:val="auto"/>
+          <w:sz w:val="24"/>
+          <w:szCs w:val="24"/>
+        </w:rPr>
+      </w:pPr>
+      <w:r>
+        <w:rPr>
+          <w:b/>
+          <w:bCs/>
+          <w:color w:val="auto"/>
+          <w:sz w:val="24"/>
+          <w:szCs w:val="24"/>
+        </w:rPr>
+        <w:t>Open-Source Contributions</w:t>
+      </w:r>
+    </w:p>
+    <w:p>
+      <w:pPr>
+        <w:spacing w:line="240" w:lineRule="auto"/>
+        <w:ind w:right="0"/>
+        <w:jc w:val="both"/>
+        <w:rPr>
+          <w:rFonts w:cs="Mangal"/>
+          <w:szCs w:val="18"/>
+        </w:rPr>
+      </w:pPr>
+      <w:hyperlink r:id="rId31" w:history="1">
+        <w:proofErr w:type="spellStart"/>
+        <w:r>
+          <w:rPr>
+            <w:rStyle w:val="Hyperlink"/>
+            <w:b/>
+            <w:bCs/>
+            <w:color w:val="auto"/>
+            <w:u w:val="none"/>
+          </w:rPr>
+          <w:t>Catima</w:t>
+        </w:r>
+        <w:proofErr w:type="spellEnd"/>
+        <w:r>
+          <w:rPr>
+            <w:rStyle w:val="Hyperlink"/>
+            <w:b/>
+            <w:bCs/>
+            <w:color w:val="auto"/>
+            <w:u w:val="none"/>
+          </w:rPr>
+          <w:t xml:space="preserve"> </w:t>
+        </w:r>
+        <w:r>
+          <w:rPr>
+            <w:rStyle w:val="Hyperlink"/>
+            <w:b/>
+            <w:bCs/>
+            <w:color w:val="auto"/>
+            <w:u w:val="none"/>
+          </w:rPr>
+          <w:t xml:space="preserve">Loyalty </w:t>
+        </w:r>
+        <w:r>
+          <w:rPr>
+            <w:rStyle w:val="Hyperlink"/>
+            <w:color w:val="auto"/>
+            <w:u w:val="none"/>
+          </w:rPr>
+          <w:t>(</w:t>
+        </w:r>
+        <w:r>
+          <w:rPr>
+            <w:rStyle w:val="Hyperlink"/>
+            <w:b/>
+            <w:bCs/>
+            <w:color w:val="auto"/>
+            <w:u w:val="none"/>
+          </w:rPr>
+          <w:t>J</w:t>
+        </w:r>
+        <w:r>
+          <w:rPr>
+            <w:rStyle w:val="Hyperlink"/>
+            <w:b/>
+            <w:bCs/>
+            <w:color w:val="auto"/>
+            <w:u w:val="none"/>
+          </w:rPr>
+          <w:t>ava</w:t>
+        </w:r>
+        <w:r>
+          <w:rPr>
+            <w:rStyle w:val="Hyperlink"/>
+            <w:b/>
+            <w:bCs/>
+            <w:color w:val="auto"/>
+            <w:u w:val="none"/>
+          </w:rPr>
+          <w:t>, YAML</w:t>
+        </w:r>
+        <w:r>
+          <w:rPr>
+            <w:rStyle w:val="Hyperlink"/>
+            <w:color w:val="auto"/>
+            <w:u w:val="none"/>
+          </w:rPr>
+          <w:t>)</w:t>
+        </w:r>
+        <w:r>
+          <w:rPr>
+            <w:rStyle w:val="Hyperlink"/>
+            <w:b/>
+            <w:bCs/>
+            <w:color w:val="auto"/>
+            <w:u w:val="none"/>
+          </w:rPr>
+          <w:t xml:space="preserve"> </w:t>
+        </w:r>
+        <w:r>
+          <w:rPr>
+            <w:rStyle w:val="Hyperlink"/>
+            <w:color w:val="auto"/>
+            <w:u w:val="none"/>
+          </w:rPr>
+          <w:t>[</w:t>
+        </w:r>
+        <w:r>
+          <w:rPr>
+            <w:rStyle w:val="Hyperlink"/>
+            <w:i/>
+            <w:iCs/>
+            <w:color w:val="auto"/>
+          </w:rPr>
+          <w:t>link</w:t>
+        </w:r>
+        <w:r>
+          <w:rPr>
+            <w:rStyle w:val="Hyperlink"/>
+            <w:color w:val="auto"/>
+            <w:u w:val="none"/>
+          </w:rPr>
+          <w:t>]:</w:t>
+        </w:r>
+      </w:hyperlink>
+    </w:p>
+    <w:p>
+      <w:pPr>
+        <w:spacing w:line="240" w:lineRule="auto"/>
+        <w:ind w:right="0"/>
+        <w:jc w:val="both"/>
+        <w:rPr>
+          <w:color w:val="auto"/>
+        </w:rPr>
+      </w:pPr>
+      <w:r>
+        <w:rPr>
+          <w:color w:val="auto"/>
+        </w:rPr>
+        <w:t>(</w:t>
+      </w:r>
+      <w:proofErr w:type="spellStart"/>
+      <w:r>
+        <w:rPr>
+          <w:color w:val="auto"/>
+        </w:rPr>
+        <w:t>Catima</w:t>
+      </w:r>
+      <w:proofErr w:type="spellEnd"/>
+      <w:r>
+        <w:rPr>
+          <w:color w:val="auto"/>
+        </w:rPr>
+        <w:t xml:space="preserve"> is a</w:t>
+      </w:r>
+      <w:r>
+        <w:rPr>
+          <w:color w:val="auto"/>
+        </w:rPr>
+        <w:t xml:space="preserve"> loyalty</w:t>
+      </w:r>
+      <w:r>
+        <w:rPr>
+          <w:color w:val="auto"/>
+        </w:rPr>
+        <w:t xml:space="preserve"> card and ticker manager with over </w:t>
+      </w:r>
+      <w:r>
+        <w:rPr>
+          <w:b/>
+          <w:bCs/>
+          <w:color w:val="auto"/>
+        </w:rPr>
+        <w:t>100K downloads</w:t>
+      </w:r>
+      <w:r>
+        <w:rPr>
+          <w:color w:val="auto"/>
+        </w:rPr>
+        <w:t xml:space="preserve"> on google play store)</w:t>
+      </w:r>
+    </w:p>
+    <w:p>
+      <w:pPr>
+        <w:pStyle w:val="ListParagraph"/>
+        <w:numPr>
+          <w:ilvl w:val="0"/>
+          <w:numId w:val="31"/>
+        </w:numPr>
+        <w:spacing w:line="240" w:lineRule="auto"/>
+        <w:ind w:right="0"/>
+        <w:jc w:val="both"/>
+        <w:rPr>
+          <w:color w:val="auto"/>
+        </w:rPr>
+      </w:pPr>
+      <w:r>
+        <w:rPr>
+          <w:color w:val="auto"/>
+        </w:rPr>
+        <w:t xml:space="preserve">Incorporated a </w:t>
+      </w:r>
+      <w:r>
+        <w:rPr>
+          <w:b/>
+          <w:bCs/>
+          <w:color w:val="auto"/>
+        </w:rPr>
+        <w:t>GitHub Action</w:t>
+      </w:r>
+      <w:r>
+        <w:rPr>
+          <w:color w:val="auto"/>
+        </w:rPr>
+        <w:t xml:space="preserve"> to create pull </w:t>
+      </w:r>
+      <w:r>
+        <w:rPr>
+          <w:color w:val="auto"/>
+        </w:rPr>
+        <w:t>requests automatically to update the Gradle wrapper.</w:t>
+      </w:r>
+    </w:p>
+    <w:p>
+      <w:pPr>
+        <w:pStyle w:val="ListParagraph"/>
+        <w:numPr>
+          <w:ilvl w:val="0"/>
+          <w:numId w:val="31"/>
+        </w:numPr>
+        <w:tabs>
+          <w:tab w:val="left" w:pos="3544"/>
+        </w:tabs>
+        <w:spacing w:line="240" w:lineRule="auto"/>
+        <w:ind w:right="0"/>
+        <w:jc w:val="both"/>
+        <w:rPr>
+          <w:color w:val="auto"/>
+        </w:rPr>
+      </w:pPr>
+      <w:r>
+        <w:rPr>
+          <w:color w:val="auto"/>
+        </w:rPr>
+        <w:t xml:space="preserve">Migrated </w:t>
+      </w:r>
+      <w:r>
+        <w:rPr>
+          <w:color w:val="auto"/>
+        </w:rPr>
+        <w:t xml:space="preserve">a </w:t>
+      </w:r>
+      <w:r>
+        <w:rPr>
+          <w:color w:val="auto"/>
+        </w:rPr>
+        <w:t xml:space="preserve">Java </w:t>
+      </w:r>
+      <w:r>
+        <w:rPr>
+          <w:color w:val="auto"/>
+        </w:rPr>
+        <w:t>class</w:t>
+      </w:r>
+      <w:r>
+        <w:rPr>
+          <w:color w:val="auto"/>
+        </w:rPr>
+        <w:t xml:space="preserve"> along with </w:t>
+      </w:r>
+      <w:r>
+        <w:rPr>
+          <w:color w:val="auto"/>
+        </w:rPr>
+        <w:t>multiple</w:t>
+      </w:r>
+      <w:r>
+        <w:rPr>
+          <w:color w:val="auto"/>
+        </w:rPr>
+        <w:t xml:space="preserve"> </w:t>
+      </w:r>
+      <w:r>
+        <w:rPr>
+          <w:color w:val="auto"/>
+        </w:rPr>
+        <w:t xml:space="preserve">interfaces, </w:t>
+      </w:r>
+      <w:r>
+        <w:rPr>
+          <w:color w:val="auto"/>
+        </w:rPr>
+        <w:t xml:space="preserve">and </w:t>
+      </w:r>
+      <w:proofErr w:type="spellStart"/>
+      <w:r>
+        <w:rPr>
+          <w:color w:val="auto"/>
+        </w:rPr>
+        <w:t>enums</w:t>
+      </w:r>
+      <w:proofErr w:type="spellEnd"/>
+      <w:r>
+        <w:rPr>
+          <w:color w:val="auto"/>
+        </w:rPr>
+        <w:t xml:space="preserve"> </w:t>
+      </w:r>
+      <w:r>
+        <w:rPr>
+          <w:color w:val="auto"/>
+        </w:rPr>
+        <w:t xml:space="preserve">to </w:t>
+      </w:r>
+      <w:r>
+        <w:rPr>
+          <w:b/>
+          <w:bCs/>
+          <w:color w:val="auto"/>
+        </w:rPr>
+        <w:t>Kotlin</w:t>
+      </w:r>
+      <w:r>
+        <w:rPr>
+          <w:color w:val="auto"/>
+        </w:rPr>
+        <w:t xml:space="preserve"> and </w:t>
+      </w:r>
+      <w:r>
+        <w:rPr>
+          <w:b/>
+          <w:bCs/>
+          <w:color w:val="auto"/>
+        </w:rPr>
+        <w:t>r</w:t>
+      </w:r>
+      <w:r>
+        <w:rPr>
+          <w:b/>
+          <w:bCs/>
+          <w:color w:val="auto"/>
+        </w:rPr>
+        <w:t>emoved</w:t>
+      </w:r>
+      <w:r>
+        <w:rPr>
+          <w:color w:val="auto"/>
+        </w:rPr>
+        <w:t xml:space="preserve"> &gt; </w:t>
+      </w:r>
+      <w:r>
+        <w:rPr>
+          <w:b/>
+          <w:bCs/>
+          <w:color w:val="auto"/>
+        </w:rPr>
+        <w:t>5</w:t>
+      </w:r>
+      <w:r>
+        <w:rPr>
+          <w:b/>
+          <w:bCs/>
+          <w:color w:val="auto"/>
+        </w:rPr>
+        <w:t>0 lines</w:t>
+      </w:r>
+      <w:r>
+        <w:rPr>
+          <w:color w:val="auto"/>
+        </w:rPr>
+        <w:t xml:space="preserve"> of </w:t>
+      </w:r>
+      <w:r>
+        <w:rPr>
+          <w:color w:val="auto"/>
+        </w:rPr>
+        <w:t xml:space="preserve">unnecessary </w:t>
+      </w:r>
+      <w:r>
+        <w:rPr>
+          <w:color w:val="auto"/>
+        </w:rPr>
+        <w:t xml:space="preserve">code </w:t>
+      </w:r>
+      <w:r>
+        <w:rPr>
+          <w:color w:val="auto"/>
+        </w:rPr>
+        <w:t xml:space="preserve">from </w:t>
+      </w:r>
+      <w:r>
+        <w:rPr>
+          <w:b/>
+          <w:bCs/>
+          <w:color w:val="auto"/>
+        </w:rPr>
+        <w:t>CI/CD</w:t>
+      </w:r>
+      <w:r>
+        <w:rPr>
+          <w:color w:val="auto"/>
+        </w:rPr>
+        <w:t xml:space="preserve"> pipelines</w:t>
+      </w:r>
+      <w:r>
+        <w:rPr>
+          <w:color w:val="auto"/>
+        </w:rPr>
+        <w:t>,</w:t>
+      </w:r>
+      <w:r>
+        <w:rPr>
+          <w:color w:val="auto"/>
+        </w:rPr>
+        <w:t xml:space="preserve"> with</w:t>
+      </w:r>
+      <w:r>
+        <w:rPr>
+          <w:color w:val="auto"/>
+        </w:rPr>
+        <w:t xml:space="preserve"> </w:t>
+      </w:r>
+      <w:r>
+        <w:rPr>
+          <w:i/>
+          <w:iCs/>
+          <w:color w:val="auto"/>
+        </w:rPr>
+        <w:t>150</w:t>
+      </w:r>
+      <w:r>
+        <w:rPr>
+          <w:i/>
+          <w:iCs/>
+          <w:color w:val="auto"/>
+        </w:rPr>
+        <w:t>+</w:t>
+      </w:r>
+      <w:r>
+        <w:rPr>
+          <w:i/>
+          <w:iCs/>
+          <w:color w:val="auto"/>
+        </w:rPr>
+        <w:t xml:space="preserve"> lines of code in production</w:t>
+      </w:r>
+      <w:r>
+        <w:rPr>
+          <w:color w:val="auto"/>
+        </w:rPr>
+        <w:t xml:space="preserve"> overall</w:t>
+      </w:r>
+      <w:r>
+        <w:rPr>
+          <w:color w:val="auto"/>
+        </w:rPr>
+        <w:t xml:space="preserve"> within first </w:t>
+      </w:r>
+      <w:r>
+        <w:rPr>
+          <w:color w:val="auto"/>
+        </w:rPr>
+        <w:t>few</w:t>
+      </w:r>
+      <w:r>
+        <w:rPr>
+          <w:color w:val="auto"/>
+        </w:rPr>
+        <w:t xml:space="preserve"> days</w:t>
+      </w:r>
+      <w:r>
+        <w:rPr>
+          <w:color w:val="auto"/>
+        </w:rPr>
+        <w:t>.</w:t>
+      </w:r>
+    </w:p>
+    <w:p>
+      <w:pPr>
+        <w:pBdr>
+          <w:bottom w:val="single" w:sz="6" w:space="1" w:color="auto"/>
+        </w:pBdr>
+        <w:spacing w:line="240" w:lineRule="auto"/>
+        <w:ind w:left="0" w:right="0" w:firstLine="0"/>
+        <w:jc w:val="both"/>
+        <w:rPr>
+          <w:color w:val="auto"/>
+        </w:rPr>
+      </w:pPr>
+    </w:p>
+    <w:p>
+      <w:pPr>
+        <w:spacing w:line="240" w:lineRule="auto"/>
+        <w:ind w:right="0"/>
+        <w:jc w:val="center"/>
+        <w:rPr>
+          <w:b/>
+          <w:bCs/>
+          <w:color w:val="auto"/>
           <w:sz w:val="22"/>
           <w:szCs w:val="22"/>
         </w:rPr>
@@ -4702,7 +5104,7 @@
           <w:color w:val="auto"/>
           <w:szCs w:val="20"/>
         </w:rPr>
-        <w:t>40</w:t>
+        <w:t>5</w:t>
       </w:r>
       <w:r>
         <w:rPr>
@@ -4711,6 +5113,15 @@
           <w:color w:val="auto"/>
           <w:szCs w:val="20"/>
         </w:rPr>
+        <w:t>0</w:t>
+      </w:r>
+      <w:r>
+        <w:rPr>
+          <w:b/>
+          <w:bCs/>
+          <w:color w:val="auto"/>
+          <w:szCs w:val="20"/>
+        </w:rPr>
         <w:t>0+ problems</w:t>
       </w:r>
       <w:r>
@@ -4719,6 +5130,13 @@
           <w:szCs w:val="20"/>
         </w:rPr>
         <w:t xml:space="preserve"> and solved </w:t>
+      </w:r>
+      <w:r>
+        <w:rPr>
+          <w:color w:val="auto"/>
+          <w:szCs w:val="20"/>
+        </w:rPr>
+        <w:t>~3</w:t>
       </w:r>
       <w:r>
         <w:rPr>
@@ -4727,7 +5145,7 @@
           <w:color w:val="auto"/>
           <w:szCs w:val="20"/>
         </w:rPr>
-        <w:t>20</w:t>
+        <w:t>0</w:t>
       </w:r>
       <w:r>
         <w:rPr>
@@ -4736,7 +5154,7 @@
           <w:color w:val="auto"/>
           <w:szCs w:val="20"/>
         </w:rPr>
-        <w:t>0+ medium</w:t>
+        <w:t>0 medium</w:t>
       </w:r>
       <w:r>
         <w:rPr>
@@ -5042,56 +5460,15 @@
           <w:color w:val="auto"/>
           <w:szCs w:val="20"/>
         </w:rPr>
-        <w:t>, gaining exposure to cuttin</w:t>
-      </w:r>
-      <w:r>
-        <w:rPr>
-          <w:bCs/>
-          <w:color w:val="auto"/>
-          <w:szCs w:val="20"/>
-        </w:rPr>
-        <w:t>g-</w:t>
-      </w:r>
-      <w:r>
-        <w:rPr>
-          <w:bCs/>
-          <w:color w:val="auto"/>
-          <w:szCs w:val="20"/>
-        </w:rPr>
-        <w:t>edge technology</w:t>
-      </w:r>
-      <w:r>
-        <w:rPr>
-          <w:bCs/>
-          <w:color w:val="auto"/>
-          <w:szCs w:val="20"/>
-        </w:rPr>
-        <w:t xml:space="preserve"> and leveraging the opportunity to network with some of the country’s top talents and industry professionals.</w:t>
-      </w:r>
-    </w:p>
-    <w:p>
-      <w:pPr>
-        <w:pStyle w:val="ListParagraph"/>
-        <w:numPr>
-          <w:ilvl w:val="0"/>
-          <w:numId w:val="32"/>
-        </w:numPr>
-        <w:spacing w:line="240" w:lineRule="auto"/>
-        <w:ind w:right="0"/>
-        <w:jc w:val="both"/>
-        <w:rPr>
-          <w:bCs/>
-          <w:color w:val="auto"/>
-          <w:szCs w:val="20"/>
-        </w:rPr>
-      </w:pPr>
-      <w:r>
-        <w:rPr>
-          <w:bCs/>
-          <w:color w:val="auto"/>
-          <w:szCs w:val="20"/>
-        </w:rPr>
-        <w:t>Earned</w:t>
+        <w:t xml:space="preserve">, </w:t>
+      </w:r>
+      <w:r>
+        <w:rPr>
+          <w:bCs/>
+          <w:color w:val="auto"/>
+          <w:szCs w:val="20"/>
+        </w:rPr>
+        <w:t xml:space="preserve">and earned </w:t>
       </w:r>
       <w:r>
         <w:rPr>
@@ -5099,39 +5476,47 @@
           <w:color w:val="auto"/>
           <w:szCs w:val="20"/>
         </w:rPr>
+        <w:t>W</w:t>
+      </w:r>
+      <w:r>
+        <w:rPr>
+          <w:b/>
+          <w:color w:val="auto"/>
+          <w:szCs w:val="20"/>
+        </w:rPr>
+        <w:t xml:space="preserve">eb </w:t>
+      </w:r>
+      <w:r>
+        <w:rPr>
+          <w:b/>
+          <w:color w:val="auto"/>
+          <w:szCs w:val="20"/>
+        </w:rPr>
+        <w:t>D</w:t>
+      </w:r>
+      <w:r>
+        <w:rPr>
+          <w:b/>
+          <w:color w:val="auto"/>
+          <w:szCs w:val="20"/>
+        </w:rPr>
+        <w:t>evelopment</w:t>
+      </w:r>
+      <w:r>
+        <w:rPr>
+          <w:bCs/>
+          <w:color w:val="auto"/>
+          <w:szCs w:val="20"/>
+        </w:rPr>
         <w:t xml:space="preserve"> </w:t>
       </w:r>
       <w:r>
         <w:rPr>
-          <w:b/>
-          <w:color w:val="auto"/>
-          <w:szCs w:val="20"/>
-        </w:rPr>
-        <w:t>W</w:t>
-      </w:r>
-      <w:r>
-        <w:rPr>
-          <w:b/>
-          <w:color w:val="auto"/>
-          <w:szCs w:val="20"/>
-        </w:rPr>
-        <w:t xml:space="preserve">eb </w:t>
-      </w:r>
-      <w:r>
-        <w:rPr>
-          <w:b/>
-          <w:color w:val="auto"/>
-          <w:szCs w:val="20"/>
-        </w:rPr>
-        <w:t>D</w:t>
-      </w:r>
-      <w:r>
-        <w:rPr>
-          <w:b/>
-          <w:color w:val="auto"/>
-          <w:szCs w:val="20"/>
-        </w:rPr>
-        <w:t>evelopment</w:t>
+          <w:bCs/>
+          <w:color w:val="auto"/>
+          <w:szCs w:val="20"/>
+        </w:rPr>
+        <w:t>certification</w:t>
       </w:r>
       <w:r>
         <w:rPr>
@@ -5147,55 +5532,7 @@
           <w:color w:val="auto"/>
           <w:szCs w:val="20"/>
         </w:rPr>
-        <w:t xml:space="preserve">certification from </w:t>
-      </w:r>
-      <w:r>
-        <w:rPr>
-          <w:b/>
-          <w:color w:val="auto"/>
-          <w:szCs w:val="20"/>
-        </w:rPr>
-        <w:t>IIT Bombay</w:t>
-      </w:r>
-      <w:r>
-        <w:rPr>
-          <w:bCs/>
-          <w:color w:val="auto"/>
-          <w:szCs w:val="20"/>
-        </w:rPr>
-        <w:t xml:space="preserve"> and</w:t>
-      </w:r>
-      <w:r>
-        <w:rPr>
-          <w:bCs/>
-          <w:color w:val="auto"/>
-          <w:szCs w:val="20"/>
-        </w:rPr>
-        <w:t xml:space="preserve"> </w:t>
-      </w:r>
-      <w:r>
-        <w:rPr>
-          <w:bCs/>
-          <w:color w:val="auto"/>
-          <w:szCs w:val="20"/>
-        </w:rPr>
-        <w:t>participated in its</w:t>
-      </w:r>
-      <w:r>
-        <w:rPr>
-          <w:bCs/>
-          <w:color w:val="auto"/>
-          <w:szCs w:val="20"/>
-        </w:rPr>
-        <w:t xml:space="preserve"> cultural fest</w:t>
-      </w:r>
-      <w:r>
-        <w:rPr>
-          <w:bCs/>
-          <w:color w:val="auto"/>
-          <w:szCs w:val="20"/>
-        </w:rPr>
-        <w:t>, Mood Indigo</w:t>
+        <w:t>at the fest</w:t>
       </w:r>
       <w:r>
         <w:rPr>
@@ -5289,42 +5626,42 @@
         <v:path o:extrusionok="f" gradientshapeok="t" o:connecttype="rect"/>
         <o:lock v:ext="edit" aspectratio="t"/>
       </v:shapetype>
-      <v:shape id="_x0000_i1506" type="#_x0000_t75" style="width:513pt;height:513pt;rotation:180;flip:x y;visibility:visible;mso-wrap-style:square" o:bullet="t">
+      <v:shape id="_x0000_i1164" type="#_x0000_t75" style="width:512.8pt;height:512.8pt;rotation:180;flip:x y;visibility:visible;mso-wrap-style:square" o:bullet="t">
         <v:imagedata r:id="rId1" o:title="107161_circle_github_icon"/>
       </v:shape>
     </w:pict>
   </w:numPicBullet>
   <w:numPicBullet w:numPicBulletId="1">
     <w:pict>
-      <v:shape id="_x0000_i1507" type="#_x0000_t75" style="width:168.75pt;height:168.75pt;visibility:visible;mso-wrap-style:square" o:bullet="t">
+      <v:shape id="_x0000_i1165" type="#_x0000_t75" style="width:168.8pt;height:168.8pt;visibility:visible;mso-wrap-style:square" o:bullet="t">
         <v:imagedata r:id="rId2" o:title="941C13C7"/>
       </v:shape>
     </w:pict>
   </w:numPicBullet>
   <w:numPicBullet w:numPicBulletId="2">
     <w:pict>
-      <v:shape id="_x0000_i1508" type="#_x0000_t75" style="width:29.25pt;height:16.5pt;visibility:visible;mso-wrap-style:square" o:bullet="t">
+      <v:shape id="_x0000_i1166" type="#_x0000_t75" style="width:29.2pt;height:16.4pt;visibility:visible;mso-wrap-style:square" o:bullet="t">
         <v:imagedata r:id="rId3" o:title="107161_circle_github_icon"/>
       </v:shape>
     </w:pict>
   </w:numPicBullet>
   <w:numPicBullet w:numPicBulletId="3">
     <w:pict>
-      <v:shape id="_x0000_i1509" type="#_x0000_t75" style="width:240pt;height:234pt;visibility:visible;mso-wrap-style:square" o:bullet="t">
+      <v:shape id="_x0000_i1167" type="#_x0000_t75" style="width:240pt;height:234pt;visibility:visible;mso-wrap-style:square" o:bullet="t">
         <v:imagedata r:id="rId4" o:title="Indian_Institute_of_Technology_Bombay_Logo"/>
       </v:shape>
     </w:pict>
   </w:numPicBullet>
   <w:numPicBullet w:numPicBulletId="4">
     <w:pict>
-      <v:shape id="_x0000_i1510" type="#_x0000_t75" style="width:22.5pt;height:16.5pt;visibility:visible;mso-wrap-style:square" o:bullet="t">
+      <v:shape id="_x0000_i1168" type="#_x0000_t75" style="width:22.4pt;height:16.4pt;visibility:visible;mso-wrap-style:square" o:bullet="t">
         <v:imagedata r:id="rId5" o:title="Indian_Institute_of_Technology_Bombay_Logo"/>
       </v:shape>
     </w:pict>
   </w:numPicBullet>
   <w:numPicBullet w:numPicBulletId="5">
     <w:pict>
-      <v:shape id="_x0000_i1511" type="#_x0000_t75" style="width:76.5pt;height:76.5pt;visibility:visible;mso-wrap-style:square" o:bullet="t">
+      <v:shape id="_x0000_i1169" type="#_x0000_t75" style="width:76.4pt;height:76.4pt;visibility:visible;mso-wrap-style:square" o:bullet="t">
         <v:imagedata r:id="rId6" o:title=""/>
       </v:shape>
     </w:pict>

</xml_diff>

<commit_message>
Bring in changes from the Amazon(v2) and start adding Tutord
</commit_message>
<xml_diff>
--- a/Resume_latest - Copy.docx
+++ b/Resume_latest - Copy.docx
@@ -935,7 +935,21 @@
           <w:bCs/>
           <w:color w:val="auto"/>
         </w:rPr>
-        <w:t xml:space="preserve"> – </w:t>
+        <w:t xml:space="preserve"> </w:t>
+      </w:r>
+      <w:r>
+        <w:rPr>
+          <w:bCs/>
+          <w:color w:val="auto"/>
+        </w:rPr>
+        <w:t>-</w:t>
+      </w:r>
+      <w:r>
+        <w:rPr>
+          <w:bCs/>
+          <w:color w:val="auto"/>
+        </w:rPr>
+        <w:t xml:space="preserve"> </w:t>
       </w:r>
       <w:r>
         <w:rPr>
@@ -1091,7 +1105,21 @@
           <w:bCs/>
           <w:color w:val="auto"/>
         </w:rPr>
-        <w:t xml:space="preserve"> – Feb 2020</w:t>
+        <w:t xml:space="preserve"> </w:t>
+      </w:r>
+      <w:r>
+        <w:rPr>
+          <w:bCs/>
+          <w:color w:val="auto"/>
+        </w:rPr>
+        <w:t>-</w:t>
+      </w:r>
+      <w:r>
+        <w:rPr>
+          <w:bCs/>
+          <w:color w:val="auto"/>
+        </w:rPr>
+        <w:t xml:space="preserve"> Feb 2020</w:t>
       </w:r>
     </w:p>
     <w:p>
@@ -1132,6 +1160,16 @@
         </w:rPr>
         <w:t>Experience</w:t>
       </w:r>
+      <w:r>
+        <w:rPr>
+          <w:b/>
+          <w:bCs/>
+          <w:color w:val="auto"/>
+          <w:sz w:val="24"/>
+          <w:szCs w:val="24"/>
+        </w:rPr>
+        <w:t xml:space="preserve"> </w:t>
+      </w:r>
     </w:p>
     <w:p>
       <w:pPr>
@@ -1154,6 +1192,296 @@
       </w:r>
       <w:r>
         <w:rPr>
+          <w:b/>
+          <w:bCs/>
+          <w:color w:val="auto"/>
+        </w:rPr>
+        <w:t xml:space="preserve"> (Full</w:t>
+      </w:r>
+      <w:r>
+        <w:rPr>
+          <w:b/>
+          <w:bCs/>
+          <w:color w:val="auto"/>
+        </w:rPr>
+        <w:t>-S</w:t>
+      </w:r>
+      <w:r>
+        <w:rPr>
+          <w:b/>
+          <w:bCs/>
+          <w:color w:val="auto"/>
+        </w:rPr>
+        <w:t>tack Cloud developer)</w:t>
+      </w:r>
+      <w:hyperlink r:id="rId24" w:history="1">
+        <w:r>
+          <w:rPr>
+            <w:rStyle w:val="Hyperlink"/>
+            <w:color w:val="auto"/>
+            <w:u w:val="none"/>
+          </w:rPr>
+          <w:t>|</w:t>
+        </w:r>
+        <w:r>
+          <w:rPr>
+            <w:rStyle w:val="Hyperlink"/>
+            <w:color w:val="auto"/>
+            <w:u w:val="none"/>
+          </w:rPr>
+          <w:t xml:space="preserve"> </w:t>
+        </w:r>
+        <w:proofErr w:type="spellStart"/>
+        <w:r>
+          <w:rPr>
+            <w:rStyle w:val="Hyperlink"/>
+            <w:color w:val="auto"/>
+            <w:u w:val="none"/>
+          </w:rPr>
+          <w:t>TutorD</w:t>
+        </w:r>
+        <w:proofErr w:type="spellEnd"/>
+        <w:r>
+          <w:rPr>
+            <w:rStyle w:val="Hyperlink"/>
+            <w:color w:val="auto"/>
+            <w:u w:val="none"/>
+          </w:rPr>
+          <w:t xml:space="preserve"> LLC (U.S.), remote </w:t>
+        </w:r>
+        <w:r>
+          <w:rPr>
+            <w:rStyle w:val="Hyperlink"/>
+            <w:bCs/>
+            <w:color w:val="auto"/>
+            <w:u w:val="none"/>
+          </w:rPr>
+          <w:t>|</w:t>
+        </w:r>
+      </w:hyperlink>
+      <w:r>
+        <w:rPr>
+          <w:rStyle w:val="Hyperlink"/>
+          <w:bCs/>
+          <w:color w:val="auto"/>
+          <w:u w:val="none"/>
+        </w:rPr>
+        <w:t xml:space="preserve"> tutord.io </w:t>
+      </w:r>
+      <w:r>
+        <w:rPr>
+          <w:i/>
+          <w:iCs/>
+          <w:color w:val="auto"/>
+        </w:rPr>
+        <w:tab/>
+      </w:r>
+      <w:r>
+        <w:rPr>
+          <w:i/>
+          <w:iCs/>
+          <w:color w:val="auto"/>
+        </w:rPr>
+        <w:t>Dec</w:t>
+      </w:r>
+      <w:r>
+        <w:rPr>
+          <w:color w:val="auto"/>
+        </w:rPr>
+        <w:t xml:space="preserve"> 202</w:t>
+      </w:r>
+      <w:r>
+        <w:rPr>
+          <w:color w:val="auto"/>
+        </w:rPr>
+        <w:t>5</w:t>
+      </w:r>
+      <w:r>
+        <w:rPr>
+          <w:color w:val="auto"/>
+        </w:rPr>
+        <w:t xml:space="preserve"> </w:t>
+      </w:r>
+      <w:r>
+        <w:rPr>
+          <w:color w:val="auto"/>
+        </w:rPr>
+        <w:t>-</w:t>
+      </w:r>
+      <w:r>
+        <w:rPr>
+          <w:color w:val="auto"/>
+        </w:rPr>
+        <w:t xml:space="preserve"> </w:t>
+      </w:r>
+      <w:r>
+        <w:rPr>
+          <w:color w:val="auto"/>
+        </w:rPr>
+        <w:t>Present</w:t>
+      </w:r>
+    </w:p>
+    <w:p>
+      <w:pPr>
+        <w:tabs>
+          <w:tab w:val="right" w:pos="10490"/>
+        </w:tabs>
+        <w:spacing w:after="0" w:line="240" w:lineRule="auto"/>
+        <w:ind w:right="0"/>
+        <w:rPr>
+          <w:color w:val="auto"/>
+        </w:rPr>
+      </w:pPr>
+      <w:proofErr w:type="gramStart"/>
+      <w:r>
+        <w:rPr>
+          <w:color w:val="auto"/>
+        </w:rPr>
+        <w:t xml:space="preserve">( </w:t>
+      </w:r>
+      <w:proofErr w:type="spellStart"/>
+      <w:r>
+        <w:rPr>
+          <w:color w:val="auto"/>
+        </w:rPr>
+        <w:t>TutorD</w:t>
+      </w:r>
+      <w:proofErr w:type="spellEnd"/>
+      <w:proofErr w:type="gramEnd"/>
+      <w:r>
+        <w:rPr>
+          <w:color w:val="auto"/>
+        </w:rPr>
+        <w:t xml:space="preserve"> is an Ed-tech platform )</w:t>
+      </w:r>
+    </w:p>
+    <w:p>
+      <w:pPr>
+        <w:pStyle w:val="ListParagraph"/>
+        <w:numPr>
+          <w:ilvl w:val="0"/>
+          <w:numId w:val="32"/>
+        </w:numPr>
+        <w:spacing w:line="240" w:lineRule="auto"/>
+        <w:ind w:right="0"/>
+        <w:jc w:val="both"/>
+        <w:rPr>
+          <w:color w:val="auto"/>
+          <w:szCs w:val="20"/>
+        </w:rPr>
+      </w:pPr>
+      <w:r>
+        <w:rPr>
+          <w:color w:val="auto"/>
+          <w:szCs w:val="20"/>
+        </w:rPr>
+        <w:t xml:space="preserve">Single </w:t>
+      </w:r>
+      <w:proofErr w:type="spellStart"/>
+      <w:r>
+        <w:rPr>
+          <w:color w:val="auto"/>
+          <w:szCs w:val="20"/>
+        </w:rPr>
+        <w:t>handedly</w:t>
+      </w:r>
+      <w:proofErr w:type="spellEnd"/>
+      <w:r>
+        <w:rPr>
+          <w:color w:val="auto"/>
+          <w:szCs w:val="20"/>
+        </w:rPr>
+        <w:t xml:space="preserve"> migrated </w:t>
+      </w:r>
+      <w:r>
+        <w:rPr>
+          <w:color w:val="auto"/>
+          <w:szCs w:val="20"/>
+        </w:rPr>
+        <w:t>the</w:t>
+      </w:r>
+      <w:r>
+        <w:rPr>
+          <w:color w:val="auto"/>
+          <w:szCs w:val="20"/>
+        </w:rPr>
+        <w:t xml:space="preserve"> frontend CI/CD pipeline to alternative cloud provider, reducing build time from 5ms to 4ms. (~20% improvement)</w:t>
+      </w:r>
+    </w:p>
+    <w:p>
+      <w:pPr>
+        <w:pStyle w:val="ListParagraph"/>
+        <w:numPr>
+          <w:ilvl w:val="0"/>
+          <w:numId w:val="32"/>
+        </w:numPr>
+        <w:spacing w:line="240" w:lineRule="auto"/>
+        <w:ind w:right="0"/>
+        <w:jc w:val="both"/>
+        <w:rPr>
+          <w:color w:val="auto"/>
+          <w:szCs w:val="20"/>
+        </w:rPr>
+      </w:pPr>
+    </w:p>
+    <w:p>
+      <w:pPr>
+        <w:tabs>
+          <w:tab w:val="right" w:pos="10490"/>
+        </w:tabs>
+        <w:spacing w:after="0" w:line="240" w:lineRule="auto"/>
+        <w:ind w:right="0"/>
+        <w:rPr>
+          <w:color w:val="auto"/>
+        </w:rPr>
+      </w:pPr>
+    </w:p>
+    <w:p>
+      <w:pPr>
+        <w:tabs>
+          <w:tab w:val="right" w:pos="10490"/>
+        </w:tabs>
+        <w:spacing w:after="0" w:line="240" w:lineRule="auto"/>
+        <w:ind w:right="0"/>
+        <w:rPr>
+          <w:color w:val="auto"/>
+        </w:rPr>
+      </w:pPr>
+    </w:p>
+    <w:p>
+      <w:pPr>
+        <w:spacing w:line="240" w:lineRule="auto"/>
+        <w:ind w:right="0"/>
+        <w:jc w:val="center"/>
+        <w:rPr>
+          <w:rFonts w:cstheme="minorBidi"/>
+          <w:color w:val="auto"/>
+          <w:sz w:val="22"/>
+          <w:szCs w:val="22"/>
+        </w:rPr>
+      </w:pPr>
+    </w:p>
+    <w:p>
+      <w:pPr>
+        <w:tabs>
+          <w:tab w:val="right" w:pos="10490"/>
+        </w:tabs>
+        <w:spacing w:after="0" w:line="240" w:lineRule="auto"/>
+        <w:ind w:right="0"/>
+        <w:rPr>
+          <w:color w:val="auto"/>
+        </w:rPr>
+      </w:pPr>
+      <w:r>
+        <w:rPr>
+          <w:b/>
+          <w:bCs/>
+          <w:color w:val="auto"/>
+        </w:rPr>
+        <w:t>Software Developer</w:t>
+      </w:r>
+      <w:r>
+        <w:rPr>
           <w:rFonts w:cstheme="minorBidi"/>
           <w:b/>
           <w:bCs/>
@@ -1167,7 +1495,7 @@
         </w:rPr>
         <w:t xml:space="preserve"> </w:t>
       </w:r>
-      <w:hyperlink r:id="rId24" w:history="1">
+      <w:hyperlink r:id="rId25" w:history="1">
         <w:r>
           <w:rPr>
             <w:rStyle w:val="Hyperlink"/>
@@ -1183,43 +1511,7 @@
             <w:color w:val="auto"/>
             <w:u w:val="none"/>
           </w:rPr>
-          <w:t>OFY Wellness, Nagpur</w:t>
-        </w:r>
-        <w:r>
-          <w:rPr>
-            <w:rStyle w:val="Hyperlink"/>
-            <w:bCs/>
-            <w:color w:val="auto"/>
-            <w:u w:val="none"/>
-          </w:rPr>
-          <w:t xml:space="preserve"> </w:t>
-        </w:r>
-        <w:r>
-          <w:rPr>
-            <w:rStyle w:val="Hyperlink"/>
-            <w:bCs/>
-            <w:color w:val="auto"/>
-            <w:u w:val="none"/>
-          </w:rPr>
-          <w:t xml:space="preserve">| </w:t>
-        </w:r>
-        <w:r>
-          <w:rPr>
-            <w:rStyle w:val="Hyperlink"/>
-            <w:bCs/>
-            <w:color w:val="auto"/>
-            <w:u w:val="none"/>
-          </w:rPr>
-          <w:t>o</w:t>
-        </w:r>
-        <w:r>
-          <w:rPr>
-            <w:rStyle w:val="Hyperlink"/>
-            <w:bCs/>
-            <w:color w:val="auto"/>
-            <w:u w:val="none"/>
-          </w:rPr>
-          <w:t>fyclinics.com</w:t>
+          <w:t>OFY Wellness, Nagpur | ofyclinics.com</w:t>
         </w:r>
       </w:hyperlink>
       <w:r>
@@ -1234,30 +1526,24 @@
         <w:rPr>
           <w:color w:val="auto"/>
         </w:rPr>
-        <w:t xml:space="preserve">February 2024 </w:t>
-      </w:r>
-      <w:r>
-        <w:rPr>
-          <w:color w:val="auto"/>
-        </w:rPr>
-        <w:t>–</w:t>
-      </w:r>
-      <w:r>
-        <w:rPr>
-          <w:color w:val="auto"/>
-        </w:rPr>
-        <w:t xml:space="preserve"> </w:t>
-      </w:r>
-      <w:r>
-        <w:rPr>
-          <w:color w:val="auto"/>
-        </w:rPr>
-        <w:t>August 2024</w:t>
+        <w:t xml:space="preserve">Feb 2024 </w:t>
+      </w:r>
+      <w:r>
+        <w:rPr>
+          <w:color w:val="auto"/>
+        </w:rPr>
+        <w:t>-</w:t>
+      </w:r>
+      <w:r>
+        <w:rPr>
+          <w:color w:val="auto"/>
+        </w:rPr>
+        <w:t xml:space="preserve"> Aug 2024</w:t>
       </w:r>
     </w:p>
     <w:p>
       <w:pPr>
-        <w:spacing w:after="0" w:line="240" w:lineRule="auto"/>
+        <w:spacing w:line="240" w:lineRule="auto"/>
         <w:ind w:right="0"/>
         <w:rPr>
           <w:color w:val="auto"/>
@@ -1302,7 +1588,7 @@
           <w:color w:val="auto"/>
         </w:rPr>
       </w:pPr>
-      <w:hyperlink r:id="rId25" w:history="1">
+      <w:hyperlink r:id="rId26" w:history="1">
         <w:r>
           <w:rPr>
             <w:rStyle w:val="Hyperlink"/>
@@ -1841,7 +2127,7 @@
           <w:color w:val="auto"/>
         </w:rPr>
       </w:pPr>
-      <w:hyperlink r:id="rId26" w:history="1">
+      <w:hyperlink r:id="rId27" w:history="1">
         <w:r>
           <w:rPr>
             <w:rStyle w:val="Hyperlink"/>
@@ -2228,7 +2514,7 @@
         </w:rPr>
         <w:t xml:space="preserve"> | </w:t>
       </w:r>
-      <w:hyperlink r:id="rId27" w:history="1">
+      <w:hyperlink r:id="rId28" w:history="1">
         <w:proofErr w:type="spellStart"/>
         <w:r>
           <w:rPr>
@@ -2292,7 +2578,7 @@
         <w:rPr>
           <w:color w:val="auto"/>
         </w:rPr>
-        <w:t>December 202</w:t>
+        <w:t>Dec 202</w:t>
       </w:r>
       <w:r>
         <w:rPr>
@@ -2814,7 +3100,7 @@
           <w:color w:val="auto"/>
         </w:rPr>
       </w:pPr>
-      <w:hyperlink r:id="rId28" w:history="1">
+      <w:hyperlink r:id="rId29" w:history="1">
         <w:r>
           <w:rPr>
             <w:rStyle w:val="Hyperlink"/>
@@ -2881,7 +3167,7 @@
         <w:pStyle w:val="ListParagraph"/>
         <w:numPr>
           <w:ilvl w:val="0"/>
-          <w:numId w:val="39"/>
+          <w:numId w:val="31"/>
         </w:numPr>
         <w:spacing w:line="240" w:lineRule="auto"/>
         <w:ind w:right="0"/>
@@ -3004,35 +3290,7 @@
         <w:rPr>
           <w:color w:val="auto"/>
         </w:rPr>
-        <w:t xml:space="preserve">by </w:t>
-      </w:r>
-      <w:r>
-        <w:rPr>
-          <w:color w:val="auto"/>
-        </w:rPr>
-        <w:t xml:space="preserve">more than </w:t>
-      </w:r>
-      <w:r>
-        <w:rPr>
-          <w:b/>
-          <w:bCs/>
-          <w:color w:val="auto"/>
-        </w:rPr>
-        <w:t>2</w:t>
-      </w:r>
-      <w:r>
-        <w:rPr>
-          <w:b/>
-          <w:bCs/>
-          <w:color w:val="auto"/>
-        </w:rPr>
-        <w:t>0%</w:t>
-      </w:r>
-      <w:r>
-        <w:rPr>
-          <w:color w:val="auto"/>
-        </w:rPr>
-        <w:t>.</w:t>
+        <w:t>and accessibility.</w:t>
       </w:r>
     </w:p>
     <w:p>
@@ -3232,7 +3490,7 @@
           <w:color w:val="auto"/>
         </w:rPr>
       </w:pPr>
-      <w:hyperlink r:id="rId29" w:history="1">
+      <w:hyperlink r:id="rId30" w:history="1">
         <w:r>
           <w:rPr>
             <w:rStyle w:val="Hyperlink"/>
@@ -3535,7 +3793,7 @@
           <w:color w:val="auto"/>
         </w:rPr>
       </w:pPr>
-      <w:hyperlink r:id="rId30" w:history="1">
+      <w:hyperlink r:id="rId31" w:history="1">
         <w:r>
           <w:rPr>
             <w:rStyle w:val="Hyperlink"/>
@@ -4051,7 +4309,7 @@
           <w:szCs w:val="18"/>
         </w:rPr>
       </w:pPr>
-      <w:hyperlink r:id="rId31" w:history="1">
+      <w:hyperlink r:id="rId32" w:history="1">
         <w:proofErr w:type="spellStart"/>
         <w:r>
           <w:rPr>
@@ -4206,7 +4464,19 @@
         <w:rPr>
           <w:color w:val="auto"/>
         </w:rPr>
-        <w:t xml:space="preserve"> card and ticker manager with over </w:t>
+        <w:t xml:space="preserve"> card and ticke</w:t>
+      </w:r>
+      <w:r>
+        <w:rPr>
+          <w:color w:val="auto"/>
+        </w:rPr>
+        <w:t>t</w:t>
+      </w:r>
+      <w:r>
+        <w:rPr>
+          <w:color w:val="auto"/>
+        </w:rPr>
+        <w:t xml:space="preserve"> manager with over </w:t>
       </w:r>
       <w:r>
         <w:rPr>
@@ -4220,7 +4490,31 @@
         <w:rPr>
           <w:color w:val="auto"/>
         </w:rPr>
-        <w:t xml:space="preserve"> on google play store)</w:t>
+        <w:t xml:space="preserve"> on </w:t>
+      </w:r>
+      <w:r>
+        <w:rPr>
+          <w:color w:val="auto"/>
+        </w:rPr>
+        <w:t>G</w:t>
+      </w:r>
+      <w:r>
+        <w:rPr>
+          <w:color w:val="auto"/>
+        </w:rPr>
+        <w:t xml:space="preserve">oogle </w:t>
+      </w:r>
+      <w:r>
+        <w:rPr>
+          <w:color w:val="auto"/>
+        </w:rPr>
+        <w:t>P</w:t>
+      </w:r>
+      <w:r>
+        <w:rPr>
+          <w:color w:val="auto"/>
+        </w:rPr>
+        <w:t>lay store)</w:t>
       </w:r>
     </w:p>
     <w:p>
@@ -4874,6 +5168,7 @@
           <w:color w:val="auto"/>
           <w:szCs w:val="20"/>
         </w:rPr>
+        <w:lastRenderedPageBreak/>
         <w:t>Beginner</w:t>
       </w:r>
       <w:r>
@@ -5069,12 +5364,13 @@
         </w:rPr>
         <w:t xml:space="preserve">% </w:t>
       </w:r>
-      <w:r>
-        <w:rPr>
-          <w:color w:val="auto"/>
-          <w:szCs w:val="20"/>
-        </w:rPr>
-        <w:t>Leet Code</w:t>
+      <w:proofErr w:type="spellStart"/>
+      <w:r>
+        <w:rPr>
+          <w:color w:val="auto"/>
+          <w:szCs w:val="20"/>
+        </w:rPr>
+        <w:t>LeetCode</w:t>
       </w:r>
       <w:r>
         <w:rPr>
@@ -5083,60 +5379,41 @@
         </w:rPr>
         <w:t>r</w:t>
       </w:r>
-      <w:r>
-        <w:rPr>
-          <w:color w:val="auto"/>
-          <w:szCs w:val="20"/>
-        </w:rPr>
-        <w:t xml:space="preserve"> with having t</w:t>
-      </w:r>
-      <w:r>
-        <w:rPr>
-          <w:color w:val="auto"/>
-          <w:szCs w:val="20"/>
-        </w:rPr>
-        <w:t xml:space="preserve">ackled </w:t>
-      </w:r>
-      <w:r>
-        <w:rPr>
-          <w:b/>
-          <w:bCs/>
+      <w:proofErr w:type="spellEnd"/>
+      <w:r>
+        <w:rPr>
+          <w:color w:val="auto"/>
+          <w:szCs w:val="20"/>
+        </w:rPr>
+        <w:t xml:space="preserve">, having </w:t>
+      </w:r>
+      <w:r>
+        <w:rPr>
+          <w:color w:val="auto"/>
+          <w:szCs w:val="20"/>
+        </w:rPr>
+        <w:t xml:space="preserve">solved </w:t>
+      </w:r>
+      <w:r>
+        <w:rPr>
+          <w:color w:val="auto"/>
+          <w:szCs w:val="20"/>
+        </w:rPr>
+        <w:t>+</w:t>
+      </w:r>
+      <w:r>
+        <w:rPr>
+          <w:color w:val="auto"/>
+          <w:szCs w:val="20"/>
+        </w:rPr>
+        <w:t>3</w:t>
+      </w:r>
+      <w:r>
+        <w:rPr>
           <w:color w:val="auto"/>
           <w:szCs w:val="20"/>
         </w:rPr>
         <w:t>5</w:t>
-      </w:r>
-      <w:r>
-        <w:rPr>
-          <w:b/>
-          <w:bCs/>
-          <w:color w:val="auto"/>
-          <w:szCs w:val="20"/>
-        </w:rPr>
-        <w:t>0</w:t>
-      </w:r>
-      <w:r>
-        <w:rPr>
-          <w:b/>
-          <w:bCs/>
-          <w:color w:val="auto"/>
-          <w:szCs w:val="20"/>
-        </w:rPr>
-        <w:t>0+ problems</w:t>
-      </w:r>
-      <w:r>
-        <w:rPr>
-          <w:color w:val="auto"/>
-          <w:szCs w:val="20"/>
-        </w:rPr>
-        <w:t xml:space="preserve"> and solved </w:t>
-      </w:r>
-      <w:r>
-        <w:rPr>
-          <w:color w:val="auto"/>
-          <w:szCs w:val="20"/>
-        </w:rPr>
-        <w:t>~3</w:t>
       </w:r>
       <w:r>
         <w:rPr>
@@ -5145,41 +5422,28 @@
           <w:color w:val="auto"/>
           <w:szCs w:val="20"/>
         </w:rPr>
-        <w:t>0</w:t>
-      </w:r>
-      <w:r>
-        <w:rPr>
-          <w:i/>
-          <w:iCs/>
-          <w:color w:val="auto"/>
-          <w:szCs w:val="20"/>
-        </w:rPr>
-        <w:t>0 medium</w:t>
-      </w:r>
-      <w:r>
-        <w:rPr>
-          <w:i/>
-          <w:iCs/>
-          <w:color w:val="auto"/>
-          <w:szCs w:val="20"/>
-        </w:rPr>
-        <w:t>-</w:t>
-      </w:r>
-      <w:r>
-        <w:rPr>
-          <w:i/>
-          <w:iCs/>
-          <w:color w:val="auto"/>
-          <w:szCs w:val="20"/>
-        </w:rPr>
-        <w:t xml:space="preserve">level </w:t>
-      </w:r>
-      <w:r>
-        <w:rPr>
-          <w:color w:val="auto"/>
-          <w:szCs w:val="20"/>
-        </w:rPr>
-        <w:t>problems.</w:t>
+        <w:t xml:space="preserve">0 </w:t>
+      </w:r>
+      <w:r>
+        <w:rPr>
+          <w:color w:val="auto"/>
+          <w:szCs w:val="20"/>
+        </w:rPr>
+        <w:t>problems</w:t>
+      </w:r>
+      <w:r>
+        <w:rPr>
+          <w:color w:val="auto"/>
+          <w:szCs w:val="20"/>
+        </w:rPr>
+        <w:t xml:space="preserve"> and earned multiple badges</w:t>
+      </w:r>
+      <w:r>
+        <w:rPr>
+          <w:color w:val="auto"/>
+          <w:szCs w:val="20"/>
+        </w:rPr>
+        <w:t>.</w:t>
       </w:r>
     </w:p>
     <w:p>
@@ -5626,42 +5890,42 @@
         <v:path o:extrusionok="f" gradientshapeok="t" o:connecttype="rect"/>
         <o:lock v:ext="edit" aspectratio="t"/>
       </v:shapetype>
-      <v:shape id="_x0000_i1164" type="#_x0000_t75" style="width:512.8pt;height:512.8pt;rotation:180;flip:x y;visibility:visible;mso-wrap-style:square" o:bullet="t">
+      <v:shape id="_x0000_i1404" type="#_x0000_t75" style="width:513pt;height:513pt;rotation:180;flip:x y;visibility:visible;mso-wrap-style:square" o:bullet="t">
         <v:imagedata r:id="rId1" o:title="107161_circle_github_icon"/>
       </v:shape>
     </w:pict>
   </w:numPicBullet>
   <w:numPicBullet w:numPicBulletId="1">
     <w:pict>
-      <v:shape id="_x0000_i1165" type="#_x0000_t75" style="width:168.8pt;height:168.8pt;visibility:visible;mso-wrap-style:square" o:bullet="t">
+      <v:shape id="_x0000_i1405" type="#_x0000_t75" style="width:168.75pt;height:168.75pt;visibility:visible;mso-wrap-style:square" o:bullet="t">
         <v:imagedata r:id="rId2" o:title="941C13C7"/>
       </v:shape>
     </w:pict>
   </w:numPicBullet>
   <w:numPicBullet w:numPicBulletId="2">
     <w:pict>
-      <v:shape id="_x0000_i1166" type="#_x0000_t75" style="width:29.2pt;height:16.4pt;visibility:visible;mso-wrap-style:square" o:bullet="t">
+      <v:shape id="_x0000_i1406" type="#_x0000_t75" style="width:29.25pt;height:16.5pt;visibility:visible;mso-wrap-style:square" o:bullet="t">
         <v:imagedata r:id="rId3" o:title="107161_circle_github_icon"/>
       </v:shape>
     </w:pict>
   </w:numPicBullet>
   <w:numPicBullet w:numPicBulletId="3">
     <w:pict>
-      <v:shape id="_x0000_i1167" type="#_x0000_t75" style="width:240pt;height:234pt;visibility:visible;mso-wrap-style:square" o:bullet="t">
+      <v:shape id="_x0000_i1407" type="#_x0000_t75" style="width:240pt;height:234pt;visibility:visible;mso-wrap-style:square" o:bullet="t">
         <v:imagedata r:id="rId4" o:title="Indian_Institute_of_Technology_Bombay_Logo"/>
       </v:shape>
     </w:pict>
   </w:numPicBullet>
   <w:numPicBullet w:numPicBulletId="4">
     <w:pict>
-      <v:shape id="_x0000_i1168" type="#_x0000_t75" style="width:22.4pt;height:16.4pt;visibility:visible;mso-wrap-style:square" o:bullet="t">
+      <v:shape id="_x0000_i1408" type="#_x0000_t75" style="width:22.5pt;height:16.5pt;visibility:visible;mso-wrap-style:square" o:bullet="t">
         <v:imagedata r:id="rId5" o:title="Indian_Institute_of_Technology_Bombay_Logo"/>
       </v:shape>
     </w:pict>
   </w:numPicBullet>
   <w:numPicBullet w:numPicBulletId="5">
     <w:pict>
-      <v:shape id="_x0000_i1169" type="#_x0000_t75" style="width:76.4pt;height:76.4pt;visibility:visible;mso-wrap-style:square" o:bullet="t">
+      <v:shape id="_x0000_i1409" type="#_x0000_t75" style="width:76.5pt;height:76.5pt;visibility:visible;mso-wrap-style:square" o:bullet="t">
         <v:imagedata r:id="rId6" o:title=""/>
       </v:shape>
     </w:pict>
@@ -10617,7 +10881,7 @@
   <w:style w:type="paragraph" w:default="1" w:styleId="Normal">
     <w:name w:val="Normal"/>
     <w:qFormat/>
-    <w:rsid w:val="00132917"/>
+    <w:rsid w:val="001B0663"/>
     <w:pPr>
       <w:spacing w:after="2" w:line="292" w:lineRule="auto"/>
       <w:ind w:left="10" w:right="4549" w:hanging="10"/>
@@ -10695,7 +10959,6 @@
   <w:style w:type="character" w:default="1" w:styleId="DefaultParagraphFont">
     <w:name w:val="Default Paragraph Font"/>
     <w:uiPriority w:val="1"/>
-    <w:semiHidden/>
     <w:unhideWhenUsed/>
   </w:style>
   <w:style w:type="table" w:default="1" w:styleId="TableNormal">

</xml_diff>

<commit_message>
Tutord changes added (polishing & metrics+ remains)
</commit_message>
<xml_diff>
--- a/Resume_latest - Copy.docx
+++ b/Resume_latest - Copy.docx
@@ -538,7 +538,10 @@
         <w:spacing w:line="240" w:lineRule="auto"/>
         <w:ind w:right="0"/>
         <w:rPr>
-          <w:color w:val="auto"/>
+          <w:rStyle w:val="Hyperlink"/>
+          <w:bCs/>
+          <w:color w:val="auto"/>
+          <w:u w:val="none"/>
         </w:rPr>
       </w:pPr>
       <w:hyperlink r:id="rId16" w:history="1">
@@ -788,11 +791,12 @@
         <w:pBdr>
           <w:bottom w:val="single" w:sz="6" w:space="1" w:color="auto"/>
         </w:pBdr>
+        <w:tabs>
+          <w:tab w:val="right" w:pos="10490"/>
+        </w:tabs>
         <w:spacing w:line="240" w:lineRule="auto"/>
         <w:ind w:left="0" w:right="0" w:firstLine="0"/>
         <w:rPr>
-          <w:b/>
-          <w:bCs/>
           <w:color w:val="auto"/>
         </w:rPr>
       </w:pPr>
@@ -1375,7 +1379,35 @@
           <w:color w:val="auto"/>
           <w:szCs w:val="20"/>
         </w:rPr>
-        <w:t xml:space="preserve">Single </w:t>
+        <w:t>M</w:t>
+      </w:r>
+      <w:r>
+        <w:rPr>
+          <w:color w:val="auto"/>
+          <w:szCs w:val="20"/>
+        </w:rPr>
+        <w:t xml:space="preserve">igrated </w:t>
+      </w:r>
+      <w:r>
+        <w:rPr>
+          <w:color w:val="auto"/>
+          <w:szCs w:val="20"/>
+        </w:rPr>
+        <w:t>the frontend</w:t>
+      </w:r>
+      <w:r>
+        <w:rPr>
+          <w:color w:val="auto"/>
+          <w:szCs w:val="20"/>
+        </w:rPr>
+        <w:t xml:space="preserve"> CI/CD pipeline</w:t>
+      </w:r>
+      <w:r>
+        <w:rPr>
+          <w:color w:val="auto"/>
+          <w:szCs w:val="20"/>
+        </w:rPr>
+        <w:t xml:space="preserve"> from AWS </w:t>
       </w:r>
       <w:proofErr w:type="spellStart"/>
       <w:r>
@@ -1383,7 +1415,7 @@
           <w:color w:val="auto"/>
           <w:szCs w:val="20"/>
         </w:rPr>
-        <w:t>handedly</w:t>
+        <w:t>CodeBuild</w:t>
       </w:r>
       <w:proofErr w:type="spellEnd"/>
       <w:r>
@@ -1391,21 +1423,169 @@
           <w:color w:val="auto"/>
           <w:szCs w:val="20"/>
         </w:rPr>
-        <w:t xml:space="preserve"> migrated </w:t>
-      </w:r>
-      <w:r>
-        <w:rPr>
-          <w:color w:val="auto"/>
-          <w:szCs w:val="20"/>
-        </w:rPr>
-        <w:t>the</w:t>
-      </w:r>
-      <w:r>
-        <w:rPr>
-          <w:color w:val="auto"/>
-          <w:szCs w:val="20"/>
-        </w:rPr>
-        <w:t xml:space="preserve"> frontend CI/CD pipeline to alternative cloud provider, reducing build time from 5ms to 4ms. (~20% improvement)</w:t>
+        <w:t xml:space="preserve"> to GitHub Actions</w:t>
+      </w:r>
+      <w:r>
+        <w:rPr>
+          <w:color w:val="auto"/>
+          <w:szCs w:val="20"/>
+        </w:rPr>
+        <w:t xml:space="preserve">, reducing build time </w:t>
+      </w:r>
+      <w:r>
+        <w:rPr>
+          <w:color w:val="auto"/>
+          <w:szCs w:val="20"/>
+        </w:rPr>
+        <w:t xml:space="preserve">by </w:t>
+      </w:r>
+      <w:r>
+        <w:rPr>
+          <w:b/>
+          <w:bCs/>
+          <w:color w:val="auto"/>
+          <w:szCs w:val="20"/>
+        </w:rPr>
+        <w:t>~20%</w:t>
+      </w:r>
+      <w:r>
+        <w:rPr>
+          <w:color w:val="auto"/>
+          <w:szCs w:val="20"/>
+        </w:rPr>
+        <w:t xml:space="preserve"> </w:t>
+      </w:r>
+      <w:r>
+        <w:rPr>
+          <w:b/>
+          <w:bCs/>
+          <w:color w:val="auto"/>
+        </w:rPr>
+        <w:t>(</w:t>
+      </w:r>
+      <w:r>
+        <w:rPr>
+          <w:b/>
+          <w:bCs/>
+          <w:color w:val="auto"/>
+        </w:rPr>
+        <w:t>~</w:t>
+      </w:r>
+      <w:r>
+        <w:rPr>
+          <w:b/>
+          <w:bCs/>
+          <w:color w:val="auto"/>
+        </w:rPr>
+        <w:t>5</w:t>
+      </w:r>
+      <w:r>
+        <w:rPr>
+          <w:b/>
+          <w:bCs/>
+          <w:color w:val="auto"/>
+        </w:rPr>
+        <w:t xml:space="preserve"> </w:t>
+      </w:r>
+      <w:r>
+        <w:rPr>
+          <w:b/>
+          <w:bCs/>
+          <w:color w:val="auto"/>
+        </w:rPr>
+        <w:t>m</w:t>
+      </w:r>
+      <w:r>
+        <w:rPr>
+          <w:b/>
+          <w:bCs/>
+          <w:color w:val="auto"/>
+        </w:rPr>
+        <w:t>in</w:t>
+      </w:r>
+      <w:r>
+        <w:rPr>
+          <w:b/>
+          <w:bCs/>
+          <w:color w:val="auto"/>
+        </w:rPr>
+        <w:t xml:space="preserve"> </w:t>
+      </w:r>
+      <w:r>
+        <w:rPr>
+          <w:b/>
+          <w:bCs/>
+          <w:color w:val="auto"/>
+        </w:rPr>
+        <w:t xml:space="preserve">to </w:t>
+      </w:r>
+      <w:r>
+        <w:rPr>
+          <w:b/>
+          <w:bCs/>
+          <w:color w:val="auto"/>
+        </w:rPr>
+        <w:t>~</w:t>
+      </w:r>
+      <w:r>
+        <w:rPr>
+          <w:b/>
+          <w:bCs/>
+          <w:color w:val="auto"/>
+        </w:rPr>
+        <w:t>4</w:t>
+      </w:r>
+      <w:r>
+        <w:rPr>
+          <w:b/>
+          <w:bCs/>
+          <w:color w:val="auto"/>
+        </w:rPr>
+        <w:t xml:space="preserve"> </w:t>
+      </w:r>
+      <w:r>
+        <w:rPr>
+          <w:b/>
+          <w:bCs/>
+          <w:color w:val="auto"/>
+        </w:rPr>
+        <w:t>m</w:t>
+      </w:r>
+      <w:r>
+        <w:rPr>
+          <w:b/>
+          <w:bCs/>
+          <w:color w:val="auto"/>
+        </w:rPr>
+        <w:t>in</w:t>
+      </w:r>
+      <w:r>
+        <w:rPr>
+          <w:b/>
+          <w:bCs/>
+          <w:color w:val="auto"/>
+        </w:rPr>
+        <w:t>)</w:t>
+      </w:r>
+      <w:r>
+        <w:rPr>
+          <w:b/>
+          <w:bCs/>
+          <w:color w:val="auto"/>
+        </w:rPr>
+        <w:t xml:space="preserve"> </w:t>
+      </w:r>
+      <w:r>
+        <w:rPr>
+          <w:color w:val="auto"/>
+        </w:rPr>
+        <w:t>and eliminating build costs</w:t>
+      </w:r>
+      <w:r>
+        <w:rPr>
+          <w:color w:val="auto"/>
+        </w:rPr>
+        <w:t>.</w:t>
       </w:r>
     </w:p>
     <w:p>
@@ -1423,41 +1603,186 @@
           <w:szCs w:val="20"/>
         </w:rPr>
       </w:pPr>
+      <w:r>
+        <w:rPr>
+          <w:color w:val="auto"/>
+          <w:szCs w:val="20"/>
+        </w:rPr>
+        <w:t xml:space="preserve">Resolved </w:t>
+      </w:r>
+      <w:r>
+        <w:rPr>
+          <w:color w:val="auto"/>
+          <w:szCs w:val="20"/>
+        </w:rPr>
+        <w:t xml:space="preserve">CI/CD and </w:t>
+      </w:r>
+      <w:r>
+        <w:rPr>
+          <w:color w:val="auto"/>
+          <w:szCs w:val="20"/>
+        </w:rPr>
+        <w:t xml:space="preserve">deployment failures by fixing environment variables and </w:t>
+      </w:r>
+      <w:r>
+        <w:rPr>
+          <w:color w:val="auto"/>
+          <w:szCs w:val="20"/>
+        </w:rPr>
+        <w:t>updating</w:t>
+      </w:r>
+      <w:r>
+        <w:rPr>
+          <w:color w:val="auto"/>
+          <w:szCs w:val="20"/>
+        </w:rPr>
+        <w:t xml:space="preserve"> ECS task defin</w:t>
+      </w:r>
+      <w:r>
+        <w:rPr>
+          <w:color w:val="auto"/>
+          <w:szCs w:val="20"/>
+        </w:rPr>
+        <w:t>i</w:t>
+      </w:r>
+      <w:r>
+        <w:rPr>
+          <w:color w:val="auto"/>
+          <w:szCs w:val="20"/>
+        </w:rPr>
+        <w:t>tion</w:t>
+      </w:r>
+      <w:r>
+        <w:rPr>
+          <w:color w:val="auto"/>
+          <w:szCs w:val="20"/>
+        </w:rPr>
+        <w:t>s</w:t>
+      </w:r>
+      <w:r>
+        <w:rPr>
+          <w:color w:val="auto"/>
+          <w:szCs w:val="20"/>
+        </w:rPr>
+        <w:t>.</w:t>
+      </w:r>
     </w:p>
     <w:p>
       <w:pPr>
-        <w:tabs>
-          <w:tab w:val="right" w:pos="10490"/>
-        </w:tabs>
-        <w:spacing w:after="0" w:line="240" w:lineRule="auto"/>
+        <w:pStyle w:val="ListParagraph"/>
+        <w:numPr>
+          <w:ilvl w:val="0"/>
+          <w:numId w:val="32"/>
+        </w:numPr>
+        <w:spacing w:line="240" w:lineRule="auto"/>
         <w:ind w:right="0"/>
-        <w:rPr>
-          <w:color w:val="auto"/>
-        </w:rPr>
-      </w:pPr>
+        <w:jc w:val="both"/>
+        <w:rPr>
+          <w:color w:val="auto"/>
+          <w:szCs w:val="20"/>
+        </w:rPr>
+      </w:pPr>
+      <w:r>
+        <w:rPr>
+          <w:color w:val="auto"/>
+          <w:szCs w:val="20"/>
+        </w:rPr>
+        <w:t xml:space="preserve">Enhanced </w:t>
+      </w:r>
+      <w:r>
+        <w:rPr>
+          <w:color w:val="auto"/>
+          <w:szCs w:val="20"/>
+        </w:rPr>
+        <w:t xml:space="preserve">service </w:t>
+      </w:r>
+      <w:r>
+        <w:rPr>
+          <w:color w:val="auto"/>
+          <w:szCs w:val="20"/>
+        </w:rPr>
+        <w:t xml:space="preserve">reliability by fixing </w:t>
+      </w:r>
+      <w:r>
+        <w:rPr>
+          <w:color w:val="auto"/>
+          <w:szCs w:val="20"/>
+        </w:rPr>
+        <w:t>failing</w:t>
+      </w:r>
+      <w:r>
+        <w:rPr>
+          <w:color w:val="auto"/>
+          <w:szCs w:val="20"/>
+        </w:rPr>
+        <w:t xml:space="preserve"> tests, diagnosing </w:t>
+      </w:r>
+      <w:r>
+        <w:rPr>
+          <w:color w:val="auto"/>
+          <w:szCs w:val="20"/>
+        </w:rPr>
+        <w:t>ECS service downtime cause</w:t>
+      </w:r>
+      <w:r>
+        <w:rPr>
+          <w:color w:val="auto"/>
+          <w:szCs w:val="20"/>
+        </w:rPr>
+        <w:t>d</w:t>
+      </w:r>
+      <w:r>
+        <w:rPr>
+          <w:color w:val="auto"/>
+          <w:szCs w:val="20"/>
+        </w:rPr>
+        <w:t xml:space="preserve"> by EFS volume deletion,</w:t>
+      </w:r>
+      <w:r>
+        <w:rPr>
+          <w:color w:val="auto"/>
+          <w:szCs w:val="20"/>
+        </w:rPr>
+        <w:t xml:space="preserve"> and recommending </w:t>
+      </w:r>
+      <w:r>
+        <w:rPr>
+          <w:color w:val="auto"/>
+          <w:szCs w:val="20"/>
+        </w:rPr>
+        <w:t xml:space="preserve">ECS deployment </w:t>
+      </w:r>
+      <w:r>
+        <w:rPr>
+          <w:color w:val="auto"/>
+          <w:szCs w:val="20"/>
+        </w:rPr>
+        <w:t>circuit breaker</w:t>
+      </w:r>
+      <w:r>
+        <w:rPr>
+          <w:color w:val="auto"/>
+          <w:szCs w:val="20"/>
+        </w:rPr>
+        <w:t>s</w:t>
+      </w:r>
+      <w:r>
+        <w:rPr>
+          <w:color w:val="auto"/>
+          <w:szCs w:val="20"/>
+        </w:rPr>
+        <w:t>.</w:t>
+      </w:r>
     </w:p>
     <w:p>
       <w:pPr>
-        <w:tabs>
-          <w:tab w:val="right" w:pos="10490"/>
-        </w:tabs>
-        <w:spacing w:after="0" w:line="240" w:lineRule="auto"/>
-        <w:ind w:right="0"/>
-        <w:rPr>
-          <w:color w:val="auto"/>
-        </w:rPr>
-      </w:pPr>
-    </w:p>
-    <w:p>
-      <w:pPr>
+        <w:pStyle w:val="ListParagraph"/>
         <w:spacing w:line="240" w:lineRule="auto"/>
-        <w:ind w:right="0"/>
-        <w:jc w:val="center"/>
-        <w:rPr>
-          <w:rFonts w:cstheme="minorBidi"/>
-          <w:color w:val="auto"/>
-          <w:sz w:val="22"/>
-          <w:szCs w:val="22"/>
+        <w:ind w:right="0" w:firstLine="0"/>
+        <w:jc w:val="both"/>
+        <w:rPr>
+          <w:color w:val="auto"/>
+          <w:szCs w:val="20"/>
         </w:rPr>
       </w:pPr>
     </w:p>
@@ -5890,42 +6215,42 @@
         <v:path o:extrusionok="f" gradientshapeok="t" o:connecttype="rect"/>
         <o:lock v:ext="edit" aspectratio="t"/>
       </v:shapetype>
-      <v:shape id="_x0000_i1404" type="#_x0000_t75" style="width:513pt;height:513pt;rotation:180;flip:x y;visibility:visible;mso-wrap-style:square" o:bullet="t">
+      <v:shape id="_x0000_i1122" type="#_x0000_t75" style="width:513pt;height:513pt;rotation:180;flip:x y;visibility:visible;mso-wrap-style:square" o:bullet="t">
         <v:imagedata r:id="rId1" o:title="107161_circle_github_icon"/>
       </v:shape>
     </w:pict>
   </w:numPicBullet>
   <w:numPicBullet w:numPicBulletId="1">
     <w:pict>
-      <v:shape id="_x0000_i1405" type="#_x0000_t75" style="width:168.75pt;height:168.75pt;visibility:visible;mso-wrap-style:square" o:bullet="t">
+      <v:shape id="_x0000_i1123" type="#_x0000_t75" style="width:168.75pt;height:168.75pt;visibility:visible;mso-wrap-style:square" o:bullet="t">
         <v:imagedata r:id="rId2" o:title="941C13C7"/>
       </v:shape>
     </w:pict>
   </w:numPicBullet>
   <w:numPicBullet w:numPicBulletId="2">
     <w:pict>
-      <v:shape id="_x0000_i1406" type="#_x0000_t75" style="width:29.25pt;height:16.5pt;visibility:visible;mso-wrap-style:square" o:bullet="t">
+      <v:shape id="_x0000_i1124" type="#_x0000_t75" style="width:29.25pt;height:16.5pt;visibility:visible;mso-wrap-style:square" o:bullet="t">
         <v:imagedata r:id="rId3" o:title="107161_circle_github_icon"/>
       </v:shape>
     </w:pict>
   </w:numPicBullet>
   <w:numPicBullet w:numPicBulletId="3">
     <w:pict>
-      <v:shape id="_x0000_i1407" type="#_x0000_t75" style="width:240pt;height:234pt;visibility:visible;mso-wrap-style:square" o:bullet="t">
+      <v:shape id="_x0000_i1125" type="#_x0000_t75" style="width:240pt;height:234pt;visibility:visible;mso-wrap-style:square" o:bullet="t">
         <v:imagedata r:id="rId4" o:title="Indian_Institute_of_Technology_Bombay_Logo"/>
       </v:shape>
     </w:pict>
   </w:numPicBullet>
   <w:numPicBullet w:numPicBulletId="4">
     <w:pict>
-      <v:shape id="_x0000_i1408" type="#_x0000_t75" style="width:22.5pt;height:16.5pt;visibility:visible;mso-wrap-style:square" o:bullet="t">
+      <v:shape id="_x0000_i1126" type="#_x0000_t75" style="width:22.5pt;height:16.5pt;visibility:visible;mso-wrap-style:square" o:bullet="t">
         <v:imagedata r:id="rId5" o:title="Indian_Institute_of_Technology_Bombay_Logo"/>
       </v:shape>
     </w:pict>
   </w:numPicBullet>
   <w:numPicBullet w:numPicBulletId="5">
     <w:pict>
-      <v:shape id="_x0000_i1409" type="#_x0000_t75" style="width:76.5pt;height:76.5pt;visibility:visible;mso-wrap-style:square" o:bullet="t">
+      <v:shape id="_x0000_i1127" type="#_x0000_t75" style="width:76.5pt;height:76.5pt;visibility:visible;mso-wrap-style:square" o:bullet="t">
         <v:imagedata r:id="rId6" o:title=""/>
       </v:shape>
     </w:pict>
@@ -10959,6 +11284,7 @@
   <w:style w:type="character" w:default="1" w:styleId="DefaultParagraphFont">
     <w:name w:val="Default Paragraph Font"/>
     <w:uiPriority w:val="1"/>
+    <w:semiHidden/>
     <w:unhideWhenUsed/>
   </w:style>
   <w:style w:type="table" w:default="1" w:styleId="TableNormal">

</xml_diff>

<commit_message>
Monior changes & Google Apprentenceship minor changes
</commit_message>
<xml_diff>
--- a/Resume_latest - Copy.docx
+++ b/Resume_latest - Copy.docx
@@ -788,21 +788,6 @@
     </w:p>
     <w:p>
       <w:pPr>
-        <w:pBdr>
-          <w:bottom w:val="single" w:sz="6" w:space="1" w:color="auto"/>
-        </w:pBdr>
-        <w:tabs>
-          <w:tab w:val="right" w:pos="10490"/>
-        </w:tabs>
-        <w:spacing w:line="240" w:lineRule="auto"/>
-        <w:ind w:left="0" w:right="0" w:firstLine="0"/>
-        <w:rPr>
-          <w:color w:val="auto"/>
-        </w:rPr>
-      </w:pPr>
-    </w:p>
-    <w:p>
-      <w:pPr>
         <w:spacing w:line="240" w:lineRule="auto"/>
         <w:ind w:right="0"/>
         <w:jc w:val="center"/>
@@ -1186,39 +1171,68 @@
           <w:color w:val="auto"/>
         </w:rPr>
       </w:pPr>
-      <w:r>
-        <w:rPr>
-          <w:b/>
-          <w:bCs/>
-          <w:color w:val="auto"/>
-        </w:rPr>
-        <w:t>Software Developer</w:t>
-      </w:r>
-      <w:r>
-        <w:rPr>
-          <w:b/>
-          <w:bCs/>
-          <w:color w:val="auto"/>
-        </w:rPr>
-        <w:t xml:space="preserve"> (Full</w:t>
-      </w:r>
-      <w:r>
-        <w:rPr>
-          <w:b/>
-          <w:bCs/>
-          <w:color w:val="auto"/>
-        </w:rPr>
-        <w:t>-S</w:t>
-      </w:r>
-      <w:r>
-        <w:rPr>
-          <w:b/>
-          <w:bCs/>
-          <w:color w:val="auto"/>
-        </w:rPr>
-        <w:t>tack Cloud developer)</w:t>
-      </w:r>
       <w:hyperlink r:id="rId24" w:history="1">
+        <w:r>
+          <w:rPr>
+            <w:rStyle w:val="Hyperlink"/>
+            <w:b/>
+            <w:bCs/>
+            <w:color w:val="auto"/>
+            <w:u w:val="none"/>
+          </w:rPr>
+          <w:t>Software Developer</w:t>
+        </w:r>
+        <w:r>
+          <w:rPr>
+            <w:rStyle w:val="Hyperlink"/>
+            <w:b/>
+            <w:bCs/>
+            <w:color w:val="auto"/>
+            <w:u w:val="none"/>
+          </w:rPr>
+          <w:t xml:space="preserve"> (Full</w:t>
+        </w:r>
+        <w:r>
+          <w:rPr>
+            <w:rStyle w:val="Hyperlink"/>
+            <w:b/>
+            <w:bCs/>
+            <w:color w:val="auto"/>
+            <w:u w:val="none"/>
+          </w:rPr>
+          <w:t>-</w:t>
+        </w:r>
+        <w:r>
+          <w:rPr>
+            <w:rStyle w:val="Hyperlink"/>
+            <w:b/>
+            <w:bCs/>
+            <w:color w:val="auto"/>
+            <w:u w:val="none"/>
+          </w:rPr>
+          <w:t>S</w:t>
+        </w:r>
+        <w:r>
+          <w:rPr>
+            <w:rStyle w:val="Hyperlink"/>
+            <w:b/>
+            <w:bCs/>
+            <w:color w:val="auto"/>
+            <w:u w:val="none"/>
+          </w:rPr>
+          <w:t xml:space="preserve">tack Cloud </w:t>
+        </w:r>
+        <w:proofErr w:type="gramStart"/>
+        <w:r>
+          <w:rPr>
+            <w:rStyle w:val="Hyperlink"/>
+            <w:b/>
+            <w:bCs/>
+            <w:color w:val="auto"/>
+            <w:u w:val="none"/>
+          </w:rPr>
+          <w:t>developer)</w:t>
+        </w:r>
         <w:r>
           <w:rPr>
             <w:rStyle w:val="Hyperlink"/>
@@ -1227,6 +1241,7 @@
           </w:rPr>
           <w:t>|</w:t>
         </w:r>
+        <w:proofErr w:type="gramEnd"/>
         <w:r>
           <w:rPr>
             <w:rStyle w:val="Hyperlink"/>
@@ -1262,6 +1277,15 @@
           </w:rPr>
           <w:t>|</w:t>
         </w:r>
+        <w:r>
+          <w:rPr>
+            <w:rStyle w:val="Hyperlink"/>
+            <w:bCs/>
+            <w:color w:val="auto"/>
+            <w:u w:val="none"/>
+          </w:rPr>
+          <w:t xml:space="preserve"> tutord.io</w:t>
+        </w:r>
       </w:hyperlink>
       <w:r>
         <w:rPr>
@@ -1270,7 +1294,7 @@
           <w:color w:val="auto"/>
           <w:u w:val="none"/>
         </w:rPr>
-        <w:t xml:space="preserve"> tutord.io </w:t>
+        <w:t xml:space="preserve"> </w:t>
       </w:r>
       <w:r>
         <w:rPr>
@@ -1336,12 +1360,11 @@
           <w:color w:val="auto"/>
         </w:rPr>
       </w:pPr>
-      <w:proofErr w:type="gramStart"/>
-      <w:r>
-        <w:rPr>
-          <w:color w:val="auto"/>
-        </w:rPr>
-        <w:t xml:space="preserve">( </w:t>
+      <w:r>
+        <w:rPr>
+          <w:color w:val="auto"/>
+        </w:rPr>
+        <w:t>(</w:t>
       </w:r>
       <w:proofErr w:type="spellStart"/>
       <w:r>
@@ -1351,12 +1374,23 @@
         <w:t>TutorD</w:t>
       </w:r>
       <w:proofErr w:type="spellEnd"/>
-      <w:proofErr w:type="gramEnd"/>
-      <w:r>
-        <w:rPr>
-          <w:color w:val="auto"/>
-        </w:rPr>
-        <w:t xml:space="preserve"> is an Ed-tech platform )</w:t>
+      <w:r>
+        <w:rPr>
+          <w:color w:val="auto"/>
+        </w:rPr>
+        <w:t xml:space="preserve"> is an Ed-tech platform</w:t>
+      </w:r>
+      <w:r>
+        <w:rPr>
+          <w:color w:val="auto"/>
+        </w:rPr>
+        <w:t xml:space="preserve"> for tutors and teachers to enable distant learning</w:t>
+      </w:r>
+      <w:r>
+        <w:rPr>
+          <w:color w:val="auto"/>
+        </w:rPr>
+        <w:t>)</w:t>
       </w:r>
     </w:p>
     <w:p>
@@ -1773,18 +1807,6 @@
         </w:rPr>
         <w:t>.</w:t>
       </w:r>
-    </w:p>
-    <w:p>
-      <w:pPr>
-        <w:pStyle w:val="ListParagraph"/>
-        <w:spacing w:line="240" w:lineRule="auto"/>
-        <w:ind w:right="0" w:firstLine="0"/>
-        <w:jc w:val="both"/>
-        <w:rPr>
-          <w:color w:val="auto"/>
-          <w:szCs w:val="20"/>
-        </w:rPr>
-      </w:pPr>
     </w:p>
     <w:p>
       <w:pPr>
@@ -1922,7 +1944,27 @@
             <w:color w:val="auto"/>
             <w:u w:val="none"/>
           </w:rPr>
-          <w:t>OFY Wellness Android app (Java)</w:t>
+          <w:t xml:space="preserve">OFY Wellness Android </w:t>
+        </w:r>
+        <w:r>
+          <w:rPr>
+            <w:rStyle w:val="Hyperlink"/>
+            <w:b/>
+            <w:bCs/>
+            <w:color w:val="auto"/>
+            <w:u w:val="none"/>
+          </w:rPr>
+          <w:t>A</w:t>
+        </w:r>
+        <w:r>
+          <w:rPr>
+            <w:rStyle w:val="Hyperlink"/>
+            <w:b/>
+            <w:bCs/>
+            <w:color w:val="auto"/>
+            <w:u w:val="none"/>
+          </w:rPr>
+          <w:t>pp (Java)</w:t>
         </w:r>
         <w:r>
           <w:rPr>
@@ -2017,111 +2059,7 @@
           <w:color w:val="auto"/>
           <w:szCs w:val="20"/>
         </w:rPr>
-        <w:t>to</w:t>
-      </w:r>
-      <w:r>
-        <w:rPr>
-          <w:color w:val="auto"/>
-          <w:szCs w:val="20"/>
-        </w:rPr>
-        <w:t xml:space="preserve"> disrupt</w:t>
-      </w:r>
-      <w:r>
-        <w:rPr>
-          <w:color w:val="auto"/>
-          <w:szCs w:val="20"/>
-        </w:rPr>
-        <w:t xml:space="preserve"> </w:t>
-      </w:r>
-      <w:r>
-        <w:rPr>
-          <w:color w:val="auto"/>
-          <w:szCs w:val="20"/>
-        </w:rPr>
-        <w:t>the</w:t>
-      </w:r>
-      <w:r>
-        <w:rPr>
-          <w:color w:val="auto"/>
-          <w:szCs w:val="20"/>
-        </w:rPr>
-        <w:t xml:space="preserve"> </w:t>
-      </w:r>
-      <w:r>
-        <w:rPr>
-          <w:i/>
-          <w:iCs/>
-          <w:color w:val="auto"/>
-          <w:szCs w:val="20"/>
-        </w:rPr>
-        <w:t>multi-</w:t>
-      </w:r>
-      <w:r>
-        <w:rPr>
-          <w:i/>
-          <w:iCs/>
-          <w:color w:val="auto"/>
-          <w:szCs w:val="20"/>
-        </w:rPr>
-        <w:t>billion</w:t>
-      </w:r>
-      <w:r>
-        <w:rPr>
-          <w:i/>
-          <w:iCs/>
-          <w:color w:val="auto"/>
-          <w:szCs w:val="20"/>
-        </w:rPr>
-        <w:t>-dollar</w:t>
-      </w:r>
-      <w:r>
-        <w:rPr>
-          <w:color w:val="auto"/>
-          <w:szCs w:val="20"/>
-        </w:rPr>
-        <w:t xml:space="preserve"> </w:t>
-      </w:r>
-      <w:r>
-        <w:rPr>
-          <w:color w:val="auto"/>
-          <w:szCs w:val="20"/>
-        </w:rPr>
-        <w:t>h</w:t>
-      </w:r>
-      <w:r>
-        <w:rPr>
-          <w:color w:val="auto"/>
-          <w:szCs w:val="20"/>
-        </w:rPr>
-        <w:t>ealth</w:t>
-      </w:r>
-      <w:r>
-        <w:rPr>
-          <w:color w:val="auto"/>
-          <w:szCs w:val="20"/>
-        </w:rPr>
-        <w:t xml:space="preserve"> </w:t>
-      </w:r>
-      <w:r>
-        <w:rPr>
-          <w:color w:val="auto"/>
-          <w:szCs w:val="20"/>
-        </w:rPr>
-        <w:t>tech</w:t>
-      </w:r>
-      <w:r>
-        <w:rPr>
-          <w:color w:val="auto"/>
-          <w:szCs w:val="20"/>
-        </w:rPr>
-        <w:t xml:space="preserve"> </w:t>
-      </w:r>
-      <w:r>
-        <w:rPr>
-          <w:color w:val="auto"/>
-          <w:szCs w:val="20"/>
-        </w:rPr>
-        <w:t>industry.</w:t>
+        <w:t>for health tracking and diet intake progress logging.</w:t>
       </w:r>
     </w:p>
     <w:p>
@@ -2358,227 +2296,77 @@
         <w:ind w:right="0"/>
         <w:jc w:val="both"/>
         <w:rPr>
+          <w:color w:val="auto"/>
+        </w:rPr>
+      </w:pPr>
+      <w:r>
+        <w:rPr>
+          <w:color w:val="auto"/>
+          <w:szCs w:val="20"/>
+        </w:rPr>
+        <w:t xml:space="preserve">Implemented meal image and nutrient detection via the </w:t>
+      </w:r>
+      <w:r>
+        <w:rPr>
           <w:b/>
           <w:bCs/>
           <w:color w:val="auto"/>
           <w:szCs w:val="20"/>
         </w:rPr>
-      </w:pPr>
-      <w:r>
-        <w:rPr>
-          <w:color w:val="auto"/>
-          <w:szCs w:val="20"/>
-        </w:rPr>
-        <w:t xml:space="preserve">Implemented meal image and nutrient detection via the </w:t>
-      </w:r>
-      <w:r>
-        <w:rPr>
-          <w:b/>
-          <w:bCs/>
-          <w:color w:val="auto"/>
-          <w:szCs w:val="20"/>
-        </w:rPr>
-        <w:t xml:space="preserve">Gemini Pro Vision (AI) </w:t>
-      </w:r>
-      <w:r>
-        <w:rPr>
-          <w:color w:val="auto"/>
-          <w:szCs w:val="20"/>
-        </w:rPr>
-        <w:t>model and i</w:t>
-      </w:r>
-      <w:r>
-        <w:rPr>
-          <w:color w:val="auto"/>
-        </w:rPr>
-        <w:t xml:space="preserve">mproved detection by </w:t>
-      </w:r>
-      <w:r>
-        <w:rPr>
-          <w:b/>
-          <w:bCs/>
-          <w:color w:val="auto"/>
-        </w:rPr>
-        <w:t>over 50%</w:t>
-      </w:r>
-      <w:r>
-        <w:rPr>
-          <w:b/>
-          <w:bCs/>
-          <w:color w:val="auto"/>
+        <w:t>Gemini Pro Vision</w:t>
+      </w:r>
+      <w:r>
+        <w:rPr>
+          <w:color w:val="auto"/>
+          <w:szCs w:val="20"/>
         </w:rPr>
         <w:t xml:space="preserve"> </w:t>
       </w:r>
       <w:r>
         <w:rPr>
           <w:color w:val="auto"/>
-        </w:rPr>
-        <w:t xml:space="preserve">by </w:t>
-      </w:r>
-      <w:r>
-        <w:rPr>
-          <w:color w:val="auto"/>
-        </w:rPr>
-        <w:t xml:space="preserve">updating the prompts to </w:t>
-      </w:r>
-      <w:r>
-        <w:rPr>
-          <w:color w:val="auto"/>
+          <w:szCs w:val="20"/>
+        </w:rPr>
+        <w:t xml:space="preserve">API </w:t>
+      </w:r>
+      <w:r>
+        <w:rPr>
+          <w:color w:val="auto"/>
+          <w:szCs w:val="20"/>
+        </w:rPr>
+        <w:t>and</w:t>
+      </w:r>
+      <w:r>
+        <w:rPr>
+          <w:color w:val="auto"/>
+          <w:szCs w:val="20"/>
+        </w:rPr>
+        <w:t xml:space="preserve"> optimize</w:t>
+      </w:r>
+      <w:r>
+        <w:rPr>
+          <w:color w:val="auto"/>
+          <w:szCs w:val="20"/>
+        </w:rPr>
+        <w:t>d</w:t>
+      </w:r>
+      <w:r>
+        <w:rPr>
+          <w:color w:val="auto"/>
+          <w:szCs w:val="20"/>
+        </w:rPr>
+        <w:t xml:space="preserve"> </w:t>
+      </w:r>
+      <w:r>
+        <w:rPr>
+          <w:color w:val="auto"/>
+          <w:szCs w:val="20"/>
         </w:rPr>
         <w:t>the model</w:t>
       </w:r>
       <w:r>
         <w:rPr>
           <w:color w:val="auto"/>
-        </w:rPr>
-        <w:t>.</w:t>
-      </w:r>
-      <w:r>
-        <w:rPr>
-          <w:color w:val="auto"/>
-        </w:rPr>
-        <w:t xml:space="preserve">  </w:t>
-      </w:r>
-    </w:p>
-    <w:p>
-      <w:pPr>
-        <w:tabs>
-          <w:tab w:val="center" w:pos="5449"/>
-        </w:tabs>
-        <w:spacing w:line="240" w:lineRule="auto"/>
-        <w:ind w:right="0" w:firstLine="350"/>
-        <w:jc w:val="both"/>
-        <w:rPr>
-          <w:color w:val="auto"/>
-        </w:rPr>
-      </w:pPr>
-      <w:hyperlink r:id="rId27" w:history="1">
-        <w:r>
-          <w:rPr>
-            <w:rStyle w:val="Hyperlink"/>
-            <w:b/>
-            <w:bCs/>
-            <w:color w:val="auto"/>
-            <w:u w:val="none"/>
-          </w:rPr>
-          <w:t xml:space="preserve">A Spring Boot </w:t>
-        </w:r>
-        <w:r>
-          <w:rPr>
-            <w:rStyle w:val="Hyperlink"/>
-            <w:b/>
-            <w:bCs/>
-            <w:color w:val="auto"/>
-            <w:u w:val="none"/>
-          </w:rPr>
-          <w:t>Currency</w:t>
-        </w:r>
-        <w:r>
-          <w:rPr>
-            <w:rStyle w:val="Hyperlink"/>
-            <w:b/>
-            <w:bCs/>
-            <w:color w:val="auto"/>
-            <w:u w:val="none"/>
-          </w:rPr>
-          <w:t xml:space="preserve"> </w:t>
-        </w:r>
-        <w:r>
-          <w:rPr>
-            <w:rStyle w:val="Hyperlink"/>
-            <w:b/>
-            <w:bCs/>
-            <w:color w:val="auto"/>
-            <w:u w:val="none"/>
-          </w:rPr>
-          <w:t>C</w:t>
-        </w:r>
-        <w:r>
-          <w:rPr>
-            <w:rStyle w:val="Hyperlink"/>
-            <w:b/>
-            <w:bCs/>
-            <w:color w:val="auto"/>
-            <w:u w:val="none"/>
-          </w:rPr>
-          <w:t>onverter (Java)</w:t>
-        </w:r>
-        <w:r>
-          <w:rPr>
-            <w:rStyle w:val="Hyperlink"/>
-            <w:color w:val="auto"/>
-            <w:u w:val="none"/>
-          </w:rPr>
-          <w:t xml:space="preserve"> [</w:t>
-        </w:r>
-        <w:r>
-          <w:rPr>
-            <w:rStyle w:val="Hyperlink"/>
-            <w:i/>
-            <w:iCs/>
-            <w:color w:val="auto"/>
-          </w:rPr>
-          <w:t>link</w:t>
-        </w:r>
-        <w:r>
-          <w:rPr>
-            <w:rStyle w:val="Hyperlink"/>
-            <w:color w:val="auto"/>
-            <w:u w:val="none"/>
-          </w:rPr>
-          <w:t>]</w:t>
-        </w:r>
-      </w:hyperlink>
-      <w:r>
-        <w:rPr>
-          <w:rStyle w:val="Hyperlink"/>
-          <w:color w:val="auto"/>
-          <w:u w:val="none"/>
-        </w:rPr>
-        <w:tab/>
-      </w:r>
-    </w:p>
-    <w:p>
-      <w:pPr>
-        <w:pStyle w:val="ListParagraph"/>
-        <w:numPr>
-          <w:ilvl w:val="0"/>
-          <w:numId w:val="32"/>
-        </w:numPr>
-        <w:spacing w:line="240" w:lineRule="auto"/>
-        <w:ind w:right="0"/>
-        <w:jc w:val="both"/>
-        <w:rPr>
-          <w:color w:val="auto"/>
-          <w:szCs w:val="20"/>
-        </w:rPr>
-      </w:pPr>
-      <w:r>
-        <w:rPr>
-          <w:color w:val="auto"/>
-          <w:szCs w:val="20"/>
-        </w:rPr>
-        <w:t xml:space="preserve">Built </w:t>
-      </w:r>
-      <w:r>
-        <w:rPr>
-          <w:color w:val="auto"/>
-          <w:szCs w:val="20"/>
-        </w:rPr>
-        <w:t xml:space="preserve">a </w:t>
-      </w:r>
-      <w:r>
-        <w:rPr>
-          <w:i/>
-          <w:iCs/>
-          <w:color w:val="auto"/>
-          <w:szCs w:val="20"/>
-        </w:rPr>
-        <w:t>Spring Boot</w:t>
-      </w:r>
-      <w:r>
-        <w:rPr>
-          <w:color w:val="auto"/>
           <w:szCs w:val="20"/>
         </w:rPr>
         <w:t xml:space="preserve"> </w:t>
@@ -2588,221 +2376,35 @@
           <w:color w:val="auto"/>
           <w:szCs w:val="20"/>
         </w:rPr>
-        <w:t xml:space="preserve">currency </w:t>
-      </w:r>
-      <w:r>
-        <w:rPr>
-          <w:color w:val="auto"/>
-          <w:szCs w:val="20"/>
-        </w:rPr>
-        <w:t>converter and scaled</w:t>
-      </w:r>
-      <w:r>
-        <w:rPr>
-          <w:color w:val="auto"/>
-          <w:szCs w:val="20"/>
+        <w:t xml:space="preserve">prompts to </w:t>
+      </w:r>
+      <w:r>
+        <w:rPr>
+          <w:color w:val="auto"/>
+          <w:szCs w:val="20"/>
+        </w:rPr>
+        <w:t>obtain</w:t>
+      </w:r>
+      <w:r>
+        <w:rPr>
+          <w:color w:val="auto"/>
+          <w:szCs w:val="20"/>
+        </w:rPr>
+        <w:t xml:space="preserve"> a</w:t>
+      </w:r>
+      <w:r>
+        <w:rPr>
+          <w:color w:val="auto"/>
+          <w:szCs w:val="20"/>
+        </w:rPr>
+        <w:t xml:space="preserve"> consistent output format for reliable parsing.</w:t>
+      </w:r>
+      <w:r>
+        <w:rPr>
+          <w:color w:val="auto"/>
         </w:rPr>
         <w:t xml:space="preserve"> </w:t>
       </w:r>
-      <w:r>
-        <w:rPr>
-          <w:color w:val="auto"/>
-          <w:szCs w:val="20"/>
-        </w:rPr>
-        <w:t xml:space="preserve">the </w:t>
-      </w:r>
-      <w:r>
-        <w:rPr>
-          <w:color w:val="auto"/>
-          <w:szCs w:val="20"/>
-        </w:rPr>
-        <w:t xml:space="preserve">currency </w:t>
-      </w:r>
-      <w:r>
-        <w:rPr>
-          <w:color w:val="auto"/>
-          <w:szCs w:val="20"/>
-        </w:rPr>
-        <w:t>conversion feature</w:t>
-      </w:r>
-      <w:r>
-        <w:rPr>
-          <w:color w:val="auto"/>
-          <w:szCs w:val="20"/>
-        </w:rPr>
-        <w:t xml:space="preserve"> to </w:t>
-      </w:r>
-      <w:r>
-        <w:rPr>
-          <w:b/>
-          <w:bCs/>
-          <w:color w:val="auto"/>
-          <w:szCs w:val="20"/>
-        </w:rPr>
-        <w:t>10+</w:t>
-      </w:r>
-      <w:r>
-        <w:rPr>
-          <w:color w:val="auto"/>
-          <w:szCs w:val="20"/>
-        </w:rPr>
-        <w:t xml:space="preserve"> currency pairs</w:t>
-      </w:r>
-      <w:r>
-        <w:rPr>
-          <w:color w:val="auto"/>
-          <w:szCs w:val="20"/>
-        </w:rPr>
-        <w:t>.</w:t>
-      </w:r>
-    </w:p>
-    <w:p>
-      <w:pPr>
-        <w:pStyle w:val="ListParagraph"/>
-        <w:numPr>
-          <w:ilvl w:val="0"/>
-          <w:numId w:val="32"/>
-        </w:numPr>
-        <w:spacing w:line="240" w:lineRule="auto"/>
-        <w:ind w:right="0"/>
-        <w:jc w:val="both"/>
-        <w:rPr>
-          <w:color w:val="auto"/>
-          <w:szCs w:val="20"/>
-        </w:rPr>
-      </w:pPr>
-      <w:proofErr w:type="spellStart"/>
-      <w:r>
-        <w:rPr>
-          <w:color w:val="auto"/>
-          <w:szCs w:val="20"/>
-        </w:rPr>
-        <w:t>Dockerized</w:t>
-      </w:r>
-      <w:proofErr w:type="spellEnd"/>
-      <w:r>
-        <w:rPr>
-          <w:color w:val="auto"/>
-          <w:szCs w:val="20"/>
-        </w:rPr>
-        <w:t xml:space="preserve"> </w:t>
-      </w:r>
-      <w:r>
-        <w:rPr>
-          <w:color w:val="auto"/>
-          <w:szCs w:val="20"/>
-        </w:rPr>
-        <w:t xml:space="preserve">the Spring Boot application and increased its availability by more than </w:t>
-      </w:r>
-      <w:r>
-        <w:rPr>
-          <w:b/>
-          <w:bCs/>
-          <w:color w:val="auto"/>
-          <w:szCs w:val="20"/>
-        </w:rPr>
-        <w:t>10%</w:t>
-      </w:r>
-      <w:r>
-        <w:rPr>
-          <w:color w:val="auto"/>
-          <w:szCs w:val="20"/>
-        </w:rPr>
-        <w:t xml:space="preserve"> by deploying it</w:t>
-      </w:r>
-      <w:r>
-        <w:rPr>
-          <w:color w:val="auto"/>
-          <w:szCs w:val="20"/>
-        </w:rPr>
-        <w:t xml:space="preserve"> to</w:t>
-      </w:r>
-      <w:r>
-        <w:rPr>
-          <w:color w:val="auto"/>
-          <w:szCs w:val="20"/>
-        </w:rPr>
-        <w:t xml:space="preserve"> </w:t>
-      </w:r>
-      <w:r>
-        <w:rPr>
-          <w:color w:val="auto"/>
-          <w:szCs w:val="20"/>
-        </w:rPr>
-        <w:t xml:space="preserve">an </w:t>
-      </w:r>
-      <w:r>
-        <w:rPr>
-          <w:i/>
-          <w:iCs/>
-          <w:color w:val="auto"/>
-          <w:szCs w:val="20"/>
-        </w:rPr>
-        <w:t>AWS EC2</w:t>
-      </w:r>
-      <w:r>
-        <w:rPr>
-          <w:color w:val="auto"/>
-          <w:szCs w:val="20"/>
-        </w:rPr>
-        <w:t xml:space="preserve"> instance and</w:t>
-      </w:r>
-      <w:r>
-        <w:rPr>
-          <w:color w:val="auto"/>
-          <w:szCs w:val="20"/>
-        </w:rPr>
-        <w:t xml:space="preserve"> multiple </w:t>
-      </w:r>
-      <w:r>
-        <w:rPr>
-          <w:i/>
-          <w:iCs/>
-          <w:color w:val="auto"/>
-          <w:szCs w:val="20"/>
-        </w:rPr>
-        <w:t>Docker</w:t>
-      </w:r>
-      <w:r>
-        <w:rPr>
-          <w:b/>
-          <w:bCs/>
-          <w:color w:val="auto"/>
-          <w:szCs w:val="20"/>
-        </w:rPr>
-        <w:t xml:space="preserve"> </w:t>
-      </w:r>
-      <w:r>
-        <w:rPr>
-          <w:color w:val="auto"/>
-          <w:szCs w:val="20"/>
-        </w:rPr>
-        <w:t>container</w:t>
-      </w:r>
-      <w:r>
-        <w:rPr>
-          <w:color w:val="auto"/>
-          <w:szCs w:val="20"/>
-        </w:rPr>
-        <w:t>s</w:t>
-      </w:r>
-      <w:r>
-        <w:rPr>
-          <w:color w:val="auto"/>
-          <w:szCs w:val="20"/>
-        </w:rPr>
-        <w:t>.</w:t>
-      </w:r>
-    </w:p>
-    <w:p>
-      <w:pPr>
-        <w:spacing w:line="240" w:lineRule="auto"/>
-        <w:ind w:right="0"/>
-        <w:jc w:val="both"/>
-        <w:rPr>
-          <w:color w:val="auto"/>
-        </w:rPr>
-      </w:pPr>
     </w:p>
     <w:p>
       <w:pPr>
@@ -2839,7 +2441,7 @@
         </w:rPr>
         <w:t xml:space="preserve"> | </w:t>
       </w:r>
-      <w:hyperlink r:id="rId28" w:history="1">
+      <w:hyperlink r:id="rId27" w:history="1">
         <w:proofErr w:type="spellStart"/>
         <w:r>
           <w:rPr>
@@ -3020,6 +2622,34 @@
           <w:color w:val="auto"/>
           <w:szCs w:val="20"/>
         </w:rPr>
+        <w:t>the fron</w:t>
+      </w:r>
+      <w:r>
+        <w:rPr>
+          <w:color w:val="auto"/>
+          <w:szCs w:val="20"/>
+        </w:rPr>
+        <w:t>t</w:t>
+      </w:r>
+      <w:r>
+        <w:rPr>
+          <w:color w:val="auto"/>
+          <w:szCs w:val="20"/>
+        </w:rPr>
+        <w:t>-</w:t>
+      </w:r>
+      <w:r>
+        <w:rPr>
+          <w:color w:val="auto"/>
+          <w:szCs w:val="20"/>
+        </w:rPr>
+        <w:t xml:space="preserve">end of </w:t>
+      </w:r>
+      <w:r>
+        <w:rPr>
+          <w:color w:val="auto"/>
+          <w:szCs w:val="20"/>
+        </w:rPr>
         <w:t>a</w:t>
       </w:r>
       <w:r>
@@ -3034,6 +2664,22 @@
           <w:color w:val="auto"/>
           <w:szCs w:val="20"/>
         </w:rPr>
+        <w:t xml:space="preserve"> </w:t>
+      </w:r>
+      <w:proofErr w:type="spellStart"/>
+      <w:r>
+        <w:rPr>
+          <w:color w:val="auto"/>
+          <w:szCs w:val="20"/>
+        </w:rPr>
+        <w:t>Hazirs</w:t>
+      </w:r>
+      <w:proofErr w:type="spellEnd"/>
+      <w:r>
+        <w:rPr>
+          <w:color w:val="auto"/>
+          <w:szCs w:val="20"/>
+        </w:rPr>
         <w:t>,</w:t>
       </w:r>
       <w:r>
@@ -3043,21 +2689,21 @@
         </w:rPr>
         <w:t xml:space="preserve"> </w:t>
       </w:r>
-      <w:proofErr w:type="spellStart"/>
-      <w:r>
-        <w:rPr>
-          <w:color w:val="auto"/>
-          <w:szCs w:val="20"/>
-        </w:rPr>
-        <w:t>Hazirs</w:t>
-      </w:r>
-      <w:proofErr w:type="spellEnd"/>
-      <w:r>
-        <w:rPr>
-          <w:color w:val="auto"/>
-          <w:szCs w:val="20"/>
-        </w:rPr>
-        <w:t>,</w:t>
+      <w:r>
+        <w:rPr>
+          <w:color w:val="auto"/>
+          <w:szCs w:val="20"/>
+        </w:rPr>
+        <w:t xml:space="preserve">in </w:t>
+      </w:r>
+      <w:r>
+        <w:rPr>
+          <w:b/>
+          <w:bCs/>
+          <w:color w:val="auto"/>
+          <w:szCs w:val="20"/>
+        </w:rPr>
+        <w:t>Java</w:t>
       </w:r>
       <w:r>
         <w:rPr>
@@ -3071,118 +2717,7 @@
           <w:color w:val="auto"/>
           <w:szCs w:val="20"/>
         </w:rPr>
-        <w:t xml:space="preserve">in </w:t>
-      </w:r>
-      <w:r>
-        <w:rPr>
-          <w:b/>
-          <w:bCs/>
-          <w:color w:val="auto"/>
-          <w:szCs w:val="20"/>
-        </w:rPr>
-        <w:t>Java</w:t>
-      </w:r>
-      <w:r>
-        <w:rPr>
-          <w:color w:val="auto"/>
-          <w:szCs w:val="20"/>
-        </w:rPr>
-        <w:t xml:space="preserve"> </w:t>
-      </w:r>
-      <w:r>
-        <w:rPr>
-          <w:color w:val="auto"/>
-          <w:szCs w:val="20"/>
-        </w:rPr>
-        <w:t>to digi</w:t>
-      </w:r>
-      <w:r>
-        <w:rPr>
-          <w:color w:val="auto"/>
-          <w:szCs w:val="20"/>
-        </w:rPr>
-        <w:t>t</w:t>
-      </w:r>
-      <w:r>
-        <w:rPr>
-          <w:color w:val="auto"/>
-          <w:szCs w:val="20"/>
-        </w:rPr>
-        <w:t>i</w:t>
-      </w:r>
-      <w:r>
-        <w:rPr>
-          <w:color w:val="auto"/>
-          <w:szCs w:val="20"/>
-        </w:rPr>
-        <w:t>z</w:t>
-      </w:r>
-      <w:r>
-        <w:rPr>
-          <w:color w:val="auto"/>
-          <w:szCs w:val="20"/>
-        </w:rPr>
-        <w:t xml:space="preserve">e the </w:t>
-      </w:r>
-      <w:r>
-        <w:rPr>
-          <w:color w:val="auto"/>
-          <w:szCs w:val="20"/>
-        </w:rPr>
-        <w:t xml:space="preserve">&gt; </w:t>
-      </w:r>
-      <w:r>
-        <w:rPr>
-          <w:color w:val="auto"/>
-          <w:szCs w:val="20"/>
-        </w:rPr>
-        <w:t>$</w:t>
-      </w:r>
-      <w:r>
-        <w:rPr>
-          <w:color w:val="auto"/>
-          <w:szCs w:val="20"/>
-        </w:rPr>
-        <w:t>60</w:t>
-      </w:r>
-      <w:r>
-        <w:rPr>
-          <w:b/>
-          <w:bCs/>
-          <w:color w:val="auto"/>
-          <w:szCs w:val="20"/>
-        </w:rPr>
-        <w:t xml:space="preserve"> </w:t>
-      </w:r>
-      <w:r>
-        <w:rPr>
-          <w:i/>
-          <w:iCs/>
-          <w:color w:val="auto"/>
-          <w:szCs w:val="20"/>
-        </w:rPr>
-        <w:t>billion</w:t>
-      </w:r>
-      <w:r>
-        <w:rPr>
-          <w:color w:val="auto"/>
-          <w:szCs w:val="20"/>
-        </w:rPr>
-        <w:t xml:space="preserve"> </w:t>
-      </w:r>
-      <w:r>
-        <w:rPr>
-          <w:color w:val="auto"/>
-          <w:szCs w:val="20"/>
-        </w:rPr>
-        <w:t>c</w:t>
-      </w:r>
-      <w:r>
-        <w:rPr>
-          <w:color w:val="auto"/>
-          <w:szCs w:val="20"/>
-        </w:rPr>
-        <w:t xml:space="preserve">leaning and </w:t>
+        <w:t xml:space="preserve">for </w:t>
       </w:r>
       <w:r>
         <w:rPr>
@@ -3196,7 +2731,14 @@
           <w:color w:val="auto"/>
           <w:szCs w:val="20"/>
         </w:rPr>
-        <w:t>ouse help industry</w:t>
+        <w:t>ouse help</w:t>
+      </w:r>
+      <w:r>
+        <w:rPr>
+          <w:color w:val="auto"/>
+          <w:szCs w:val="20"/>
+        </w:rPr>
+        <w:t xml:space="preserve"> service booking</w:t>
       </w:r>
       <w:r>
         <w:rPr>
@@ -3224,144 +2766,38 @@
       </w:pPr>
       <w:r>
         <w:rPr>
-          <w:rFonts w:cstheme="minorBidi"/>
-          <w:color w:val="auto"/>
-          <w:szCs w:val="20"/>
-        </w:rPr>
-        <w:t>R</w:t>
-      </w:r>
-      <w:r>
-        <w:rPr>
-          <w:rFonts w:cstheme="minorBidi"/>
-          <w:color w:val="auto"/>
-          <w:szCs w:val="20"/>
-        </w:rPr>
-        <w:t>educed</w:t>
-      </w:r>
-      <w:r>
-        <w:rPr>
-          <w:rFonts w:cstheme="minorBidi"/>
-          <w:color w:val="auto"/>
-          <w:szCs w:val="20"/>
-        </w:rPr>
-        <w:t xml:space="preserve"> </w:t>
-      </w:r>
-      <w:r>
-        <w:rPr>
-          <w:rFonts w:cstheme="minorBidi"/>
-          <w:color w:val="auto"/>
-          <w:szCs w:val="20"/>
-        </w:rPr>
-        <w:t xml:space="preserve">the </w:t>
-      </w:r>
-      <w:r>
-        <w:rPr>
-          <w:rFonts w:cstheme="minorBidi"/>
-          <w:color w:val="auto"/>
-          <w:szCs w:val="20"/>
-        </w:rPr>
-        <w:t>number of clicks required before reaching</w:t>
-      </w:r>
-      <w:r>
-        <w:rPr>
-          <w:rFonts w:cstheme="minorBidi"/>
-          <w:color w:val="auto"/>
-          <w:szCs w:val="20"/>
-        </w:rPr>
-        <w:t xml:space="preserve"> </w:t>
-      </w:r>
-      <w:r>
-        <w:rPr>
-          <w:rFonts w:cstheme="minorBidi"/>
-          <w:color w:val="auto"/>
-          <w:szCs w:val="20"/>
-        </w:rPr>
-        <w:t xml:space="preserve">the </w:t>
-      </w:r>
-      <w:r>
-        <w:rPr>
-          <w:rFonts w:cstheme="minorBidi"/>
-          <w:color w:val="auto"/>
-          <w:szCs w:val="20"/>
-        </w:rPr>
-        <w:t>home page</w:t>
-      </w:r>
-      <w:r>
-        <w:rPr>
-          <w:rFonts w:cstheme="minorBidi"/>
-          <w:color w:val="auto"/>
-          <w:szCs w:val="20"/>
-        </w:rPr>
-        <w:t xml:space="preserve"> </w:t>
-      </w:r>
-      <w:r>
-        <w:rPr>
-          <w:rFonts w:cstheme="minorBidi"/>
-          <w:color w:val="auto"/>
-          <w:szCs w:val="20"/>
-        </w:rPr>
-        <w:t>by</w:t>
-      </w:r>
-      <w:r>
-        <w:rPr>
-          <w:rFonts w:cstheme="minorBidi"/>
-          <w:color w:val="auto"/>
-          <w:szCs w:val="20"/>
-        </w:rPr>
-        <w:t xml:space="preserve"> </w:t>
-      </w:r>
-      <w:r>
-        <w:rPr>
-          <w:rFonts w:cstheme="minorBidi"/>
-          <w:color w:val="auto"/>
-          <w:szCs w:val="20"/>
-        </w:rPr>
-        <w:t>~</w:t>
-      </w:r>
-      <w:r>
-        <w:rPr>
-          <w:rFonts w:cstheme="minorBidi"/>
-          <w:b/>
-          <w:bCs/>
-          <w:color w:val="auto"/>
-          <w:szCs w:val="20"/>
-        </w:rPr>
-        <w:t>33%</w:t>
-      </w:r>
-      <w:r>
-        <w:rPr>
-          <w:rFonts w:cstheme="minorBidi"/>
-          <w:b/>
-          <w:bCs/>
-          <w:color w:val="auto"/>
-          <w:szCs w:val="20"/>
-        </w:rPr>
-        <w:t xml:space="preserve"> </w:t>
-      </w:r>
-      <w:r>
-        <w:rPr>
-          <w:rFonts w:cstheme="minorBidi"/>
-          <w:color w:val="auto"/>
-          <w:szCs w:val="20"/>
-        </w:rPr>
-        <w:t>using</w:t>
-      </w:r>
-      <w:r>
-        <w:rPr>
-          <w:rFonts w:cstheme="minorBidi"/>
-          <w:b/>
-          <w:bCs/>
-          <w:color w:val="auto"/>
-          <w:szCs w:val="20"/>
-        </w:rPr>
-        <w:t xml:space="preserve"> </w:t>
-      </w:r>
-      <w:r>
-        <w:rPr>
-          <w:color w:val="auto"/>
-          <w:szCs w:val="20"/>
-        </w:rPr>
-        <w:t xml:space="preserve">the </w:t>
+          <w:color w:val="auto"/>
+          <w:szCs w:val="20"/>
+        </w:rPr>
+        <w:t xml:space="preserve">Integrated </w:t>
+      </w:r>
+      <w:r>
+        <w:rPr>
+          <w:color w:val="auto"/>
+          <w:szCs w:val="20"/>
+        </w:rPr>
+        <w:t>one</w:t>
+      </w:r>
+      <w:r>
+        <w:rPr>
+          <w:color w:val="auto"/>
+          <w:szCs w:val="20"/>
+        </w:rPr>
+        <w:t>-</w:t>
+      </w:r>
+      <w:r>
+        <w:rPr>
+          <w:color w:val="auto"/>
+          <w:szCs w:val="20"/>
+        </w:rPr>
+        <w:t xml:space="preserve">tap authentication </w:t>
+      </w:r>
+      <w:r>
+        <w:rPr>
+          <w:color w:val="auto"/>
+          <w:szCs w:val="20"/>
+        </w:rPr>
+        <w:t xml:space="preserve">using </w:t>
       </w:r>
       <w:r>
         <w:rPr>
@@ -3370,7 +2806,53 @@
           <w:color w:val="auto"/>
           <w:szCs w:val="20"/>
         </w:rPr>
-        <w:t>Google Sign-In API.</w:t>
+        <w:t>Google Sign-In API</w:t>
+      </w:r>
+      <w:r>
+        <w:rPr>
+          <w:i/>
+          <w:iCs/>
+          <w:color w:val="auto"/>
+          <w:szCs w:val="20"/>
+        </w:rPr>
+        <w:t xml:space="preserve"> </w:t>
+      </w:r>
+      <w:r>
+        <w:rPr>
+          <w:color w:val="auto"/>
+          <w:szCs w:val="20"/>
+        </w:rPr>
+        <w:t>streamlining</w:t>
+      </w:r>
+      <w:r>
+        <w:rPr>
+          <w:color w:val="auto"/>
+          <w:szCs w:val="20"/>
+        </w:rPr>
+        <w:t xml:space="preserve"> the</w:t>
+      </w:r>
+      <w:r>
+        <w:rPr>
+          <w:i/>
+          <w:iCs/>
+          <w:color w:val="auto"/>
+          <w:szCs w:val="20"/>
+        </w:rPr>
+        <w:t xml:space="preserve"> </w:t>
+      </w:r>
+      <w:r>
+        <w:rPr>
+          <w:color w:val="auto"/>
+          <w:szCs w:val="20"/>
+        </w:rPr>
+        <w:t>user login experience</w:t>
+      </w:r>
+      <w:r>
+        <w:rPr>
+          <w:color w:val="auto"/>
+          <w:szCs w:val="20"/>
+        </w:rPr>
+        <w:t>.</w:t>
       </w:r>
     </w:p>
     <w:p>
@@ -3425,7 +2907,7 @@
           <w:color w:val="auto"/>
         </w:rPr>
       </w:pPr>
-      <w:hyperlink r:id="rId29" w:history="1">
+      <w:hyperlink r:id="rId28" w:history="1">
         <w:r>
           <w:rPr>
             <w:rStyle w:val="Hyperlink"/>
@@ -3597,13 +3079,13 @@
         <w:rPr>
           <w:color w:val="auto"/>
         </w:rPr>
-        <w:t xml:space="preserve">increase </w:t>
-      </w:r>
-      <w:r>
-        <w:rPr>
-          <w:color w:val="auto"/>
-        </w:rPr>
-        <w:t>earnings</w:t>
+        <w:t>ease l</w:t>
+      </w:r>
+      <w:r>
+        <w:rPr>
+          <w:color w:val="auto"/>
+        </w:rPr>
+        <w:t>earning</w:t>
       </w:r>
       <w:r>
         <w:rPr>
@@ -3815,7 +3297,7 @@
           <w:color w:val="auto"/>
         </w:rPr>
       </w:pPr>
-      <w:hyperlink r:id="rId30" w:history="1">
+      <w:hyperlink r:id="rId29" w:history="1">
         <w:r>
           <w:rPr>
             <w:rStyle w:val="Hyperlink"/>
@@ -4118,7 +3600,7 @@
           <w:color w:val="auto"/>
         </w:rPr>
       </w:pPr>
-      <w:hyperlink r:id="rId31" w:history="1">
+      <w:hyperlink r:id="rId30" w:history="1">
         <w:r>
           <w:rPr>
             <w:rStyle w:val="Hyperlink"/>
@@ -4220,7 +3702,37 @@
         <w:rPr>
           <w:color w:val="auto"/>
         </w:rPr>
-        <w:t xml:space="preserve">Attempted to build an internet-controlled autonomous drone and </w:t>
+        <w:t>B</w:t>
+      </w:r>
+      <w:r>
+        <w:rPr>
+          <w:color w:val="auto"/>
+        </w:rPr>
+        <w:t>uil</w:t>
+      </w:r>
+      <w:r>
+        <w:rPr>
+          <w:color w:val="auto"/>
+        </w:rPr>
+        <w:t>t</w:t>
+      </w:r>
+      <w:r>
+        <w:rPr>
+          <w:color w:val="auto"/>
+        </w:rPr>
+        <w:t xml:space="preserve"> a</w:t>
+      </w:r>
+      <w:r>
+        <w:rPr>
+          <w:color w:val="auto"/>
+        </w:rPr>
+        <w:t>n</w:t>
+      </w:r>
+      <w:r>
+        <w:rPr>
+          <w:color w:val="auto"/>
+        </w:rPr>
+        <w:t xml:space="preserve"> internet-controlled drone and </w:t>
       </w:r>
       <w:r>
         <w:rPr>
@@ -4634,7 +4146,7 @@
           <w:szCs w:val="18"/>
         </w:rPr>
       </w:pPr>
-      <w:hyperlink r:id="rId32" w:history="1">
+      <w:hyperlink r:id="rId31" w:history="1">
         <w:proofErr w:type="spellStart"/>
         <w:r>
           <w:rPr>
@@ -5074,13 +4586,13 @@
         <w:rPr>
           <w:color w:val="auto"/>
         </w:rPr>
-        <w:t xml:space="preserve"> with</w:t>
-      </w:r>
-      <w:r>
-        <w:rPr>
-          <w:color w:val="auto"/>
-        </w:rPr>
         <w:t xml:space="preserve"> </w:t>
+      </w:r>
+      <w:r>
+        <w:rPr>
+          <w:color w:val="auto"/>
+        </w:rPr>
+        <w:t xml:space="preserve">contributing </w:t>
       </w:r>
       <w:r>
         <w:rPr>
@@ -5111,24 +4623,6 @@
           <w:color w:val="auto"/>
         </w:rPr>
         <w:t xml:space="preserve"> overall</w:t>
-      </w:r>
-      <w:r>
-        <w:rPr>
-          <w:color w:val="auto"/>
-        </w:rPr>
-        <w:t xml:space="preserve"> within first </w:t>
-      </w:r>
-      <w:r>
-        <w:rPr>
-          <w:color w:val="auto"/>
-        </w:rPr>
-        <w:t>few</w:t>
-      </w:r>
-      <w:r>
-        <w:rPr>
-          <w:color w:val="auto"/>
-        </w:rPr>
-        <w:t xml:space="preserve"> days</w:t>
       </w:r>
       <w:r>
         <w:rPr>
@@ -5493,7 +4987,6 @@
           <w:color w:val="auto"/>
           <w:szCs w:val="20"/>
         </w:rPr>
-        <w:lastRenderedPageBreak/>
         <w:t>Beginner</w:t>
       </w:r>
       <w:r>
@@ -5721,6 +5214,7 @@
       </w:r>
       <w:r>
         <w:rPr>
+          <w:rFonts w:cs="Arial"/>
           <w:color w:val="auto"/>
           <w:szCs w:val="20"/>
         </w:rPr>
@@ -5728,17 +5222,19 @@
       </w:r>
       <w:r>
         <w:rPr>
-          <w:color w:val="auto"/>
-          <w:szCs w:val="20"/>
-        </w:rPr>
-        <w:t>3</w:t>
-      </w:r>
-      <w:r>
-        <w:rPr>
-          <w:color w:val="auto"/>
-          <w:szCs w:val="20"/>
-        </w:rPr>
-        <w:t>5</w:t>
+          <w:rFonts w:cs="Arial"/>
+          <w:color w:val="auto"/>
+          <w:szCs w:val="20"/>
+        </w:rPr>
+        <w:t>40</w:t>
+      </w:r>
+      <w:r>
+        <w:rPr>
+          <w:rFonts w:cs="Arial"/>
+          <w:color w:val="auto"/>
+          <w:szCs w:val="20"/>
+        </w:rPr>
+        <w:t>0</w:t>
       </w:r>
       <w:r>
         <w:rPr>
@@ -5747,7 +5243,7 @@
           <w:color w:val="auto"/>
           <w:szCs w:val="20"/>
         </w:rPr>
-        <w:t xml:space="preserve">0 </w:t>
+        <w:t xml:space="preserve"> </w:t>
       </w:r>
       <w:r>
         <w:rPr>
@@ -5897,235 +5393,6 @@
       </w:r>
       <w:r>
         <w:rPr>
-          <w:color w:val="auto"/>
-          <w:szCs w:val="20"/>
-        </w:rPr>
-        <w:t>.</w:t>
-      </w:r>
-    </w:p>
-    <w:p>
-      <w:pPr>
-        <w:pStyle w:val="ListParagraph"/>
-        <w:numPr>
-          <w:ilvl w:val="0"/>
-          <w:numId w:val="32"/>
-        </w:numPr>
-        <w:spacing w:line="240" w:lineRule="auto"/>
-        <w:ind w:right="0"/>
-        <w:jc w:val="both"/>
-        <w:rPr>
-          <w:bCs/>
-          <w:color w:val="auto"/>
-          <w:szCs w:val="20"/>
-        </w:rPr>
-      </w:pPr>
-      <w:r>
-        <w:rPr>
-          <w:bCs/>
-          <w:color w:val="auto"/>
-          <w:szCs w:val="20"/>
-        </w:rPr>
-        <w:t>A</w:t>
-      </w:r>
-      <w:r>
-        <w:rPr>
-          <w:bCs/>
-          <w:color w:val="auto"/>
-          <w:szCs w:val="20"/>
-        </w:rPr>
-        <w:t>ttended</w:t>
-      </w:r>
-      <w:r>
-        <w:rPr>
-          <w:b/>
-          <w:i/>
-          <w:iCs/>
-          <w:color w:val="auto"/>
-          <w:szCs w:val="20"/>
-        </w:rPr>
-        <w:t xml:space="preserve"> </w:t>
-      </w:r>
-      <w:r>
-        <w:rPr>
-          <w:b/>
-          <w:color w:val="auto"/>
-          <w:szCs w:val="20"/>
-        </w:rPr>
-        <w:t>A</w:t>
-      </w:r>
-      <w:r>
-        <w:rPr>
-          <w:b/>
-          <w:color w:val="auto"/>
-          <w:szCs w:val="20"/>
-        </w:rPr>
-        <w:t>sia’s large</w:t>
-      </w:r>
-      <w:r>
-        <w:rPr>
-          <w:b/>
-          <w:color w:val="auto"/>
-          <w:szCs w:val="20"/>
-        </w:rPr>
-        <w:t>s</w:t>
-      </w:r>
-      <w:r>
-        <w:rPr>
-          <w:b/>
-          <w:color w:val="auto"/>
-          <w:szCs w:val="20"/>
-        </w:rPr>
-        <w:t>t</w:t>
-      </w:r>
-      <w:r>
-        <w:rPr>
-          <w:b/>
-          <w:color w:val="auto"/>
-          <w:szCs w:val="20"/>
-        </w:rPr>
-        <w:t xml:space="preserve"> tech</w:t>
-      </w:r>
-      <w:r>
-        <w:rPr>
-          <w:b/>
-          <w:color w:val="auto"/>
-          <w:szCs w:val="20"/>
-        </w:rPr>
-        <w:t xml:space="preserve"> </w:t>
-      </w:r>
-      <w:r>
-        <w:rPr>
-          <w:b/>
-          <w:color w:val="auto"/>
-          <w:szCs w:val="20"/>
-        </w:rPr>
-        <w:t>fest</w:t>
-      </w:r>
-      <w:r>
-        <w:rPr>
-          <w:bCs/>
-          <w:color w:val="auto"/>
-          <w:szCs w:val="20"/>
-        </w:rPr>
-        <w:t xml:space="preserve"> </w:t>
-      </w:r>
-      <w:r>
-        <w:rPr>
-          <w:bCs/>
-          <w:color w:val="auto"/>
-          <w:szCs w:val="20"/>
-        </w:rPr>
-        <w:t>at IIT B</w:t>
-      </w:r>
-      <w:r>
-        <w:rPr>
-          <w:bCs/>
-          <w:color w:val="auto"/>
-          <w:szCs w:val="20"/>
-        </w:rPr>
-        <w:t>ombay</w:t>
-      </w:r>
-      <w:r>
-        <w:rPr>
-          <w:bCs/>
-          <w:color w:val="auto"/>
-          <w:szCs w:val="20"/>
-        </w:rPr>
-        <w:t xml:space="preserve"> </w:t>
-      </w:r>
-      <w:r>
-        <w:rPr>
-          <w:bCs/>
-          <w:i/>
-          <w:iCs/>
-          <w:color w:val="auto"/>
-          <w:szCs w:val="20"/>
-        </w:rPr>
-        <w:t>twice</w:t>
-      </w:r>
-      <w:r>
-        <w:rPr>
-          <w:bCs/>
-          <w:color w:val="auto"/>
-          <w:szCs w:val="20"/>
-        </w:rPr>
-        <w:t xml:space="preserve">, </w:t>
-      </w:r>
-      <w:r>
-        <w:rPr>
-          <w:bCs/>
-          <w:color w:val="auto"/>
-          <w:szCs w:val="20"/>
-        </w:rPr>
-        <w:t xml:space="preserve">and earned </w:t>
-      </w:r>
-      <w:r>
-        <w:rPr>
-          <w:b/>
-          <w:color w:val="auto"/>
-          <w:szCs w:val="20"/>
-        </w:rPr>
-        <w:t>W</w:t>
-      </w:r>
-      <w:r>
-        <w:rPr>
-          <w:b/>
-          <w:color w:val="auto"/>
-          <w:szCs w:val="20"/>
-        </w:rPr>
-        <w:t xml:space="preserve">eb </w:t>
-      </w:r>
-      <w:r>
-        <w:rPr>
-          <w:b/>
-          <w:color w:val="auto"/>
-          <w:szCs w:val="20"/>
-        </w:rPr>
-        <w:t>D</w:t>
-      </w:r>
-      <w:r>
-        <w:rPr>
-          <w:b/>
-          <w:color w:val="auto"/>
-          <w:szCs w:val="20"/>
-        </w:rPr>
-        <w:t>evelopment</w:t>
-      </w:r>
-      <w:r>
-        <w:rPr>
-          <w:bCs/>
-          <w:color w:val="auto"/>
-          <w:szCs w:val="20"/>
-        </w:rPr>
-        <w:t xml:space="preserve"> </w:t>
-      </w:r>
-      <w:r>
-        <w:rPr>
-          <w:bCs/>
-          <w:color w:val="auto"/>
-          <w:szCs w:val="20"/>
-        </w:rPr>
-        <w:t>certification</w:t>
-      </w:r>
-      <w:r>
-        <w:rPr>
-          <w:bCs/>
-          <w:color w:val="auto"/>
-          <w:szCs w:val="20"/>
-        </w:rPr>
-        <w:t xml:space="preserve"> </w:t>
-      </w:r>
-      <w:r>
-        <w:rPr>
-          <w:bCs/>
-          <w:color w:val="auto"/>
-          <w:szCs w:val="20"/>
-        </w:rPr>
-        <w:t>at the fest</w:t>
-      </w:r>
-      <w:r>
-        <w:rPr>
-          <w:bCs/>
           <w:color w:val="auto"/>
           <w:szCs w:val="20"/>
         </w:rPr>
@@ -6215,42 +5482,42 @@
         <v:path o:extrusionok="f" gradientshapeok="t" o:connecttype="rect"/>
         <o:lock v:ext="edit" aspectratio="t"/>
       </v:shapetype>
-      <v:shape id="_x0000_i1122" type="#_x0000_t75" style="width:513pt;height:513pt;rotation:180;flip:x y;visibility:visible;mso-wrap-style:square" o:bullet="t">
+      <v:shape id="_x0000_i1398" type="#_x0000_t75" style="width:512.4pt;height:512.4pt;rotation:180;flip:x y;visibility:visible;mso-wrap-style:square" o:bullet="t">
         <v:imagedata r:id="rId1" o:title="107161_circle_github_icon"/>
       </v:shape>
     </w:pict>
   </w:numPicBullet>
   <w:numPicBullet w:numPicBulletId="1">
     <w:pict>
-      <v:shape id="_x0000_i1123" type="#_x0000_t75" style="width:168.75pt;height:168.75pt;visibility:visible;mso-wrap-style:square" o:bullet="t">
+      <v:shape id="_x0000_i1399" type="#_x0000_t75" style="width:168.6pt;height:168.6pt;visibility:visible;mso-wrap-style:square" o:bullet="t">
         <v:imagedata r:id="rId2" o:title="941C13C7"/>
       </v:shape>
     </w:pict>
   </w:numPicBullet>
   <w:numPicBullet w:numPicBulletId="2">
     <w:pict>
-      <v:shape id="_x0000_i1124" type="#_x0000_t75" style="width:29.25pt;height:16.5pt;visibility:visible;mso-wrap-style:square" o:bullet="t">
+      <v:shape id="_x0000_i1400" type="#_x0000_t75" style="width:28.8pt;height:16.2pt;visibility:visible;mso-wrap-style:square" o:bullet="t">
         <v:imagedata r:id="rId3" o:title="107161_circle_github_icon"/>
       </v:shape>
     </w:pict>
   </w:numPicBullet>
   <w:numPicBullet w:numPicBulletId="3">
     <w:pict>
-      <v:shape id="_x0000_i1125" type="#_x0000_t75" style="width:240pt;height:234pt;visibility:visible;mso-wrap-style:square" o:bullet="t">
+      <v:shape id="_x0000_i1401" type="#_x0000_t75" style="width:240pt;height:234pt;visibility:visible;mso-wrap-style:square" o:bullet="t">
         <v:imagedata r:id="rId4" o:title="Indian_Institute_of_Technology_Bombay_Logo"/>
       </v:shape>
     </w:pict>
   </w:numPicBullet>
   <w:numPicBullet w:numPicBulletId="4">
     <w:pict>
-      <v:shape id="_x0000_i1126" type="#_x0000_t75" style="width:22.5pt;height:16.5pt;visibility:visible;mso-wrap-style:square" o:bullet="t">
+      <v:shape id="_x0000_i1402" type="#_x0000_t75" style="width:22.8pt;height:16.2pt;visibility:visible;mso-wrap-style:square" o:bullet="t">
         <v:imagedata r:id="rId5" o:title="Indian_Institute_of_Technology_Bombay_Logo"/>
       </v:shape>
     </w:pict>
   </w:numPicBullet>
   <w:numPicBullet w:numPicBulletId="5">
     <w:pict>
-      <v:shape id="_x0000_i1127" type="#_x0000_t75" style="width:76.5pt;height:76.5pt;visibility:visible;mso-wrap-style:square" o:bullet="t">
+      <v:shape id="_x0000_i1403" type="#_x0000_t75" style="width:76.2pt;height:76.2pt;visibility:visible;mso-wrap-style:square" o:bullet="t">
         <v:imagedata r:id="rId6" o:title=""/>
       </v:shape>
     </w:pict>

</xml_diff>

<commit_message>
minor changes for that canvas for cloud company
</commit_message>
<xml_diff>
--- a/Resume_latest - Copy.docx
+++ b/Resume_latest - Copy.docx
@@ -1296,8 +1296,6 @@
       </w:r>
       <w:r>
         <w:rPr>
-          <w:i/>
-          <w:iCs/>
           <w:color w:val="auto"/>
         </w:rPr>
         <w:t>Dec</w:t>
@@ -1306,7 +1304,13 @@
         <w:rPr>
           <w:color w:val="auto"/>
         </w:rPr>
-        <w:t xml:space="preserve"> 202</w:t>
+        <w:t xml:space="preserve"> </w:t>
+      </w:r>
+      <w:r>
+        <w:rPr>
+          <w:color w:val="auto"/>
+        </w:rPr>
+        <w:t>202</w:t>
       </w:r>
       <w:r>
         <w:rPr>
@@ -1368,7 +1372,19 @@
         <w:rPr>
           <w:color w:val="auto"/>
         </w:rPr>
-        <w:t xml:space="preserve"> is an Ed-tech platform</w:t>
+        <w:t xml:space="preserve"> is an Ed</w:t>
+      </w:r>
+      <w:r>
+        <w:rPr>
+          <w:color w:val="auto"/>
+        </w:rPr>
+        <w:t>T</w:t>
+      </w:r>
+      <w:r>
+        <w:rPr>
+          <w:color w:val="auto"/>
+        </w:rPr>
+        <w:t>ech platform</w:t>
       </w:r>
       <w:r>
         <w:rPr>
@@ -1632,7 +1648,79 @@
           <w:color w:val="auto"/>
           <w:szCs w:val="20"/>
         </w:rPr>
-        <w:t xml:space="preserve">Resolved </w:t>
+        <w:t xml:space="preserve">Removed NAT Gateways from </w:t>
+      </w:r>
+      <w:r>
+        <w:rPr>
+          <w:color w:val="auto"/>
+          <w:szCs w:val="20"/>
+        </w:rPr>
+        <w:t xml:space="preserve">public subnets of all </w:t>
+      </w:r>
+      <w:r>
+        <w:rPr>
+          <w:color w:val="auto"/>
+          <w:szCs w:val="20"/>
+        </w:rPr>
+        <w:t xml:space="preserve">environments </w:t>
+      </w:r>
+      <w:r>
+        <w:rPr>
+          <w:color w:val="auto"/>
+          <w:szCs w:val="20"/>
+        </w:rPr>
+        <w:t xml:space="preserve">(including production) </w:t>
+      </w:r>
+      <w:r>
+        <w:rPr>
+          <w:color w:val="auto"/>
+          <w:szCs w:val="20"/>
+        </w:rPr>
+        <w:t>to reduce costs</w:t>
+      </w:r>
+      <w:r>
+        <w:rPr>
+          <w:color w:val="auto"/>
+          <w:szCs w:val="20"/>
+        </w:rPr>
+        <w:t>.</w:t>
+      </w:r>
+      <w:r>
+        <w:rPr>
+          <w:color w:val="auto"/>
+          <w:szCs w:val="20"/>
+        </w:rPr>
+        <w:t xml:space="preserve"> </w:t>
+      </w:r>
+    </w:p>
+    <w:p>
+      <w:pPr>
+        <w:pStyle w:val="ListParagraph"/>
+        <w:numPr>
+          <w:ilvl w:val="0"/>
+          <w:numId w:val="32"/>
+        </w:numPr>
+        <w:spacing w:line="240" w:lineRule="auto"/>
+        <w:ind w:right="0"/>
+        <w:jc w:val="both"/>
+        <w:rPr>
+          <w:color w:val="auto"/>
+          <w:szCs w:val="20"/>
+        </w:rPr>
+      </w:pPr>
+      <w:r>
+        <w:rPr>
+          <w:color w:val="auto"/>
+          <w:szCs w:val="20"/>
+        </w:rPr>
+        <w:t>R</w:t>
+      </w:r>
+      <w:r>
+        <w:rPr>
+          <w:color w:val="auto"/>
+          <w:szCs w:val="20"/>
+        </w:rPr>
+        <w:t xml:space="preserve">esolved </w:t>
       </w:r>
       <w:r>
         <w:rPr>
@@ -2784,21 +2872,7 @@
           <w:color w:val="auto"/>
           <w:szCs w:val="20"/>
         </w:rPr>
-        <w:t xml:space="preserve"> </w:t>
-      </w:r>
-      <w:r>
-        <w:rPr>
-          <w:color w:val="auto"/>
-          <w:szCs w:val="20"/>
-        </w:rPr>
-        <w:t>streamlining</w:t>
-      </w:r>
-      <w:r>
-        <w:rPr>
-          <w:color w:val="auto"/>
-          <w:szCs w:val="20"/>
-        </w:rPr>
-        <w:t xml:space="preserve"> the</w:t>
+        <w:t>,</w:t>
       </w:r>
       <w:r>
         <w:rPr>
@@ -2814,6 +2888,29 @@
           <w:color w:val="auto"/>
           <w:szCs w:val="20"/>
         </w:rPr>
+        <w:t>streamlining</w:t>
+      </w:r>
+      <w:r>
+        <w:rPr>
+          <w:color w:val="auto"/>
+          <w:szCs w:val="20"/>
+        </w:rPr>
+        <w:t xml:space="preserve"> the</w:t>
+      </w:r>
+      <w:r>
+        <w:rPr>
+          <w:i/>
+          <w:iCs/>
+          <w:color w:val="auto"/>
+          <w:szCs w:val="20"/>
+        </w:rPr>
+        <w:t xml:space="preserve"> </w:t>
+      </w:r>
+      <w:r>
+        <w:rPr>
+          <w:color w:val="auto"/>
+          <w:szCs w:val="20"/>
+        </w:rPr>
         <w:t>user login experience</w:t>
       </w:r>
       <w:r>
@@ -2822,6 +2919,466 @@
           <w:szCs w:val="20"/>
         </w:rPr>
         <w:t>.</w:t>
+      </w:r>
+    </w:p>
+    <w:p>
+      <w:pPr>
+        <w:pBdr>
+          <w:bottom w:val="single" w:sz="6" w:space="1" w:color="auto"/>
+        </w:pBdr>
+        <w:spacing w:line="240" w:lineRule="auto"/>
+        <w:ind w:left="0" w:right="0" w:firstLine="0"/>
+        <w:jc w:val="both"/>
+        <w:rPr>
+          <w:color w:val="auto"/>
+        </w:rPr>
+      </w:pPr>
+    </w:p>
+    <w:p>
+      <w:pPr>
+        <w:spacing w:line="240" w:lineRule="auto"/>
+        <w:ind w:right="0"/>
+        <w:jc w:val="center"/>
+        <w:rPr>
+          <w:b/>
+          <w:bCs/>
+          <w:color w:val="auto"/>
+          <w:sz w:val="24"/>
+          <w:szCs w:val="24"/>
+        </w:rPr>
+      </w:pPr>
+      <w:r>
+        <w:rPr>
+          <w:b/>
+          <w:bCs/>
+          <w:color w:val="auto"/>
+          <w:sz w:val="24"/>
+          <w:szCs w:val="24"/>
+        </w:rPr>
+        <w:t>Open-Source Contributions</w:t>
+      </w:r>
+    </w:p>
+    <w:p>
+      <w:pPr>
+        <w:spacing w:line="240" w:lineRule="auto"/>
+        <w:ind w:right="0"/>
+        <w:jc w:val="both"/>
+        <w:rPr>
+          <w:rFonts w:cs="Mangal"/>
+          <w:szCs w:val="18"/>
+        </w:rPr>
+      </w:pPr>
+      <w:hyperlink r:id="rId28" w:history="1">
+        <w:proofErr w:type="spellStart"/>
+        <w:r>
+          <w:rPr>
+            <w:rStyle w:val="Hyperlink"/>
+            <w:b/>
+            <w:bCs/>
+            <w:color w:val="auto"/>
+            <w:u w:val="none"/>
+          </w:rPr>
+          <w:t>Catima</w:t>
+        </w:r>
+        <w:proofErr w:type="spellEnd"/>
+        <w:r>
+          <w:rPr>
+            <w:rStyle w:val="Hyperlink"/>
+            <w:b/>
+            <w:bCs/>
+            <w:color w:val="auto"/>
+            <w:u w:val="none"/>
+          </w:rPr>
+          <w:t xml:space="preserve"> Loyalty </w:t>
+        </w:r>
+        <w:r>
+          <w:rPr>
+            <w:rStyle w:val="Hyperlink"/>
+            <w:color w:val="auto"/>
+            <w:u w:val="none"/>
+          </w:rPr>
+          <w:t>(</w:t>
+        </w:r>
+        <w:r>
+          <w:rPr>
+            <w:rStyle w:val="Hyperlink"/>
+            <w:b/>
+            <w:bCs/>
+            <w:color w:val="auto"/>
+            <w:u w:val="none"/>
+          </w:rPr>
+          <w:t>Java, YAML</w:t>
+        </w:r>
+        <w:r>
+          <w:rPr>
+            <w:rStyle w:val="Hyperlink"/>
+            <w:color w:val="auto"/>
+            <w:u w:val="none"/>
+          </w:rPr>
+          <w:t>)</w:t>
+        </w:r>
+        <w:r>
+          <w:rPr>
+            <w:rStyle w:val="Hyperlink"/>
+            <w:b/>
+            <w:bCs/>
+            <w:color w:val="auto"/>
+            <w:u w:val="none"/>
+          </w:rPr>
+          <w:t xml:space="preserve"> </w:t>
+        </w:r>
+        <w:r>
+          <w:rPr>
+            <w:rStyle w:val="Hyperlink"/>
+            <w:color w:val="auto"/>
+            <w:u w:val="none"/>
+          </w:rPr>
+          <w:t>[</w:t>
+        </w:r>
+        <w:r>
+          <w:rPr>
+            <w:rStyle w:val="Hyperlink"/>
+            <w:i/>
+            <w:iCs/>
+            <w:color w:val="auto"/>
+          </w:rPr>
+          <w:t>link</w:t>
+        </w:r>
+        <w:r>
+          <w:rPr>
+            <w:rStyle w:val="Hyperlink"/>
+            <w:color w:val="auto"/>
+            <w:u w:val="none"/>
+          </w:rPr>
+          <w:t>]:</w:t>
+        </w:r>
+      </w:hyperlink>
+    </w:p>
+    <w:p>
+      <w:pPr>
+        <w:spacing w:line="240" w:lineRule="auto"/>
+        <w:ind w:right="0"/>
+        <w:jc w:val="both"/>
+        <w:rPr>
+          <w:color w:val="auto"/>
+        </w:rPr>
+      </w:pPr>
+      <w:r>
+        <w:rPr>
+          <w:color w:val="auto"/>
+        </w:rPr>
+        <w:t>(</w:t>
+      </w:r>
+      <w:proofErr w:type="spellStart"/>
+      <w:r>
+        <w:rPr>
+          <w:color w:val="auto"/>
+        </w:rPr>
+        <w:t>Catima</w:t>
+      </w:r>
+      <w:proofErr w:type="spellEnd"/>
+      <w:r>
+        <w:rPr>
+          <w:color w:val="auto"/>
+        </w:rPr>
+        <w:t xml:space="preserve"> is a</w:t>
+      </w:r>
+      <w:r>
+        <w:rPr>
+          <w:color w:val="auto"/>
+        </w:rPr>
+        <w:t xml:space="preserve"> loyalty</w:t>
+      </w:r>
+      <w:r>
+        <w:rPr>
+          <w:color w:val="auto"/>
+        </w:rPr>
+        <w:t xml:space="preserve"> card and ticke</w:t>
+      </w:r>
+      <w:r>
+        <w:rPr>
+          <w:color w:val="auto"/>
+        </w:rPr>
+        <w:t>t</w:t>
+      </w:r>
+      <w:r>
+        <w:rPr>
+          <w:color w:val="auto"/>
+        </w:rPr>
+        <w:t xml:space="preserve"> manager with over </w:t>
+      </w:r>
+      <w:r>
+        <w:rPr>
+          <w:b/>
+          <w:bCs/>
+          <w:color w:val="auto"/>
+        </w:rPr>
+        <w:t>100K downloads</w:t>
+      </w:r>
+      <w:r>
+        <w:rPr>
+          <w:color w:val="auto"/>
+        </w:rPr>
+        <w:t xml:space="preserve"> on </w:t>
+      </w:r>
+      <w:r>
+        <w:rPr>
+          <w:color w:val="auto"/>
+        </w:rPr>
+        <w:t>G</w:t>
+      </w:r>
+      <w:r>
+        <w:rPr>
+          <w:color w:val="auto"/>
+        </w:rPr>
+        <w:t xml:space="preserve">oogle </w:t>
+      </w:r>
+      <w:r>
+        <w:rPr>
+          <w:color w:val="auto"/>
+        </w:rPr>
+        <w:t>P</w:t>
+      </w:r>
+      <w:r>
+        <w:rPr>
+          <w:color w:val="auto"/>
+        </w:rPr>
+        <w:t xml:space="preserve">lay </w:t>
+      </w:r>
+      <w:r>
+        <w:rPr>
+          <w:color w:val="auto"/>
+        </w:rPr>
+        <w:t>S</w:t>
+      </w:r>
+      <w:r>
+        <w:rPr>
+          <w:color w:val="auto"/>
+        </w:rPr>
+        <w:t>tore)</w:t>
+      </w:r>
+    </w:p>
+    <w:p>
+      <w:pPr>
+        <w:pStyle w:val="ListParagraph"/>
+        <w:numPr>
+          <w:ilvl w:val="0"/>
+          <w:numId w:val="31"/>
+        </w:numPr>
+        <w:spacing w:line="240" w:lineRule="auto"/>
+        <w:ind w:right="0"/>
+        <w:jc w:val="both"/>
+        <w:rPr>
+          <w:color w:val="auto"/>
+        </w:rPr>
+      </w:pPr>
+      <w:r>
+        <w:rPr>
+          <w:color w:val="auto"/>
+        </w:rPr>
+        <w:t xml:space="preserve">Incorporated a </w:t>
+      </w:r>
+      <w:r>
+        <w:rPr>
+          <w:b/>
+          <w:bCs/>
+          <w:color w:val="auto"/>
+        </w:rPr>
+        <w:t>GitHub Action</w:t>
+      </w:r>
+      <w:r>
+        <w:rPr>
+          <w:color w:val="auto"/>
+        </w:rPr>
+        <w:t xml:space="preserve"> to create pull </w:t>
+      </w:r>
+      <w:r>
+        <w:rPr>
+          <w:color w:val="auto"/>
+        </w:rPr>
+        <w:t>requests automatically to update the Gradle wrapper.</w:t>
+      </w:r>
+    </w:p>
+    <w:p>
+      <w:pPr>
+        <w:pStyle w:val="ListParagraph"/>
+        <w:numPr>
+          <w:ilvl w:val="0"/>
+          <w:numId w:val="31"/>
+        </w:numPr>
+        <w:tabs>
+          <w:tab w:val="left" w:pos="3544"/>
+        </w:tabs>
+        <w:spacing w:line="240" w:lineRule="auto"/>
+        <w:ind w:right="0"/>
+        <w:jc w:val="both"/>
+        <w:rPr>
+          <w:color w:val="auto"/>
+        </w:rPr>
+      </w:pPr>
+      <w:r>
+        <w:rPr>
+          <w:color w:val="auto"/>
+        </w:rPr>
+        <w:t xml:space="preserve">Migrated </w:t>
+      </w:r>
+      <w:r>
+        <w:rPr>
+          <w:color w:val="auto"/>
+        </w:rPr>
+        <w:t xml:space="preserve">a </w:t>
+      </w:r>
+      <w:r>
+        <w:rPr>
+          <w:color w:val="auto"/>
+        </w:rPr>
+        <w:t>Java class</w:t>
+      </w:r>
+      <w:r>
+        <w:rPr>
+          <w:color w:val="auto"/>
+        </w:rPr>
+        <w:t xml:space="preserve"> along with </w:t>
+      </w:r>
+      <w:r>
+        <w:rPr>
+          <w:color w:val="auto"/>
+        </w:rPr>
+        <w:t xml:space="preserve">multiple interfaces, and </w:t>
+      </w:r>
+      <w:proofErr w:type="spellStart"/>
+      <w:r>
+        <w:rPr>
+          <w:color w:val="auto"/>
+        </w:rPr>
+        <w:t>enums</w:t>
+      </w:r>
+      <w:proofErr w:type="spellEnd"/>
+      <w:r>
+        <w:rPr>
+          <w:color w:val="auto"/>
+        </w:rPr>
+        <w:t xml:space="preserve"> to </w:t>
+      </w:r>
+      <w:r>
+        <w:rPr>
+          <w:b/>
+          <w:bCs/>
+          <w:color w:val="auto"/>
+        </w:rPr>
+        <w:t>Kotlin</w:t>
+      </w:r>
+      <w:r>
+        <w:rPr>
+          <w:color w:val="auto"/>
+        </w:rPr>
+        <w:t xml:space="preserve"> and </w:t>
+      </w:r>
+      <w:r>
+        <w:rPr>
+          <w:b/>
+          <w:bCs/>
+          <w:color w:val="auto"/>
+        </w:rPr>
+        <w:t>r</w:t>
+      </w:r>
+      <w:r>
+        <w:rPr>
+          <w:b/>
+          <w:bCs/>
+          <w:color w:val="auto"/>
+        </w:rPr>
+        <w:t>emoved</w:t>
+      </w:r>
+      <w:r>
+        <w:rPr>
+          <w:color w:val="auto"/>
+        </w:rPr>
+        <w:t xml:space="preserve"> &gt; </w:t>
+      </w:r>
+      <w:r>
+        <w:rPr>
+          <w:b/>
+          <w:bCs/>
+          <w:color w:val="auto"/>
+        </w:rPr>
+        <w:t>5</w:t>
+      </w:r>
+      <w:r>
+        <w:rPr>
+          <w:b/>
+          <w:bCs/>
+          <w:color w:val="auto"/>
+        </w:rPr>
+        <w:t>0 lines</w:t>
+      </w:r>
+      <w:r>
+        <w:rPr>
+          <w:color w:val="auto"/>
+        </w:rPr>
+        <w:t xml:space="preserve"> of unnecessary code from </w:t>
+      </w:r>
+      <w:r>
+        <w:rPr>
+          <w:b/>
+          <w:bCs/>
+          <w:color w:val="auto"/>
+        </w:rPr>
+        <w:t>CI/CD</w:t>
+      </w:r>
+      <w:r>
+        <w:rPr>
+          <w:color w:val="auto"/>
+        </w:rPr>
+        <w:t xml:space="preserve"> pipelines</w:t>
+      </w:r>
+      <w:r>
+        <w:rPr>
+          <w:color w:val="auto"/>
+        </w:rPr>
+        <w:t>,</w:t>
+      </w:r>
+      <w:r>
+        <w:rPr>
+          <w:color w:val="auto"/>
+        </w:rPr>
+        <w:t xml:space="preserve"> </w:t>
+      </w:r>
+      <w:r>
+        <w:rPr>
+          <w:color w:val="auto"/>
+        </w:rPr>
+        <w:t xml:space="preserve">contributing </w:t>
+      </w:r>
+      <w:r>
+        <w:rPr>
+          <w:i/>
+          <w:iCs/>
+          <w:color w:val="auto"/>
+        </w:rPr>
+        <w:t>150</w:t>
+      </w:r>
+      <w:r>
+        <w:rPr>
+          <w:i/>
+          <w:iCs/>
+          <w:color w:val="auto"/>
+        </w:rPr>
+        <w:t>+</w:t>
+      </w:r>
+      <w:r>
+        <w:rPr>
+          <w:i/>
+          <w:iCs/>
+          <w:color w:val="auto"/>
+        </w:rPr>
+        <w:t xml:space="preserve"> lines of code in production</w:t>
+      </w:r>
+      <w:r>
+        <w:rPr>
+          <w:color w:val="auto"/>
+        </w:rPr>
+        <w:t xml:space="preserve"> overall.</w:t>
       </w:r>
     </w:p>
     <w:p>
@@ -2876,7 +3433,7 @@
           <w:color w:val="auto"/>
         </w:rPr>
       </w:pPr>
-      <w:hyperlink r:id="rId28" w:history="1">
+      <w:hyperlink r:id="rId29" w:history="1">
         <w:r>
           <w:rPr>
             <w:rStyle w:val="Hyperlink"/>
@@ -3266,7 +3823,7 @@
           <w:color w:val="auto"/>
         </w:rPr>
       </w:pPr>
-      <w:hyperlink r:id="rId29" w:history="1">
+      <w:hyperlink r:id="rId30" w:history="1">
         <w:r>
           <w:rPr>
             <w:rStyle w:val="Hyperlink"/>
@@ -3569,7 +4126,7 @@
           <w:color w:val="auto"/>
         </w:rPr>
       </w:pPr>
-      <w:hyperlink r:id="rId30" w:history="1">
+      <w:hyperlink r:id="rId31" w:history="1">
         <w:r>
           <w:rPr>
             <w:rStyle w:val="Hyperlink"/>
@@ -4090,538 +4647,6 @@
           <w:b/>
           <w:bCs/>
           <w:color w:val="auto"/>
-          <w:sz w:val="24"/>
-          <w:szCs w:val="24"/>
-        </w:rPr>
-      </w:pPr>
-      <w:r>
-        <w:rPr>
-          <w:b/>
-          <w:bCs/>
-          <w:color w:val="auto"/>
-          <w:sz w:val="24"/>
-          <w:szCs w:val="24"/>
-        </w:rPr>
-        <w:t>Open-Source Contributions</w:t>
-      </w:r>
-    </w:p>
-    <w:p>
-      <w:pPr>
-        <w:spacing w:line="240" w:lineRule="auto"/>
-        <w:ind w:right="0"/>
-        <w:jc w:val="both"/>
-        <w:rPr>
-          <w:rFonts w:cs="Mangal"/>
-          <w:szCs w:val="18"/>
-        </w:rPr>
-      </w:pPr>
-      <w:hyperlink r:id="rId31" w:history="1">
-        <w:proofErr w:type="spellStart"/>
-        <w:r>
-          <w:rPr>
-            <w:rStyle w:val="Hyperlink"/>
-            <w:b/>
-            <w:bCs/>
-            <w:color w:val="auto"/>
-            <w:u w:val="none"/>
-          </w:rPr>
-          <w:t>Catima</w:t>
-        </w:r>
-        <w:proofErr w:type="spellEnd"/>
-        <w:r>
-          <w:rPr>
-            <w:rStyle w:val="Hyperlink"/>
-            <w:b/>
-            <w:bCs/>
-            <w:color w:val="auto"/>
-            <w:u w:val="none"/>
-          </w:rPr>
-          <w:t xml:space="preserve"> </w:t>
-        </w:r>
-        <w:r>
-          <w:rPr>
-            <w:rStyle w:val="Hyperlink"/>
-            <w:b/>
-            <w:bCs/>
-            <w:color w:val="auto"/>
-            <w:u w:val="none"/>
-          </w:rPr>
-          <w:t xml:space="preserve">Loyalty </w:t>
-        </w:r>
-        <w:r>
-          <w:rPr>
-            <w:rStyle w:val="Hyperlink"/>
-            <w:color w:val="auto"/>
-            <w:u w:val="none"/>
-          </w:rPr>
-          <w:t>(</w:t>
-        </w:r>
-        <w:r>
-          <w:rPr>
-            <w:rStyle w:val="Hyperlink"/>
-            <w:b/>
-            <w:bCs/>
-            <w:color w:val="auto"/>
-            <w:u w:val="none"/>
-          </w:rPr>
-          <w:t>J</w:t>
-        </w:r>
-        <w:r>
-          <w:rPr>
-            <w:rStyle w:val="Hyperlink"/>
-            <w:b/>
-            <w:bCs/>
-            <w:color w:val="auto"/>
-            <w:u w:val="none"/>
-          </w:rPr>
-          <w:t>ava</w:t>
-        </w:r>
-        <w:r>
-          <w:rPr>
-            <w:rStyle w:val="Hyperlink"/>
-            <w:b/>
-            <w:bCs/>
-            <w:color w:val="auto"/>
-            <w:u w:val="none"/>
-          </w:rPr>
-          <w:t>, YAML</w:t>
-        </w:r>
-        <w:r>
-          <w:rPr>
-            <w:rStyle w:val="Hyperlink"/>
-            <w:color w:val="auto"/>
-            <w:u w:val="none"/>
-          </w:rPr>
-          <w:t>)</w:t>
-        </w:r>
-        <w:r>
-          <w:rPr>
-            <w:rStyle w:val="Hyperlink"/>
-            <w:b/>
-            <w:bCs/>
-            <w:color w:val="auto"/>
-            <w:u w:val="none"/>
-          </w:rPr>
-          <w:t xml:space="preserve"> </w:t>
-        </w:r>
-        <w:r>
-          <w:rPr>
-            <w:rStyle w:val="Hyperlink"/>
-            <w:color w:val="auto"/>
-            <w:u w:val="none"/>
-          </w:rPr>
-          <w:t>[</w:t>
-        </w:r>
-        <w:r>
-          <w:rPr>
-            <w:rStyle w:val="Hyperlink"/>
-            <w:i/>
-            <w:iCs/>
-            <w:color w:val="auto"/>
-          </w:rPr>
-          <w:t>link</w:t>
-        </w:r>
-        <w:r>
-          <w:rPr>
-            <w:rStyle w:val="Hyperlink"/>
-            <w:color w:val="auto"/>
-            <w:u w:val="none"/>
-          </w:rPr>
-          <w:t>]:</w:t>
-        </w:r>
-      </w:hyperlink>
-    </w:p>
-    <w:p>
-      <w:pPr>
-        <w:spacing w:line="240" w:lineRule="auto"/>
-        <w:ind w:right="0"/>
-        <w:jc w:val="both"/>
-        <w:rPr>
-          <w:color w:val="auto"/>
-        </w:rPr>
-      </w:pPr>
-      <w:r>
-        <w:rPr>
-          <w:color w:val="auto"/>
-        </w:rPr>
-        <w:t>(</w:t>
-      </w:r>
-      <w:proofErr w:type="spellStart"/>
-      <w:r>
-        <w:rPr>
-          <w:color w:val="auto"/>
-        </w:rPr>
-        <w:t>Catima</w:t>
-      </w:r>
-      <w:proofErr w:type="spellEnd"/>
-      <w:r>
-        <w:rPr>
-          <w:color w:val="auto"/>
-        </w:rPr>
-        <w:t xml:space="preserve"> is a</w:t>
-      </w:r>
-      <w:r>
-        <w:rPr>
-          <w:color w:val="auto"/>
-        </w:rPr>
-        <w:t xml:space="preserve"> loyalty</w:t>
-      </w:r>
-      <w:r>
-        <w:rPr>
-          <w:color w:val="auto"/>
-        </w:rPr>
-        <w:t xml:space="preserve"> card and ticke</w:t>
-      </w:r>
-      <w:r>
-        <w:rPr>
-          <w:color w:val="auto"/>
-        </w:rPr>
-        <w:t>t</w:t>
-      </w:r>
-      <w:r>
-        <w:rPr>
-          <w:color w:val="auto"/>
-        </w:rPr>
-        <w:t xml:space="preserve"> manager with over </w:t>
-      </w:r>
-      <w:r>
-        <w:rPr>
-          <w:b/>
-          <w:bCs/>
-          <w:color w:val="auto"/>
-        </w:rPr>
-        <w:t>100K downloads</w:t>
-      </w:r>
-      <w:r>
-        <w:rPr>
-          <w:color w:val="auto"/>
-        </w:rPr>
-        <w:t xml:space="preserve"> on </w:t>
-      </w:r>
-      <w:r>
-        <w:rPr>
-          <w:color w:val="auto"/>
-        </w:rPr>
-        <w:t>G</w:t>
-      </w:r>
-      <w:r>
-        <w:rPr>
-          <w:color w:val="auto"/>
-        </w:rPr>
-        <w:t xml:space="preserve">oogle </w:t>
-      </w:r>
-      <w:r>
-        <w:rPr>
-          <w:color w:val="auto"/>
-        </w:rPr>
-        <w:t>P</w:t>
-      </w:r>
-      <w:r>
-        <w:rPr>
-          <w:color w:val="auto"/>
-        </w:rPr>
-        <w:t>lay store)</w:t>
-      </w:r>
-    </w:p>
-    <w:p>
-      <w:pPr>
-        <w:pStyle w:val="ListParagraph"/>
-        <w:numPr>
-          <w:ilvl w:val="0"/>
-          <w:numId w:val="31"/>
-        </w:numPr>
-        <w:spacing w:line="240" w:lineRule="auto"/>
-        <w:ind w:right="0"/>
-        <w:jc w:val="both"/>
-        <w:rPr>
-          <w:color w:val="auto"/>
-        </w:rPr>
-      </w:pPr>
-      <w:r>
-        <w:rPr>
-          <w:color w:val="auto"/>
-        </w:rPr>
-        <w:t xml:space="preserve">Incorporated a </w:t>
-      </w:r>
-      <w:r>
-        <w:rPr>
-          <w:b/>
-          <w:bCs/>
-          <w:color w:val="auto"/>
-        </w:rPr>
-        <w:t>GitHub Action</w:t>
-      </w:r>
-      <w:r>
-        <w:rPr>
-          <w:color w:val="auto"/>
-        </w:rPr>
-        <w:t xml:space="preserve"> to create pull </w:t>
-      </w:r>
-      <w:r>
-        <w:rPr>
-          <w:color w:val="auto"/>
-        </w:rPr>
-        <w:t>requests automatically to update the Gradle wrapper.</w:t>
-      </w:r>
-    </w:p>
-    <w:p>
-      <w:pPr>
-        <w:pStyle w:val="ListParagraph"/>
-        <w:numPr>
-          <w:ilvl w:val="0"/>
-          <w:numId w:val="31"/>
-        </w:numPr>
-        <w:tabs>
-          <w:tab w:val="left" w:pos="3544"/>
-        </w:tabs>
-        <w:spacing w:line="240" w:lineRule="auto"/>
-        <w:ind w:right="0"/>
-        <w:jc w:val="both"/>
-        <w:rPr>
-          <w:color w:val="auto"/>
-        </w:rPr>
-      </w:pPr>
-      <w:r>
-        <w:rPr>
-          <w:color w:val="auto"/>
-        </w:rPr>
-        <w:t xml:space="preserve">Migrated </w:t>
-      </w:r>
-      <w:r>
-        <w:rPr>
-          <w:color w:val="auto"/>
-        </w:rPr>
-        <w:t xml:space="preserve">a </w:t>
-      </w:r>
-      <w:r>
-        <w:rPr>
-          <w:color w:val="auto"/>
-        </w:rPr>
-        <w:t xml:space="preserve">Java </w:t>
-      </w:r>
-      <w:r>
-        <w:rPr>
-          <w:color w:val="auto"/>
-        </w:rPr>
-        <w:t>class</w:t>
-      </w:r>
-      <w:r>
-        <w:rPr>
-          <w:color w:val="auto"/>
-        </w:rPr>
-        <w:t xml:space="preserve"> along with </w:t>
-      </w:r>
-      <w:r>
-        <w:rPr>
-          <w:color w:val="auto"/>
-        </w:rPr>
-        <w:t>multiple</w:t>
-      </w:r>
-      <w:r>
-        <w:rPr>
-          <w:color w:val="auto"/>
-        </w:rPr>
-        <w:t xml:space="preserve"> </w:t>
-      </w:r>
-      <w:r>
-        <w:rPr>
-          <w:color w:val="auto"/>
-        </w:rPr>
-        <w:t xml:space="preserve">interfaces, </w:t>
-      </w:r>
-      <w:r>
-        <w:rPr>
-          <w:color w:val="auto"/>
-        </w:rPr>
-        <w:t xml:space="preserve">and </w:t>
-      </w:r>
-      <w:proofErr w:type="spellStart"/>
-      <w:r>
-        <w:rPr>
-          <w:color w:val="auto"/>
-        </w:rPr>
-        <w:t>enums</w:t>
-      </w:r>
-      <w:proofErr w:type="spellEnd"/>
-      <w:r>
-        <w:rPr>
-          <w:color w:val="auto"/>
-        </w:rPr>
-        <w:t xml:space="preserve"> </w:t>
-      </w:r>
-      <w:r>
-        <w:rPr>
-          <w:color w:val="auto"/>
-        </w:rPr>
-        <w:t xml:space="preserve">to </w:t>
-      </w:r>
-      <w:r>
-        <w:rPr>
-          <w:b/>
-          <w:bCs/>
-          <w:color w:val="auto"/>
-        </w:rPr>
-        <w:t>Kotlin</w:t>
-      </w:r>
-      <w:r>
-        <w:rPr>
-          <w:color w:val="auto"/>
-        </w:rPr>
-        <w:t xml:space="preserve"> and </w:t>
-      </w:r>
-      <w:r>
-        <w:rPr>
-          <w:b/>
-          <w:bCs/>
-          <w:color w:val="auto"/>
-        </w:rPr>
-        <w:t>r</w:t>
-      </w:r>
-      <w:r>
-        <w:rPr>
-          <w:b/>
-          <w:bCs/>
-          <w:color w:val="auto"/>
-        </w:rPr>
-        <w:t>emoved</w:t>
-      </w:r>
-      <w:r>
-        <w:rPr>
-          <w:color w:val="auto"/>
-        </w:rPr>
-        <w:t xml:space="preserve"> &gt; </w:t>
-      </w:r>
-      <w:r>
-        <w:rPr>
-          <w:b/>
-          <w:bCs/>
-          <w:color w:val="auto"/>
-        </w:rPr>
-        <w:t>5</w:t>
-      </w:r>
-      <w:r>
-        <w:rPr>
-          <w:b/>
-          <w:bCs/>
-          <w:color w:val="auto"/>
-        </w:rPr>
-        <w:t>0 lines</w:t>
-      </w:r>
-      <w:r>
-        <w:rPr>
-          <w:color w:val="auto"/>
-        </w:rPr>
-        <w:t xml:space="preserve"> of </w:t>
-      </w:r>
-      <w:r>
-        <w:rPr>
-          <w:color w:val="auto"/>
-        </w:rPr>
-        <w:t xml:space="preserve">unnecessary </w:t>
-      </w:r>
-      <w:r>
-        <w:rPr>
-          <w:color w:val="auto"/>
-        </w:rPr>
-        <w:t xml:space="preserve">code </w:t>
-      </w:r>
-      <w:r>
-        <w:rPr>
-          <w:color w:val="auto"/>
-        </w:rPr>
-        <w:t xml:space="preserve">from </w:t>
-      </w:r>
-      <w:r>
-        <w:rPr>
-          <w:b/>
-          <w:bCs/>
-          <w:color w:val="auto"/>
-        </w:rPr>
-        <w:t>CI/CD</w:t>
-      </w:r>
-      <w:r>
-        <w:rPr>
-          <w:color w:val="auto"/>
-        </w:rPr>
-        <w:t xml:space="preserve"> pipelines</w:t>
-      </w:r>
-      <w:r>
-        <w:rPr>
-          <w:color w:val="auto"/>
-        </w:rPr>
-        <w:t>,</w:t>
-      </w:r>
-      <w:r>
-        <w:rPr>
-          <w:color w:val="auto"/>
-        </w:rPr>
-        <w:t xml:space="preserve"> </w:t>
-      </w:r>
-      <w:r>
-        <w:rPr>
-          <w:color w:val="auto"/>
-        </w:rPr>
-        <w:t xml:space="preserve">contributing </w:t>
-      </w:r>
-      <w:r>
-        <w:rPr>
-          <w:i/>
-          <w:iCs/>
-          <w:color w:val="auto"/>
-        </w:rPr>
-        <w:t>150</w:t>
-      </w:r>
-      <w:r>
-        <w:rPr>
-          <w:i/>
-          <w:iCs/>
-          <w:color w:val="auto"/>
-        </w:rPr>
-        <w:t>+</w:t>
-      </w:r>
-      <w:r>
-        <w:rPr>
-          <w:i/>
-          <w:iCs/>
-          <w:color w:val="auto"/>
-        </w:rPr>
-        <w:t xml:space="preserve"> lines of code in production</w:t>
-      </w:r>
-      <w:r>
-        <w:rPr>
-          <w:color w:val="auto"/>
-        </w:rPr>
-        <w:t xml:space="preserve"> overall</w:t>
-      </w:r>
-      <w:r>
-        <w:rPr>
-          <w:color w:val="auto"/>
-        </w:rPr>
-        <w:t>.</w:t>
-      </w:r>
-    </w:p>
-    <w:p>
-      <w:pPr>
-        <w:pBdr>
-          <w:bottom w:val="single" w:sz="6" w:space="1" w:color="auto"/>
-        </w:pBdr>
-        <w:spacing w:line="240" w:lineRule="auto"/>
-        <w:ind w:left="0" w:right="0" w:firstLine="0"/>
-        <w:jc w:val="both"/>
-        <w:rPr>
-          <w:color w:val="auto"/>
-        </w:rPr>
-      </w:pPr>
-    </w:p>
-    <w:p>
-      <w:pPr>
-        <w:spacing w:line="240" w:lineRule="auto"/>
-        <w:ind w:right="0"/>
-        <w:jc w:val="center"/>
-        <w:rPr>
-          <w:b/>
-          <w:bCs/>
-          <w:color w:val="auto"/>
           <w:sz w:val="22"/>
           <w:szCs w:val="22"/>
         </w:rPr>
@@ -5393,42 +5418,42 @@
         <v:path o:extrusionok="f" gradientshapeok="t" o:connecttype="rect"/>
         <o:lock v:ext="edit" aspectratio="t"/>
       </v:shapetype>
-      <v:shape id="_x0000_i1194" type="#_x0000_t75" style="width:512.15pt;height:512.15pt;rotation:180;flip:x y;visibility:visible;mso-wrap-style:square" o:bullet="t">
+      <v:shape id="_x0000_i1116" type="#_x0000_t75" style="width:512.25pt;height:512.25pt;rotation:180;flip:x y;visibility:visible;mso-wrap-style:square" o:bullet="t">
         <v:imagedata r:id="rId1" o:title="107161_circle_github_icon"/>
       </v:shape>
     </w:pict>
   </w:numPicBullet>
   <w:numPicBullet w:numPicBulletId="1">
     <w:pict>
-      <v:shape id="_x0000_i1195" type="#_x0000_t75" style="width:168.45pt;height:168.45pt;visibility:visible;mso-wrap-style:square" o:bullet="t">
+      <v:shape id="_x0000_i1117" type="#_x0000_t75" style="width:168.75pt;height:168.75pt;visibility:visible;mso-wrap-style:square" o:bullet="t">
         <v:imagedata r:id="rId2" o:title="941C13C7"/>
       </v:shape>
     </w:pict>
   </w:numPicBullet>
   <w:numPicBullet w:numPicBulletId="2">
     <w:pict>
-      <v:shape id="_x0000_i1196" type="#_x0000_t75" style="width:28.55pt;height:16.3pt;visibility:visible;mso-wrap-style:square" o:bullet="t">
+      <v:shape id="_x0000_i1118" type="#_x0000_t75" style="width:28.5pt;height:16.5pt;visibility:visible;mso-wrap-style:square" o:bullet="t">
         <v:imagedata r:id="rId3" o:title="107161_circle_github_icon"/>
       </v:shape>
     </w:pict>
   </w:numPicBullet>
   <w:numPicBullet w:numPicBulletId="3">
     <w:pict>
-      <v:shape id="_x0000_i1197" type="#_x0000_t75" style="width:239.75pt;height:234.35pt;visibility:visible;mso-wrap-style:square" o:bullet="t">
+      <v:shape id="_x0000_i1119" type="#_x0000_t75" style="width:240pt;height:234pt;visibility:visible;mso-wrap-style:square" o:bullet="t">
         <v:imagedata r:id="rId4" o:title="Indian_Institute_of_Technology_Bombay_Logo"/>
       </v:shape>
     </w:pict>
   </w:numPicBullet>
   <w:numPicBullet w:numPicBulletId="4">
     <w:pict>
-      <v:shape id="_x0000_i1198" type="#_x0000_t75" style="width:23.1pt;height:16.3pt;visibility:visible;mso-wrap-style:square" o:bullet="t">
+      <v:shape id="_x0000_i1120" type="#_x0000_t75" style="width:23.25pt;height:16.5pt;visibility:visible;mso-wrap-style:square" o:bullet="t">
         <v:imagedata r:id="rId5" o:title="Indian_Institute_of_Technology_Bombay_Logo"/>
       </v:shape>
     </w:pict>
   </w:numPicBullet>
   <w:numPicBullet w:numPicBulletId="5">
     <w:pict>
-      <v:shape id="_x0000_i1199" type="#_x0000_t75" style="width:76.1pt;height:76.1pt;visibility:visible;mso-wrap-style:square" o:bullet="t">
+      <v:shape id="_x0000_i1121" type="#_x0000_t75" style="width:75.75pt;height:75.75pt;visibility:visible;mso-wrap-style:square" o:bullet="t">
         <v:imagedata r:id="rId6" o:title=""/>
       </v:shape>
     </w:pict>

</xml_diff>

<commit_message>
a typo fixed and "$3000 saved" updated in the NAT GW line
</commit_message>
<xml_diff>
--- a/Resume_latest - Copy.docx
+++ b/Resume_latest - Copy.docx
@@ -190,25 +190,7 @@
             <w:color w:val="auto"/>
             <w:u w:val="none"/>
           </w:rPr>
-          <w:t>ub.com/</w:t>
-        </w:r>
-        <w:proofErr w:type="spellStart"/>
-        <w:r>
-          <w:rPr>
-            <w:rStyle w:val="Hyperlink"/>
-            <w:color w:val="auto"/>
-            <w:u w:val="none"/>
-          </w:rPr>
-          <w:t>PrathameshBhagat</w:t>
-        </w:r>
-        <w:proofErr w:type="spellEnd"/>
-        <w:r>
-          <w:rPr>
-            <w:rStyle w:val="Hyperlink"/>
-            <w:color w:val="auto"/>
-            <w:u w:val="none"/>
-          </w:rPr>
-          <w:t xml:space="preserve"> </w:t>
+          <w:t xml:space="preserve">ub.com/PrathameshBhagat </w:t>
         </w:r>
       </w:hyperlink>
     </w:p>
@@ -650,20 +632,8 @@
             <w:u w:val="none"/>
             <w:shd w:val="clear" w:color="auto" w:fill="FFFFFF"/>
           </w:rPr>
-          <w:t>n.com/in/</w:t>
+          <w:t>n.com/in/prathameshvivekbhagat</w:t>
         </w:r>
-        <w:proofErr w:type="spellStart"/>
-        <w:r>
-          <w:rPr>
-            <w:rStyle w:val="Hyperlink"/>
-            <w:bCs/>
-            <w:color w:val="auto"/>
-            <w:u w:val="none"/>
-            <w:shd w:val="clear" w:color="auto" w:fill="FFFFFF"/>
-          </w:rPr>
-          <w:t>prathameshvivekbhagat</w:t>
-        </w:r>
-        <w:proofErr w:type="spellEnd"/>
       </w:hyperlink>
       <w:r>
         <w:rPr>
@@ -978,19 +948,8 @@
             <w:color w:val="auto"/>
             <w:u w:val="none"/>
           </w:rPr>
-          <w:t xml:space="preserve">Lal Bahadur Shastri Jr. College, </w:t>
+          <w:t>Lal Bahadur Shastri Jr. College, Bhandara</w:t>
         </w:r>
-        <w:proofErr w:type="spellStart"/>
-        <w:r>
-          <w:rPr>
-            <w:rStyle w:val="Hyperlink"/>
-            <w:bCs/>
-            <w:color w:val="auto"/>
-            <w:u w:val="none"/>
-          </w:rPr>
-          <w:t>Bhandara</w:t>
-        </w:r>
-        <w:proofErr w:type="spellEnd"/>
       </w:hyperlink>
       <w:r>
         <w:rPr>
@@ -1212,7 +1171,6 @@
           </w:rPr>
           <w:t xml:space="preserve">tack Cloud </w:t>
         </w:r>
-        <w:proofErr w:type="gramStart"/>
         <w:r>
           <w:rPr>
             <w:rStyle w:val="Hyperlink"/>
@@ -1221,7 +1179,17 @@
             <w:color w:val="auto"/>
             <w:u w:val="none"/>
           </w:rPr>
-          <w:t>developer)</w:t>
+          <w:t>D</w:t>
+        </w:r>
+        <w:r>
+          <w:rPr>
+            <w:rStyle w:val="Hyperlink"/>
+            <w:b/>
+            <w:bCs/>
+            <w:color w:val="auto"/>
+            <w:u w:val="none"/>
+          </w:rPr>
+          <w:t>eveloper)</w:t>
         </w:r>
         <w:r>
           <w:rPr>
@@ -1231,32 +1199,13 @@
           </w:rPr>
           <w:t>|</w:t>
         </w:r>
-        <w:proofErr w:type="gramEnd"/>
         <w:r>
           <w:rPr>
             <w:rStyle w:val="Hyperlink"/>
             <w:color w:val="auto"/>
             <w:u w:val="none"/>
           </w:rPr>
-          <w:t xml:space="preserve"> </w:t>
-        </w:r>
-        <w:proofErr w:type="spellStart"/>
-        <w:r>
-          <w:rPr>
-            <w:rStyle w:val="Hyperlink"/>
-            <w:color w:val="auto"/>
-            <w:u w:val="none"/>
-          </w:rPr>
-          <w:t>TutorD</w:t>
-        </w:r>
-        <w:proofErr w:type="spellEnd"/>
-        <w:r>
-          <w:rPr>
-            <w:rStyle w:val="Hyperlink"/>
-            <w:color w:val="auto"/>
-            <w:u w:val="none"/>
-          </w:rPr>
-          <w:t xml:space="preserve"> LLC (U.S.), remote </w:t>
+          <w:t xml:space="preserve"> TutorD LLC (U.S.), remote </w:t>
         </w:r>
         <w:r>
           <w:rPr>
@@ -1360,14 +1309,12 @@
         </w:rPr>
         <w:t>(</w:t>
       </w:r>
-      <w:proofErr w:type="spellStart"/>
       <w:r>
         <w:rPr>
           <w:color w:val="auto"/>
         </w:rPr>
         <w:t>TutorD</w:t>
       </w:r>
-      <w:proofErr w:type="spellEnd"/>
       <w:r>
         <w:rPr>
           <w:color w:val="auto"/>
@@ -1447,23 +1394,7 @@
           <w:color w:val="auto"/>
           <w:szCs w:val="20"/>
         </w:rPr>
-        <w:t xml:space="preserve"> from AWS </w:t>
-      </w:r>
-      <w:proofErr w:type="spellStart"/>
-      <w:r>
-        <w:rPr>
-          <w:color w:val="auto"/>
-          <w:szCs w:val="20"/>
-        </w:rPr>
-        <w:t>CodeBuild</w:t>
-      </w:r>
-      <w:proofErr w:type="spellEnd"/>
-      <w:r>
-        <w:rPr>
-          <w:color w:val="auto"/>
-          <w:szCs w:val="20"/>
-        </w:rPr>
-        <w:t xml:space="preserve"> to GitHub Actions</w:t>
+        <w:t xml:space="preserve"> from AWS CodeBuild to GitHub Actions</w:t>
       </w:r>
       <w:r>
         <w:rPr>
@@ -1648,35 +1579,102 @@
           <w:color w:val="auto"/>
           <w:szCs w:val="20"/>
         </w:rPr>
-        <w:t xml:space="preserve">Removed NAT Gateways from </w:t>
-      </w:r>
-      <w:r>
-        <w:rPr>
-          <w:color w:val="auto"/>
-          <w:szCs w:val="20"/>
-        </w:rPr>
-        <w:t xml:space="preserve">public subnets of all </w:t>
-      </w:r>
-      <w:r>
-        <w:rPr>
-          <w:color w:val="auto"/>
-          <w:szCs w:val="20"/>
-        </w:rPr>
-        <w:t xml:space="preserve">environments </w:t>
-      </w:r>
-      <w:r>
-        <w:rPr>
-          <w:color w:val="auto"/>
-          <w:szCs w:val="20"/>
-        </w:rPr>
-        <w:t xml:space="preserve">(including production) </w:t>
-      </w:r>
-      <w:r>
-        <w:rPr>
-          <w:color w:val="auto"/>
-          <w:szCs w:val="20"/>
-        </w:rPr>
-        <w:t>to reduce costs</w:t>
+        <w:t xml:space="preserve">Removed </w:t>
+      </w:r>
+      <w:r>
+        <w:rPr>
+          <w:color w:val="auto"/>
+          <w:szCs w:val="20"/>
+        </w:rPr>
+        <w:t xml:space="preserve">unused </w:t>
+      </w:r>
+      <w:r>
+        <w:rPr>
+          <w:color w:val="auto"/>
+          <w:szCs w:val="20"/>
+        </w:rPr>
+        <w:t xml:space="preserve">NAT Gateways </w:t>
+      </w:r>
+      <w:r>
+        <w:rPr>
+          <w:color w:val="auto"/>
+          <w:szCs w:val="20"/>
+        </w:rPr>
+        <w:t xml:space="preserve">across </w:t>
+      </w:r>
+      <w:r>
+        <w:rPr>
+          <w:color w:val="auto"/>
+          <w:szCs w:val="20"/>
+        </w:rPr>
+        <w:t>production</w:t>
+      </w:r>
+      <w:r>
+        <w:rPr>
+          <w:color w:val="auto"/>
+          <w:szCs w:val="20"/>
+        </w:rPr>
+        <w:t xml:space="preserve"> and </w:t>
+      </w:r>
+      <w:r>
+        <w:rPr>
+          <w:color w:val="auto"/>
+          <w:szCs w:val="20"/>
+        </w:rPr>
+        <w:t xml:space="preserve">lower </w:t>
+      </w:r>
+      <w:r>
+        <w:rPr>
+          <w:color w:val="auto"/>
+          <w:szCs w:val="20"/>
+        </w:rPr>
+        <w:t>environments</w:t>
+      </w:r>
+      <w:r>
+        <w:rPr>
+          <w:color w:val="auto"/>
+          <w:szCs w:val="20"/>
+        </w:rPr>
+        <w:t xml:space="preserve"> </w:t>
+      </w:r>
+      <w:r>
+        <w:rPr>
+          <w:b/>
+          <w:bCs/>
+          <w:color w:val="auto"/>
+          <w:szCs w:val="20"/>
+        </w:rPr>
+        <w:t xml:space="preserve">saving </w:t>
+      </w:r>
+      <w:r>
+        <w:rPr>
+          <w:b/>
+          <w:bCs/>
+          <w:color w:val="auto"/>
+          <w:szCs w:val="20"/>
+        </w:rPr>
+        <w:t>~$3,000 USD</w:t>
+      </w:r>
+      <w:r>
+        <w:rPr>
+          <w:color w:val="auto"/>
+          <w:szCs w:val="20"/>
+        </w:rPr>
+        <w:t xml:space="preserve"> in annual </w:t>
+      </w:r>
+      <w:r>
+        <w:rPr>
+          <w:color w:val="auto"/>
+          <w:szCs w:val="20"/>
+        </w:rPr>
+        <w:t xml:space="preserve">infra </w:t>
+      </w:r>
+      <w:r>
+        <w:rPr>
+          <w:color w:val="auto"/>
+          <w:szCs w:val="20"/>
+        </w:rPr>
+        <w:t>costs</w:t>
       </w:r>
       <w:r>
         <w:rPr>
@@ -2513,7 +2511,6 @@
         <w:t xml:space="preserve"> | </w:t>
       </w:r>
       <w:hyperlink r:id="rId27" w:history="1">
-        <w:proofErr w:type="spellStart"/>
         <w:r>
           <w:rPr>
             <w:rStyle w:val="Hyperlink"/>
@@ -2522,7 +2519,6 @@
           </w:rPr>
           <w:t>Hazirs</w:t>
         </w:r>
-        <w:proofErr w:type="spellEnd"/>
         <w:r>
           <w:rPr>
             <w:rStyle w:val="Hyperlink"/>
@@ -2603,19 +2599,11 @@
         </w:rPr>
         <w:t>(</w:t>
       </w:r>
-      <w:proofErr w:type="spellStart"/>
-      <w:r>
-        <w:rPr>
-          <w:color w:val="auto"/>
-        </w:rPr>
-        <w:t>Hazirs</w:t>
-      </w:r>
-      <w:proofErr w:type="spellEnd"/>
-      <w:r>
-        <w:rPr>
-          <w:color w:val="auto"/>
-        </w:rPr>
-        <w:t xml:space="preserve"> is an early-stage start</w:t>
+      <w:r>
+        <w:rPr>
+          <w:color w:val="auto"/>
+        </w:rPr>
+        <w:t>Hazirs is an early-stage start</w:t>
       </w:r>
       <w:r>
         <w:rPr>
@@ -2737,7 +2725,6 @@
         </w:rPr>
         <w:t xml:space="preserve"> </w:t>
       </w:r>
-      <w:proofErr w:type="spellStart"/>
       <w:r>
         <w:rPr>
           <w:color w:val="auto"/>
@@ -2745,7 +2732,6 @@
         </w:rPr>
         <w:t>Hazirs</w:t>
       </w:r>
-      <w:proofErr w:type="spellEnd"/>
       <w:r>
         <w:rPr>
           <w:color w:val="auto"/>
@@ -2969,7 +2955,6 @@
         </w:rPr>
       </w:pPr>
       <w:hyperlink r:id="rId28" w:history="1">
-        <w:proofErr w:type="spellStart"/>
         <w:r>
           <w:rPr>
             <w:rStyle w:val="Hyperlink"/>
@@ -2978,18 +2963,7 @@
             <w:color w:val="auto"/>
             <w:u w:val="none"/>
           </w:rPr>
-          <w:t>Catima</w:t>
-        </w:r>
-        <w:proofErr w:type="spellEnd"/>
-        <w:r>
-          <w:rPr>
-            <w:rStyle w:val="Hyperlink"/>
-            <w:b/>
-            <w:bCs/>
-            <w:color w:val="auto"/>
-            <w:u w:val="none"/>
-          </w:rPr>
-          <w:t xml:space="preserve"> Loyalty </w:t>
+          <w:t xml:space="preserve">Catima Loyalty </w:t>
         </w:r>
         <w:r>
           <w:rPr>
@@ -3067,21 +3041,7 @@
         <w:rPr>
           <w:color w:val="auto"/>
         </w:rPr>
-        <w:t>(</w:t>
-      </w:r>
-      <w:proofErr w:type="spellStart"/>
-      <w:r>
-        <w:rPr>
-          <w:color w:val="auto"/>
-        </w:rPr>
-        <w:t>Catima</w:t>
-      </w:r>
-      <w:proofErr w:type="spellEnd"/>
-      <w:r>
-        <w:rPr>
-          <w:color w:val="auto"/>
-        </w:rPr>
-        <w:t xml:space="preserve"> is a</w:t>
+        <w:t>(Catima is a</w:t>
       </w:r>
       <w:r>
         <w:rPr>
@@ -3244,21 +3204,7 @@
         <w:rPr>
           <w:color w:val="auto"/>
         </w:rPr>
-        <w:t xml:space="preserve">multiple interfaces, and </w:t>
-      </w:r>
-      <w:proofErr w:type="spellStart"/>
-      <w:r>
-        <w:rPr>
-          <w:color w:val="auto"/>
-        </w:rPr>
-        <w:t>enums</w:t>
-      </w:r>
-      <w:proofErr w:type="spellEnd"/>
-      <w:r>
-        <w:rPr>
-          <w:color w:val="auto"/>
-        </w:rPr>
-        <w:t xml:space="preserve"> to </w:t>
+        <w:t xml:space="preserve">multiple interfaces, and enums to </w:t>
       </w:r>
       <w:r>
         <w:rPr>
@@ -4096,7 +4042,6 @@
         </w:rPr>
         <w:t xml:space="preserve"> and web scraping </w:t>
       </w:r>
-      <w:proofErr w:type="spellStart"/>
       <w:r>
         <w:rPr>
           <w:b/>
@@ -4105,7 +4050,6 @@
         </w:rPr>
         <w:t>Zerodha’s</w:t>
       </w:r>
-      <w:proofErr w:type="spellEnd"/>
       <w:r>
         <w:rPr>
           <w:color w:val="auto"/>
@@ -5118,7 +5062,6 @@
         </w:rPr>
         <w:t xml:space="preserve">% </w:t>
       </w:r>
-      <w:proofErr w:type="spellStart"/>
       <w:r>
         <w:rPr>
           <w:color w:val="auto"/>
@@ -5133,7 +5076,6 @@
         </w:rPr>
         <w:t>r</w:t>
       </w:r>
-      <w:proofErr w:type="spellEnd"/>
       <w:r>
         <w:rPr>
           <w:color w:val="auto"/>
@@ -5418,42 +5360,42 @@
         <v:path o:extrusionok="f" gradientshapeok="t" o:connecttype="rect"/>
         <o:lock v:ext="edit" aspectratio="t"/>
       </v:shapetype>
-      <v:shape id="_x0000_i1116" type="#_x0000_t75" style="width:512.25pt;height:512.25pt;rotation:180;flip:x y;visibility:visible;mso-wrap-style:square" o:bullet="t">
+      <v:shape id="_x0000_i1176" type="#_x0000_t75" style="width:512.4pt;height:512.4pt;rotation:180;flip:x y;visibility:visible;mso-wrap-style:square" o:bullet="t">
         <v:imagedata r:id="rId1" o:title="107161_circle_github_icon"/>
       </v:shape>
     </w:pict>
   </w:numPicBullet>
   <w:numPicBullet w:numPicBulletId="1">
     <w:pict>
-      <v:shape id="_x0000_i1117" type="#_x0000_t75" style="width:168.75pt;height:168.75pt;visibility:visible;mso-wrap-style:square" o:bullet="t">
+      <v:shape id="_x0000_i1177" type="#_x0000_t75" style="width:168.6pt;height:168.6pt;visibility:visible;mso-wrap-style:square" o:bullet="t">
         <v:imagedata r:id="rId2" o:title="941C13C7"/>
       </v:shape>
     </w:pict>
   </w:numPicBullet>
   <w:numPicBullet w:numPicBulletId="2">
     <w:pict>
-      <v:shape id="_x0000_i1118" type="#_x0000_t75" style="width:28.5pt;height:16.5pt;visibility:visible;mso-wrap-style:square" o:bullet="t">
+      <v:shape id="_x0000_i1178" type="#_x0000_t75" style="width:28.8pt;height:16.2pt;visibility:visible;mso-wrap-style:square" o:bullet="t">
         <v:imagedata r:id="rId3" o:title="107161_circle_github_icon"/>
       </v:shape>
     </w:pict>
   </w:numPicBullet>
   <w:numPicBullet w:numPicBulletId="3">
     <w:pict>
-      <v:shape id="_x0000_i1119" type="#_x0000_t75" style="width:240pt;height:234pt;visibility:visible;mso-wrap-style:square" o:bullet="t">
+      <v:shape id="_x0000_i1179" type="#_x0000_t75" style="width:240pt;height:234pt;visibility:visible;mso-wrap-style:square" o:bullet="t">
         <v:imagedata r:id="rId4" o:title="Indian_Institute_of_Technology_Bombay_Logo"/>
       </v:shape>
     </w:pict>
   </w:numPicBullet>
   <w:numPicBullet w:numPicBulletId="4">
     <w:pict>
-      <v:shape id="_x0000_i1120" type="#_x0000_t75" style="width:23.25pt;height:16.5pt;visibility:visible;mso-wrap-style:square" o:bullet="t">
+      <v:shape id="_x0000_i1180" type="#_x0000_t75" style="width:23.4pt;height:16.2pt;visibility:visible;mso-wrap-style:square" o:bullet="t">
         <v:imagedata r:id="rId5" o:title="Indian_Institute_of_Technology_Bombay_Logo"/>
       </v:shape>
     </w:pict>
   </w:numPicBullet>
   <w:numPicBullet w:numPicBulletId="5">
     <w:pict>
-      <v:shape id="_x0000_i1121" type="#_x0000_t75" style="width:75.75pt;height:75.75pt;visibility:visible;mso-wrap-style:square" o:bullet="t">
+      <v:shape id="_x0000_i1181" type="#_x0000_t75" style="width:75.6pt;height:75.6pt;visibility:visible;mso-wrap-style:square" o:bullet="t">
         <v:imagedata r:id="rId6" o:title=""/>
       </v:shape>
     </w:pict>

</xml_diff>

<commit_message>
[parasji] Brought Education section down
</commit_message>
<xml_diff>
--- a/Resume_latest - Copy.docx
+++ b/Resume_latest - Copy.docx
@@ -190,7 +190,25 @@
             <w:color w:val="auto"/>
             <w:u w:val="none"/>
           </w:rPr>
-          <w:t xml:space="preserve">ub.com/PrathameshBhagat </w:t>
+          <w:t>ub.com/</w:t>
+        </w:r>
+        <w:proofErr w:type="spellStart"/>
+        <w:r>
+          <w:rPr>
+            <w:rStyle w:val="Hyperlink"/>
+            <w:color w:val="auto"/>
+            <w:u w:val="none"/>
+          </w:rPr>
+          <w:t>PrathameshBhagat</w:t>
+        </w:r>
+        <w:proofErr w:type="spellEnd"/>
+        <w:r>
+          <w:rPr>
+            <w:rStyle w:val="Hyperlink"/>
+            <w:color w:val="auto"/>
+            <w:u w:val="none"/>
+          </w:rPr>
+          <w:t xml:space="preserve"> </w:t>
         </w:r>
       </w:hyperlink>
     </w:p>
@@ -632,8 +650,20 @@
             <w:u w:val="none"/>
             <w:shd w:val="clear" w:color="auto" w:fill="FFFFFF"/>
           </w:rPr>
-          <w:t>n.com/in/prathameshvivekbhagat</w:t>
+          <w:t>n.com/in/</w:t>
         </w:r>
+        <w:proofErr w:type="spellStart"/>
+        <w:r>
+          <w:rPr>
+            <w:rStyle w:val="Hyperlink"/>
+            <w:bCs/>
+            <w:color w:val="auto"/>
+            <w:u w:val="none"/>
+            <w:shd w:val="clear" w:color="auto" w:fill="FFFFFF"/>
+          </w:rPr>
+          <w:t>prathameshvivekbhagat</w:t>
+        </w:r>
+        <w:proofErr w:type="spellEnd"/>
       </w:hyperlink>
       <w:r>
         <w:rPr>
@@ -762,336 +792,6 @@
         <w:ind w:right="0"/>
         <w:jc w:val="center"/>
         <w:rPr>
-          <w:b/>
-          <w:bCs/>
-          <w:color w:val="auto"/>
-          <w:sz w:val="24"/>
-          <w:szCs w:val="24"/>
-        </w:rPr>
-      </w:pPr>
-      <w:r>
-        <w:rPr>
-          <w:b/>
-          <w:bCs/>
-          <w:color w:val="auto"/>
-          <w:sz w:val="24"/>
-          <w:szCs w:val="24"/>
-        </w:rPr>
-        <w:t>Education</w:t>
-      </w:r>
-    </w:p>
-    <w:p>
-      <w:pPr>
-        <w:pBdr>
-          <w:bottom w:val="single" w:sz="6" w:space="1" w:color="auto"/>
-        </w:pBdr>
-        <w:tabs>
-          <w:tab w:val="right" w:pos="10490"/>
-        </w:tabs>
-        <w:spacing w:line="240" w:lineRule="auto"/>
-        <w:ind w:right="0"/>
-        <w:rPr>
-          <w:color w:val="auto"/>
-        </w:rPr>
-      </w:pPr>
-      <w:hyperlink r:id="rId20" w:history="1">
-        <w:r>
-          <w:rPr>
-            <w:rStyle w:val="Hyperlink"/>
-            <w:color w:val="auto"/>
-            <w:u w:val="none"/>
-          </w:rPr>
-          <w:t>Bajaj Institute of Technology, Wardha</w:t>
-        </w:r>
-      </w:hyperlink>
-      <w:r>
-        <w:rPr>
-          <w:rStyle w:val="Hyperlink"/>
-          <w:color w:val="auto"/>
-          <w:u w:val="none"/>
-        </w:rPr>
-        <w:t xml:space="preserve"> </w:t>
-      </w:r>
-      <w:r>
-        <w:rPr>
-          <w:bCs/>
-          <w:color w:val="auto"/>
-        </w:rPr>
-        <w:t>–</w:t>
-      </w:r>
-      <w:r>
-        <w:rPr>
-          <w:color w:val="auto"/>
-        </w:rPr>
-        <w:t xml:space="preserve"> </w:t>
-      </w:r>
-      <w:r>
-        <w:rPr>
-          <w:b/>
-          <w:i/>
-          <w:iCs/>
-          <w:color w:val="auto"/>
-        </w:rPr>
-        <w:t>B. Tech.</w:t>
-      </w:r>
-      <w:r>
-        <w:rPr>
-          <w:bCs/>
-          <w:color w:val="auto"/>
-        </w:rPr>
-        <w:t xml:space="preserve"> (</w:t>
-      </w:r>
-      <w:r>
-        <w:rPr>
-          <w:bCs/>
-          <w:i/>
-          <w:iCs/>
-          <w:color w:val="auto"/>
-        </w:rPr>
-        <w:t>Computer Engineering</w:t>
-      </w:r>
-      <w:r>
-        <w:rPr>
-          <w:bCs/>
-          <w:color w:val="auto"/>
-        </w:rPr>
-        <w:t>) [</w:t>
-      </w:r>
-      <w:hyperlink r:id="rId21" w:history="1">
-        <w:r>
-          <w:rPr>
-            <w:rStyle w:val="Hyperlink"/>
-            <w:bCs/>
-            <w:color w:val="auto"/>
-          </w:rPr>
-          <w:t>DBATU</w:t>
-        </w:r>
-      </w:hyperlink>
-      <w:r>
-        <w:rPr>
-          <w:bCs/>
-          <w:color w:val="auto"/>
-        </w:rPr>
-        <w:t>]</w:t>
-      </w:r>
-      <w:r>
-        <w:rPr>
-          <w:bCs/>
-          <w:color w:val="auto"/>
-        </w:rPr>
-        <w:tab/>
-        <w:t xml:space="preserve"> 202</w:t>
-      </w:r>
-      <w:r>
-        <w:rPr>
-          <w:bCs/>
-          <w:color w:val="auto"/>
-        </w:rPr>
-        <w:t>0</w:t>
-      </w:r>
-      <w:r>
-        <w:rPr>
-          <w:bCs/>
-          <w:color w:val="auto"/>
-        </w:rPr>
-        <w:t xml:space="preserve"> </w:t>
-      </w:r>
-      <w:r>
-        <w:rPr>
-          <w:bCs/>
-          <w:color w:val="auto"/>
-        </w:rPr>
-        <w:t>-</w:t>
-      </w:r>
-      <w:r>
-        <w:rPr>
-          <w:bCs/>
-          <w:color w:val="auto"/>
-        </w:rPr>
-        <w:t xml:space="preserve"> </w:t>
-      </w:r>
-      <w:r>
-        <w:rPr>
-          <w:bCs/>
-          <w:color w:val="auto"/>
-        </w:rPr>
-        <w:t xml:space="preserve">Aug </w:t>
-      </w:r>
-      <w:r>
-        <w:rPr>
-          <w:bCs/>
-          <w:color w:val="auto"/>
-        </w:rPr>
-        <w:t>2024</w:t>
-      </w:r>
-    </w:p>
-    <w:p>
-      <w:pPr>
-        <w:pBdr>
-          <w:bottom w:val="single" w:sz="6" w:space="1" w:color="auto"/>
-        </w:pBdr>
-        <w:tabs>
-          <w:tab w:val="right" w:pos="10490"/>
-        </w:tabs>
-        <w:spacing w:line="240" w:lineRule="auto"/>
-        <w:ind w:right="0"/>
-        <w:rPr>
-          <w:bCs/>
-          <w:color w:val="auto"/>
-        </w:rPr>
-      </w:pPr>
-      <w:hyperlink r:id="rId22" w:history="1">
-        <w:r>
-          <w:rPr>
-            <w:rStyle w:val="Hyperlink"/>
-            <w:bCs/>
-            <w:color w:val="auto"/>
-            <w:u w:val="none"/>
-          </w:rPr>
-          <w:t>Lal Bahadur Shastri Jr. College, Bhandara</w:t>
-        </w:r>
-      </w:hyperlink>
-      <w:r>
-        <w:rPr>
-          <w:rStyle w:val="Hyperlink"/>
-          <w:bCs/>
-          <w:color w:val="auto"/>
-          <w:u w:val="none"/>
-        </w:rPr>
-        <w:t xml:space="preserve"> </w:t>
-      </w:r>
-      <w:r>
-        <w:rPr>
-          <w:bCs/>
-          <w:color w:val="auto"/>
-        </w:rPr>
-        <w:t>–</w:t>
-      </w:r>
-      <w:r>
-        <w:rPr>
-          <w:color w:val="auto"/>
-        </w:rPr>
-        <w:t xml:space="preserve"> </w:t>
-      </w:r>
-      <w:r>
-        <w:rPr>
-          <w:b/>
-          <w:bCs/>
-          <w:i/>
-          <w:iCs/>
-          <w:color w:val="auto"/>
-        </w:rPr>
-        <w:t>12</w:t>
-      </w:r>
-      <w:r>
-        <w:rPr>
-          <w:b/>
-          <w:bCs/>
-          <w:i/>
-          <w:iCs/>
-          <w:color w:val="auto"/>
-          <w:vertAlign w:val="superscript"/>
-        </w:rPr>
-        <w:t>th</w:t>
-      </w:r>
-      <w:r>
-        <w:rPr>
-          <w:b/>
-          <w:bCs/>
-          <w:i/>
-          <w:iCs/>
-          <w:color w:val="auto"/>
-        </w:rPr>
-        <w:t xml:space="preserve"> std. </w:t>
-      </w:r>
-      <w:r>
-        <w:rPr>
-          <w:i/>
-          <w:iCs/>
-          <w:color w:val="auto"/>
-        </w:rPr>
-        <w:t xml:space="preserve">(PCMB + IT) </w:t>
-      </w:r>
-      <w:r>
-        <w:rPr>
-          <w:color w:val="auto"/>
-        </w:rPr>
-        <w:t>[</w:t>
-      </w:r>
-      <w:hyperlink r:id="rId23" w:history="1">
-        <w:r>
-          <w:rPr>
-            <w:rStyle w:val="Hyperlink"/>
-            <w:color w:val="auto"/>
-          </w:rPr>
-          <w:t>Maharashtra State Board</w:t>
-        </w:r>
-      </w:hyperlink>
-      <w:r>
-        <w:rPr>
-          <w:color w:val="auto"/>
-        </w:rPr>
-        <w:t>]</w:t>
-      </w:r>
-      <w:r>
-        <w:rPr>
-          <w:bCs/>
-          <w:color w:val="auto"/>
-        </w:rPr>
-        <w:tab/>
-        <w:t xml:space="preserve"> 201</w:t>
-      </w:r>
-      <w:r>
-        <w:rPr>
-          <w:bCs/>
-          <w:color w:val="auto"/>
-        </w:rPr>
-        <w:t>9</w:t>
-      </w:r>
-      <w:r>
-        <w:rPr>
-          <w:bCs/>
-          <w:color w:val="auto"/>
-        </w:rPr>
-        <w:t xml:space="preserve"> </w:t>
-      </w:r>
-      <w:r>
-        <w:rPr>
-          <w:bCs/>
-          <w:color w:val="auto"/>
-        </w:rPr>
-        <w:t>-</w:t>
-      </w:r>
-      <w:r>
-        <w:rPr>
-          <w:bCs/>
-          <w:color w:val="auto"/>
-        </w:rPr>
-        <w:t xml:space="preserve"> Feb 2020</w:t>
-      </w:r>
-    </w:p>
-    <w:p>
-      <w:pPr>
-        <w:pBdr>
-          <w:bottom w:val="single" w:sz="6" w:space="1" w:color="auto"/>
-        </w:pBdr>
-        <w:tabs>
-          <w:tab w:val="right" w:pos="10490"/>
-        </w:tabs>
-        <w:spacing w:line="240" w:lineRule="auto"/>
-        <w:ind w:right="0"/>
-        <w:rPr>
-          <w:bCs/>
-          <w:color w:val="auto"/>
-        </w:rPr>
-      </w:pPr>
-    </w:p>
-    <w:p>
-      <w:pPr>
-        <w:spacing w:line="240" w:lineRule="auto"/>
-        <w:ind w:right="0"/>
-        <w:jc w:val="center"/>
-        <w:rPr>
           <w:rFonts w:cstheme="minorBidi"/>
           <w:color w:val="auto"/>
           <w:sz w:val="22"/>
@@ -1130,7 +830,7 @@
           <w:color w:val="auto"/>
         </w:rPr>
       </w:pPr>
-      <w:hyperlink r:id="rId24" w:history="1">
+      <w:hyperlink r:id="rId20" w:history="1">
         <w:r>
           <w:rPr>
             <w:rStyle w:val="Hyperlink"/>
@@ -1205,7 +905,25 @@
             <w:color w:val="auto"/>
             <w:u w:val="none"/>
           </w:rPr>
-          <w:t xml:space="preserve"> TutorD LLC (U.S.), remote </w:t>
+          <w:t xml:space="preserve"> </w:t>
+        </w:r>
+        <w:proofErr w:type="spellStart"/>
+        <w:r>
+          <w:rPr>
+            <w:rStyle w:val="Hyperlink"/>
+            <w:color w:val="auto"/>
+            <w:u w:val="none"/>
+          </w:rPr>
+          <w:t>TutorD</w:t>
+        </w:r>
+        <w:proofErr w:type="spellEnd"/>
+        <w:r>
+          <w:rPr>
+            <w:rStyle w:val="Hyperlink"/>
+            <w:color w:val="auto"/>
+            <w:u w:val="none"/>
+          </w:rPr>
+          <w:t xml:space="preserve"> LLC (U.S.), remote </w:t>
         </w:r>
         <w:r>
           <w:rPr>
@@ -1309,12 +1027,14 @@
         </w:rPr>
         <w:t>(</w:t>
       </w:r>
+      <w:proofErr w:type="spellStart"/>
       <w:r>
         <w:rPr>
           <w:color w:val="auto"/>
         </w:rPr>
         <w:t>TutorD</w:t>
       </w:r>
+      <w:proofErr w:type="spellEnd"/>
       <w:r>
         <w:rPr>
           <w:color w:val="auto"/>
@@ -1394,7 +1114,23 @@
           <w:color w:val="auto"/>
           <w:szCs w:val="20"/>
         </w:rPr>
-        <w:t xml:space="preserve"> from AWS CodeBuild to GitHub Actions</w:t>
+        <w:t xml:space="preserve"> from AWS </w:t>
+      </w:r>
+      <w:proofErr w:type="spellStart"/>
+      <w:r>
+        <w:rPr>
+          <w:color w:val="auto"/>
+          <w:szCs w:val="20"/>
+        </w:rPr>
+        <w:t>CodeBuild</w:t>
+      </w:r>
+      <w:proofErr w:type="spellEnd"/>
+      <w:r>
+        <w:rPr>
+          <w:color w:val="auto"/>
+          <w:szCs w:val="20"/>
+        </w:rPr>
+        <w:t xml:space="preserve"> to GitHub Actions</w:t>
       </w:r>
       <w:r>
         <w:rPr>
@@ -1918,7 +1654,7 @@
         </w:rPr>
         <w:t xml:space="preserve"> </w:t>
       </w:r>
-      <w:hyperlink r:id="rId25" w:history="1">
+      <w:hyperlink r:id="rId21" w:history="1">
         <w:r>
           <w:rPr>
             <w:rStyle w:val="Hyperlink"/>
@@ -2011,7 +1747,7 @@
           <w:color w:val="auto"/>
         </w:rPr>
       </w:pPr>
-      <w:hyperlink r:id="rId26" w:history="1">
+      <w:hyperlink r:id="rId22" w:history="1">
         <w:r>
           <w:rPr>
             <w:rStyle w:val="Hyperlink"/>
@@ -2510,7 +2246,8 @@
         </w:rPr>
         <w:t xml:space="preserve"> | </w:t>
       </w:r>
-      <w:hyperlink r:id="rId27" w:history="1">
+      <w:hyperlink r:id="rId23" w:history="1">
+        <w:proofErr w:type="spellStart"/>
         <w:r>
           <w:rPr>
             <w:rStyle w:val="Hyperlink"/>
@@ -2519,6 +2256,7 @@
           </w:rPr>
           <w:t>Hazirs</w:t>
         </w:r>
+        <w:proofErr w:type="spellEnd"/>
         <w:r>
           <w:rPr>
             <w:rStyle w:val="Hyperlink"/>
@@ -2599,11 +2337,19 @@
         </w:rPr>
         <w:t>(</w:t>
       </w:r>
-      <w:r>
-        <w:rPr>
-          <w:color w:val="auto"/>
-        </w:rPr>
-        <w:t>Hazirs is an early-stage start</w:t>
+      <w:proofErr w:type="spellStart"/>
+      <w:r>
+        <w:rPr>
+          <w:color w:val="auto"/>
+        </w:rPr>
+        <w:t>Hazirs</w:t>
+      </w:r>
+      <w:proofErr w:type="spellEnd"/>
+      <w:r>
+        <w:rPr>
+          <w:color w:val="auto"/>
+        </w:rPr>
+        <w:t xml:space="preserve"> is an early-stage start</w:t>
       </w:r>
       <w:r>
         <w:rPr>
@@ -2725,6 +2471,7 @@
         </w:rPr>
         <w:t xml:space="preserve"> </w:t>
       </w:r>
+      <w:proofErr w:type="spellStart"/>
       <w:r>
         <w:rPr>
           <w:color w:val="auto"/>
@@ -2732,6 +2479,7 @@
         </w:rPr>
         <w:t>Hazirs</w:t>
       </w:r>
+      <w:proofErr w:type="spellEnd"/>
       <w:r>
         <w:rPr>
           <w:color w:val="auto"/>
@@ -2954,7 +2702,8 @@
           <w:szCs w:val="18"/>
         </w:rPr>
       </w:pPr>
-      <w:hyperlink r:id="rId28" w:history="1">
+      <w:hyperlink r:id="rId24" w:history="1">
+        <w:proofErr w:type="spellStart"/>
         <w:r>
           <w:rPr>
             <w:rStyle w:val="Hyperlink"/>
@@ -2963,7 +2712,18 @@
             <w:color w:val="auto"/>
             <w:u w:val="none"/>
           </w:rPr>
-          <w:t xml:space="preserve">Catima Loyalty </w:t>
+          <w:t>Catima</w:t>
+        </w:r>
+        <w:proofErr w:type="spellEnd"/>
+        <w:r>
+          <w:rPr>
+            <w:rStyle w:val="Hyperlink"/>
+            <w:b/>
+            <w:bCs/>
+            <w:color w:val="auto"/>
+            <w:u w:val="none"/>
+          </w:rPr>
+          <w:t xml:space="preserve"> Loyalty </w:t>
         </w:r>
         <w:r>
           <w:rPr>
@@ -3041,7 +2801,21 @@
         <w:rPr>
           <w:color w:val="auto"/>
         </w:rPr>
-        <w:t>(Catima is a</w:t>
+        <w:t>(</w:t>
+      </w:r>
+      <w:proofErr w:type="spellStart"/>
+      <w:r>
+        <w:rPr>
+          <w:color w:val="auto"/>
+        </w:rPr>
+        <w:t>Catima</w:t>
+      </w:r>
+      <w:proofErr w:type="spellEnd"/>
+      <w:r>
+        <w:rPr>
+          <w:color w:val="auto"/>
+        </w:rPr>
+        <w:t xml:space="preserve"> is a</w:t>
       </w:r>
       <w:r>
         <w:rPr>
@@ -3204,7 +2978,21 @@
         <w:rPr>
           <w:color w:val="auto"/>
         </w:rPr>
-        <w:t xml:space="preserve">multiple interfaces, and enums to </w:t>
+        <w:t xml:space="preserve">multiple interfaces, and </w:t>
+      </w:r>
+      <w:proofErr w:type="spellStart"/>
+      <w:r>
+        <w:rPr>
+          <w:color w:val="auto"/>
+        </w:rPr>
+        <w:t>enums</w:t>
+      </w:r>
+      <w:proofErr w:type="spellEnd"/>
+      <w:r>
+        <w:rPr>
+          <w:color w:val="auto"/>
+        </w:rPr>
+        <w:t xml:space="preserve"> to </w:t>
       </w:r>
       <w:r>
         <w:rPr>
@@ -3379,7 +3167,7 @@
           <w:color w:val="auto"/>
         </w:rPr>
       </w:pPr>
-      <w:hyperlink r:id="rId29" w:history="1">
+      <w:hyperlink r:id="rId25" w:history="1">
         <w:r>
           <w:rPr>
             <w:rStyle w:val="Hyperlink"/>
@@ -3769,7 +3557,7 @@
           <w:color w:val="auto"/>
         </w:rPr>
       </w:pPr>
-      <w:hyperlink r:id="rId30" w:history="1">
+      <w:hyperlink r:id="rId26" w:history="1">
         <w:r>
           <w:rPr>
             <w:rStyle w:val="Hyperlink"/>
@@ -4042,6 +3830,7 @@
         </w:rPr>
         <w:t xml:space="preserve"> and web scraping </w:t>
       </w:r>
+      <w:proofErr w:type="spellStart"/>
       <w:r>
         <w:rPr>
           <w:b/>
@@ -4050,6 +3839,7 @@
         </w:rPr>
         <w:t>Zerodha’s</w:t>
       </w:r>
+      <w:proofErr w:type="spellEnd"/>
       <w:r>
         <w:rPr>
           <w:color w:val="auto"/>
@@ -4070,7 +3860,7 @@
           <w:color w:val="auto"/>
         </w:rPr>
       </w:pPr>
-      <w:hyperlink r:id="rId31" w:history="1">
+      <w:hyperlink r:id="rId27" w:history="1">
         <w:r>
           <w:rPr>
             <w:rStyle w:val="Hyperlink"/>
@@ -4988,6 +4778,306 @@
     <w:p>
       <w:pPr>
         <w:spacing w:line="240" w:lineRule="auto"/>
+        <w:ind w:right="0"/>
+        <w:jc w:val="center"/>
+        <w:rPr>
+          <w:b/>
+          <w:bCs/>
+          <w:color w:val="auto"/>
+          <w:sz w:val="24"/>
+          <w:szCs w:val="24"/>
+        </w:rPr>
+      </w:pPr>
+      <w:r>
+        <w:rPr>
+          <w:b/>
+          <w:bCs/>
+          <w:color w:val="auto"/>
+          <w:sz w:val="24"/>
+          <w:szCs w:val="24"/>
+        </w:rPr>
+        <w:t>Education</w:t>
+      </w:r>
+    </w:p>
+    <w:p>
+      <w:pPr>
+        <w:pBdr>
+          <w:bottom w:val="single" w:sz="6" w:space="1" w:color="auto"/>
+        </w:pBdr>
+        <w:tabs>
+          <w:tab w:val="right" w:pos="10490"/>
+        </w:tabs>
+        <w:spacing w:line="240" w:lineRule="auto"/>
+        <w:ind w:right="0"/>
+        <w:rPr>
+          <w:color w:val="auto"/>
+        </w:rPr>
+      </w:pPr>
+      <w:hyperlink r:id="rId28" w:history="1">
+        <w:r>
+          <w:rPr>
+            <w:rStyle w:val="Hyperlink"/>
+            <w:color w:val="auto"/>
+            <w:u w:val="none"/>
+          </w:rPr>
+          <w:t>Bajaj Institute of Technology, Wardha</w:t>
+        </w:r>
+      </w:hyperlink>
+      <w:r>
+        <w:rPr>
+          <w:rStyle w:val="Hyperlink"/>
+          <w:color w:val="auto"/>
+          <w:u w:val="none"/>
+        </w:rPr>
+        <w:t xml:space="preserve"> </w:t>
+      </w:r>
+      <w:r>
+        <w:rPr>
+          <w:bCs/>
+          <w:color w:val="auto"/>
+        </w:rPr>
+        <w:t>–</w:t>
+      </w:r>
+      <w:r>
+        <w:rPr>
+          <w:color w:val="auto"/>
+        </w:rPr>
+        <w:t xml:space="preserve"> </w:t>
+      </w:r>
+      <w:r>
+        <w:rPr>
+          <w:b/>
+          <w:i/>
+          <w:iCs/>
+          <w:color w:val="auto"/>
+        </w:rPr>
+        <w:t>B. Tech.</w:t>
+      </w:r>
+      <w:r>
+        <w:rPr>
+          <w:bCs/>
+          <w:color w:val="auto"/>
+        </w:rPr>
+        <w:t xml:space="preserve"> (</w:t>
+      </w:r>
+      <w:r>
+        <w:rPr>
+          <w:bCs/>
+          <w:i/>
+          <w:iCs/>
+          <w:color w:val="auto"/>
+        </w:rPr>
+        <w:t>Computer Engineering</w:t>
+      </w:r>
+      <w:r>
+        <w:rPr>
+          <w:bCs/>
+          <w:color w:val="auto"/>
+        </w:rPr>
+        <w:t>) [</w:t>
+      </w:r>
+      <w:hyperlink r:id="rId29" w:history="1">
+        <w:r>
+          <w:rPr>
+            <w:rStyle w:val="Hyperlink"/>
+            <w:bCs/>
+            <w:color w:val="auto"/>
+          </w:rPr>
+          <w:t>DBATU</w:t>
+        </w:r>
+      </w:hyperlink>
+      <w:r>
+        <w:rPr>
+          <w:bCs/>
+          <w:color w:val="auto"/>
+        </w:rPr>
+        <w:t>]</w:t>
+      </w:r>
+      <w:r>
+        <w:rPr>
+          <w:bCs/>
+          <w:color w:val="auto"/>
+        </w:rPr>
+        <w:tab/>
+        <w:t xml:space="preserve"> 2020 </w:t>
+      </w:r>
+      <w:r>
+        <w:rPr>
+          <w:bCs/>
+          <w:color w:val="auto"/>
+        </w:rPr>
+        <w:t>-</w:t>
+      </w:r>
+      <w:r>
+        <w:rPr>
+          <w:bCs/>
+          <w:color w:val="auto"/>
+        </w:rPr>
+        <w:t xml:space="preserve"> Aug 2024</w:t>
+      </w:r>
+    </w:p>
+    <w:p>
+      <w:pPr>
+        <w:pBdr>
+          <w:bottom w:val="single" w:sz="6" w:space="1" w:color="auto"/>
+        </w:pBdr>
+        <w:tabs>
+          <w:tab w:val="right" w:pos="10490"/>
+        </w:tabs>
+        <w:spacing w:line="240" w:lineRule="auto"/>
+        <w:ind w:right="0"/>
+        <w:rPr>
+          <w:bCs/>
+          <w:color w:val="auto"/>
+        </w:rPr>
+      </w:pPr>
+      <w:hyperlink r:id="rId30" w:history="1">
+        <w:r>
+          <w:rPr>
+            <w:rStyle w:val="Hyperlink"/>
+            <w:bCs/>
+            <w:color w:val="auto"/>
+            <w:u w:val="none"/>
+          </w:rPr>
+          <w:t xml:space="preserve">Lal Bahadur Shastri Jr. College, </w:t>
+        </w:r>
+        <w:proofErr w:type="spellStart"/>
+        <w:r>
+          <w:rPr>
+            <w:rStyle w:val="Hyperlink"/>
+            <w:bCs/>
+            <w:color w:val="auto"/>
+            <w:u w:val="none"/>
+          </w:rPr>
+          <w:t>Bhandara</w:t>
+        </w:r>
+        <w:proofErr w:type="spellEnd"/>
+      </w:hyperlink>
+      <w:r>
+        <w:rPr>
+          <w:rStyle w:val="Hyperlink"/>
+          <w:bCs/>
+          <w:color w:val="auto"/>
+          <w:u w:val="none"/>
+        </w:rPr>
+        <w:t xml:space="preserve"> </w:t>
+      </w:r>
+      <w:r>
+        <w:rPr>
+          <w:bCs/>
+          <w:color w:val="auto"/>
+        </w:rPr>
+        <w:t>–</w:t>
+      </w:r>
+      <w:r>
+        <w:rPr>
+          <w:color w:val="auto"/>
+        </w:rPr>
+        <w:t xml:space="preserve"> </w:t>
+      </w:r>
+      <w:r>
+        <w:rPr>
+          <w:b/>
+          <w:bCs/>
+          <w:i/>
+          <w:iCs/>
+          <w:color w:val="auto"/>
+        </w:rPr>
+        <w:t>12</w:t>
+      </w:r>
+      <w:r>
+        <w:rPr>
+          <w:b/>
+          <w:bCs/>
+          <w:i/>
+          <w:iCs/>
+          <w:color w:val="auto"/>
+          <w:vertAlign w:val="superscript"/>
+        </w:rPr>
+        <w:t>th</w:t>
+      </w:r>
+      <w:r>
+        <w:rPr>
+          <w:b/>
+          <w:bCs/>
+          <w:i/>
+          <w:iCs/>
+          <w:color w:val="auto"/>
+        </w:rPr>
+        <w:t xml:space="preserve"> std. </w:t>
+      </w:r>
+      <w:r>
+        <w:rPr>
+          <w:i/>
+          <w:iCs/>
+          <w:color w:val="auto"/>
+        </w:rPr>
+        <w:t xml:space="preserve">(PCMB + IT) </w:t>
+      </w:r>
+      <w:r>
+        <w:rPr>
+          <w:color w:val="auto"/>
+        </w:rPr>
+        <w:t>[</w:t>
+      </w:r>
+      <w:hyperlink r:id="rId31" w:history="1">
+        <w:r>
+          <w:rPr>
+            <w:rStyle w:val="Hyperlink"/>
+            <w:color w:val="auto"/>
+          </w:rPr>
+          <w:t>Maharashtra State Board</w:t>
+        </w:r>
+      </w:hyperlink>
+      <w:r>
+        <w:rPr>
+          <w:color w:val="auto"/>
+        </w:rPr>
+        <w:t>]</w:t>
+      </w:r>
+      <w:r>
+        <w:rPr>
+          <w:bCs/>
+          <w:color w:val="auto"/>
+        </w:rPr>
+        <w:tab/>
+        <w:t xml:space="preserve"> 2019 </w:t>
+      </w:r>
+      <w:r>
+        <w:rPr>
+          <w:bCs/>
+          <w:color w:val="auto"/>
+        </w:rPr>
+        <w:t>-</w:t>
+      </w:r>
+      <w:r>
+        <w:rPr>
+          <w:bCs/>
+          <w:color w:val="auto"/>
+        </w:rPr>
+        <w:t xml:space="preserve"> Feb 2020</w:t>
+      </w:r>
+    </w:p>
+    <w:p>
+      <w:pPr>
+        <w:pBdr>
+          <w:bottom w:val="single" w:sz="6" w:space="1" w:color="auto"/>
+        </w:pBdr>
+        <w:spacing w:line="240" w:lineRule="auto"/>
+        <w:ind w:right="0"/>
+        <w:jc w:val="both"/>
+        <w:rPr>
+          <w:b/>
+          <w:bCs/>
+          <w:color w:val="auto"/>
+          <w:sz w:val="22"/>
+          <w:szCs w:val="22"/>
+        </w:rPr>
+      </w:pPr>
+    </w:p>
+    <w:p>
+      <w:pPr>
+        <w:spacing w:line="240" w:lineRule="auto"/>
         <w:ind w:left="0" w:right="0" w:firstLine="0"/>
         <w:jc w:val="center"/>
         <w:rPr>
@@ -5062,6 +5152,7 @@
         </w:rPr>
         <w:t xml:space="preserve">% </w:t>
       </w:r>
+      <w:proofErr w:type="spellStart"/>
       <w:r>
         <w:rPr>
           <w:color w:val="auto"/>
@@ -5076,6 +5167,7 @@
         </w:rPr>
         <w:t>r</w:t>
       </w:r>
+      <w:proofErr w:type="spellEnd"/>
       <w:r>
         <w:rPr>
           <w:color w:val="auto"/>
@@ -5360,42 +5452,42 @@
         <v:path o:extrusionok="f" gradientshapeok="t" o:connecttype="rect"/>
         <o:lock v:ext="edit" aspectratio="t"/>
       </v:shapetype>
-      <v:shape id="_x0000_i1176" type="#_x0000_t75" style="width:512.4pt;height:512.4pt;rotation:180;flip:x y;visibility:visible;mso-wrap-style:square" o:bullet="t">
+      <v:shape id="_x0000_i1284" type="#_x0000_t75" style="width:512.4pt;height:512.4pt;rotation:180;flip:x y;visibility:visible;mso-wrap-style:square" o:bullet="t">
         <v:imagedata r:id="rId1" o:title="107161_circle_github_icon"/>
       </v:shape>
     </w:pict>
   </w:numPicBullet>
   <w:numPicBullet w:numPicBulletId="1">
     <w:pict>
-      <v:shape id="_x0000_i1177" type="#_x0000_t75" style="width:168.6pt;height:168.6pt;visibility:visible;mso-wrap-style:square" o:bullet="t">
+      <v:shape id="_x0000_i1285" type="#_x0000_t75" style="width:168.6pt;height:168.6pt;visibility:visible;mso-wrap-style:square" o:bullet="t">
         <v:imagedata r:id="rId2" o:title="941C13C7"/>
       </v:shape>
     </w:pict>
   </w:numPicBullet>
   <w:numPicBullet w:numPicBulletId="2">
     <w:pict>
-      <v:shape id="_x0000_i1178" type="#_x0000_t75" style="width:28.8pt;height:16.2pt;visibility:visible;mso-wrap-style:square" o:bullet="t">
+      <v:shape id="_x0000_i1286" type="#_x0000_t75" style="width:28.8pt;height:16.2pt;visibility:visible;mso-wrap-style:square" o:bullet="t">
         <v:imagedata r:id="rId3" o:title="107161_circle_github_icon"/>
       </v:shape>
     </w:pict>
   </w:numPicBullet>
   <w:numPicBullet w:numPicBulletId="3">
     <w:pict>
-      <v:shape id="_x0000_i1179" type="#_x0000_t75" style="width:240pt;height:234pt;visibility:visible;mso-wrap-style:square" o:bullet="t">
+      <v:shape id="_x0000_i1287" type="#_x0000_t75" style="width:240pt;height:234pt;visibility:visible;mso-wrap-style:square" o:bullet="t">
         <v:imagedata r:id="rId4" o:title="Indian_Institute_of_Technology_Bombay_Logo"/>
       </v:shape>
     </w:pict>
   </w:numPicBullet>
   <w:numPicBullet w:numPicBulletId="4">
     <w:pict>
-      <v:shape id="_x0000_i1180" type="#_x0000_t75" style="width:23.4pt;height:16.2pt;visibility:visible;mso-wrap-style:square" o:bullet="t">
+      <v:shape id="_x0000_i1288" type="#_x0000_t75" style="width:23.4pt;height:16.2pt;visibility:visible;mso-wrap-style:square" o:bullet="t">
         <v:imagedata r:id="rId5" o:title="Indian_Institute_of_Technology_Bombay_Logo"/>
       </v:shape>
     </w:pict>
   </w:numPicBullet>
   <w:numPicBullet w:numPicBulletId="5">
     <w:pict>
-      <v:shape id="_x0000_i1181" type="#_x0000_t75" style="width:75.6pt;height:75.6pt;visibility:visible;mso-wrap-style:square" o:bullet="t">
+      <v:shape id="_x0000_i1289" type="#_x0000_t75" style="width:75.6pt;height:75.6pt;visibility:visible;mso-wrap-style:square" o:bullet="t">
         <v:imagedata r:id="rId6" o:title=""/>
       </v:shape>
     </w:pict>

</xml_diff>

<commit_message>
[parasji] Skills section moved up
</commit_message>
<xml_diff>
--- a/Resume_latest - Copy.docx
+++ b/Resume_latest - Copy.docx
@@ -792,6 +792,324 @@
         <w:ind w:right="0"/>
         <w:jc w:val="center"/>
         <w:rPr>
+          <w:b/>
+          <w:bCs/>
+          <w:color w:val="auto"/>
+          <w:sz w:val="22"/>
+          <w:szCs w:val="22"/>
+        </w:rPr>
+      </w:pPr>
+      <w:r>
+        <w:rPr>
+          <w:b/>
+          <w:bCs/>
+          <w:color w:val="auto"/>
+          <w:sz w:val="24"/>
+          <w:szCs w:val="24"/>
+        </w:rPr>
+        <w:t>Skills</w:t>
+      </w:r>
+    </w:p>
+    <w:p>
+      <w:pPr>
+        <w:pStyle w:val="ListParagraph"/>
+        <w:numPr>
+          <w:ilvl w:val="0"/>
+          <w:numId w:val="32"/>
+        </w:numPr>
+        <w:spacing w:line="240" w:lineRule="auto"/>
+        <w:ind w:right="0"/>
+        <w:jc w:val="both"/>
+        <w:rPr>
+          <w:color w:val="auto"/>
+          <w:szCs w:val="20"/>
+        </w:rPr>
+      </w:pPr>
+      <w:r>
+        <w:rPr>
+          <w:i/>
+          <w:iCs/>
+          <w:color w:val="auto"/>
+          <w:szCs w:val="20"/>
+        </w:rPr>
+        <w:t>Primary programming language</w:t>
+      </w:r>
+      <w:r>
+        <w:rPr>
+          <w:b/>
+          <w:bCs/>
+          <w:color w:val="auto"/>
+          <w:szCs w:val="20"/>
+        </w:rPr>
+        <w:t>: Java</w:t>
+      </w:r>
+      <w:r>
+        <w:rPr>
+          <w:b/>
+          <w:bCs/>
+          <w:color w:val="auto"/>
+          <w:szCs w:val="20"/>
+        </w:rPr>
+        <w:t xml:space="preserve"> </w:t>
+      </w:r>
+      <w:r>
+        <w:rPr>
+          <w:color w:val="auto"/>
+          <w:szCs w:val="20"/>
+        </w:rPr>
+        <w:t>(Primary)</w:t>
+      </w:r>
+      <w:r>
+        <w:rPr>
+          <w:color w:val="auto"/>
+          <w:szCs w:val="20"/>
+        </w:rPr>
+        <w:t xml:space="preserve">, </w:t>
+      </w:r>
+      <w:r>
+        <w:rPr>
+          <w:color w:val="auto"/>
+          <w:szCs w:val="20"/>
+        </w:rPr>
+        <w:t>JavaScript, PHP, Python, and SQL.</w:t>
+      </w:r>
+    </w:p>
+    <w:p>
+      <w:pPr>
+        <w:pStyle w:val="ListParagraph"/>
+        <w:numPr>
+          <w:ilvl w:val="0"/>
+          <w:numId w:val="32"/>
+        </w:numPr>
+        <w:spacing w:line="240" w:lineRule="auto"/>
+        <w:ind w:right="0"/>
+        <w:jc w:val="both"/>
+        <w:rPr>
+          <w:color w:val="auto"/>
+          <w:sz w:val="18"/>
+        </w:rPr>
+      </w:pPr>
+      <w:r>
+        <w:rPr>
+          <w:i/>
+          <w:iCs/>
+          <w:color w:val="auto"/>
+          <w:szCs w:val="20"/>
+        </w:rPr>
+        <w:t>Domains</w:t>
+      </w:r>
+      <w:r>
+        <w:rPr>
+          <w:color w:val="auto"/>
+          <w:szCs w:val="20"/>
+        </w:rPr>
+        <w:t xml:space="preserve">: </w:t>
+      </w:r>
+      <w:r>
+        <w:rPr>
+          <w:color w:val="auto"/>
+          <w:szCs w:val="20"/>
+        </w:rPr>
+        <w:t>B</w:t>
+      </w:r>
+      <w:r>
+        <w:rPr>
+          <w:color w:val="auto"/>
+          <w:szCs w:val="20"/>
+        </w:rPr>
+        <w:t>ack</w:t>
+      </w:r>
+      <w:r>
+        <w:rPr>
+          <w:color w:val="auto"/>
+          <w:szCs w:val="20"/>
+        </w:rPr>
+        <w:t>en</w:t>
+      </w:r>
+      <w:r>
+        <w:rPr>
+          <w:color w:val="auto"/>
+          <w:szCs w:val="20"/>
+        </w:rPr>
+        <w:t xml:space="preserve">d </w:t>
+      </w:r>
+      <w:r>
+        <w:rPr>
+          <w:color w:val="auto"/>
+          <w:szCs w:val="20"/>
+        </w:rPr>
+        <w:t>Engineering</w:t>
+      </w:r>
+      <w:r>
+        <w:rPr>
+          <w:color w:val="auto"/>
+          <w:szCs w:val="20"/>
+        </w:rPr>
+        <w:t>, Android application development</w:t>
+      </w:r>
+      <w:r>
+        <w:rPr>
+          <w:b/>
+          <w:bCs/>
+          <w:color w:val="auto"/>
+          <w:szCs w:val="20"/>
+        </w:rPr>
+        <w:t xml:space="preserve">, </w:t>
+      </w:r>
+      <w:r>
+        <w:rPr>
+          <w:color w:val="auto"/>
+          <w:szCs w:val="20"/>
+        </w:rPr>
+        <w:t>Full</w:t>
+      </w:r>
+      <w:r>
+        <w:rPr>
+          <w:color w:val="auto"/>
+          <w:szCs w:val="20"/>
+        </w:rPr>
+        <w:t>-</w:t>
+      </w:r>
+      <w:r>
+        <w:rPr>
+          <w:color w:val="auto"/>
+          <w:szCs w:val="20"/>
+        </w:rPr>
+        <w:t>S</w:t>
+      </w:r>
+      <w:r>
+        <w:rPr>
+          <w:color w:val="auto"/>
+          <w:szCs w:val="20"/>
+        </w:rPr>
+        <w:t xml:space="preserve">tack </w:t>
+      </w:r>
+      <w:r>
+        <w:rPr>
+          <w:color w:val="auto"/>
+          <w:szCs w:val="20"/>
+        </w:rPr>
+        <w:t>W</w:t>
+      </w:r>
+      <w:r>
+        <w:rPr>
+          <w:color w:val="auto"/>
+          <w:szCs w:val="20"/>
+        </w:rPr>
+        <w:t>eb development.</w:t>
+      </w:r>
+    </w:p>
+    <w:p>
+      <w:pPr>
+        <w:pStyle w:val="ListParagraph"/>
+        <w:numPr>
+          <w:ilvl w:val="0"/>
+          <w:numId w:val="32"/>
+        </w:numPr>
+        <w:spacing w:line="240" w:lineRule="auto"/>
+        <w:ind w:right="0"/>
+        <w:jc w:val="both"/>
+        <w:rPr>
+          <w:bCs/>
+          <w:color w:val="auto"/>
+          <w:szCs w:val="20"/>
+        </w:rPr>
+      </w:pPr>
+      <w:r>
+        <w:rPr>
+          <w:i/>
+          <w:iCs/>
+          <w:color w:val="auto"/>
+          <w:szCs w:val="20"/>
+        </w:rPr>
+        <w:t>Technologies</w:t>
+      </w:r>
+      <w:r>
+        <w:rPr>
+          <w:i/>
+          <w:iCs/>
+          <w:color w:val="auto"/>
+          <w:szCs w:val="20"/>
+        </w:rPr>
+        <w:t xml:space="preserve"> worked with</w:t>
+      </w:r>
+      <w:r>
+        <w:rPr>
+          <w:i/>
+          <w:iCs/>
+          <w:color w:val="auto"/>
+          <w:szCs w:val="20"/>
+        </w:rPr>
+        <w:t xml:space="preserve">: </w:t>
+      </w:r>
+      <w:r>
+        <w:rPr>
+          <w:color w:val="auto"/>
+          <w:szCs w:val="20"/>
+        </w:rPr>
+        <w:t>GitHub Actions</w:t>
+      </w:r>
+      <w:r>
+        <w:rPr>
+          <w:color w:val="auto"/>
+          <w:szCs w:val="20"/>
+        </w:rPr>
+        <w:t xml:space="preserve">, </w:t>
+      </w:r>
+      <w:r>
+        <w:rPr>
+          <w:color w:val="auto"/>
+          <w:szCs w:val="20"/>
+        </w:rPr>
+        <w:t>REST APIs,</w:t>
+      </w:r>
+      <w:r>
+        <w:rPr>
+          <w:b/>
+          <w:bCs/>
+          <w:color w:val="auto"/>
+          <w:szCs w:val="20"/>
+        </w:rPr>
+        <w:t xml:space="preserve"> </w:t>
+      </w:r>
+      <w:r>
+        <w:rPr>
+          <w:color w:val="auto"/>
+          <w:szCs w:val="20"/>
+        </w:rPr>
+        <w:t>AWS, Docker, Postman, Ubuntu (Linux),</w:t>
+      </w:r>
+      <w:r>
+        <w:rPr>
+          <w:color w:val="auto"/>
+        </w:rPr>
+        <w:t xml:space="preserve"> React, Firebase real-time database, MySQL, and MySQL Workbench.</w:t>
+      </w:r>
+    </w:p>
+    <w:p>
+      <w:pPr>
+        <w:pBdr>
+          <w:bottom w:val="single" w:sz="6" w:space="1" w:color="auto"/>
+        </w:pBdr>
+        <w:tabs>
+          <w:tab w:val="right" w:pos="10490"/>
+        </w:tabs>
+        <w:spacing w:line="240" w:lineRule="auto"/>
+        <w:ind w:right="0"/>
+        <w:rPr>
+          <w:rStyle w:val="Hyperlink"/>
+          <w:bCs/>
+          <w:color w:val="auto"/>
+          <w:u w:val="none"/>
+        </w:rPr>
+      </w:pPr>
+    </w:p>
+    <w:p>
+      <w:pPr>
+        <w:spacing w:line="240" w:lineRule="auto"/>
+        <w:ind w:right="0"/>
+        <w:jc w:val="center"/>
+        <w:rPr>
           <w:rFonts w:cstheme="minorBidi"/>
           <w:color w:val="auto"/>
           <w:sz w:val="22"/>
@@ -871,6 +1189,7 @@
           </w:rPr>
           <w:t xml:space="preserve">tack Cloud </w:t>
         </w:r>
+        <w:proofErr w:type="gramStart"/>
         <w:r>
           <w:rPr>
             <w:rStyle w:val="Hyperlink"/>
@@ -899,6 +1218,7 @@
           </w:rPr>
           <w:t>|</w:t>
         </w:r>
+        <w:proofErr w:type="gramEnd"/>
         <w:r>
           <w:rPr>
             <w:rStyle w:val="Hyperlink"/>
@@ -4365,405 +4685,6 @@
           <w:bottom w:val="single" w:sz="6" w:space="1" w:color="auto"/>
         </w:pBdr>
         <w:spacing w:line="240" w:lineRule="auto"/>
-        <w:ind w:left="0" w:right="0" w:firstLine="0"/>
-        <w:jc w:val="both"/>
-        <w:rPr>
-          <w:color w:val="auto"/>
-        </w:rPr>
-      </w:pPr>
-    </w:p>
-    <w:p>
-      <w:pPr>
-        <w:spacing w:line="240" w:lineRule="auto"/>
-        <w:ind w:right="0"/>
-        <w:jc w:val="center"/>
-        <w:rPr>
-          <w:b/>
-          <w:bCs/>
-          <w:color w:val="auto"/>
-          <w:sz w:val="22"/>
-          <w:szCs w:val="22"/>
-        </w:rPr>
-      </w:pPr>
-      <w:r>
-        <w:rPr>
-          <w:b/>
-          <w:bCs/>
-          <w:color w:val="auto"/>
-          <w:sz w:val="24"/>
-          <w:szCs w:val="24"/>
-        </w:rPr>
-        <w:t>Skills</w:t>
-      </w:r>
-    </w:p>
-    <w:p>
-      <w:pPr>
-        <w:pStyle w:val="ListParagraph"/>
-        <w:numPr>
-          <w:ilvl w:val="0"/>
-          <w:numId w:val="32"/>
-        </w:numPr>
-        <w:spacing w:line="240" w:lineRule="auto"/>
-        <w:ind w:right="0"/>
-        <w:jc w:val="both"/>
-        <w:rPr>
-          <w:color w:val="auto"/>
-          <w:szCs w:val="20"/>
-        </w:rPr>
-      </w:pPr>
-      <w:r>
-        <w:rPr>
-          <w:i/>
-          <w:iCs/>
-          <w:color w:val="auto"/>
-          <w:szCs w:val="20"/>
-        </w:rPr>
-        <w:t xml:space="preserve">Primary </w:t>
-      </w:r>
-      <w:r>
-        <w:rPr>
-          <w:i/>
-          <w:iCs/>
-          <w:color w:val="auto"/>
-          <w:szCs w:val="20"/>
-        </w:rPr>
-        <w:t>programming language</w:t>
-      </w:r>
-      <w:r>
-        <w:rPr>
-          <w:b/>
-          <w:bCs/>
-          <w:color w:val="auto"/>
-          <w:szCs w:val="20"/>
-        </w:rPr>
-        <w:t>: Java</w:t>
-      </w:r>
-      <w:r>
-        <w:rPr>
-          <w:b/>
-          <w:bCs/>
-          <w:color w:val="auto"/>
-          <w:szCs w:val="20"/>
-        </w:rPr>
-        <w:t xml:space="preserve"> </w:t>
-      </w:r>
-      <w:r>
-        <w:rPr>
-          <w:color w:val="auto"/>
-          <w:szCs w:val="20"/>
-        </w:rPr>
-        <w:t>(Primary)</w:t>
-      </w:r>
-      <w:r>
-        <w:rPr>
-          <w:color w:val="auto"/>
-          <w:szCs w:val="20"/>
-        </w:rPr>
-        <w:t xml:space="preserve">, </w:t>
-      </w:r>
-      <w:r>
-        <w:rPr>
-          <w:color w:val="auto"/>
-          <w:szCs w:val="20"/>
-        </w:rPr>
-        <w:t>JavaScript, PHP, Python, and SQL</w:t>
-      </w:r>
-      <w:r>
-        <w:rPr>
-          <w:color w:val="auto"/>
-          <w:szCs w:val="20"/>
-        </w:rPr>
-        <w:t>.</w:t>
-      </w:r>
-    </w:p>
-    <w:p>
-      <w:pPr>
-        <w:pStyle w:val="ListParagraph"/>
-        <w:numPr>
-          <w:ilvl w:val="0"/>
-          <w:numId w:val="32"/>
-        </w:numPr>
-        <w:spacing w:line="240" w:lineRule="auto"/>
-        <w:ind w:right="0"/>
-        <w:jc w:val="both"/>
-        <w:rPr>
-          <w:color w:val="auto"/>
-          <w:sz w:val="18"/>
-        </w:rPr>
-      </w:pPr>
-      <w:r>
-        <w:rPr>
-          <w:i/>
-          <w:iCs/>
-          <w:color w:val="auto"/>
-          <w:szCs w:val="20"/>
-        </w:rPr>
-        <w:t>Domains</w:t>
-      </w:r>
-      <w:r>
-        <w:rPr>
-          <w:color w:val="auto"/>
-          <w:szCs w:val="20"/>
-        </w:rPr>
-        <w:t xml:space="preserve">: </w:t>
-      </w:r>
-      <w:r>
-        <w:rPr>
-          <w:color w:val="auto"/>
-          <w:szCs w:val="20"/>
-        </w:rPr>
-        <w:t>B</w:t>
-      </w:r>
-      <w:r>
-        <w:rPr>
-          <w:color w:val="auto"/>
-          <w:szCs w:val="20"/>
-        </w:rPr>
-        <w:t>ack</w:t>
-      </w:r>
-      <w:r>
-        <w:rPr>
-          <w:color w:val="auto"/>
-          <w:szCs w:val="20"/>
-        </w:rPr>
-        <w:t>e</w:t>
-      </w:r>
-      <w:r>
-        <w:rPr>
-          <w:color w:val="auto"/>
-          <w:szCs w:val="20"/>
-        </w:rPr>
-        <w:t>n</w:t>
-      </w:r>
-      <w:r>
-        <w:rPr>
-          <w:color w:val="auto"/>
-          <w:szCs w:val="20"/>
-        </w:rPr>
-        <w:t xml:space="preserve">d </w:t>
-      </w:r>
-      <w:r>
-        <w:rPr>
-          <w:color w:val="auto"/>
-          <w:szCs w:val="20"/>
-        </w:rPr>
-        <w:t>Engineering</w:t>
-      </w:r>
-      <w:r>
-        <w:rPr>
-          <w:color w:val="auto"/>
-          <w:szCs w:val="20"/>
-        </w:rPr>
-        <w:t xml:space="preserve">, </w:t>
-      </w:r>
-      <w:r>
-        <w:rPr>
-          <w:color w:val="auto"/>
-          <w:szCs w:val="20"/>
-        </w:rPr>
-        <w:t>Android application development</w:t>
-      </w:r>
-      <w:r>
-        <w:rPr>
-          <w:b/>
-          <w:bCs/>
-          <w:color w:val="auto"/>
-          <w:szCs w:val="20"/>
-        </w:rPr>
-        <w:t xml:space="preserve">, </w:t>
-      </w:r>
-      <w:r>
-        <w:rPr>
-          <w:color w:val="auto"/>
-          <w:szCs w:val="20"/>
-        </w:rPr>
-        <w:t>F</w:t>
-      </w:r>
-      <w:r>
-        <w:rPr>
-          <w:color w:val="auto"/>
-          <w:szCs w:val="20"/>
-        </w:rPr>
-        <w:t>ull</w:t>
-      </w:r>
-      <w:r>
-        <w:rPr>
-          <w:color w:val="auto"/>
-          <w:szCs w:val="20"/>
-        </w:rPr>
-        <w:t>-</w:t>
-      </w:r>
-      <w:r>
-        <w:rPr>
-          <w:color w:val="auto"/>
-          <w:szCs w:val="20"/>
-        </w:rPr>
-        <w:t>S</w:t>
-      </w:r>
-      <w:r>
-        <w:rPr>
-          <w:color w:val="auto"/>
-          <w:szCs w:val="20"/>
-        </w:rPr>
-        <w:t xml:space="preserve">tack </w:t>
-      </w:r>
-      <w:r>
-        <w:rPr>
-          <w:color w:val="auto"/>
-          <w:szCs w:val="20"/>
-        </w:rPr>
-        <w:t>W</w:t>
-      </w:r>
-      <w:r>
-        <w:rPr>
-          <w:color w:val="auto"/>
-          <w:szCs w:val="20"/>
-        </w:rPr>
-        <w:t>eb development.</w:t>
-      </w:r>
-    </w:p>
-    <w:p>
-      <w:pPr>
-        <w:pStyle w:val="ListParagraph"/>
-        <w:numPr>
-          <w:ilvl w:val="0"/>
-          <w:numId w:val="32"/>
-        </w:numPr>
-        <w:spacing w:line="240" w:lineRule="auto"/>
-        <w:ind w:right="0"/>
-        <w:jc w:val="both"/>
-        <w:rPr>
-          <w:bCs/>
-          <w:color w:val="auto"/>
-          <w:szCs w:val="20"/>
-        </w:rPr>
-      </w:pPr>
-      <w:r>
-        <w:rPr>
-          <w:i/>
-          <w:iCs/>
-          <w:color w:val="auto"/>
-          <w:szCs w:val="20"/>
-        </w:rPr>
-        <w:t>Technologies</w:t>
-      </w:r>
-      <w:r>
-        <w:rPr>
-          <w:i/>
-          <w:iCs/>
-          <w:color w:val="auto"/>
-          <w:szCs w:val="20"/>
-        </w:rPr>
-        <w:t xml:space="preserve"> worked with</w:t>
-      </w:r>
-      <w:r>
-        <w:rPr>
-          <w:i/>
-          <w:iCs/>
-          <w:color w:val="auto"/>
-          <w:szCs w:val="20"/>
-        </w:rPr>
-        <w:t>:</w:t>
-      </w:r>
-      <w:r>
-        <w:rPr>
-          <w:i/>
-          <w:iCs/>
-          <w:color w:val="auto"/>
-          <w:szCs w:val="20"/>
-        </w:rPr>
-        <w:t xml:space="preserve"> </w:t>
-      </w:r>
-      <w:r>
-        <w:rPr>
-          <w:color w:val="auto"/>
-          <w:szCs w:val="20"/>
-        </w:rPr>
-        <w:t>GitHub Actions</w:t>
-      </w:r>
-      <w:r>
-        <w:rPr>
-          <w:color w:val="auto"/>
-          <w:szCs w:val="20"/>
-        </w:rPr>
-        <w:t xml:space="preserve">, </w:t>
-      </w:r>
-      <w:r>
-        <w:rPr>
-          <w:color w:val="auto"/>
-          <w:szCs w:val="20"/>
-        </w:rPr>
-        <w:t>REST APIs</w:t>
-      </w:r>
-      <w:r>
-        <w:rPr>
-          <w:color w:val="auto"/>
-          <w:szCs w:val="20"/>
-        </w:rPr>
-        <w:t>,</w:t>
-      </w:r>
-      <w:r>
-        <w:rPr>
-          <w:b/>
-          <w:bCs/>
-          <w:color w:val="auto"/>
-          <w:szCs w:val="20"/>
-        </w:rPr>
-        <w:t xml:space="preserve"> </w:t>
-      </w:r>
-      <w:r>
-        <w:rPr>
-          <w:color w:val="auto"/>
-          <w:szCs w:val="20"/>
-        </w:rPr>
-        <w:t xml:space="preserve">AWS, Docker, </w:t>
-      </w:r>
-      <w:r>
-        <w:rPr>
-          <w:color w:val="auto"/>
-          <w:szCs w:val="20"/>
-        </w:rPr>
-        <w:t xml:space="preserve">Postman, </w:t>
-      </w:r>
-      <w:r>
-        <w:rPr>
-          <w:color w:val="auto"/>
-          <w:szCs w:val="20"/>
-        </w:rPr>
-        <w:t>Ubuntu (Linux)</w:t>
-      </w:r>
-      <w:r>
-        <w:rPr>
-          <w:color w:val="auto"/>
-          <w:szCs w:val="20"/>
-        </w:rPr>
-        <w:t>,</w:t>
-      </w:r>
-      <w:r>
-        <w:rPr>
-          <w:color w:val="auto"/>
-        </w:rPr>
-        <w:t xml:space="preserve"> </w:t>
-      </w:r>
-      <w:r>
-        <w:rPr>
-          <w:color w:val="auto"/>
-        </w:rPr>
-        <w:t xml:space="preserve">React, </w:t>
-      </w:r>
-      <w:r>
-        <w:rPr>
-          <w:color w:val="auto"/>
-        </w:rPr>
-        <w:t>Firebase real-time database, MySQL, and MySQL Workbench.</w:t>
-      </w:r>
-    </w:p>
-    <w:p>
-      <w:pPr>
-        <w:pBdr>
-          <w:bottom w:val="single" w:sz="6" w:space="1" w:color="auto"/>
-        </w:pBdr>
-        <w:spacing w:line="240" w:lineRule="auto"/>
         <w:ind w:right="0"/>
         <w:jc w:val="both"/>
         <w:rPr>
@@ -5452,42 +5373,42 @@
         <v:path o:extrusionok="f" gradientshapeok="t" o:connecttype="rect"/>
         <o:lock v:ext="edit" aspectratio="t"/>
       </v:shapetype>
-      <v:shape id="_x0000_i1284" type="#_x0000_t75" style="width:512.4pt;height:512.4pt;rotation:180;flip:x y;visibility:visible;mso-wrap-style:square" o:bullet="t">
+      <v:shape id="_x0000_i1278" type="#_x0000_t75" style="width:512.4pt;height:512.4pt;rotation:180;flip:x y;visibility:visible;mso-wrap-style:square" o:bullet="t">
         <v:imagedata r:id="rId1" o:title="107161_circle_github_icon"/>
       </v:shape>
     </w:pict>
   </w:numPicBullet>
   <w:numPicBullet w:numPicBulletId="1">
     <w:pict>
-      <v:shape id="_x0000_i1285" type="#_x0000_t75" style="width:168.6pt;height:168.6pt;visibility:visible;mso-wrap-style:square" o:bullet="t">
+      <v:shape id="_x0000_i1279" type="#_x0000_t75" style="width:168.6pt;height:168.6pt;visibility:visible;mso-wrap-style:square" o:bullet="t">
         <v:imagedata r:id="rId2" o:title="941C13C7"/>
       </v:shape>
     </w:pict>
   </w:numPicBullet>
   <w:numPicBullet w:numPicBulletId="2">
     <w:pict>
-      <v:shape id="_x0000_i1286" type="#_x0000_t75" style="width:28.8pt;height:16.2pt;visibility:visible;mso-wrap-style:square" o:bullet="t">
+      <v:shape id="_x0000_i1280" type="#_x0000_t75" style="width:28.8pt;height:16.2pt;visibility:visible;mso-wrap-style:square" o:bullet="t">
         <v:imagedata r:id="rId3" o:title="107161_circle_github_icon"/>
       </v:shape>
     </w:pict>
   </w:numPicBullet>
   <w:numPicBullet w:numPicBulletId="3">
     <w:pict>
-      <v:shape id="_x0000_i1287" type="#_x0000_t75" style="width:240pt;height:234pt;visibility:visible;mso-wrap-style:square" o:bullet="t">
+      <v:shape id="_x0000_i1281" type="#_x0000_t75" style="width:240pt;height:234pt;visibility:visible;mso-wrap-style:square" o:bullet="t">
         <v:imagedata r:id="rId4" o:title="Indian_Institute_of_Technology_Bombay_Logo"/>
       </v:shape>
     </w:pict>
   </w:numPicBullet>
   <w:numPicBullet w:numPicBulletId="4">
     <w:pict>
-      <v:shape id="_x0000_i1288" type="#_x0000_t75" style="width:23.4pt;height:16.2pt;visibility:visible;mso-wrap-style:square" o:bullet="t">
+      <v:shape id="_x0000_i1282" type="#_x0000_t75" style="width:23.4pt;height:16.2pt;visibility:visible;mso-wrap-style:square" o:bullet="t">
         <v:imagedata r:id="rId5" o:title="Indian_Institute_of_Technology_Bombay_Logo"/>
       </v:shape>
     </w:pict>
   </w:numPicBullet>
   <w:numPicBullet w:numPicBulletId="5">
     <w:pict>
-      <v:shape id="_x0000_i1289" type="#_x0000_t75" style="width:75.6pt;height:75.6pt;visibility:visible;mso-wrap-style:square" o:bullet="t">
+      <v:shape id="_x0000_i1283" type="#_x0000_t75" style="width:75.6pt;height:75.6pt;visibility:visible;mso-wrap-style:square" o:bullet="t">
         <v:imagedata r:id="rId6" o:title=""/>
       </v:shape>
     </w:pict>

</xml_diff>

<commit_message>
[parasji] "Primary" programming language - handled as required
</commit_message>
<xml_diff>
--- a/Resume_latest - Copy.docx
+++ b/Resume_latest - Copy.docx
@@ -44,46 +44,7 @@
           <w:color w:val="auto"/>
           <w:u w:val="none"/>
         </w:rPr>
-        <w:t xml:space="preserve">| </w:t>
-      </w:r>
-      <w:r>
-        <w:rPr>
-          <w:rStyle w:val="Hyperlink"/>
-          <w:bCs/>
-          <w:i/>
-          <w:iCs/>
-          <w:color w:val="auto"/>
-          <w:u w:val="none"/>
-          <w:shd w:val="clear" w:color="auto" w:fill="FFFFFF"/>
-        </w:rPr>
-        <w:t xml:space="preserve">Primary prog. lang.: </w:t>
-      </w:r>
-      <w:r>
-        <w:rPr>
-          <w:rStyle w:val="Hyperlink"/>
-          <w:b/>
-          <w:i/>
-          <w:iCs/>
-          <w:color w:val="auto"/>
-          <w:sz w:val="24"/>
-          <w:szCs w:val="24"/>
-          <w:u w:val="none"/>
-          <w:shd w:val="clear" w:color="auto" w:fill="FFFFFF"/>
-        </w:rPr>
-        <w:t>J</w:t>
-      </w:r>
-      <w:r>
-        <w:rPr>
-          <w:rStyle w:val="Hyperlink"/>
-          <w:b/>
-          <w:i/>
-          <w:iCs/>
-          <w:color w:val="auto"/>
-          <w:sz w:val="24"/>
-          <w:szCs w:val="24"/>
-          <w:u w:val="none"/>
-        </w:rPr>
-        <w:t>ava</w:t>
+        <w:t>|</w:t>
       </w:r>
       <w:r>
         <w:rPr>
@@ -832,7 +793,7 @@
           <w:color w:val="auto"/>
           <w:szCs w:val="20"/>
         </w:rPr>
-        <w:t>Primary programming language</w:t>
+        <w:t>Programming language</w:t>
       </w:r>
       <w:r>
         <w:rPr>
@@ -842,22 +803,6 @@
           <w:szCs w:val="20"/>
         </w:rPr>
         <w:t>: Java</w:t>
-      </w:r>
-      <w:r>
-        <w:rPr>
-          <w:b/>
-          <w:bCs/>
-          <w:color w:val="auto"/>
-          <w:szCs w:val="20"/>
-        </w:rPr>
-        <w:t xml:space="preserve"> </w:t>
-      </w:r>
-      <w:r>
-        <w:rPr>
-          <w:color w:val="auto"/>
-          <w:szCs w:val="20"/>
-        </w:rPr>
-        <w:t>(Primary)</w:t>
       </w:r>
       <w:r>
         <w:rPr>
@@ -5373,42 +5318,42 @@
         <v:path o:extrusionok="f" gradientshapeok="t" o:connecttype="rect"/>
         <o:lock v:ext="edit" aspectratio="t"/>
       </v:shapetype>
-      <v:shape id="_x0000_i1278" type="#_x0000_t75" style="width:512.4pt;height:512.4pt;rotation:180;flip:x y;visibility:visible;mso-wrap-style:square" o:bullet="t">
+      <v:shape id="_x0000_i1152" type="#_x0000_t75" style="width:512.4pt;height:512.4pt;rotation:180;flip:x y;visibility:visible;mso-wrap-style:square" o:bullet="t">
         <v:imagedata r:id="rId1" o:title="107161_circle_github_icon"/>
       </v:shape>
     </w:pict>
   </w:numPicBullet>
   <w:numPicBullet w:numPicBulletId="1">
     <w:pict>
-      <v:shape id="_x0000_i1279" type="#_x0000_t75" style="width:168.6pt;height:168.6pt;visibility:visible;mso-wrap-style:square" o:bullet="t">
+      <v:shape id="_x0000_i1153" type="#_x0000_t75" style="width:168.6pt;height:168.6pt;visibility:visible;mso-wrap-style:square" o:bullet="t">
         <v:imagedata r:id="rId2" o:title="941C13C7"/>
       </v:shape>
     </w:pict>
   </w:numPicBullet>
   <w:numPicBullet w:numPicBulletId="2">
     <w:pict>
-      <v:shape id="_x0000_i1280" type="#_x0000_t75" style="width:28.8pt;height:16.2pt;visibility:visible;mso-wrap-style:square" o:bullet="t">
+      <v:shape id="_x0000_i1154" type="#_x0000_t75" style="width:28.8pt;height:16.2pt;visibility:visible;mso-wrap-style:square" o:bullet="t">
         <v:imagedata r:id="rId3" o:title="107161_circle_github_icon"/>
       </v:shape>
     </w:pict>
   </w:numPicBullet>
   <w:numPicBullet w:numPicBulletId="3">
     <w:pict>
-      <v:shape id="_x0000_i1281" type="#_x0000_t75" style="width:240pt;height:234pt;visibility:visible;mso-wrap-style:square" o:bullet="t">
+      <v:shape id="_x0000_i1155" type="#_x0000_t75" style="width:240pt;height:234pt;visibility:visible;mso-wrap-style:square" o:bullet="t">
         <v:imagedata r:id="rId4" o:title="Indian_Institute_of_Technology_Bombay_Logo"/>
       </v:shape>
     </w:pict>
   </w:numPicBullet>
   <w:numPicBullet w:numPicBulletId="4">
     <w:pict>
-      <v:shape id="_x0000_i1282" type="#_x0000_t75" style="width:23.4pt;height:16.2pt;visibility:visible;mso-wrap-style:square" o:bullet="t">
+      <v:shape id="_x0000_i1156" type="#_x0000_t75" style="width:23.4pt;height:16.2pt;visibility:visible;mso-wrap-style:square" o:bullet="t">
         <v:imagedata r:id="rId5" o:title="Indian_Institute_of_Technology_Bombay_Logo"/>
       </v:shape>
     </w:pict>
   </w:numPicBullet>
   <w:numPicBullet w:numPicBulletId="5">
     <w:pict>
-      <v:shape id="_x0000_i1283" type="#_x0000_t75" style="width:75.6pt;height:75.6pt;visibility:visible;mso-wrap-style:square" o:bullet="t">
+      <v:shape id="_x0000_i1157" type="#_x0000_t75" style="width:75.6pt;height:75.6pt;visibility:visible;mso-wrap-style:square" o:bullet="t">
         <v:imagedata r:id="rId6" o:title=""/>
       </v:shape>
     </w:pict>

</xml_diff>

<commit_message>
[parasji] - Experimental changes to header section - spacing
</commit_message>
<xml_diff>
--- a/Resume_latest - Copy.docx
+++ b/Resume_latest - Copy.docx
@@ -12,6 +12,7 @@
         </w:tabs>
         <w:spacing w:line="240" w:lineRule="auto"/>
         <w:ind w:right="0"/>
+        <w:jc w:val="center"/>
         <w:rPr>
           <w:bCs/>
           <w:color w:val="auto"/>
@@ -27,151 +28,6 @@
         </w:rPr>
         <w:t>Prathamesh Vivek Bhagat</w:t>
       </w:r>
-      <w:r>
-        <w:rPr>
-          <w:b/>
-          <w:bCs/>
-          <w:color w:val="auto"/>
-          <w:sz w:val="28"/>
-          <w:szCs w:val="28"/>
-        </w:rPr>
-        <w:t xml:space="preserve"> </w:t>
-      </w:r>
-      <w:r>
-        <w:rPr>
-          <w:rStyle w:val="Hyperlink"/>
-          <w:bCs/>
-          <w:color w:val="auto"/>
-          <w:u w:val="none"/>
-        </w:rPr>
-        <w:t>|</w:t>
-      </w:r>
-      <w:r>
-        <w:rPr>
-          <w:bCs/>
-          <w:color w:val="auto"/>
-        </w:rPr>
-        <w:tab/>
-        <w:t xml:space="preserve"> </w:t>
-      </w:r>
-      <w:hyperlink r:id="rId8" w:history="1">
-        <w:r>
-          <w:rPr>
-            <w:rStyle w:val="Hyperlink"/>
-            <w:noProof/>
-            <w:color w:val="auto"/>
-            <w:u w:val="none"/>
-          </w:rPr>
-          <w:drawing>
-            <wp:inline distT="0" distB="0" distL="0" distR="0" wp14:anchorId="49675239" wp14:editId="1BCA3764">
-              <wp:extent cx="136800" cy="136800"/>
-              <wp:effectExtent l="0" t="0" r="0" b="0"/>
-              <wp:docPr id="774" name="Picture 774" descr="C:\Users\DELL\Downloads\107161_circle_github_icon.png"/>
-              <wp:cNvGraphicFramePr>
-                <a:graphicFrameLocks xmlns:a="http://schemas.openxmlformats.org/drawingml/2006/main"/>
-              </wp:cNvGraphicFramePr>
-              <a:graphic xmlns:a="http://schemas.openxmlformats.org/drawingml/2006/main">
-                <a:graphicData uri="http://schemas.openxmlformats.org/drawingml/2006/picture">
-                  <pic:pic xmlns:pic="http://schemas.openxmlformats.org/drawingml/2006/picture">
-                    <pic:nvPicPr>
-                      <pic:cNvPr id="0" name="Picture 5" descr="C:\Users\DELL\Downloads\107161_circle_github_icon.png"/>
-                      <pic:cNvPicPr>
-                        <a:picLocks noChangeAspect="1" noChangeArrowheads="1"/>
-                      </pic:cNvPicPr>
-                    </pic:nvPicPr>
-                    <pic:blipFill>
-                      <a:blip r:embed="rId9" cstate="print">
-                        <a:extLst>
-                          <a:ext uri="{28A0092B-C50C-407E-A947-70E740481C1C}">
-                            <a14:useLocalDpi xmlns:a14="http://schemas.microsoft.com/office/drawing/2010/main" val="0"/>
-                          </a:ext>
-                        </a:extLst>
-                      </a:blip>
-                      <a:srcRect/>
-                      <a:stretch>
-                        <a:fillRect/>
-                      </a:stretch>
-                    </pic:blipFill>
-                    <pic:spPr bwMode="auto">
-                      <a:xfrm>
-                        <a:off x="0" y="0"/>
-                        <a:ext cx="136800" cy="136800"/>
-                      </a:xfrm>
-                      <a:prstGeom prst="rect">
-                        <a:avLst/>
-                      </a:prstGeom>
-                      <a:noFill/>
-                      <a:ln>
-                        <a:noFill/>
-                      </a:ln>
-                    </pic:spPr>
-                  </pic:pic>
-                </a:graphicData>
-              </a:graphic>
-            </wp:inline>
-          </w:drawing>
-        </w:r>
-        <w:r>
-          <w:rPr>
-            <w:rStyle w:val="Hyperlink"/>
-            <w:color w:val="auto"/>
-            <w:u w:val="none"/>
-            <w:shd w:val="clear" w:color="auto" w:fill="FFFFFF"/>
-          </w:rPr>
-          <w:t xml:space="preserve"> </w:t>
-        </w:r>
-        <w:r>
-          <w:rPr>
-            <w:rStyle w:val="Hyperlink"/>
-            <w:color w:val="auto"/>
-            <w:u w:val="none"/>
-            <w:shd w:val="clear" w:color="auto" w:fill="FFFFFF"/>
-          </w:rPr>
-          <w:t>g</w:t>
-        </w:r>
-        <w:r>
-          <w:rPr>
-            <w:rStyle w:val="Hyperlink"/>
-            <w:color w:val="auto"/>
-            <w:u w:val="none"/>
-          </w:rPr>
-          <w:t>it</w:t>
-        </w:r>
-        <w:r>
-          <w:rPr>
-            <w:rStyle w:val="Hyperlink"/>
-            <w:color w:val="auto"/>
-            <w:u w:val="none"/>
-          </w:rPr>
-          <w:t>h</w:t>
-        </w:r>
-        <w:r>
-          <w:rPr>
-            <w:rStyle w:val="Hyperlink"/>
-            <w:color w:val="auto"/>
-            <w:u w:val="none"/>
-          </w:rPr>
-          <w:t>ub.com/</w:t>
-        </w:r>
-        <w:proofErr w:type="spellStart"/>
-        <w:r>
-          <w:rPr>
-            <w:rStyle w:val="Hyperlink"/>
-            <w:color w:val="auto"/>
-            <w:u w:val="none"/>
-          </w:rPr>
-          <w:t>PrathameshBhagat</w:t>
-        </w:r>
-        <w:proofErr w:type="spellEnd"/>
-        <w:r>
-          <w:rPr>
-            <w:rStyle w:val="Hyperlink"/>
-            <w:color w:val="auto"/>
-            <w:u w:val="none"/>
-          </w:rPr>
-          <w:t xml:space="preserve"> </w:t>
-        </w:r>
-      </w:hyperlink>
     </w:p>
     <w:p>
       <w:pPr>
@@ -183,11 +39,13 @@
         </w:tabs>
         <w:spacing w:line="240" w:lineRule="auto"/>
         <w:ind w:right="0"/>
-        <w:rPr>
-          <w:color w:val="auto"/>
-        </w:rPr>
-      </w:pPr>
-      <w:hyperlink r:id="rId10" w:history="1">
+        <w:jc w:val="center"/>
+        <w:rPr>
+          <w:bCs/>
+          <w:color w:val="auto"/>
+        </w:rPr>
+      </w:pPr>
+      <w:hyperlink r:id="rId8" w:history="1">
         <w:r>
           <w:rPr>
             <w:rStyle w:val="Hyperlink"/>
@@ -215,7 +73,7 @@
                       </pic:cNvPicPr>
                     </pic:nvPicPr>
                     <pic:blipFill>
-                      <a:blip r:embed="rId11" cstate="print">
+                      <a:blip r:embed="rId9" cstate="print">
                         <a:extLst>
                           <a:ext uri="{28A0092B-C50C-407E-A947-70E740481C1C}">
                             <a14:useLocalDpi xmlns:a14="http://schemas.microsoft.com/office/drawing/2010/main" val="0"/>
@@ -282,7 +140,25 @@
           <w:color w:val="auto"/>
           <w:u w:val="none"/>
         </w:rPr>
-        <w:t xml:space="preserve"> | </w:t>
+        <w:t xml:space="preserve"> |</w:t>
+      </w:r>
+      <w:r>
+        <w:rPr>
+          <w:rStyle w:val="Hyperlink"/>
+          <w:bCs/>
+          <w:color w:val="auto"/>
+          <w:u w:val="none"/>
+        </w:rPr>
+        <w:t xml:space="preserve"> </w:t>
+      </w:r>
+      <w:r>
+        <w:rPr>
+          <w:rStyle w:val="Hyperlink"/>
+          <w:bCs/>
+          <w:color w:val="auto"/>
+          <w:u w:val="none"/>
+        </w:rPr>
+        <w:t xml:space="preserve"> </w:t>
       </w:r>
       <w:r>
         <w:rPr>
@@ -307,7 +183,7 @@
                     </pic:cNvPicPr>
                   </pic:nvPicPr>
                   <pic:blipFill>
-                    <a:blip r:embed="rId12" cstate="print">
+                    <a:blip r:embed="rId10" cstate="print">
                       <a:extLst>
                         <a:ext uri="{28A0092B-C50C-407E-A947-70E740481C1C}">
                           <a14:useLocalDpi xmlns:a14="http://schemas.microsoft.com/office/drawing/2010/main" val="0"/>
@@ -348,7 +224,7 @@
         </w:rPr>
         <w:t xml:space="preserve"> </w:t>
       </w:r>
-      <w:hyperlink r:id="rId13" w:history="1">
+      <w:hyperlink r:id="rId11" w:history="1">
         <w:r>
           <w:rPr>
             <w:rStyle w:val="Hyperlink"/>
@@ -397,68 +273,39 @@
       </w:hyperlink>
       <w:r>
         <w:rPr>
-          <w:bCs/>
-          <w:color w:val="auto"/>
-        </w:rPr>
-        <w:tab/>
-      </w:r>
-      <w:r>
-        <w:rPr>
-          <w:noProof/>
-          <w:color w:val="auto"/>
-          <w:sz w:val="18"/>
-          <w:szCs w:val="18"/>
-        </w:rPr>
-        <w:drawing>
-          <wp:inline distT="0" distB="0" distL="0" distR="0" wp14:anchorId="4E759B88" wp14:editId="10DC927E">
-            <wp:extent cx="125730" cy="118586"/>
-            <wp:effectExtent l="0" t="0" r="7620" b="0"/>
-            <wp:docPr id="2" name="Picture 2" descr="leetcode&quot; Icon - Download for free – Iconduck"/>
-            <wp:cNvGraphicFramePr>
-              <a:graphicFrameLocks xmlns:a="http://schemas.openxmlformats.org/drawingml/2006/main"/>
-            </wp:cNvGraphicFramePr>
-            <a:graphic xmlns:a="http://schemas.openxmlformats.org/drawingml/2006/main">
-              <a:graphicData uri="http://schemas.openxmlformats.org/drawingml/2006/picture">
-                <pic:pic xmlns:pic="http://schemas.openxmlformats.org/drawingml/2006/picture">
-                  <pic:nvPicPr>
-                    <pic:cNvPr id="0" name="Picture 9" descr="leetcode&quot; Icon - Download for free – Iconduck"/>
-                    <pic:cNvPicPr>
-                      <a:picLocks noChangeAspect="1" noChangeArrowheads="1"/>
-                    </pic:cNvPicPr>
-                  </pic:nvPicPr>
-                  <pic:blipFill>
-                    <a:blip r:embed="rId14" cstate="print">
-                      <a:extLst>
-                        <a:ext uri="{28A0092B-C50C-407E-A947-70E740481C1C}">
-                          <a14:useLocalDpi xmlns:a14="http://schemas.microsoft.com/office/drawing/2010/main" val="0"/>
-                        </a:ext>
-                      </a:extLst>
-                    </a:blip>
-                    <a:srcRect/>
-                    <a:stretch>
-                      <a:fillRect/>
-                    </a:stretch>
-                  </pic:blipFill>
-                  <pic:spPr bwMode="auto">
-                    <a:xfrm>
-                      <a:off x="0" y="0"/>
-                      <a:ext cx="131502" cy="124030"/>
-                    </a:xfrm>
-                    <a:prstGeom prst="rect">
-                      <a:avLst/>
-                    </a:prstGeom>
-                    <a:noFill/>
-                    <a:ln>
-                      <a:noFill/>
-                    </a:ln>
-                  </pic:spPr>
-                </pic:pic>
-              </a:graphicData>
-            </a:graphic>
-          </wp:inline>
-        </w:drawing>
-      </w:r>
-      <w:hyperlink r:id="rId15" w:history="1">
+          <w:rStyle w:val="Hyperlink"/>
+          <w:bCs/>
+          <w:color w:val="auto"/>
+          <w:u w:val="none"/>
+        </w:rPr>
+        <w:t xml:space="preserve"> </w:t>
+      </w:r>
+      <w:r>
+        <w:rPr>
+          <w:rStyle w:val="Hyperlink"/>
+          <w:bCs/>
+          <w:color w:val="auto"/>
+          <w:u w:val="none"/>
+        </w:rPr>
+        <w:t xml:space="preserve"> </w:t>
+      </w:r>
+      <w:r>
+        <w:rPr>
+          <w:rStyle w:val="Hyperlink"/>
+          <w:bCs/>
+          <w:color w:val="auto"/>
+          <w:u w:val="none"/>
+        </w:rPr>
+        <w:t xml:space="preserve">| </w:t>
+      </w:r>
+      <w:r>
+        <w:rPr>
+          <w:bCs/>
+          <w:color w:val="auto"/>
+        </w:rPr>
+        <w:t xml:space="preserve"> </w:t>
+      </w:r>
+      <w:hyperlink r:id="rId12" w:history="1">
         <w:r>
           <w:rPr>
             <w:rStyle w:val="Hyperlink"/>
@@ -466,25 +313,89 @@
             <w:color w:val="auto"/>
             <w:u w:val="none"/>
           </w:rPr>
-          <w:t xml:space="preserve"> </w:t>
+          <w:drawing>
+            <wp:inline distT="0" distB="0" distL="0" distR="0" wp14:anchorId="78ECC506" wp14:editId="2E4F7942">
+              <wp:extent cx="136800" cy="136800"/>
+              <wp:effectExtent l="0" t="0" r="0" b="0"/>
+              <wp:docPr id="774" name="Picture 774" descr="C:\Users\DELL\Downloads\107161_circle_github_icon.png"/>
+              <wp:cNvGraphicFramePr>
+                <a:graphicFrameLocks xmlns:a="http://schemas.openxmlformats.org/drawingml/2006/main"/>
+              </wp:cNvGraphicFramePr>
+              <a:graphic xmlns:a="http://schemas.openxmlformats.org/drawingml/2006/main">
+                <a:graphicData uri="http://schemas.openxmlformats.org/drawingml/2006/picture">
+                  <pic:pic xmlns:pic="http://schemas.openxmlformats.org/drawingml/2006/picture">
+                    <pic:nvPicPr>
+                      <pic:cNvPr id="0" name="Picture 5" descr="C:\Users\DELL\Downloads\107161_circle_github_icon.png"/>
+                      <pic:cNvPicPr>
+                        <a:picLocks noChangeAspect="1" noChangeArrowheads="1"/>
+                      </pic:cNvPicPr>
+                    </pic:nvPicPr>
+                    <pic:blipFill>
+                      <a:blip r:embed="rId13" cstate="print">
+                        <a:extLst>
+                          <a:ext uri="{28A0092B-C50C-407E-A947-70E740481C1C}">
+                            <a14:useLocalDpi xmlns:a14="http://schemas.microsoft.com/office/drawing/2010/main" val="0"/>
+                          </a:ext>
+                        </a:extLst>
+                      </a:blip>
+                      <a:srcRect/>
+                      <a:stretch>
+                        <a:fillRect/>
+                      </a:stretch>
+                    </pic:blipFill>
+                    <pic:spPr bwMode="auto">
+                      <a:xfrm>
+                        <a:off x="0" y="0"/>
+                        <a:ext cx="136800" cy="136800"/>
+                      </a:xfrm>
+                      <a:prstGeom prst="rect">
+                        <a:avLst/>
+                      </a:prstGeom>
+                      <a:noFill/>
+                      <a:ln>
+                        <a:noFill/>
+                      </a:ln>
+                    </pic:spPr>
+                  </pic:pic>
+                </a:graphicData>
+              </a:graphic>
+            </wp:inline>
+          </w:drawing>
         </w:r>
         <w:r>
           <w:rPr>
             <w:rStyle w:val="Hyperlink"/>
-            <w:noProof/>
             <w:color w:val="auto"/>
             <w:u w:val="none"/>
+            <w:shd w:val="clear" w:color="auto" w:fill="FFFFFF"/>
           </w:rPr>
-          <w:t>l</w:t>
+          <w:t xml:space="preserve"> g</w:t>
         </w:r>
         <w:r>
           <w:rPr>
             <w:rStyle w:val="Hyperlink"/>
-            <w:noProof/>
             <w:color w:val="auto"/>
             <w:u w:val="none"/>
           </w:rPr>
-          <w:t>eetcode.com/Prathamesh_Bhagat</w:t>
+          <w:t>ithub.com/</w:t>
+        </w:r>
+        <w:proofErr w:type="spellStart"/>
+        <w:r>
+          <w:rPr>
+            <w:rStyle w:val="Hyperlink"/>
+            <w:color w:val="auto"/>
+            <w:u w:val="none"/>
+          </w:rPr>
+          <w:t>PrathameshBhagat</w:t>
+        </w:r>
+        <w:proofErr w:type="spellEnd"/>
+        <w:r>
+          <w:rPr>
+            <w:rStyle w:val="Hyperlink"/>
+            <w:color w:val="auto"/>
+            <w:u w:val="none"/>
+          </w:rPr>
+          <w:t xml:space="preserve"> </w:t>
         </w:r>
       </w:hyperlink>
     </w:p>
@@ -498,6 +409,7 @@
         </w:tabs>
         <w:spacing w:line="240" w:lineRule="auto"/>
         <w:ind w:right="0"/>
+        <w:jc w:val="center"/>
         <w:rPr>
           <w:rStyle w:val="Hyperlink"/>
           <w:bCs/>
@@ -505,7 +417,7 @@
           <w:u w:val="none"/>
         </w:rPr>
       </w:pPr>
-      <w:hyperlink r:id="rId16" w:history="1">
+      <w:hyperlink r:id="rId14" w:history="1">
         <w:r>
           <w:rPr>
             <w:rStyle w:val="Hyperlink"/>
@@ -533,7 +445,7 @@
                       </pic:cNvPicPr>
                     </pic:nvPicPr>
                     <pic:blipFill>
-                      <a:blip r:embed="rId17" cstate="print">
+                      <a:blip r:embed="rId15" cstate="print">
                         <a:extLst>
                           <a:ext uri="{28A0092B-C50C-407E-A947-70E740481C1C}">
                             <a14:useLocalDpi xmlns:a14="http://schemas.microsoft.com/office/drawing/2010/main" val="0"/>
@@ -628,10 +540,146 @@
       </w:hyperlink>
       <w:r>
         <w:rPr>
-          <w:bCs/>
-          <w:color w:val="auto"/>
-        </w:rPr>
-        <w:tab/>
+          <w:rStyle w:val="Hyperlink"/>
+          <w:bCs/>
+          <w:color w:val="auto"/>
+          <w:u w:val="none"/>
+          <w:shd w:val="clear" w:color="auto" w:fill="FFFFFF"/>
+        </w:rPr>
+        <w:t xml:space="preserve"> </w:t>
+      </w:r>
+      <w:r>
+        <w:rPr>
+          <w:rStyle w:val="Hyperlink"/>
+          <w:bCs/>
+          <w:color w:val="auto"/>
+          <w:u w:val="none"/>
+          <w:shd w:val="clear" w:color="auto" w:fill="FFFFFF"/>
+        </w:rPr>
+        <w:t xml:space="preserve"> |</w:t>
+      </w:r>
+      <w:r>
+        <w:rPr>
+          <w:rStyle w:val="Hyperlink"/>
+          <w:bCs/>
+          <w:color w:val="auto"/>
+          <w:u w:val="none"/>
+          <w:shd w:val="clear" w:color="auto" w:fill="FFFFFF"/>
+        </w:rPr>
+        <w:t xml:space="preserve"> </w:t>
+      </w:r>
+      <w:r>
+        <w:rPr>
+          <w:rStyle w:val="Hyperlink"/>
+          <w:bCs/>
+          <w:color w:val="auto"/>
+          <w:u w:val="none"/>
+          <w:shd w:val="clear" w:color="auto" w:fill="FFFFFF"/>
+        </w:rPr>
+        <w:t xml:space="preserve"> </w:t>
+      </w:r>
+      <w:r>
+        <w:rPr>
+          <w:noProof/>
+          <w:color w:val="auto"/>
+          <w:sz w:val="18"/>
+          <w:szCs w:val="18"/>
+        </w:rPr>
+        <w:drawing>
+          <wp:inline distT="0" distB="0" distL="0" distR="0" wp14:anchorId="7C568B12" wp14:editId="1F22302C">
+            <wp:extent cx="125730" cy="118586"/>
+            <wp:effectExtent l="0" t="0" r="7620" b="0"/>
+            <wp:docPr id="2" name="Picture 2" descr="leetcode&quot; Icon - Download for free – Iconduck"/>
+            <wp:cNvGraphicFramePr>
+              <a:graphicFrameLocks xmlns:a="http://schemas.openxmlformats.org/drawingml/2006/main"/>
+            </wp:cNvGraphicFramePr>
+            <a:graphic xmlns:a="http://schemas.openxmlformats.org/drawingml/2006/main">
+              <a:graphicData uri="http://schemas.openxmlformats.org/drawingml/2006/picture">
+                <pic:pic xmlns:pic="http://schemas.openxmlformats.org/drawingml/2006/picture">
+                  <pic:nvPicPr>
+                    <pic:cNvPr id="0" name="Picture 9" descr="leetcode&quot; Icon - Download for free – Iconduck"/>
+                    <pic:cNvPicPr>
+                      <a:picLocks noChangeAspect="1" noChangeArrowheads="1"/>
+                    </pic:cNvPicPr>
+                  </pic:nvPicPr>
+                  <pic:blipFill>
+                    <a:blip r:embed="rId16" cstate="print">
+                      <a:extLst>
+                        <a:ext uri="{28A0092B-C50C-407E-A947-70E740481C1C}">
+                          <a14:useLocalDpi xmlns:a14="http://schemas.microsoft.com/office/drawing/2010/main" val="0"/>
+                        </a:ext>
+                      </a:extLst>
+                    </a:blip>
+                    <a:srcRect/>
+                    <a:stretch>
+                      <a:fillRect/>
+                    </a:stretch>
+                  </pic:blipFill>
+                  <pic:spPr bwMode="auto">
+                    <a:xfrm>
+                      <a:off x="0" y="0"/>
+                      <a:ext cx="131502" cy="124030"/>
+                    </a:xfrm>
+                    <a:prstGeom prst="rect">
+                      <a:avLst/>
+                    </a:prstGeom>
+                    <a:noFill/>
+                    <a:ln>
+                      <a:noFill/>
+                    </a:ln>
+                  </pic:spPr>
+                </pic:pic>
+              </a:graphicData>
+            </a:graphic>
+          </wp:inline>
+        </w:drawing>
+      </w:r>
+      <w:hyperlink r:id="rId17" w:history="1">
+        <w:r>
+          <w:rPr>
+            <w:rStyle w:val="Hyperlink"/>
+            <w:noProof/>
+            <w:color w:val="auto"/>
+            <w:u w:val="none"/>
+          </w:rPr>
+          <w:t xml:space="preserve"> leetcode.com/Prathamesh_Bhagat</w:t>
+        </w:r>
+      </w:hyperlink>
+      <w:r>
+        <w:rPr>
+          <w:rStyle w:val="Hyperlink"/>
+          <w:noProof/>
+          <w:color w:val="auto"/>
+          <w:u w:val="none"/>
+        </w:rPr>
+        <w:t xml:space="preserve"> </w:t>
+      </w:r>
+      <w:r>
+        <w:rPr>
+          <w:rStyle w:val="Hyperlink"/>
+          <w:noProof/>
+          <w:color w:val="auto"/>
+          <w:u w:val="none"/>
+        </w:rPr>
+        <w:t xml:space="preserve"> </w:t>
+      </w:r>
+      <w:r>
+        <w:rPr>
+          <w:rStyle w:val="Hyperlink"/>
+          <w:noProof/>
+          <w:color w:val="auto"/>
+          <w:u w:val="none"/>
+        </w:rPr>
+        <w:t>|</w:t>
+      </w:r>
+      <w:r>
+        <w:rPr>
+          <w:rStyle w:val="Hyperlink"/>
+          <w:noProof/>
+          <w:color w:val="auto"/>
+          <w:u w:val="none"/>
+        </w:rPr>
+        <w:t xml:space="preserve">  </w:t>
       </w:r>
       <w:hyperlink r:id="rId18" w:history="1">
         <w:r>

</xml_diff>

<commit_message>
[startup] small changes in skills and experience (2T) section
</commit_message>
<xml_diff>
--- a/Resume_latest - Copy.docx
+++ b/Resume_latest - Copy.docx
@@ -831,7 +831,7 @@
         <w:jc w:val="both"/>
         <w:rPr>
           <w:color w:val="auto"/>
-          <w:szCs w:val="20"/>
+          <w:sz w:val="18"/>
         </w:rPr>
       </w:pPr>
       <w:r>
@@ -878,8 +878,9 @@
         <w:ind w:right="0"/>
         <w:jc w:val="both"/>
         <w:rPr>
-          <w:color w:val="auto"/>
-          <w:sz w:val="18"/>
+          <w:bCs/>
+          <w:color w:val="auto"/>
+          <w:szCs w:val="20"/>
         </w:rPr>
       </w:pPr>
       <w:r>
@@ -889,56 +890,56 @@
           <w:color w:val="auto"/>
           <w:szCs w:val="20"/>
         </w:rPr>
-        <w:t>Domains</w:t>
-      </w:r>
-      <w:r>
-        <w:rPr>
-          <w:color w:val="auto"/>
-          <w:szCs w:val="20"/>
-        </w:rPr>
-        <w:t xml:space="preserve">: </w:t>
-      </w:r>
-      <w:r>
-        <w:rPr>
-          <w:color w:val="auto"/>
-          <w:szCs w:val="20"/>
-        </w:rPr>
-        <w:t>B</w:t>
-      </w:r>
-      <w:r>
-        <w:rPr>
-          <w:color w:val="auto"/>
-          <w:szCs w:val="20"/>
-        </w:rPr>
-        <w:t>ack</w:t>
-      </w:r>
-      <w:r>
-        <w:rPr>
-          <w:color w:val="auto"/>
-          <w:szCs w:val="20"/>
-        </w:rPr>
-        <w:t>en</w:t>
-      </w:r>
-      <w:r>
-        <w:rPr>
-          <w:color w:val="auto"/>
-          <w:szCs w:val="20"/>
-        </w:rPr>
-        <w:t xml:space="preserve">d </w:t>
-      </w:r>
-      <w:r>
-        <w:rPr>
-          <w:color w:val="auto"/>
-          <w:szCs w:val="20"/>
-        </w:rPr>
-        <w:t>Engineering</w:t>
-      </w:r>
-      <w:r>
-        <w:rPr>
-          <w:color w:val="auto"/>
-          <w:szCs w:val="20"/>
-        </w:rPr>
-        <w:t>, Android application development</w:t>
+        <w:t xml:space="preserve">Technologies: </w:t>
+      </w:r>
+      <w:r>
+        <w:rPr>
+          <w:color w:val="auto"/>
+          <w:szCs w:val="20"/>
+        </w:rPr>
+        <w:t>GitHub Actions</w:t>
+      </w:r>
+      <w:r>
+        <w:rPr>
+          <w:color w:val="auto"/>
+          <w:szCs w:val="20"/>
+        </w:rPr>
+        <w:t xml:space="preserve">, </w:t>
+      </w:r>
+      <w:r>
+        <w:rPr>
+          <w:color w:val="auto"/>
+          <w:szCs w:val="20"/>
+        </w:rPr>
+        <w:t>AWS</w:t>
+      </w:r>
+      <w:r>
+        <w:rPr>
+          <w:color w:val="auto"/>
+          <w:szCs w:val="20"/>
+        </w:rPr>
+        <w:t xml:space="preserve"> ECS</w:t>
+      </w:r>
+      <w:r>
+        <w:rPr>
+          <w:color w:val="auto"/>
+          <w:szCs w:val="20"/>
+        </w:rPr>
+        <w:t>,</w:t>
+      </w:r>
+      <w:r>
+        <w:rPr>
+          <w:color w:val="auto"/>
+          <w:szCs w:val="20"/>
+        </w:rPr>
+        <w:t xml:space="preserve"> </w:t>
+      </w:r>
+      <w:r>
+        <w:rPr>
+          <w:color w:val="auto"/>
+          <w:szCs w:val="20"/>
+        </w:rPr>
+        <w:t>REST APIs,</w:t>
       </w:r>
       <w:r>
         <w:rPr>
@@ -947,122 +948,6 @@
           <w:color w:val="auto"/>
           <w:szCs w:val="20"/>
         </w:rPr>
-        <w:t xml:space="preserve">, </w:t>
-      </w:r>
-      <w:r>
-        <w:rPr>
-          <w:color w:val="auto"/>
-          <w:szCs w:val="20"/>
-        </w:rPr>
-        <w:t>Full</w:t>
-      </w:r>
-      <w:r>
-        <w:rPr>
-          <w:color w:val="auto"/>
-          <w:szCs w:val="20"/>
-        </w:rPr>
-        <w:t>-</w:t>
-      </w:r>
-      <w:r>
-        <w:rPr>
-          <w:color w:val="auto"/>
-          <w:szCs w:val="20"/>
-        </w:rPr>
-        <w:t>S</w:t>
-      </w:r>
-      <w:r>
-        <w:rPr>
-          <w:color w:val="auto"/>
-          <w:szCs w:val="20"/>
-        </w:rPr>
-        <w:t xml:space="preserve">tack </w:t>
-      </w:r>
-      <w:r>
-        <w:rPr>
-          <w:color w:val="auto"/>
-          <w:szCs w:val="20"/>
-        </w:rPr>
-        <w:t>W</w:t>
-      </w:r>
-      <w:r>
-        <w:rPr>
-          <w:color w:val="auto"/>
-          <w:szCs w:val="20"/>
-        </w:rPr>
-        <w:t>eb development.</w:t>
-      </w:r>
-    </w:p>
-    <w:p>
-      <w:pPr>
-        <w:pStyle w:val="ListParagraph"/>
-        <w:numPr>
-          <w:ilvl w:val="0"/>
-          <w:numId w:val="32"/>
-        </w:numPr>
-        <w:spacing w:line="240" w:lineRule="auto"/>
-        <w:ind w:right="0"/>
-        <w:jc w:val="both"/>
-        <w:rPr>
-          <w:bCs/>
-          <w:color w:val="auto"/>
-          <w:szCs w:val="20"/>
-        </w:rPr>
-      </w:pPr>
-      <w:r>
-        <w:rPr>
-          <w:i/>
-          <w:iCs/>
-          <w:color w:val="auto"/>
-          <w:szCs w:val="20"/>
-        </w:rPr>
-        <w:t>Technologies</w:t>
-      </w:r>
-      <w:r>
-        <w:rPr>
-          <w:i/>
-          <w:iCs/>
-          <w:color w:val="auto"/>
-          <w:szCs w:val="20"/>
-        </w:rPr>
-        <w:t xml:space="preserve"> worked with</w:t>
-      </w:r>
-      <w:r>
-        <w:rPr>
-          <w:i/>
-          <w:iCs/>
-          <w:color w:val="auto"/>
-          <w:szCs w:val="20"/>
-        </w:rPr>
-        <w:t xml:space="preserve">: </w:t>
-      </w:r>
-      <w:r>
-        <w:rPr>
-          <w:color w:val="auto"/>
-          <w:szCs w:val="20"/>
-        </w:rPr>
-        <w:t>GitHub Actions</w:t>
-      </w:r>
-      <w:r>
-        <w:rPr>
-          <w:color w:val="auto"/>
-          <w:szCs w:val="20"/>
-        </w:rPr>
-        <w:t xml:space="preserve">, </w:t>
-      </w:r>
-      <w:r>
-        <w:rPr>
-          <w:color w:val="auto"/>
-          <w:szCs w:val="20"/>
-        </w:rPr>
-        <w:t>REST APIs,</w:t>
-      </w:r>
-      <w:r>
-        <w:rPr>
-          <w:b/>
-          <w:bCs/>
-          <w:color w:val="auto"/>
-          <w:szCs w:val="20"/>
-        </w:rPr>
         <w:t xml:space="preserve"> </w:t>
       </w:r>
       <w:r>
@@ -1070,7 +955,21 @@
           <w:color w:val="auto"/>
           <w:szCs w:val="20"/>
         </w:rPr>
-        <w:t>AWS, Docker, Postman, Ubuntu (Linux),</w:t>
+        <w:t>Docker,</w:t>
+      </w:r>
+      <w:r>
+        <w:rPr>
+          <w:color w:val="auto"/>
+          <w:szCs w:val="20"/>
+        </w:rPr>
+        <w:t xml:space="preserve"> terraform,</w:t>
+      </w:r>
+      <w:r>
+        <w:rPr>
+          <w:color w:val="auto"/>
+          <w:szCs w:val="20"/>
+        </w:rPr>
+        <w:t xml:space="preserve"> Postman, Ubuntu (Linux),</w:t>
       </w:r>
       <w:r>
         <w:rPr>
@@ -1160,7 +1059,17 @@
             <w:color w:val="auto"/>
             <w:u w:val="none"/>
           </w:rPr>
-          <w:t xml:space="preserve"> (Full</w:t>
+          <w:t xml:space="preserve"> </w:t>
+        </w:r>
+        <w:r>
+          <w:rPr>
+            <w:rStyle w:val="Hyperlink"/>
+            <w:b/>
+            <w:bCs/>
+            <w:color w:val="auto"/>
+            <w:u w:val="none"/>
+          </w:rPr>
+          <w:t>(Full</w:t>
         </w:r>
         <w:r>
           <w:rPr>
@@ -1180,18 +1089,7 @@
             <w:color w:val="auto"/>
             <w:u w:val="none"/>
           </w:rPr>
-          <w:t xml:space="preserve">tack Cloud </w:t>
-        </w:r>
-        <w:proofErr w:type="gramStart"/>
-        <w:r>
-          <w:rPr>
-            <w:rStyle w:val="Hyperlink"/>
-            <w:b/>
-            <w:bCs/>
-            <w:color w:val="auto"/>
-            <w:u w:val="none"/>
-          </w:rPr>
-          <w:t>D</w:t>
+          <w:t>tack Cloud</w:t>
         </w:r>
         <w:r>
           <w:rPr>
@@ -1201,7 +1099,47 @@
             <w:color w:val="auto"/>
             <w:u w:val="none"/>
           </w:rPr>
-          <w:t>eveloper)</w:t>
+          <w:t xml:space="preserve"> </w:t>
+        </w:r>
+        <w:r>
+          <w:rPr>
+            <w:rStyle w:val="Hyperlink"/>
+            <w:b/>
+            <w:bCs/>
+            <w:color w:val="auto"/>
+            <w:u w:val="none"/>
+          </w:rPr>
+          <w:t xml:space="preserve">Developer </w:t>
+        </w:r>
+        <w:r>
+          <w:rPr>
+            <w:rStyle w:val="Hyperlink"/>
+            <w:b/>
+            <w:bCs/>
+            <w:color w:val="auto"/>
+            <w:u w:val="none"/>
+          </w:rPr>
+          <w:t>Contractor</w:t>
+        </w:r>
+        <w:r>
+          <w:rPr>
+            <w:rStyle w:val="Hyperlink"/>
+            <w:b/>
+            <w:bCs/>
+            <w:color w:val="auto"/>
+            <w:u w:val="none"/>
+          </w:rPr>
+          <w:t>)</w:t>
+        </w:r>
+        <w:r>
+          <w:rPr>
+            <w:rStyle w:val="Hyperlink"/>
+            <w:b/>
+            <w:bCs/>
+            <w:color w:val="auto"/>
+            <w:u w:val="none"/>
+          </w:rPr>
+          <w:t xml:space="preserve"> </w:t>
         </w:r>
         <w:r>
           <w:rPr>
@@ -1211,7 +1149,6 @@
           </w:rPr>
           <w:t>|</w:t>
         </w:r>
-        <w:proofErr w:type="gramEnd"/>
         <w:r>
           <w:rPr>
             <w:rStyle w:val="Hyperlink"/>
@@ -1254,30 +1191,16 @@
             <w:color w:val="auto"/>
             <w:u w:val="none"/>
           </w:rPr>
-          <w:t xml:space="preserve"> tutord.io</w:t>
+          <w:t xml:space="preserve"> tutord.</w:t>
+        </w:r>
+        <w:r>
+          <w:t>io</w:t>
         </w:r>
       </w:hyperlink>
       <w:r>
-        <w:rPr>
-          <w:rStyle w:val="Hyperlink"/>
-          <w:bCs/>
-          <w:color w:val="auto"/>
-          <w:u w:val="none"/>
-        </w:rPr>
         <w:t xml:space="preserve"> </w:t>
       </w:r>
       <w:r>
-        <w:rPr>
-          <w:i/>
-          <w:iCs/>
-          <w:color w:val="auto"/>
-        </w:rPr>
-        <w:tab/>
-      </w:r>
-      <w:r>
-        <w:rPr>
-          <w:color w:val="auto"/>
-        </w:rPr>
         <w:t>Dec</w:t>
       </w:r>
       <w:r>
@@ -1320,7 +1243,7 @@
         <w:rPr>
           <w:color w:val="auto"/>
         </w:rPr>
-        <w:t>Present</w:t>
+        <w:t>resent</w:t>
       </w:r>
     </w:p>
     <w:p>
@@ -1399,65 +1322,7 @@
           <w:color w:val="auto"/>
           <w:szCs w:val="20"/>
         </w:rPr>
-        <w:t>M</w:t>
-      </w:r>
-      <w:r>
-        <w:rPr>
-          <w:color w:val="auto"/>
-          <w:szCs w:val="20"/>
-        </w:rPr>
-        <w:t xml:space="preserve">igrated </w:t>
-      </w:r>
-      <w:r>
-        <w:rPr>
-          <w:color w:val="auto"/>
-          <w:szCs w:val="20"/>
-        </w:rPr>
-        <w:t>the frontend</w:t>
-      </w:r>
-      <w:r>
-        <w:rPr>
-          <w:color w:val="auto"/>
-          <w:szCs w:val="20"/>
-        </w:rPr>
-        <w:t xml:space="preserve"> CI/CD pipeline</w:t>
-      </w:r>
-      <w:r>
-        <w:rPr>
-          <w:color w:val="auto"/>
-          <w:szCs w:val="20"/>
-        </w:rPr>
-        <w:t xml:space="preserve"> from AWS </w:t>
-      </w:r>
-      <w:proofErr w:type="spellStart"/>
-      <w:r>
-        <w:rPr>
-          <w:color w:val="auto"/>
-          <w:szCs w:val="20"/>
-        </w:rPr>
-        <w:t>CodeBuild</w:t>
-      </w:r>
-      <w:proofErr w:type="spellEnd"/>
-      <w:r>
-        <w:rPr>
-          <w:color w:val="auto"/>
-          <w:szCs w:val="20"/>
-        </w:rPr>
-        <w:t xml:space="preserve"> to GitHub Actions</w:t>
-      </w:r>
-      <w:r>
-        <w:rPr>
-          <w:color w:val="auto"/>
-          <w:szCs w:val="20"/>
-        </w:rPr>
-        <w:t xml:space="preserve">, reducing build time </w:t>
-      </w:r>
-      <w:r>
-        <w:rPr>
-          <w:color w:val="auto"/>
-          <w:szCs w:val="20"/>
-        </w:rPr>
-        <w:t xml:space="preserve">by </w:t>
+        <w:t xml:space="preserve">Removed 8 unused NAT gateways across production and lower environments via terraform saving </w:t>
       </w:r>
       <w:r>
         <w:rPr>
@@ -1466,146 +1331,41 @@
           <w:color w:val="auto"/>
           <w:szCs w:val="20"/>
         </w:rPr>
-        <w:t>~20%</w:t>
-      </w:r>
-      <w:r>
-        <w:rPr>
-          <w:color w:val="auto"/>
-          <w:szCs w:val="20"/>
-        </w:rPr>
-        <w:t xml:space="preserve"> </w:t>
+        <w:t>$3</w:t>
       </w:r>
       <w:r>
         <w:rPr>
           <w:b/>
           <w:bCs/>
           <w:color w:val="auto"/>
-        </w:rPr>
-        <w:t>(</w:t>
+          <w:szCs w:val="20"/>
+        </w:rPr>
+        <w:t>,</w:t>
       </w:r>
       <w:r>
         <w:rPr>
           <w:b/>
           <w:bCs/>
           <w:color w:val="auto"/>
-        </w:rPr>
-        <w:t>~</w:t>
+          <w:szCs w:val="20"/>
+        </w:rPr>
+        <w:t>000</w:t>
       </w:r>
       <w:r>
         <w:rPr>
           <w:b/>
           <w:bCs/>
           <w:color w:val="auto"/>
-        </w:rPr>
-        <w:t>5</w:t>
-      </w:r>
-      <w:r>
-        <w:rPr>
-          <w:b/>
-          <w:bCs/>
-          <w:color w:val="auto"/>
-        </w:rPr>
-        <w:t xml:space="preserve"> </w:t>
-      </w:r>
-      <w:r>
-        <w:rPr>
-          <w:b/>
-          <w:bCs/>
-          <w:color w:val="auto"/>
-        </w:rPr>
-        <w:t>m</w:t>
-      </w:r>
-      <w:r>
-        <w:rPr>
-          <w:b/>
-          <w:bCs/>
-          <w:color w:val="auto"/>
-        </w:rPr>
-        <w:t>in</w:t>
-      </w:r>
-      <w:r>
-        <w:rPr>
-          <w:b/>
-          <w:bCs/>
-          <w:color w:val="auto"/>
-        </w:rPr>
-        <w:t xml:space="preserve"> </w:t>
-      </w:r>
-      <w:r>
-        <w:rPr>
-          <w:b/>
-          <w:bCs/>
-          <w:color w:val="auto"/>
-        </w:rPr>
-        <w:t xml:space="preserve">to </w:t>
-      </w:r>
-      <w:r>
-        <w:rPr>
-          <w:b/>
-          <w:bCs/>
-          <w:color w:val="auto"/>
-        </w:rPr>
-        <w:t>~</w:t>
-      </w:r>
-      <w:r>
-        <w:rPr>
-          <w:b/>
-          <w:bCs/>
-          <w:color w:val="auto"/>
-        </w:rPr>
-        <w:t>4</w:t>
-      </w:r>
-      <w:r>
-        <w:rPr>
-          <w:b/>
-          <w:bCs/>
-          <w:color w:val="auto"/>
-        </w:rPr>
-        <w:t xml:space="preserve"> </w:t>
-      </w:r>
-      <w:r>
-        <w:rPr>
-          <w:b/>
-          <w:bCs/>
-          <w:color w:val="auto"/>
-        </w:rPr>
-        <w:t>m</w:t>
-      </w:r>
-      <w:r>
-        <w:rPr>
-          <w:b/>
-          <w:bCs/>
-          <w:color w:val="auto"/>
-        </w:rPr>
-        <w:t>in</w:t>
-      </w:r>
-      <w:r>
-        <w:rPr>
-          <w:b/>
-          <w:bCs/>
-          <w:color w:val="auto"/>
-        </w:rPr>
-        <w:t>)</w:t>
-      </w:r>
-      <w:r>
-        <w:rPr>
-          <w:b/>
-          <w:bCs/>
-          <w:color w:val="auto"/>
-        </w:rPr>
-        <w:t xml:space="preserve"> </w:t>
-      </w:r>
-      <w:r>
-        <w:rPr>
-          <w:color w:val="auto"/>
-        </w:rPr>
-        <w:t>and eliminating build costs</w:t>
-      </w:r>
-      <w:r>
-        <w:rPr>
-          <w:color w:val="auto"/>
-        </w:rPr>
-        <w:t>.</w:t>
+          <w:szCs w:val="20"/>
+        </w:rPr>
+        <w:t>+</w:t>
+      </w:r>
+      <w:r>
+        <w:rPr>
+          <w:color w:val="auto"/>
+          <w:szCs w:val="20"/>
+        </w:rPr>
+        <w:t xml:space="preserve"> annually.</w:t>
       </w:r>
     </w:p>
     <w:p>
@@ -1628,63 +1388,23 @@
           <w:color w:val="auto"/>
           <w:szCs w:val="20"/>
         </w:rPr>
-        <w:t xml:space="preserve">Removed </w:t>
-      </w:r>
-      <w:r>
-        <w:rPr>
-          <w:color w:val="auto"/>
-          <w:szCs w:val="20"/>
-        </w:rPr>
-        <w:t xml:space="preserve">unused </w:t>
-      </w:r>
-      <w:r>
-        <w:rPr>
-          <w:color w:val="auto"/>
-          <w:szCs w:val="20"/>
-        </w:rPr>
-        <w:t xml:space="preserve">NAT Gateways </w:t>
-      </w:r>
-      <w:r>
-        <w:rPr>
-          <w:color w:val="auto"/>
-          <w:szCs w:val="20"/>
-        </w:rPr>
-        <w:t xml:space="preserve">across </w:t>
-      </w:r>
-      <w:r>
-        <w:rPr>
-          <w:color w:val="auto"/>
-          <w:szCs w:val="20"/>
-        </w:rPr>
-        <w:t>production</w:t>
-      </w:r>
-      <w:r>
-        <w:rPr>
-          <w:color w:val="auto"/>
-          <w:szCs w:val="20"/>
-        </w:rPr>
-        <w:t xml:space="preserve"> and </w:t>
-      </w:r>
-      <w:r>
-        <w:rPr>
-          <w:color w:val="auto"/>
-          <w:szCs w:val="20"/>
-        </w:rPr>
-        <w:t xml:space="preserve">lower </w:t>
-      </w:r>
-      <w:r>
-        <w:rPr>
-          <w:color w:val="auto"/>
-          <w:szCs w:val="20"/>
-        </w:rPr>
-        <w:t>environments</w:t>
-      </w:r>
-      <w:r>
-        <w:rPr>
-          <w:color w:val="auto"/>
-          <w:szCs w:val="20"/>
-        </w:rPr>
-        <w:t xml:space="preserve"> </w:t>
+        <w:t xml:space="preserve">Migrated the frontend CI/CD pipeline from AWS </w:t>
+      </w:r>
+      <w:proofErr w:type="spellStart"/>
+      <w:r>
+        <w:rPr>
+          <w:color w:val="auto"/>
+          <w:szCs w:val="20"/>
+        </w:rPr>
+        <w:t>CodeBuild</w:t>
+      </w:r>
+      <w:proofErr w:type="spellEnd"/>
+      <w:r>
+        <w:rPr>
+          <w:color w:val="auto"/>
+          <w:szCs w:val="20"/>
+        </w:rPr>
+        <w:t xml:space="preserve"> to GitHub Actions, reducing build time by </w:t>
       </w:r>
       <w:r>
         <w:rPr>
@@ -1693,51 +1413,34 @@
           <w:color w:val="auto"/>
           <w:szCs w:val="20"/>
         </w:rPr>
-        <w:t xml:space="preserve">saving </w:t>
+        <w:t>~20%</w:t>
+      </w:r>
+      <w:r>
+        <w:rPr>
+          <w:color w:val="auto"/>
+          <w:szCs w:val="20"/>
+        </w:rPr>
+        <w:t xml:space="preserve"> </w:t>
       </w:r>
       <w:r>
         <w:rPr>
           <w:b/>
           <w:bCs/>
           <w:color w:val="auto"/>
-          <w:szCs w:val="20"/>
-        </w:rPr>
-        <w:t>~$3,000 USD</w:t>
-      </w:r>
-      <w:r>
-        <w:rPr>
-          <w:color w:val="auto"/>
-          <w:szCs w:val="20"/>
-        </w:rPr>
-        <w:t xml:space="preserve"> in annual </w:t>
-      </w:r>
-      <w:r>
-        <w:rPr>
-          <w:color w:val="auto"/>
-          <w:szCs w:val="20"/>
-        </w:rPr>
-        <w:t xml:space="preserve">infra </w:t>
-      </w:r>
-      <w:r>
-        <w:rPr>
-          <w:color w:val="auto"/>
-          <w:szCs w:val="20"/>
-        </w:rPr>
-        <w:t>costs</w:t>
-      </w:r>
-      <w:r>
-        <w:rPr>
-          <w:color w:val="auto"/>
-          <w:szCs w:val="20"/>
+        </w:rPr>
+        <w:t xml:space="preserve">(~5 min to ~4 min) </w:t>
+      </w:r>
+      <w:r>
+        <w:rPr>
+          <w:color w:val="auto"/>
+        </w:rPr>
+        <w:t>and eliminating build costs</w:t>
+      </w:r>
+      <w:r>
+        <w:rPr>
+          <w:color w:val="auto"/>
         </w:rPr>
         <w:t>.</w:t>
-      </w:r>
-      <w:r>
-        <w:rPr>
-          <w:color w:val="auto"/>
-          <w:szCs w:val="20"/>
-        </w:rPr>
-        <w:t xml:space="preserve"> </w:t>
       </w:r>
     </w:p>
     <w:p>
@@ -1860,14 +1563,28 @@
           <w:color w:val="auto"/>
           <w:szCs w:val="20"/>
         </w:rPr>
-        <w:t xml:space="preserve">reliability by fixing </w:t>
-      </w:r>
-      <w:r>
-        <w:rPr>
-          <w:color w:val="auto"/>
-          <w:szCs w:val="20"/>
-        </w:rPr>
-        <w:t>failing</w:t>
+        <w:t>reliability by fixing</w:t>
+      </w:r>
+      <w:r>
+        <w:rPr>
+          <w:color w:val="auto"/>
+          <w:szCs w:val="20"/>
+        </w:rPr>
+        <w:t xml:space="preserve"> unit and inte</w:t>
+      </w:r>
+      <w:r>
+        <w:rPr>
+          <w:color w:val="auto"/>
+          <w:szCs w:val="20"/>
+        </w:rPr>
+        <w:t>g</w:t>
+      </w:r>
+      <w:r>
+        <w:rPr>
+          <w:color w:val="auto"/>
+          <w:szCs w:val="20"/>
+        </w:rPr>
+        <w:t>ration</w:t>
       </w:r>
       <w:r>
         <w:rPr>
@@ -3541,6 +3258,12 @@
         </w:rPr>
         <w:t>:</w:t>
       </w:r>
+      <w:r>
+        <w:rPr>
+          <w:color w:val="auto"/>
+        </w:rPr>
+        <w:t xml:space="preserve"> </w:t>
+      </w:r>
     </w:p>
     <w:p>
       <w:pPr>
@@ -3560,7 +3283,7 @@
         <w:rPr>
           <w:color w:val="auto"/>
         </w:rPr>
-        <w:t>Attempted to b</w:t>
+        <w:t>B</w:t>
       </w:r>
       <w:r>
         <w:rPr>
@@ -4036,9 +3759,11 @@
       </w:r>
       <w:r>
         <w:rPr>
-          <w:color w:val="auto"/>
-        </w:rPr>
-        <w:t xml:space="preserve"> worth over </w:t>
+          <w:i/>
+          <w:iCs/>
+          <w:color w:val="auto"/>
+        </w:rPr>
+        <w:t>.</w:t>
       </w:r>
       <w:r>
         <w:rPr>
@@ -4046,37 +3771,7 @@
           <w:bCs/>
           <w:color w:val="auto"/>
         </w:rPr>
-        <w:t xml:space="preserve">$100 </w:t>
-      </w:r>
-      <w:r>
-        <w:rPr>
-          <w:color w:val="auto"/>
-        </w:rPr>
-        <w:t>(</w:t>
-      </w:r>
-      <w:r>
-        <w:rPr>
-          <w:i/>
-          <w:iCs/>
-          <w:color w:val="auto"/>
-        </w:rPr>
-        <w:t>~₹</w:t>
-      </w:r>
-      <w:r>
-        <w:rPr>
-          <w:b/>
-          <w:bCs/>
-          <w:i/>
-          <w:iCs/>
-          <w:color w:val="auto"/>
-        </w:rPr>
-        <w:t>10,000</w:t>
-      </w:r>
-      <w:r>
-        <w:rPr>
-          <w:color w:val="auto"/>
-        </w:rPr>
-        <w:t>).</w:t>
+        <w:t xml:space="preserve"> </w:t>
       </w:r>
     </w:p>
     <w:p>
@@ -4724,6 +4419,7 @@
         <w:spacing w:line="240" w:lineRule="auto"/>
         <w:ind w:right="0"/>
         <w:rPr>
+          <w:bCs/>
           <w:color w:val="auto"/>
         </w:rPr>
       </w:pPr>
@@ -4828,148 +4524,6 @@
           <w:color w:val="auto"/>
         </w:rPr>
         <w:t xml:space="preserve"> Aug 2024</w:t>
-      </w:r>
-    </w:p>
-    <w:p>
-      <w:pPr>
-        <w:pBdr>
-          <w:bottom w:val="single" w:sz="6" w:space="1" w:color="auto"/>
-        </w:pBdr>
-        <w:tabs>
-          <w:tab w:val="right" w:pos="10490"/>
-        </w:tabs>
-        <w:spacing w:line="240" w:lineRule="auto"/>
-        <w:ind w:right="0"/>
-        <w:rPr>
-          <w:bCs/>
-          <w:color w:val="auto"/>
-        </w:rPr>
-      </w:pPr>
-      <w:hyperlink r:id="rId30" w:history="1">
-        <w:r>
-          <w:rPr>
-            <w:rStyle w:val="Hyperlink"/>
-            <w:bCs/>
-            <w:color w:val="auto"/>
-            <w:u w:val="none"/>
-          </w:rPr>
-          <w:t xml:space="preserve">Lal Bahadur Shastri Jr. College, </w:t>
-        </w:r>
-        <w:proofErr w:type="spellStart"/>
-        <w:r>
-          <w:rPr>
-            <w:rStyle w:val="Hyperlink"/>
-            <w:bCs/>
-            <w:color w:val="auto"/>
-            <w:u w:val="none"/>
-          </w:rPr>
-          <w:t>Bhandara</w:t>
-        </w:r>
-        <w:proofErr w:type="spellEnd"/>
-      </w:hyperlink>
-      <w:r>
-        <w:rPr>
-          <w:rStyle w:val="Hyperlink"/>
-          <w:bCs/>
-          <w:color w:val="auto"/>
-          <w:u w:val="none"/>
-        </w:rPr>
-        <w:t xml:space="preserve"> </w:t>
-      </w:r>
-      <w:r>
-        <w:rPr>
-          <w:bCs/>
-          <w:color w:val="auto"/>
-        </w:rPr>
-        <w:t>–</w:t>
-      </w:r>
-      <w:r>
-        <w:rPr>
-          <w:color w:val="auto"/>
-        </w:rPr>
-        <w:t xml:space="preserve"> </w:t>
-      </w:r>
-      <w:r>
-        <w:rPr>
-          <w:b/>
-          <w:bCs/>
-          <w:i/>
-          <w:iCs/>
-          <w:color w:val="auto"/>
-        </w:rPr>
-        <w:t>12</w:t>
-      </w:r>
-      <w:r>
-        <w:rPr>
-          <w:b/>
-          <w:bCs/>
-          <w:i/>
-          <w:iCs/>
-          <w:color w:val="auto"/>
-          <w:vertAlign w:val="superscript"/>
-        </w:rPr>
-        <w:t>th</w:t>
-      </w:r>
-      <w:r>
-        <w:rPr>
-          <w:b/>
-          <w:bCs/>
-          <w:i/>
-          <w:iCs/>
-          <w:color w:val="auto"/>
-        </w:rPr>
-        <w:t xml:space="preserve"> std. </w:t>
-      </w:r>
-      <w:r>
-        <w:rPr>
-          <w:i/>
-          <w:iCs/>
-          <w:color w:val="auto"/>
-        </w:rPr>
-        <w:t xml:space="preserve">(PCMB + IT) </w:t>
-      </w:r>
-      <w:r>
-        <w:rPr>
-          <w:color w:val="auto"/>
-        </w:rPr>
-        <w:t>[</w:t>
-      </w:r>
-      <w:hyperlink r:id="rId31" w:history="1">
-        <w:r>
-          <w:rPr>
-            <w:rStyle w:val="Hyperlink"/>
-            <w:color w:val="auto"/>
-          </w:rPr>
-          <w:t>Maharashtra State Board</w:t>
-        </w:r>
-      </w:hyperlink>
-      <w:r>
-        <w:rPr>
-          <w:color w:val="auto"/>
-        </w:rPr>
-        <w:t>]</w:t>
-      </w:r>
-      <w:r>
-        <w:rPr>
-          <w:bCs/>
-          <w:color w:val="auto"/>
-        </w:rPr>
-        <w:tab/>
-        <w:t xml:space="preserve"> 2019 </w:t>
-      </w:r>
-      <w:r>
-        <w:rPr>
-          <w:bCs/>
-          <w:color w:val="auto"/>
-        </w:rPr>
-        <w:t>-</w:t>
-      </w:r>
-      <w:r>
-        <w:rPr>
-          <w:bCs/>
-          <w:color w:val="auto"/>
-        </w:rPr>
-        <w:t xml:space="preserve"> Feb 2020</w:t>
       </w:r>
     </w:p>
     <w:p>
@@ -5366,42 +4920,42 @@
         <v:path o:extrusionok="f" gradientshapeok="t" o:connecttype="rect"/>
         <o:lock v:ext="edit" aspectratio="t"/>
       </v:shapetype>
-      <v:shape id="_x0000_i1152" type="#_x0000_t75" style="width:512.4pt;height:512.4pt;rotation:180;flip:x y;visibility:visible;mso-wrap-style:square" o:bullet="t">
+      <v:shape id="_x0000_i1627" type="#_x0000_t75" style="width:512.4pt;height:512.4pt;rotation:180;flip:x y;visibility:visible;mso-wrap-style:square" o:bullet="t">
         <v:imagedata r:id="rId1" o:title="107161_circle_github_icon"/>
       </v:shape>
     </w:pict>
   </w:numPicBullet>
   <w:numPicBullet w:numPicBulletId="1">
     <w:pict>
-      <v:shape id="_x0000_i1153" type="#_x0000_t75" style="width:168.6pt;height:168.6pt;visibility:visible;mso-wrap-style:square" o:bullet="t">
+      <v:shape id="_x0000_i1628" type="#_x0000_t75" style="width:168.6pt;height:168.6pt;visibility:visible;mso-wrap-style:square" o:bullet="t">
         <v:imagedata r:id="rId2" o:title="941C13C7"/>
       </v:shape>
     </w:pict>
   </w:numPicBullet>
   <w:numPicBullet w:numPicBulletId="2">
     <w:pict>
-      <v:shape id="_x0000_i1154" type="#_x0000_t75" style="width:28.8pt;height:16.2pt;visibility:visible;mso-wrap-style:square" o:bullet="t">
+      <v:shape id="_x0000_i1629" type="#_x0000_t75" style="width:28.8pt;height:16.2pt;visibility:visible;mso-wrap-style:square" o:bullet="t">
         <v:imagedata r:id="rId3" o:title="107161_circle_github_icon"/>
       </v:shape>
     </w:pict>
   </w:numPicBullet>
   <w:numPicBullet w:numPicBulletId="3">
     <w:pict>
-      <v:shape id="_x0000_i1155" type="#_x0000_t75" style="width:240pt;height:234pt;visibility:visible;mso-wrap-style:square" o:bullet="t">
+      <v:shape id="_x0000_i1630" type="#_x0000_t75" style="width:240pt;height:234pt;visibility:visible;mso-wrap-style:square" o:bullet="t">
         <v:imagedata r:id="rId4" o:title="Indian_Institute_of_Technology_Bombay_Logo"/>
       </v:shape>
     </w:pict>
   </w:numPicBullet>
   <w:numPicBullet w:numPicBulletId="4">
     <w:pict>
-      <v:shape id="_x0000_i1156" type="#_x0000_t75" style="width:23.4pt;height:16.2pt;visibility:visible;mso-wrap-style:square" o:bullet="t">
+      <v:shape id="_x0000_i1631" type="#_x0000_t75" style="width:23.4pt;height:16.2pt;visibility:visible;mso-wrap-style:square" o:bullet="t">
         <v:imagedata r:id="rId5" o:title="Indian_Institute_of_Technology_Bombay_Logo"/>
       </v:shape>
     </w:pict>
   </w:numPicBullet>
   <w:numPicBullet w:numPicBulletId="5">
     <w:pict>
-      <v:shape id="_x0000_i1157" type="#_x0000_t75" style="width:75.6pt;height:75.6pt;visibility:visible;mso-wrap-style:square" o:bullet="t">
+      <v:shape id="_x0000_i1632" type="#_x0000_t75" style="width:75.6pt;height:75.6pt;visibility:visible;mso-wrap-style:square" o:bullet="t">
         <v:imagedata r:id="rId6" o:title=""/>
       </v:shape>
     </w:pict>
@@ -10435,7 +9989,6 @@
   <w:style w:type="character" w:default="1" w:styleId="DefaultParagraphFont">
     <w:name w:val="Default Paragraph Font"/>
     <w:uiPriority w:val="1"/>
-    <w:semiHidden/>
     <w:unhideWhenUsed/>
   </w:style>
   <w:style w:type="table" w:default="1" w:styleId="TableNormal">

</xml_diff>

<commit_message>
[microsoft] (quick) small-meduim changes to skills, experience and projects section
</commit_message>
<xml_diff>
--- a/Resume_latest - Copy.docx
+++ b/Resume_latest - Copy.docx
@@ -797,6 +797,25 @@
     </w:p>
     <w:p>
       <w:pPr>
+        <w:pBdr>
+          <w:bottom w:val="single" w:sz="6" w:space="1" w:color="auto"/>
+        </w:pBdr>
+        <w:tabs>
+          <w:tab w:val="right" w:pos="10490"/>
+        </w:tabs>
+        <w:spacing w:line="240" w:lineRule="auto"/>
+        <w:ind w:right="0"/>
+        <w:jc w:val="center"/>
+        <w:rPr>
+          <w:rStyle w:val="Hyperlink"/>
+          <w:bCs/>
+          <w:color w:val="auto"/>
+          <w:u w:val="none"/>
+        </w:rPr>
+      </w:pPr>
+    </w:p>
+    <w:p>
+      <w:pPr>
         <w:spacing w:line="240" w:lineRule="auto"/>
         <w:ind w:right="0"/>
         <w:jc w:val="center"/>
@@ -864,7 +883,56 @@
           <w:color w:val="auto"/>
           <w:szCs w:val="20"/>
         </w:rPr>
-        <w:t>JavaScript, PHP, Python, and SQL.</w:t>
+        <w:t xml:space="preserve">JavaScript, </w:t>
+      </w:r>
+      <w:r>
+        <w:rPr>
+          <w:color w:val="auto"/>
+          <w:szCs w:val="20"/>
+        </w:rPr>
+        <w:t>SQL</w:t>
+      </w:r>
+      <w:r>
+        <w:rPr>
+          <w:color w:val="auto"/>
+          <w:szCs w:val="20"/>
+        </w:rPr>
+        <w:t>. (Familiar:</w:t>
+      </w:r>
+      <w:r>
+        <w:rPr>
+          <w:color w:val="auto"/>
+          <w:szCs w:val="20"/>
+        </w:rPr>
+        <w:t xml:space="preserve"> </w:t>
+      </w:r>
+      <w:r>
+        <w:rPr>
+          <w:color w:val="auto"/>
+          <w:szCs w:val="20"/>
+        </w:rPr>
+        <w:t xml:space="preserve">PHP, </w:t>
+      </w:r>
+      <w:r>
+        <w:rPr>
+          <w:color w:val="auto"/>
+          <w:szCs w:val="20"/>
+        </w:rPr>
+        <w:t xml:space="preserve">Python, </w:t>
+      </w:r>
+      <w:r>
+        <w:rPr>
+          <w:color w:val="auto"/>
+          <w:szCs w:val="20"/>
+        </w:rPr>
+        <w:t>C++</w:t>
+      </w:r>
+      <w:r>
+        <w:rPr>
+          <w:color w:val="auto"/>
+          <w:szCs w:val="20"/>
+        </w:rPr>
+        <w:t>)</w:t>
       </w:r>
     </w:p>
     <w:p>
@@ -962,20 +1030,40 @@
           <w:color w:val="auto"/>
           <w:szCs w:val="20"/>
         </w:rPr>
-        <w:t xml:space="preserve"> terraform,</w:t>
-      </w:r>
-      <w:r>
-        <w:rPr>
-          <w:color w:val="auto"/>
-          <w:szCs w:val="20"/>
-        </w:rPr>
-        <w:t xml:space="preserve"> Postman, Ubuntu (Linux),</w:t>
-      </w:r>
-      <w:r>
-        <w:rPr>
-          <w:color w:val="auto"/>
-        </w:rPr>
-        <w:t xml:space="preserve"> React, Firebase real-time database, MySQL, and MySQL Workbench.</w:t>
+        <w:t xml:space="preserve"> </w:t>
+      </w:r>
+      <w:r>
+        <w:rPr>
+          <w:color w:val="auto"/>
+          <w:szCs w:val="20"/>
+        </w:rPr>
+        <w:t>T</w:t>
+      </w:r>
+      <w:r>
+        <w:rPr>
+          <w:color w:val="auto"/>
+          <w:szCs w:val="20"/>
+        </w:rPr>
+        <w:t>erraform,</w:t>
+      </w:r>
+      <w:r>
+        <w:rPr>
+          <w:color w:val="auto"/>
+          <w:szCs w:val="20"/>
+        </w:rPr>
+        <w:t xml:space="preserve"> </w:t>
+      </w:r>
+      <w:r>
+        <w:rPr>
+          <w:color w:val="auto"/>
+        </w:rPr>
+        <w:t>MySQL</w:t>
+      </w:r>
+      <w:r>
+        <w:rPr>
+          <w:color w:val="auto"/>
+        </w:rPr>
+        <w:t>.</w:t>
       </w:r>
     </w:p>
     <w:p>
@@ -1002,10 +1090,11 @@
         <w:ind w:right="0"/>
         <w:jc w:val="center"/>
         <w:rPr>
-          <w:rFonts w:cstheme="minorBidi"/>
-          <w:color w:val="auto"/>
-          <w:sz w:val="22"/>
-          <w:szCs w:val="22"/>
+          <w:b/>
+          <w:bCs/>
+          <w:color w:val="auto"/>
+          <w:sz w:val="24"/>
+          <w:szCs w:val="24"/>
         </w:rPr>
       </w:pPr>
       <w:r>
@@ -1049,7 +1138,7 @@
             <w:color w:val="auto"/>
             <w:u w:val="none"/>
           </w:rPr>
-          <w:t>Software Developer</w:t>
+          <w:t>Software Developer (Full-Stack Cloud Developer</w:t>
         </w:r>
         <w:r>
           <w:rPr>
@@ -1059,67 +1148,7 @@
             <w:color w:val="auto"/>
             <w:u w:val="none"/>
           </w:rPr>
-          <w:t xml:space="preserve"> </w:t>
-        </w:r>
-        <w:r>
-          <w:rPr>
-            <w:rStyle w:val="Hyperlink"/>
-            <w:b/>
-            <w:bCs/>
-            <w:color w:val="auto"/>
-            <w:u w:val="none"/>
-          </w:rPr>
-          <w:t>(Full</w:t>
-        </w:r>
-        <w:r>
-          <w:rPr>
-            <w:rStyle w:val="Hyperlink"/>
-            <w:b/>
-            <w:bCs/>
-            <w:color w:val="auto"/>
-            <w:u w:val="none"/>
-          </w:rPr>
-          <w:t>-S</w:t>
-        </w:r>
-        <w:r>
-          <w:rPr>
-            <w:rStyle w:val="Hyperlink"/>
-            <w:b/>
-            <w:bCs/>
-            <w:color w:val="auto"/>
-            <w:u w:val="none"/>
-          </w:rPr>
-          <w:t>tack Cloud</w:t>
-        </w:r>
-        <w:r>
-          <w:rPr>
-            <w:rStyle w:val="Hyperlink"/>
-            <w:b/>
-            <w:bCs/>
-            <w:color w:val="auto"/>
-            <w:u w:val="none"/>
-          </w:rPr>
-          <w:t xml:space="preserve"> </w:t>
-        </w:r>
-        <w:r>
-          <w:rPr>
-            <w:rStyle w:val="Hyperlink"/>
-            <w:b/>
-            <w:bCs/>
-            <w:color w:val="auto"/>
-            <w:u w:val="none"/>
-          </w:rPr>
-          <w:t xml:space="preserve">Developer </w:t>
-        </w:r>
-        <w:r>
-          <w:rPr>
-            <w:rStyle w:val="Hyperlink"/>
-            <w:b/>
-            <w:bCs/>
-            <w:color w:val="auto"/>
-            <w:u w:val="none"/>
-          </w:rPr>
-          <w:t>Contractor</w:t>
+          <w:t xml:space="preserve"> Contractor</w:t>
         </w:r>
         <w:r>
           <w:rPr>
@@ -1131,119 +1160,29 @@
           </w:rPr>
           <w:t>)</w:t>
         </w:r>
-        <w:r>
-          <w:rPr>
-            <w:rStyle w:val="Hyperlink"/>
-            <w:b/>
-            <w:bCs/>
-            <w:color w:val="auto"/>
-            <w:u w:val="none"/>
-          </w:rPr>
-          <w:t xml:space="preserve"> </w:t>
-        </w:r>
-        <w:r>
-          <w:rPr>
-            <w:rStyle w:val="Hyperlink"/>
-            <w:color w:val="auto"/>
-            <w:u w:val="none"/>
-          </w:rPr>
-          <w:t>|</w:t>
-        </w:r>
-        <w:r>
-          <w:rPr>
-            <w:rStyle w:val="Hyperlink"/>
-            <w:color w:val="auto"/>
-            <w:u w:val="none"/>
-          </w:rPr>
-          <w:t xml:space="preserve"> </w:t>
-        </w:r>
-        <w:proofErr w:type="spellStart"/>
-        <w:r>
-          <w:rPr>
-            <w:rStyle w:val="Hyperlink"/>
-            <w:color w:val="auto"/>
-            <w:u w:val="none"/>
-          </w:rPr>
-          <w:t>TutorD</w:t>
-        </w:r>
-        <w:proofErr w:type="spellEnd"/>
-        <w:r>
-          <w:rPr>
-            <w:rStyle w:val="Hyperlink"/>
-            <w:color w:val="auto"/>
-            <w:u w:val="none"/>
-          </w:rPr>
-          <w:t xml:space="preserve"> LLC (U.S.), remote </w:t>
-        </w:r>
-        <w:r>
-          <w:rPr>
-            <w:rStyle w:val="Hyperlink"/>
-            <w:bCs/>
-            <w:color w:val="auto"/>
-            <w:u w:val="none"/>
-          </w:rPr>
-          <w:t>|</w:t>
-        </w:r>
-        <w:r>
-          <w:rPr>
-            <w:rStyle w:val="Hyperlink"/>
-            <w:bCs/>
-            <w:color w:val="auto"/>
-            <w:u w:val="none"/>
-          </w:rPr>
-          <w:t xml:space="preserve"> tutord.</w:t>
-        </w:r>
-        <w:r>
-          <w:t>io</w:t>
-        </w:r>
       </w:hyperlink>
       <w:r>
+        <w:rPr>
+          <w:rStyle w:val="Hyperlink"/>
+          <w:bCs/>
+          <w:color w:val="auto"/>
+          <w:u w:val="none"/>
+        </w:rPr>
         <w:t xml:space="preserve"> </w:t>
       </w:r>
       <w:r>
-        <w:t>Dec</w:t>
-      </w:r>
-      <w:r>
-        <w:rPr>
-          <w:color w:val="auto"/>
-        </w:rPr>
-        <w:t xml:space="preserve"> </w:t>
-      </w:r>
-      <w:r>
-        <w:rPr>
-          <w:color w:val="auto"/>
-        </w:rPr>
-        <w:t>202</w:t>
-      </w:r>
-      <w:r>
-        <w:rPr>
-          <w:color w:val="auto"/>
-        </w:rPr>
-        <w:t>5</w:t>
-      </w:r>
-      <w:r>
-        <w:rPr>
-          <w:color w:val="auto"/>
-        </w:rPr>
-        <w:t xml:space="preserve"> </w:t>
-      </w:r>
-      <w:r>
-        <w:rPr>
-          <w:color w:val="auto"/>
-        </w:rPr>
-        <w:t>-</w:t>
-      </w:r>
-      <w:r>
-        <w:rPr>
-          <w:color w:val="auto"/>
-        </w:rPr>
-        <w:t xml:space="preserve"> </w:t>
-      </w:r>
-      <w:r>
-        <w:rPr>
-          <w:color w:val="auto"/>
-        </w:rPr>
-        <w:t>resent</w:t>
+        <w:rPr>
+          <w:i/>
+          <w:iCs/>
+          <w:color w:val="auto"/>
+        </w:rPr>
+        <w:tab/>
+      </w:r>
+      <w:r>
+        <w:rPr>
+          <w:color w:val="auto"/>
+        </w:rPr>
+        <w:t>Dec 2025 - Present</w:t>
       </w:r>
     </w:p>
     <w:p>
@@ -1257,6 +1196,36 @@
           <w:color w:val="auto"/>
         </w:rPr>
       </w:pPr>
+      <w:proofErr w:type="spellStart"/>
+      <w:r>
+        <w:rPr>
+          <w:b/>
+          <w:bCs/>
+          <w:color w:val="auto"/>
+        </w:rPr>
+        <w:t>TutorD</w:t>
+      </w:r>
+      <w:proofErr w:type="spellEnd"/>
+      <w:r>
+        <w:rPr>
+          <w:b/>
+          <w:bCs/>
+          <w:color w:val="auto"/>
+        </w:rPr>
+        <w:t xml:space="preserve"> LLC (U.S.), remote | tutord.io</w:t>
+      </w:r>
+      <w:r>
+        <w:rPr>
+          <w:color w:val="auto"/>
+        </w:rPr>
+        <w:t xml:space="preserve"> </w:t>
+      </w:r>
+      <w:r>
+        <w:rPr>
+          <w:color w:val="auto"/>
+        </w:rPr>
+        <w:t xml:space="preserve">| </w:t>
+      </w:r>
       <w:r>
         <w:rPr>
           <w:color w:val="auto"/>
@@ -1293,7 +1262,19 @@
         <w:rPr>
           <w:color w:val="auto"/>
         </w:rPr>
-        <w:t xml:space="preserve"> for tutors and teachers to enable distant learning</w:t>
+        <w:t xml:space="preserve"> </w:t>
+      </w:r>
+      <w:r>
+        <w:rPr>
+          <w:color w:val="auto"/>
+        </w:rPr>
+        <w:t xml:space="preserve">for </w:t>
+      </w:r>
+      <w:r>
+        <w:rPr>
+          <w:color w:val="auto"/>
+        </w:rPr>
+        <w:t>teachers to enable distant learning</w:t>
       </w:r>
       <w:r>
         <w:rPr>
@@ -1322,7 +1303,21 @@
           <w:color w:val="auto"/>
           <w:szCs w:val="20"/>
         </w:rPr>
-        <w:t xml:space="preserve">Removed 8 unused NAT gateways across production and lower environments via terraform saving </w:t>
+        <w:t xml:space="preserve">Removed 8 unused NAT gateways across production and lower environments via </w:t>
+      </w:r>
+      <w:r>
+        <w:rPr>
+          <w:color w:val="auto"/>
+          <w:szCs w:val="20"/>
+        </w:rPr>
+        <w:t>T</w:t>
+      </w:r>
+      <w:r>
+        <w:rPr>
+          <w:color w:val="auto"/>
+          <w:szCs w:val="20"/>
+        </w:rPr>
+        <w:t xml:space="preserve">erraform </w:t>
       </w:r>
       <w:r>
         <w:rPr>
@@ -1331,7 +1326,7 @@
           <w:color w:val="auto"/>
           <w:szCs w:val="20"/>
         </w:rPr>
-        <w:t>$3</w:t>
+        <w:t xml:space="preserve">saving </w:t>
       </w:r>
       <w:r>
         <w:rPr>
@@ -1340,7 +1335,7 @@
           <w:color w:val="auto"/>
           <w:szCs w:val="20"/>
         </w:rPr>
-        <w:t>,</w:t>
+        <w:t xml:space="preserve">over </w:t>
       </w:r>
       <w:r>
         <w:rPr>
@@ -1349,7 +1344,7 @@
           <w:color w:val="auto"/>
           <w:szCs w:val="20"/>
         </w:rPr>
-        <w:t>000</w:t>
+        <w:t>$3,000</w:t>
       </w:r>
       <w:r>
         <w:rPr>
@@ -1358,14 +1353,44 @@
           <w:color w:val="auto"/>
           <w:szCs w:val="20"/>
         </w:rPr>
-        <w:t>+</w:t>
-      </w:r>
-      <w:r>
-        <w:rPr>
-          <w:color w:val="auto"/>
-          <w:szCs w:val="20"/>
-        </w:rPr>
-        <w:t xml:space="preserve"> annually.</w:t>
+        <w:t xml:space="preserve"> </w:t>
+      </w:r>
+      <w:r>
+        <w:rPr>
+          <w:color w:val="auto"/>
+          <w:szCs w:val="20"/>
+        </w:rPr>
+        <w:t>in</w:t>
+      </w:r>
+      <w:r>
+        <w:rPr>
+          <w:b/>
+          <w:bCs/>
+          <w:color w:val="auto"/>
+          <w:szCs w:val="20"/>
+        </w:rPr>
+        <w:t xml:space="preserve"> </w:t>
+      </w:r>
+      <w:r>
+        <w:rPr>
+          <w:color w:val="auto"/>
+          <w:szCs w:val="20"/>
+        </w:rPr>
+        <w:t>annual</w:t>
+      </w:r>
+      <w:r>
+        <w:rPr>
+          <w:color w:val="auto"/>
+          <w:szCs w:val="20"/>
+        </w:rPr>
+        <w:t xml:space="preserve"> infrastructure costs</w:t>
+      </w:r>
+      <w:r>
+        <w:rPr>
+          <w:color w:val="auto"/>
+          <w:szCs w:val="20"/>
+        </w:rPr>
+        <w:t>.</w:t>
       </w:r>
     </w:p>
     <w:p>
@@ -1463,70 +1488,35 @@
           <w:color w:val="auto"/>
           <w:szCs w:val="20"/>
         </w:rPr>
-        <w:t>R</w:t>
-      </w:r>
-      <w:r>
-        <w:rPr>
-          <w:color w:val="auto"/>
-          <w:szCs w:val="20"/>
-        </w:rPr>
-        <w:t xml:space="preserve">esolved </w:t>
-      </w:r>
-      <w:r>
-        <w:rPr>
-          <w:color w:val="auto"/>
-          <w:szCs w:val="20"/>
-        </w:rPr>
-        <w:t xml:space="preserve">CI/CD and </w:t>
-      </w:r>
-      <w:r>
-        <w:rPr>
-          <w:color w:val="auto"/>
-          <w:szCs w:val="20"/>
-        </w:rPr>
-        <w:t xml:space="preserve">deployment failures by fixing environment variables and </w:t>
-      </w:r>
-      <w:r>
-        <w:rPr>
-          <w:color w:val="auto"/>
-          <w:szCs w:val="20"/>
-        </w:rPr>
-        <w:t>updating</w:t>
-      </w:r>
-      <w:r>
-        <w:rPr>
-          <w:color w:val="auto"/>
-          <w:szCs w:val="20"/>
-        </w:rPr>
-        <w:t xml:space="preserve"> ECS task defin</w:t>
-      </w:r>
-      <w:r>
-        <w:rPr>
-          <w:color w:val="auto"/>
-          <w:szCs w:val="20"/>
-        </w:rPr>
-        <w:t>i</w:t>
-      </w:r>
-      <w:r>
-        <w:rPr>
-          <w:color w:val="auto"/>
-          <w:szCs w:val="20"/>
-        </w:rPr>
-        <w:t>tion</w:t>
-      </w:r>
-      <w:r>
-        <w:rPr>
-          <w:color w:val="auto"/>
-          <w:szCs w:val="20"/>
-        </w:rPr>
-        <w:t>s</w:t>
-      </w:r>
-      <w:r>
-        <w:rPr>
-          <w:color w:val="auto"/>
-          <w:szCs w:val="20"/>
-        </w:rPr>
-        <w:t>.</w:t>
+        <w:t xml:space="preserve">Enhanced service reliability by fixing unit and integration tests, diagnosing </w:t>
+      </w:r>
+      <w:r>
+        <w:rPr>
+          <w:color w:val="auto"/>
+          <w:szCs w:val="20"/>
+        </w:rPr>
+        <w:t>ECS service downtime cause</w:t>
+      </w:r>
+      <w:r>
+        <w:rPr>
+          <w:color w:val="auto"/>
+          <w:szCs w:val="20"/>
+        </w:rPr>
+        <w:t>d</w:t>
+      </w:r>
+      <w:r>
+        <w:rPr>
+          <w:color w:val="auto"/>
+          <w:szCs w:val="20"/>
+        </w:rPr>
+        <w:t xml:space="preserve"> by EFS volume deletion,</w:t>
+      </w:r>
+      <w:r>
+        <w:rPr>
+          <w:color w:val="auto"/>
+          <w:szCs w:val="20"/>
+        </w:rPr>
+        <w:t xml:space="preserve"> and recommending ECS deployment circuit breakers.</w:t>
       </w:r>
     </w:p>
     <w:p>
@@ -1549,91 +1539,56 @@
           <w:color w:val="auto"/>
           <w:szCs w:val="20"/>
         </w:rPr>
-        <w:t xml:space="preserve">Enhanced </w:t>
-      </w:r>
-      <w:r>
-        <w:rPr>
-          <w:color w:val="auto"/>
-          <w:szCs w:val="20"/>
-        </w:rPr>
-        <w:t xml:space="preserve">service </w:t>
-      </w:r>
-      <w:r>
-        <w:rPr>
-          <w:color w:val="auto"/>
-          <w:szCs w:val="20"/>
-        </w:rPr>
-        <w:t>reliability by fixing</w:t>
-      </w:r>
-      <w:r>
-        <w:rPr>
-          <w:color w:val="auto"/>
-          <w:szCs w:val="20"/>
-        </w:rPr>
-        <w:t xml:space="preserve"> unit and inte</w:t>
-      </w:r>
-      <w:r>
-        <w:rPr>
-          <w:color w:val="auto"/>
-          <w:szCs w:val="20"/>
-        </w:rPr>
-        <w:t>g</w:t>
-      </w:r>
-      <w:r>
-        <w:rPr>
-          <w:color w:val="auto"/>
-          <w:szCs w:val="20"/>
-        </w:rPr>
-        <w:t>ration</w:t>
-      </w:r>
-      <w:r>
-        <w:rPr>
-          <w:color w:val="auto"/>
-          <w:szCs w:val="20"/>
-        </w:rPr>
-        <w:t xml:space="preserve"> tests, diagnosing </w:t>
-      </w:r>
-      <w:r>
-        <w:rPr>
-          <w:color w:val="auto"/>
-          <w:szCs w:val="20"/>
-        </w:rPr>
-        <w:t>ECS service downtime cause</w:t>
-      </w:r>
-      <w:r>
-        <w:rPr>
-          <w:color w:val="auto"/>
-          <w:szCs w:val="20"/>
-        </w:rPr>
-        <w:t>d</w:t>
-      </w:r>
-      <w:r>
-        <w:rPr>
-          <w:color w:val="auto"/>
-          <w:szCs w:val="20"/>
-        </w:rPr>
-        <w:t xml:space="preserve"> by EFS volume deletion,</w:t>
-      </w:r>
-      <w:r>
-        <w:rPr>
-          <w:color w:val="auto"/>
-          <w:szCs w:val="20"/>
-        </w:rPr>
-        <w:t xml:space="preserve"> and recommending </w:t>
-      </w:r>
-      <w:r>
-        <w:rPr>
-          <w:color w:val="auto"/>
-          <w:szCs w:val="20"/>
-        </w:rPr>
-        <w:t xml:space="preserve">ECS deployment </w:t>
-      </w:r>
-      <w:r>
-        <w:rPr>
-          <w:color w:val="auto"/>
-          <w:szCs w:val="20"/>
-        </w:rPr>
-        <w:t>circuit breaker</w:t>
+        <w:t>R</w:t>
+      </w:r>
+      <w:r>
+        <w:rPr>
+          <w:color w:val="auto"/>
+          <w:szCs w:val="20"/>
+        </w:rPr>
+        <w:t xml:space="preserve">esolved </w:t>
+      </w:r>
+      <w:r>
+        <w:rPr>
+          <w:color w:val="auto"/>
+          <w:szCs w:val="20"/>
+        </w:rPr>
+        <w:t xml:space="preserve">CI/CD and </w:t>
+      </w:r>
+      <w:r>
+        <w:rPr>
+          <w:color w:val="auto"/>
+          <w:szCs w:val="20"/>
+        </w:rPr>
+        <w:t xml:space="preserve">deployment failures by fixing environment variables and </w:t>
+      </w:r>
+      <w:r>
+        <w:rPr>
+          <w:color w:val="auto"/>
+          <w:szCs w:val="20"/>
+        </w:rPr>
+        <w:t>updating</w:t>
+      </w:r>
+      <w:r>
+        <w:rPr>
+          <w:color w:val="auto"/>
+          <w:szCs w:val="20"/>
+        </w:rPr>
+        <w:t xml:space="preserve"> ECS task defin</w:t>
+      </w:r>
+      <w:r>
+        <w:rPr>
+          <w:color w:val="auto"/>
+          <w:szCs w:val="20"/>
+        </w:rPr>
+        <w:t>i</w:t>
+      </w:r>
+      <w:r>
+        <w:rPr>
+          <w:color w:val="auto"/>
+          <w:szCs w:val="20"/>
+        </w:rPr>
+        <w:t>tion</w:t>
       </w:r>
       <w:r>
         <w:rPr>
@@ -2724,12 +2679,13 @@
     </w:p>
     <w:p>
       <w:pPr>
-        <w:spacing w:line="240" w:lineRule="auto"/>
+        <w:tabs>
+          <w:tab w:val="right" w:pos="10490"/>
+        </w:tabs>
+        <w:spacing w:after="0" w:line="240" w:lineRule="auto"/>
         <w:ind w:right="0"/>
-        <w:jc w:val="both"/>
-        <w:rPr>
-          <w:rFonts w:cs="Mangal"/>
-          <w:szCs w:val="18"/>
+        <w:rPr>
+          <w:color w:val="auto"/>
         </w:rPr>
       </w:pPr>
       <w:hyperlink r:id="rId24" w:history="1">
@@ -2817,6 +2773,32 @@
           <w:t>]:</w:t>
         </w:r>
       </w:hyperlink>
+      <w:r>
+        <w:rPr>
+          <w:i/>
+          <w:iCs/>
+          <w:color w:val="auto"/>
+        </w:rPr>
+        <w:tab/>
+      </w:r>
+      <w:r>
+        <w:rPr>
+          <w:color w:val="auto"/>
+        </w:rPr>
+        <w:t xml:space="preserve">Sep </w:t>
+      </w:r>
+      <w:r>
+        <w:rPr>
+          <w:color w:val="auto"/>
+        </w:rPr>
+        <w:t>202</w:t>
+      </w:r>
+      <w:r>
+        <w:rPr>
+          <w:color w:val="auto"/>
+        </w:rPr>
+        <w:t>5</w:t>
+      </w:r>
     </w:p>
     <w:p>
       <w:pPr>
@@ -3295,7 +3277,7 @@
         <w:rPr>
           <w:color w:val="auto"/>
         </w:rPr>
-        <w:t>d</w:t>
+        <w:t>t</w:t>
       </w:r>
       <w:r>
         <w:rPr>
@@ -3994,13 +3976,31 @@
         <w:rPr>
           <w:color w:val="auto"/>
         </w:rPr>
-        <w:t>n</w:t>
-      </w:r>
-      <w:r>
-        <w:rPr>
-          <w:color w:val="auto"/>
-        </w:rPr>
-        <w:t xml:space="preserve"> internet-controlled drone and </w:t>
+        <w:t xml:space="preserve"> </w:t>
+      </w:r>
+      <w:r>
+        <w:rPr>
+          <w:color w:val="auto"/>
+        </w:rPr>
+        <w:t>Wi</w:t>
+      </w:r>
+      <w:r>
+        <w:rPr>
+          <w:color w:val="auto"/>
+        </w:rPr>
+        <w:t>-</w:t>
+      </w:r>
+      <w:r>
+        <w:rPr>
+          <w:color w:val="auto"/>
+        </w:rPr>
+        <w:t xml:space="preserve">Fi </w:t>
+      </w:r>
+      <w:r>
+        <w:rPr>
+          <w:color w:val="auto"/>
+        </w:rPr>
+        <w:t xml:space="preserve">controlled drone and </w:t>
       </w:r>
       <w:r>
         <w:rPr>
@@ -4920,42 +4920,42 @@
         <v:path o:extrusionok="f" gradientshapeok="t" o:connecttype="rect"/>
         <o:lock v:ext="edit" aspectratio="t"/>
       </v:shapetype>
-      <v:shape id="_x0000_i1627" type="#_x0000_t75" style="width:512.4pt;height:512.4pt;rotation:180;flip:x y;visibility:visible;mso-wrap-style:square" o:bullet="t">
+      <v:shape id="_x0000_i1152" type="#_x0000_t75" style="width:512.4pt;height:512.4pt;rotation:180;flip:x y;visibility:visible;mso-wrap-style:square" o:bullet="t">
         <v:imagedata r:id="rId1" o:title="107161_circle_github_icon"/>
       </v:shape>
     </w:pict>
   </w:numPicBullet>
   <w:numPicBullet w:numPicBulletId="1">
     <w:pict>
-      <v:shape id="_x0000_i1628" type="#_x0000_t75" style="width:168.6pt;height:168.6pt;visibility:visible;mso-wrap-style:square" o:bullet="t">
+      <v:shape id="_x0000_i1153" type="#_x0000_t75" style="width:168.6pt;height:168.6pt;visibility:visible;mso-wrap-style:square" o:bullet="t">
         <v:imagedata r:id="rId2" o:title="941C13C7"/>
       </v:shape>
     </w:pict>
   </w:numPicBullet>
   <w:numPicBullet w:numPicBulletId="2">
     <w:pict>
-      <v:shape id="_x0000_i1629" type="#_x0000_t75" style="width:28.8pt;height:16.2pt;visibility:visible;mso-wrap-style:square" o:bullet="t">
+      <v:shape id="_x0000_i1154" type="#_x0000_t75" style="width:28.8pt;height:16.2pt;visibility:visible;mso-wrap-style:square" o:bullet="t">
         <v:imagedata r:id="rId3" o:title="107161_circle_github_icon"/>
       </v:shape>
     </w:pict>
   </w:numPicBullet>
   <w:numPicBullet w:numPicBulletId="3">
     <w:pict>
-      <v:shape id="_x0000_i1630" type="#_x0000_t75" style="width:240pt;height:234pt;visibility:visible;mso-wrap-style:square" o:bullet="t">
+      <v:shape id="_x0000_i1155" type="#_x0000_t75" style="width:240pt;height:234pt;visibility:visible;mso-wrap-style:square" o:bullet="t">
         <v:imagedata r:id="rId4" o:title="Indian_Institute_of_Technology_Bombay_Logo"/>
       </v:shape>
     </w:pict>
   </w:numPicBullet>
   <w:numPicBullet w:numPicBulletId="4">
     <w:pict>
-      <v:shape id="_x0000_i1631" type="#_x0000_t75" style="width:23.4pt;height:16.2pt;visibility:visible;mso-wrap-style:square" o:bullet="t">
+      <v:shape id="_x0000_i1156" type="#_x0000_t75" style="width:23.4pt;height:16.2pt;visibility:visible;mso-wrap-style:square" o:bullet="t">
         <v:imagedata r:id="rId5" o:title="Indian_Institute_of_Technology_Bombay_Logo"/>
       </v:shape>
     </w:pict>
   </w:numPicBullet>
   <w:numPicBullet w:numPicBulletId="5">
     <w:pict>
-      <v:shape id="_x0000_i1632" type="#_x0000_t75" style="width:75.6pt;height:75.6pt;visibility:visible;mso-wrap-style:square" o:bullet="t">
+      <v:shape id="_x0000_i1157" type="#_x0000_t75" style="width:75.6pt;height:75.6pt;visibility:visible;mso-wrap-style:square" o:bullet="t">
         <v:imagedata r:id="rId6" o:title=""/>
       </v:shape>
     </w:pict>
@@ -9911,7 +9911,7 @@
   <w:style w:type="paragraph" w:default="1" w:styleId="Normal">
     <w:name w:val="Normal"/>
     <w:qFormat/>
-    <w:rsid w:val="001B0663"/>
+    <w:rsid w:val="006E5EF9"/>
     <w:pPr>
       <w:spacing w:after="2" w:line="292" w:lineRule="auto"/>
       <w:ind w:left="10" w:right="4549" w:hanging="10"/>
@@ -9989,6 +9989,7 @@
   <w:style w:type="character" w:default="1" w:styleId="DefaultParagraphFont">
     <w:name w:val="Default Paragraph Font"/>
     <w:uiPriority w:val="1"/>
+    <w:semiHidden/>
     <w:unhideWhenUsed/>
   </w:style>
   <w:style w:type="table" w:default="1" w:styleId="TableNormal">

</xml_diff>

<commit_message>
[microsoft] fix Hindi4All project
</commit_message>
<xml_diff>
--- a/Resume_latest - Copy.docx
+++ b/Resume_latest - Copy.docx
@@ -377,25 +377,7 @@
             <w:color w:val="auto"/>
             <w:u w:val="none"/>
           </w:rPr>
-          <w:t>ithub.com/</w:t>
-        </w:r>
-        <w:proofErr w:type="spellStart"/>
-        <w:r>
-          <w:rPr>
-            <w:rStyle w:val="Hyperlink"/>
-            <w:color w:val="auto"/>
-            <w:u w:val="none"/>
-          </w:rPr>
-          <w:t>PrathameshBhagat</w:t>
-        </w:r>
-        <w:proofErr w:type="spellEnd"/>
-        <w:r>
-          <w:rPr>
-            <w:rStyle w:val="Hyperlink"/>
-            <w:color w:val="auto"/>
-            <w:u w:val="none"/>
-          </w:rPr>
-          <w:t xml:space="preserve"> </w:t>
+          <w:t xml:space="preserve">ithub.com/PrathameshBhagat </w:t>
         </w:r>
       </w:hyperlink>
     </w:p>
@@ -523,20 +505,8 @@
             <w:u w:val="none"/>
             <w:shd w:val="clear" w:color="auto" w:fill="FFFFFF"/>
           </w:rPr>
-          <w:t>n.com/in/</w:t>
+          <w:t>n.com/in/prathameshvivekbhagat</w:t>
         </w:r>
-        <w:proofErr w:type="spellStart"/>
-        <w:r>
-          <w:rPr>
-            <w:rStyle w:val="Hyperlink"/>
-            <w:bCs/>
-            <w:color w:val="auto"/>
-            <w:u w:val="none"/>
-            <w:shd w:val="clear" w:color="auto" w:fill="FFFFFF"/>
-          </w:rPr>
-          <w:t>prathameshvivekbhagat</w:t>
-        </w:r>
-        <w:proofErr w:type="spellEnd"/>
       </w:hyperlink>
       <w:r>
         <w:rPr>
@@ -1196,50 +1166,38 @@
           <w:color w:val="auto"/>
         </w:rPr>
       </w:pPr>
-      <w:proofErr w:type="spellStart"/>
       <w:r>
         <w:rPr>
           <w:b/>
           <w:bCs/>
           <w:color w:val="auto"/>
         </w:rPr>
+        <w:t>TutorD LLC (U.S.), remote | tutord.io</w:t>
+      </w:r>
+      <w:r>
+        <w:rPr>
+          <w:color w:val="auto"/>
+        </w:rPr>
+        <w:t xml:space="preserve"> </w:t>
+      </w:r>
+      <w:r>
+        <w:rPr>
+          <w:color w:val="auto"/>
+        </w:rPr>
+        <w:t xml:space="preserve">| </w:t>
+      </w:r>
+      <w:r>
+        <w:rPr>
+          <w:color w:val="auto"/>
+        </w:rPr>
+        <w:t>(</w:t>
+      </w:r>
+      <w:r>
+        <w:rPr>
+          <w:color w:val="auto"/>
+        </w:rPr>
         <w:t>TutorD</w:t>
       </w:r>
-      <w:proofErr w:type="spellEnd"/>
-      <w:r>
-        <w:rPr>
-          <w:b/>
-          <w:bCs/>
-          <w:color w:val="auto"/>
-        </w:rPr>
-        <w:t xml:space="preserve"> LLC (U.S.), remote | tutord.io</w:t>
-      </w:r>
-      <w:r>
-        <w:rPr>
-          <w:color w:val="auto"/>
-        </w:rPr>
-        <w:t xml:space="preserve"> </w:t>
-      </w:r>
-      <w:r>
-        <w:rPr>
-          <w:color w:val="auto"/>
-        </w:rPr>
-        <w:t xml:space="preserve">| </w:t>
-      </w:r>
-      <w:r>
-        <w:rPr>
-          <w:color w:val="auto"/>
-        </w:rPr>
-        <w:t>(</w:t>
-      </w:r>
-      <w:proofErr w:type="spellStart"/>
-      <w:r>
-        <w:rPr>
-          <w:color w:val="auto"/>
-        </w:rPr>
-        <w:t>TutorD</w:t>
-      </w:r>
-      <w:proofErr w:type="spellEnd"/>
       <w:r>
         <w:rPr>
           <w:color w:val="auto"/>
@@ -1413,23 +1371,7 @@
           <w:color w:val="auto"/>
           <w:szCs w:val="20"/>
         </w:rPr>
-        <w:t xml:space="preserve">Migrated the frontend CI/CD pipeline from AWS </w:t>
-      </w:r>
-      <w:proofErr w:type="spellStart"/>
-      <w:r>
-        <w:rPr>
-          <w:color w:val="auto"/>
-          <w:szCs w:val="20"/>
-        </w:rPr>
-        <w:t>CodeBuild</w:t>
-      </w:r>
-      <w:proofErr w:type="spellEnd"/>
-      <w:r>
-        <w:rPr>
-          <w:color w:val="auto"/>
-          <w:szCs w:val="20"/>
-        </w:rPr>
-        <w:t xml:space="preserve"> to GitHub Actions, reducing build time by </w:t>
+        <w:t xml:space="preserve">Migrated the frontend CI/CD pipeline from AWS CodeBuild to GitHub Actions, reducing build time by </w:t>
       </w:r>
       <w:r>
         <w:rPr>
@@ -2232,7 +2174,6 @@
         <w:t xml:space="preserve"> | </w:t>
       </w:r>
       <w:hyperlink r:id="rId23" w:history="1">
-        <w:proofErr w:type="spellStart"/>
         <w:r>
           <w:rPr>
             <w:rStyle w:val="Hyperlink"/>
@@ -2241,7 +2182,6 @@
           </w:rPr>
           <w:t>Hazirs</w:t>
         </w:r>
-        <w:proofErr w:type="spellEnd"/>
         <w:r>
           <w:rPr>
             <w:rStyle w:val="Hyperlink"/>
@@ -2322,19 +2262,11 @@
         </w:rPr>
         <w:t>(</w:t>
       </w:r>
-      <w:proofErr w:type="spellStart"/>
-      <w:r>
-        <w:rPr>
-          <w:color w:val="auto"/>
-        </w:rPr>
-        <w:t>Hazirs</w:t>
-      </w:r>
-      <w:proofErr w:type="spellEnd"/>
-      <w:r>
-        <w:rPr>
-          <w:color w:val="auto"/>
-        </w:rPr>
-        <w:t xml:space="preserve"> is an early-stage start</w:t>
+      <w:r>
+        <w:rPr>
+          <w:color w:val="auto"/>
+        </w:rPr>
+        <w:t>Hazirs is an early-stage start</w:t>
       </w:r>
       <w:r>
         <w:rPr>
@@ -2456,7 +2388,6 @@
         </w:rPr>
         <w:t xml:space="preserve"> </w:t>
       </w:r>
-      <w:proofErr w:type="spellStart"/>
       <w:r>
         <w:rPr>
           <w:color w:val="auto"/>
@@ -2464,7 +2395,6 @@
         </w:rPr>
         <w:t>Hazirs</w:t>
       </w:r>
-      <w:proofErr w:type="spellEnd"/>
       <w:r>
         <w:rPr>
           <w:color w:val="auto"/>
@@ -2689,7 +2619,6 @@
         </w:rPr>
       </w:pPr>
       <w:hyperlink r:id="rId24" w:history="1">
-        <w:proofErr w:type="spellStart"/>
         <w:r>
           <w:rPr>
             <w:rStyle w:val="Hyperlink"/>
@@ -2698,18 +2627,7 @@
             <w:color w:val="auto"/>
             <w:u w:val="none"/>
           </w:rPr>
-          <w:t>Catima</w:t>
-        </w:r>
-        <w:proofErr w:type="spellEnd"/>
-        <w:r>
-          <w:rPr>
-            <w:rStyle w:val="Hyperlink"/>
-            <w:b/>
-            <w:bCs/>
-            <w:color w:val="auto"/>
-            <w:u w:val="none"/>
-          </w:rPr>
-          <w:t xml:space="preserve"> Loyalty </w:t>
+          <w:t xml:space="preserve">Catima Loyalty </w:t>
         </w:r>
         <w:r>
           <w:rPr>
@@ -2813,21 +2731,7 @@
         <w:rPr>
           <w:color w:val="auto"/>
         </w:rPr>
-        <w:t>(</w:t>
-      </w:r>
-      <w:proofErr w:type="spellStart"/>
-      <w:r>
-        <w:rPr>
-          <w:color w:val="auto"/>
-        </w:rPr>
-        <w:t>Catima</w:t>
-      </w:r>
-      <w:proofErr w:type="spellEnd"/>
-      <w:r>
-        <w:rPr>
-          <w:color w:val="auto"/>
-        </w:rPr>
-        <w:t xml:space="preserve"> is a</w:t>
+        <w:t>(Catima is a</w:t>
       </w:r>
       <w:r>
         <w:rPr>
@@ -2990,21 +2894,7 @@
         <w:rPr>
           <w:color w:val="auto"/>
         </w:rPr>
-        <w:t xml:space="preserve">multiple interfaces, and </w:t>
-      </w:r>
-      <w:proofErr w:type="spellStart"/>
-      <w:r>
-        <w:rPr>
-          <w:color w:val="auto"/>
-        </w:rPr>
-        <w:t>enums</w:t>
-      </w:r>
-      <w:proofErr w:type="spellEnd"/>
-      <w:r>
-        <w:rPr>
-          <w:color w:val="auto"/>
-        </w:rPr>
-        <w:t xml:space="preserve"> to </w:t>
+        <w:t xml:space="preserve">multiple interfaces, and enums to </w:t>
       </w:r>
       <w:r>
         <w:rPr>
@@ -3211,6 +3101,16 @@
         <w:r>
           <w:rPr>
             <w:rStyle w:val="Hyperlink"/>
+            <w:b/>
+            <w:bCs/>
+            <w:color w:val="auto"/>
+            <w:u w:val="none"/>
+          </w:rPr>
+          <w:t>, Java</w:t>
+        </w:r>
+        <w:r>
+          <w:rPr>
+            <w:rStyle w:val="Hyperlink"/>
             <w:color w:val="auto"/>
             <w:u w:val="none"/>
           </w:rPr>
@@ -3299,17 +3199,15 @@
           <w:iCs/>
           <w:color w:val="auto"/>
         </w:rPr>
-        <w:t xml:space="preserve"> brand-new</w:t>
-      </w:r>
-      <w:r>
-        <w:rPr>
-          <w:b/>
-          <w:bCs/>
+        <w:t xml:space="preserve"> Hindi</w:t>
+      </w:r>
+      <w:r>
+        <w:rPr>
           <w:i/>
           <w:iCs/>
           <w:color w:val="auto"/>
         </w:rPr>
-        <w:t xml:space="preserve"> </w:t>
+        <w:t xml:space="preserve"> code </w:t>
       </w:r>
       <w:r>
         <w:rPr>
@@ -3317,65 +3215,37 @@
           <w:iCs/>
           <w:color w:val="auto"/>
         </w:rPr>
-        <w:t>programming language</w:t>
-      </w:r>
-      <w:r>
-        <w:rPr>
-          <w:color w:val="auto"/>
-        </w:rPr>
-        <w:t xml:space="preserve"> in </w:t>
-      </w:r>
-      <w:r>
-        <w:rPr>
-          <w:b/>
-          <w:bCs/>
-          <w:color w:val="auto"/>
-        </w:rPr>
-        <w:t>Hindi</w:t>
-      </w:r>
-      <w:r>
-        <w:rPr>
-          <w:b/>
-          <w:bCs/>
-          <w:color w:val="auto"/>
-        </w:rPr>
-        <w:t>,</w:t>
-      </w:r>
-      <w:r>
-        <w:rPr>
-          <w:color w:val="auto"/>
-        </w:rPr>
-        <w:t xml:space="preserve"> to</w:t>
-      </w:r>
-      <w:r>
-        <w:rPr>
-          <w:color w:val="auto"/>
-        </w:rPr>
-        <w:t xml:space="preserve"> help </w:t>
-      </w:r>
-      <w:r>
-        <w:rPr>
-          <w:color w:val="auto"/>
-        </w:rPr>
-        <w:t>ease l</w:t>
-      </w:r>
-      <w:r>
-        <w:rPr>
-          <w:color w:val="auto"/>
-        </w:rPr>
-        <w:t>earning</w:t>
-      </w:r>
-      <w:r>
-        <w:rPr>
-          <w:color w:val="auto"/>
-        </w:rPr>
+        <w:t>execution system</w:t>
+      </w:r>
+      <w:r>
+        <w:rPr>
+          <w:color w:val="auto"/>
+        </w:rPr>
+        <w:t xml:space="preserve"> which </w:t>
+      </w:r>
+      <w:r>
+        <w:t>transpiles</w:t>
+      </w:r>
+      <w:r>
         <w:t xml:space="preserve"> </w:t>
       </w:r>
       <w:r>
         <w:rPr>
           <w:color w:val="auto"/>
         </w:rPr>
-        <w:t>and accessibility.</w:t>
+        <w:t>H</w:t>
+      </w:r>
+      <w:r>
+        <w:rPr>
+          <w:color w:val="auto"/>
+        </w:rPr>
+        <w:t>indi code to java</w:t>
+      </w:r>
+      <w:r>
+        <w:rPr>
+          <w:color w:val="auto"/>
+        </w:rPr>
+        <w:t>, executes it and displays output.</w:t>
       </w:r>
     </w:p>
     <w:p>
@@ -3820,7 +3690,6 @@
         </w:rPr>
         <w:t xml:space="preserve"> and web scraping </w:t>
       </w:r>
-      <w:proofErr w:type="spellStart"/>
       <w:r>
         <w:rPr>
           <w:b/>
@@ -3829,7 +3698,6 @@
         </w:rPr>
         <w:t>Zerodha’s</w:t>
       </w:r>
-      <w:proofErr w:type="spellEnd"/>
       <w:r>
         <w:rPr>
           <w:color w:val="auto"/>
@@ -4620,7 +4488,6 @@
         </w:rPr>
         <w:t xml:space="preserve">% </w:t>
       </w:r>
-      <w:proofErr w:type="spellStart"/>
       <w:r>
         <w:rPr>
           <w:color w:val="auto"/>
@@ -4635,7 +4502,6 @@
         </w:rPr>
         <w:t>r</w:t>
       </w:r>
-      <w:proofErr w:type="spellEnd"/>
       <w:r>
         <w:rPr>
           <w:color w:val="auto"/>

</xml_diff>

<commit_message>
[microsoft] Language => Languages(s) and leetcode => ~500 problems fix
</commit_message>
<xml_diff>
--- a/Resume_latest - Copy.docx
+++ b/Resume_latest - Copy.docx
@@ -377,7 +377,25 @@
             <w:color w:val="auto"/>
             <w:u w:val="none"/>
           </w:rPr>
-          <w:t xml:space="preserve">ithub.com/PrathameshBhagat </w:t>
+          <w:t>ithub.com/</w:t>
+        </w:r>
+        <w:proofErr w:type="spellStart"/>
+        <w:r>
+          <w:rPr>
+            <w:rStyle w:val="Hyperlink"/>
+            <w:color w:val="auto"/>
+            <w:u w:val="none"/>
+          </w:rPr>
+          <w:t>PrathameshBhagat</w:t>
+        </w:r>
+        <w:proofErr w:type="spellEnd"/>
+        <w:r>
+          <w:rPr>
+            <w:rStyle w:val="Hyperlink"/>
+            <w:color w:val="auto"/>
+            <w:u w:val="none"/>
+          </w:rPr>
+          <w:t xml:space="preserve"> </w:t>
         </w:r>
       </w:hyperlink>
     </w:p>
@@ -505,8 +523,20 @@
             <w:u w:val="none"/>
             <w:shd w:val="clear" w:color="auto" w:fill="FFFFFF"/>
           </w:rPr>
-          <w:t>n.com/in/prathameshvivekbhagat</w:t>
+          <w:t>n.com/in/</w:t>
         </w:r>
+        <w:proofErr w:type="spellStart"/>
+        <w:r>
+          <w:rPr>
+            <w:rStyle w:val="Hyperlink"/>
+            <w:bCs/>
+            <w:color w:val="auto"/>
+            <w:u w:val="none"/>
+            <w:shd w:val="clear" w:color="auto" w:fill="FFFFFF"/>
+          </w:rPr>
+          <w:t>prathameshvivekbhagat</w:t>
+        </w:r>
+        <w:proofErr w:type="spellEnd"/>
       </w:hyperlink>
       <w:r>
         <w:rPr>
@@ -834,6 +864,15 @@
       </w:r>
       <w:r>
         <w:rPr>
+          <w:i/>
+          <w:iCs/>
+          <w:color w:val="auto"/>
+          <w:szCs w:val="20"/>
+        </w:rPr>
+        <w:t>s</w:t>
+      </w:r>
+      <w:r>
+        <w:rPr>
           <w:b/>
           <w:bCs/>
           <w:color w:val="auto"/>
@@ -1166,13 +1205,23 @@
           <w:color w:val="auto"/>
         </w:rPr>
       </w:pPr>
+      <w:proofErr w:type="spellStart"/>
       <w:r>
         <w:rPr>
           <w:b/>
           <w:bCs/>
           <w:color w:val="auto"/>
         </w:rPr>
-        <w:t>TutorD LLC (U.S.), remote | tutord.io</w:t>
+        <w:t>TutorD</w:t>
+      </w:r>
+      <w:proofErr w:type="spellEnd"/>
+      <w:r>
+        <w:rPr>
+          <w:b/>
+          <w:bCs/>
+          <w:color w:val="auto"/>
+        </w:rPr>
+        <w:t xml:space="preserve"> LLC (U.S.), remote | tutord.io</w:t>
       </w:r>
       <w:r>
         <w:rPr>
@@ -1192,12 +1241,14 @@
         </w:rPr>
         <w:t>(</w:t>
       </w:r>
+      <w:proofErr w:type="spellStart"/>
       <w:r>
         <w:rPr>
           <w:color w:val="auto"/>
         </w:rPr>
         <w:t>TutorD</w:t>
       </w:r>
+      <w:proofErr w:type="spellEnd"/>
       <w:r>
         <w:rPr>
           <w:color w:val="auto"/>
@@ -1371,7 +1422,23 @@
           <w:color w:val="auto"/>
           <w:szCs w:val="20"/>
         </w:rPr>
-        <w:t xml:space="preserve">Migrated the frontend CI/CD pipeline from AWS CodeBuild to GitHub Actions, reducing build time by </w:t>
+        <w:t xml:space="preserve">Migrated the frontend CI/CD pipeline from AWS </w:t>
+      </w:r>
+      <w:proofErr w:type="spellStart"/>
+      <w:r>
+        <w:rPr>
+          <w:color w:val="auto"/>
+          <w:szCs w:val="20"/>
+        </w:rPr>
+        <w:t>CodeBuild</w:t>
+      </w:r>
+      <w:proofErr w:type="spellEnd"/>
+      <w:r>
+        <w:rPr>
+          <w:color w:val="auto"/>
+          <w:szCs w:val="20"/>
+        </w:rPr>
+        <w:t xml:space="preserve"> to GitHub Actions, reducing build time by </w:t>
       </w:r>
       <w:r>
         <w:rPr>
@@ -2174,6 +2241,7 @@
         <w:t xml:space="preserve"> | </w:t>
       </w:r>
       <w:hyperlink r:id="rId23" w:history="1">
+        <w:proofErr w:type="spellStart"/>
         <w:r>
           <w:rPr>
             <w:rStyle w:val="Hyperlink"/>
@@ -2182,6 +2250,7 @@
           </w:rPr>
           <w:t>Hazirs</w:t>
         </w:r>
+        <w:proofErr w:type="spellEnd"/>
         <w:r>
           <w:rPr>
             <w:rStyle w:val="Hyperlink"/>
@@ -2262,11 +2331,19 @@
         </w:rPr>
         <w:t>(</w:t>
       </w:r>
-      <w:r>
-        <w:rPr>
-          <w:color w:val="auto"/>
-        </w:rPr>
-        <w:t>Hazirs is an early-stage start</w:t>
+      <w:proofErr w:type="spellStart"/>
+      <w:r>
+        <w:rPr>
+          <w:color w:val="auto"/>
+        </w:rPr>
+        <w:t>Hazirs</w:t>
+      </w:r>
+      <w:proofErr w:type="spellEnd"/>
+      <w:r>
+        <w:rPr>
+          <w:color w:val="auto"/>
+        </w:rPr>
+        <w:t xml:space="preserve"> is an early-stage start</w:t>
       </w:r>
       <w:r>
         <w:rPr>
@@ -2388,6 +2465,7 @@
         </w:rPr>
         <w:t xml:space="preserve"> </w:t>
       </w:r>
+      <w:proofErr w:type="spellStart"/>
       <w:r>
         <w:rPr>
           <w:color w:val="auto"/>
@@ -2395,6 +2473,7 @@
         </w:rPr>
         <w:t>Hazirs</w:t>
       </w:r>
+      <w:proofErr w:type="spellEnd"/>
       <w:r>
         <w:rPr>
           <w:color w:val="auto"/>
@@ -2619,6 +2698,7 @@
         </w:rPr>
       </w:pPr>
       <w:hyperlink r:id="rId24" w:history="1">
+        <w:proofErr w:type="spellStart"/>
         <w:r>
           <w:rPr>
             <w:rStyle w:val="Hyperlink"/>
@@ -2627,7 +2707,18 @@
             <w:color w:val="auto"/>
             <w:u w:val="none"/>
           </w:rPr>
-          <w:t xml:space="preserve">Catima Loyalty </w:t>
+          <w:t>Catima</w:t>
+        </w:r>
+        <w:proofErr w:type="spellEnd"/>
+        <w:r>
+          <w:rPr>
+            <w:rStyle w:val="Hyperlink"/>
+            <w:b/>
+            <w:bCs/>
+            <w:color w:val="auto"/>
+            <w:u w:val="none"/>
+          </w:rPr>
+          <w:t xml:space="preserve"> Loyalty </w:t>
         </w:r>
         <w:r>
           <w:rPr>
@@ -2731,7 +2822,21 @@
         <w:rPr>
           <w:color w:val="auto"/>
         </w:rPr>
-        <w:t>(Catima is a</w:t>
+        <w:t>(</w:t>
+      </w:r>
+      <w:proofErr w:type="spellStart"/>
+      <w:r>
+        <w:rPr>
+          <w:color w:val="auto"/>
+        </w:rPr>
+        <w:t>Catima</w:t>
+      </w:r>
+      <w:proofErr w:type="spellEnd"/>
+      <w:r>
+        <w:rPr>
+          <w:color w:val="auto"/>
+        </w:rPr>
+        <w:t xml:space="preserve"> is a</w:t>
       </w:r>
       <w:r>
         <w:rPr>
@@ -2894,7 +2999,21 @@
         <w:rPr>
           <w:color w:val="auto"/>
         </w:rPr>
-        <w:t xml:space="preserve">multiple interfaces, and enums to </w:t>
+        <w:t xml:space="preserve">multiple interfaces, and </w:t>
+      </w:r>
+      <w:proofErr w:type="spellStart"/>
+      <w:r>
+        <w:rPr>
+          <w:color w:val="auto"/>
+        </w:rPr>
+        <w:t>enums</w:t>
+      </w:r>
+      <w:proofErr w:type="spellEnd"/>
+      <w:r>
+        <w:rPr>
+          <w:color w:val="auto"/>
+        </w:rPr>
+        <w:t xml:space="preserve"> to </w:t>
       </w:r>
       <w:r>
         <w:rPr>
@@ -3223,9 +3342,11 @@
         </w:rPr>
         <w:t xml:space="preserve"> which </w:t>
       </w:r>
+      <w:proofErr w:type="spellStart"/>
       <w:r>
         <w:t>transpiles</w:t>
       </w:r>
+      <w:proofErr w:type="spellEnd"/>
       <w:r>
         <w:t xml:space="preserve"> </w:t>
       </w:r>
@@ -3690,6 +3811,7 @@
         </w:rPr>
         <w:t xml:space="preserve"> and web scraping </w:t>
       </w:r>
+      <w:proofErr w:type="spellStart"/>
       <w:r>
         <w:rPr>
           <w:b/>
@@ -3698,6 +3820,7 @@
         </w:rPr>
         <w:t>Zerodha’s</w:t>
       </w:r>
+      <w:proofErr w:type="spellEnd"/>
       <w:r>
         <w:rPr>
           <w:color w:val="auto"/>
@@ -4488,6 +4611,7 @@
         </w:rPr>
         <w:t xml:space="preserve">% </w:t>
       </w:r>
+      <w:proofErr w:type="spellStart"/>
       <w:r>
         <w:rPr>
           <w:color w:val="auto"/>
@@ -4502,6 +4626,7 @@
         </w:rPr>
         <w:t>r</w:t>
       </w:r>
+      <w:proofErr w:type="spellEnd"/>
       <w:r>
         <w:rPr>
           <w:color w:val="auto"/>
@@ -4518,19 +4643,18 @@
       </w:r>
       <w:r>
         <w:rPr>
+          <w:color w:val="auto"/>
+          <w:szCs w:val="20"/>
+        </w:rPr>
+        <w:t>~5</w:t>
+      </w:r>
+      <w:r>
+        <w:rPr>
           <w:rFonts w:cs="Arial"/>
           <w:color w:val="auto"/>
           <w:szCs w:val="20"/>
         </w:rPr>
-        <w:t>+</w:t>
-      </w:r>
-      <w:r>
-        <w:rPr>
-          <w:rFonts w:cs="Arial"/>
-          <w:color w:val="auto"/>
-          <w:szCs w:val="20"/>
-        </w:rPr>
-        <w:t>40</w:t>
+        <w:t>0</w:t>
       </w:r>
       <w:r>
         <w:rPr>

</xml_diff>

<commit_message>
[microsoft] fix hyper link for 2T
</commit_message>
<xml_diff>
--- a/Resume_latest - Copy.docx
+++ b/Resume_latest - Copy.docx
@@ -1205,24 +1205,30 @@
           <w:color w:val="auto"/>
         </w:rPr>
       </w:pPr>
-      <w:proofErr w:type="spellStart"/>
-      <w:r>
-        <w:rPr>
-          <w:b/>
-          <w:bCs/>
-          <w:color w:val="auto"/>
-        </w:rPr>
-        <w:t>TutorD</w:t>
-      </w:r>
-      <w:proofErr w:type="spellEnd"/>
-      <w:r>
-        <w:rPr>
-          <w:b/>
-          <w:bCs/>
-          <w:color w:val="auto"/>
-        </w:rPr>
-        <w:t xml:space="preserve"> LLC (U.S.), remote | tutord.io</w:t>
-      </w:r>
+      <w:hyperlink r:id="rId21" w:history="1">
+        <w:proofErr w:type="spellStart"/>
+        <w:r>
+          <w:rPr>
+            <w:rStyle w:val="Hyperlink"/>
+            <w:b/>
+            <w:bCs/>
+            <w:color w:val="auto"/>
+            <w:u w:val="none"/>
+          </w:rPr>
+          <w:t>TutorD</w:t>
+        </w:r>
+        <w:proofErr w:type="spellEnd"/>
+        <w:r>
+          <w:rPr>
+            <w:rStyle w:val="Hyperlink"/>
+            <w:b/>
+            <w:bCs/>
+            <w:color w:val="auto"/>
+            <w:u w:val="none"/>
+          </w:rPr>
+          <w:t xml:space="preserve"> LLC (U.S.), remote | tutord.io</w:t>
+        </w:r>
+      </w:hyperlink>
       <w:r>
         <w:rPr>
           <w:color w:val="auto"/>
@@ -1648,7 +1654,7 @@
         </w:rPr>
         <w:t xml:space="preserve"> </w:t>
       </w:r>
-      <w:hyperlink r:id="rId21" w:history="1">
+      <w:hyperlink r:id="rId22" w:history="1">
         <w:r>
           <w:rPr>
             <w:rStyle w:val="Hyperlink"/>
@@ -1741,7 +1747,7 @@
           <w:color w:val="auto"/>
         </w:rPr>
       </w:pPr>
-      <w:hyperlink r:id="rId22" w:history="1">
+      <w:hyperlink r:id="rId23" w:history="1">
         <w:r>
           <w:rPr>
             <w:rStyle w:val="Hyperlink"/>
@@ -2240,7 +2246,7 @@
         </w:rPr>
         <w:t xml:space="preserve"> | </w:t>
       </w:r>
-      <w:hyperlink r:id="rId23" w:history="1">
+      <w:hyperlink r:id="rId24" w:history="1">
         <w:proofErr w:type="spellStart"/>
         <w:r>
           <w:rPr>
@@ -2697,7 +2703,7 @@
           <w:color w:val="auto"/>
         </w:rPr>
       </w:pPr>
-      <w:hyperlink r:id="rId24" w:history="1">
+      <w:hyperlink r:id="rId25" w:history="1">
         <w:proofErr w:type="spellStart"/>
         <w:r>
           <w:rPr>
@@ -3188,7 +3194,7 @@
           <w:color w:val="auto"/>
         </w:rPr>
       </w:pPr>
-      <w:hyperlink r:id="rId25" w:history="1">
+      <w:hyperlink r:id="rId26" w:history="1">
         <w:r>
           <w:rPr>
             <w:rStyle w:val="Hyperlink"/>
@@ -3566,7 +3572,7 @@
           <w:color w:val="auto"/>
         </w:rPr>
       </w:pPr>
-      <w:hyperlink r:id="rId26" w:history="1">
+      <w:hyperlink r:id="rId27" w:history="1">
         <w:r>
           <w:rPr>
             <w:rStyle w:val="Hyperlink"/>
@@ -3841,7 +3847,7 @@
           <w:color w:val="auto"/>
         </w:rPr>
       </w:pPr>
-      <w:hyperlink r:id="rId27" w:history="1">
+      <w:hyperlink r:id="rId28" w:history="1">
         <w:r>
           <w:rPr>
             <w:rStyle w:val="Hyperlink"/>
@@ -4414,7 +4420,7 @@
           <w:color w:val="auto"/>
         </w:rPr>
       </w:pPr>
-      <w:hyperlink r:id="rId28" w:history="1">
+      <w:hyperlink r:id="rId29" w:history="1">
         <w:r>
           <w:rPr>
             <w:rStyle w:val="Hyperlink"/>
@@ -4477,7 +4483,7 @@
         </w:rPr>
         <w:t>) [</w:t>
       </w:r>
-      <w:hyperlink r:id="rId29" w:history="1">
+      <w:hyperlink r:id="rId30" w:history="1">
         <w:r>
           <w:rPr>
             <w:rStyle w:val="Hyperlink"/>

</xml_diff>

<commit_message>
[micorsoft] added line Implemented ....Uptime.io and removed the *Zerodha webscraping* thing
</commit_message>
<xml_diff>
--- a/Resume_latest - Copy.docx
+++ b/Resume_latest - Copy.docx
@@ -797,25 +797,6 @@
     </w:p>
     <w:p>
       <w:pPr>
-        <w:pBdr>
-          <w:bottom w:val="single" w:sz="6" w:space="1" w:color="auto"/>
-        </w:pBdr>
-        <w:tabs>
-          <w:tab w:val="right" w:pos="10490"/>
-        </w:tabs>
-        <w:spacing w:line="240" w:lineRule="auto"/>
-        <w:ind w:right="0"/>
-        <w:jc w:val="center"/>
-        <w:rPr>
-          <w:rStyle w:val="Hyperlink"/>
-          <w:bCs/>
-          <w:color w:val="auto"/>
-          <w:u w:val="none"/>
-        </w:rPr>
-      </w:pPr>
-    </w:p>
-    <w:p>
-      <w:pPr>
         <w:spacing w:line="240" w:lineRule="auto"/>
         <w:ind w:right="0"/>
         <w:jc w:val="center"/>
@@ -1568,6 +1549,13 @@
           <w:color w:val="auto"/>
           <w:szCs w:val="20"/>
         </w:rPr>
+        <w:t xml:space="preserve">multiple </w:t>
+      </w:r>
+      <w:r>
+        <w:rPr>
+          <w:color w:val="auto"/>
+          <w:szCs w:val="20"/>
+        </w:rPr>
         <w:t xml:space="preserve">CI/CD and </w:t>
       </w:r>
       <w:r>
@@ -1575,21 +1563,35 @@
           <w:color w:val="auto"/>
           <w:szCs w:val="20"/>
         </w:rPr>
-        <w:t xml:space="preserve">deployment failures by fixing environment variables and </w:t>
-      </w:r>
-      <w:r>
-        <w:rPr>
-          <w:color w:val="auto"/>
-          <w:szCs w:val="20"/>
-        </w:rPr>
-        <w:t>updating</w:t>
-      </w:r>
-      <w:r>
-        <w:rPr>
-          <w:color w:val="auto"/>
-          <w:szCs w:val="20"/>
-        </w:rPr>
-        <w:t xml:space="preserve"> ECS task defin</w:t>
+        <w:t>deployment failures by fixing environment variables</w:t>
+      </w:r>
+      <w:r>
+        <w:rPr>
+          <w:color w:val="auto"/>
+          <w:szCs w:val="20"/>
+        </w:rPr>
+        <w:t>,</w:t>
+      </w:r>
+      <w:r>
+        <w:rPr>
+          <w:color w:val="auto"/>
+          <w:szCs w:val="20"/>
+        </w:rPr>
+        <w:t xml:space="preserve"> </w:t>
+      </w:r>
+      <w:r>
+        <w:rPr>
+          <w:color w:val="auto"/>
+          <w:szCs w:val="20"/>
+        </w:rPr>
+        <w:t xml:space="preserve">and </w:t>
+      </w:r>
+      <w:r>
+        <w:rPr>
+          <w:color w:val="auto"/>
+          <w:szCs w:val="20"/>
+        </w:rPr>
+        <w:t>ECS task defin</w:t>
       </w:r>
       <w:r>
         <w:rPr>
@@ -1610,7 +1612,86 @@
           <w:color w:val="auto"/>
           <w:szCs w:val="20"/>
         </w:rPr>
-        <w:t>s</w:t>
+        <w:t xml:space="preserve"> configurations. </w:t>
+      </w:r>
+    </w:p>
+    <w:p>
+      <w:pPr>
+        <w:pStyle w:val="ListParagraph"/>
+        <w:numPr>
+          <w:ilvl w:val="0"/>
+          <w:numId w:val="32"/>
+        </w:numPr>
+        <w:spacing w:line="240" w:lineRule="auto"/>
+        <w:ind w:right="0"/>
+        <w:jc w:val="both"/>
+        <w:rPr>
+          <w:color w:val="auto"/>
+          <w:szCs w:val="20"/>
+        </w:rPr>
+      </w:pPr>
+      <w:r>
+        <w:rPr>
+          <w:color w:val="auto"/>
+          <w:szCs w:val="20"/>
+        </w:rPr>
+        <w:t xml:space="preserve">Implemented </w:t>
+      </w:r>
+      <w:r>
+        <w:rPr>
+          <w:color w:val="auto"/>
+          <w:szCs w:val="20"/>
+        </w:rPr>
+        <w:t>external availability monitoring</w:t>
+      </w:r>
+      <w:r>
+        <w:rPr>
+          <w:color w:val="auto"/>
+          <w:szCs w:val="20"/>
+        </w:rPr>
+        <w:t xml:space="preserve"> of ECS services</w:t>
+      </w:r>
+      <w:r>
+        <w:rPr>
+          <w:color w:val="auto"/>
+          <w:szCs w:val="20"/>
+        </w:rPr>
+        <w:t xml:space="preserve"> </w:t>
+      </w:r>
+      <w:r>
+        <w:rPr>
+          <w:color w:val="auto"/>
+          <w:szCs w:val="20"/>
+        </w:rPr>
+        <w:t>using Uptime.io</w:t>
+      </w:r>
+      <w:r>
+        <w:rPr>
+          <w:color w:val="auto"/>
+          <w:szCs w:val="20"/>
+        </w:rPr>
+        <w:t>,</w:t>
+      </w:r>
+      <w:r>
+        <w:rPr>
+          <w:color w:val="auto"/>
+          <w:szCs w:val="20"/>
+        </w:rPr>
+        <w:t xml:space="preserve"> providing real-time availability and health </w:t>
+      </w:r>
+      <w:r>
+        <w:rPr>
+          <w:color w:val="auto"/>
+          <w:szCs w:val="20"/>
+        </w:rPr>
+        <w:t xml:space="preserve">status </w:t>
+      </w:r>
+      <w:r>
+        <w:rPr>
+          <w:color w:val="auto"/>
+          <w:szCs w:val="20"/>
+        </w:rPr>
+        <w:t>of all ECS services</w:t>
       </w:r>
       <w:r>
         <w:rPr>
@@ -3815,23 +3896,7 @@
         <w:rPr>
           <w:color w:val="auto"/>
         </w:rPr>
-        <w:t xml:space="preserve"> and web scraping </w:t>
-      </w:r>
-      <w:proofErr w:type="spellStart"/>
-      <w:r>
-        <w:rPr>
-          <w:b/>
-          <w:bCs/>
-          <w:color w:val="auto"/>
-        </w:rPr>
-        <w:t>Zerodha’s</w:t>
-      </w:r>
-      <w:proofErr w:type="spellEnd"/>
-      <w:r>
-        <w:rPr>
-          <w:color w:val="auto"/>
-        </w:rPr>
-        <w:t xml:space="preserve"> website (also a leading Indian stockbroker).</w:t>
+        <w:t>.</w:t>
       </w:r>
     </w:p>
     <w:p>
@@ -4916,42 +4981,42 @@
         <v:path o:extrusionok="f" gradientshapeok="t" o:connecttype="rect"/>
         <o:lock v:ext="edit" aspectratio="t"/>
       </v:shapetype>
-      <v:shape id="_x0000_i1152" type="#_x0000_t75" style="width:512.4pt;height:512.4pt;rotation:180;flip:x y;visibility:visible;mso-wrap-style:square" o:bullet="t">
+      <v:shape id="_x0000_i1188" type="#_x0000_t75" style="width:512.4pt;height:512.4pt;rotation:180;flip:x y;visibility:visible;mso-wrap-style:square" o:bullet="t">
         <v:imagedata r:id="rId1" o:title="107161_circle_github_icon"/>
       </v:shape>
     </w:pict>
   </w:numPicBullet>
   <w:numPicBullet w:numPicBulletId="1">
     <w:pict>
-      <v:shape id="_x0000_i1153" type="#_x0000_t75" style="width:168.6pt;height:168.6pt;visibility:visible;mso-wrap-style:square" o:bullet="t">
+      <v:shape id="_x0000_i1189" type="#_x0000_t75" style="width:168.6pt;height:168.6pt;visibility:visible;mso-wrap-style:square" o:bullet="t">
         <v:imagedata r:id="rId2" o:title="941C13C7"/>
       </v:shape>
     </w:pict>
   </w:numPicBullet>
   <w:numPicBullet w:numPicBulletId="2">
     <w:pict>
-      <v:shape id="_x0000_i1154" type="#_x0000_t75" style="width:28.8pt;height:16.2pt;visibility:visible;mso-wrap-style:square" o:bullet="t">
+      <v:shape id="_x0000_i1190" type="#_x0000_t75" style="width:28.8pt;height:16.2pt;visibility:visible;mso-wrap-style:square" o:bullet="t">
         <v:imagedata r:id="rId3" o:title="107161_circle_github_icon"/>
       </v:shape>
     </w:pict>
   </w:numPicBullet>
   <w:numPicBullet w:numPicBulletId="3">
     <w:pict>
-      <v:shape id="_x0000_i1155" type="#_x0000_t75" style="width:240pt;height:234pt;visibility:visible;mso-wrap-style:square" o:bullet="t">
+      <v:shape id="_x0000_i1191" type="#_x0000_t75" style="width:240pt;height:234pt;visibility:visible;mso-wrap-style:square" o:bullet="t">
         <v:imagedata r:id="rId4" o:title="Indian_Institute_of_Technology_Bombay_Logo"/>
       </v:shape>
     </w:pict>
   </w:numPicBullet>
   <w:numPicBullet w:numPicBulletId="4">
     <w:pict>
-      <v:shape id="_x0000_i1156" type="#_x0000_t75" style="width:23.4pt;height:16.2pt;visibility:visible;mso-wrap-style:square" o:bullet="t">
+      <v:shape id="_x0000_i1192" type="#_x0000_t75" style="width:23.4pt;height:16.2pt;visibility:visible;mso-wrap-style:square" o:bullet="t">
         <v:imagedata r:id="rId5" o:title="Indian_Institute_of_Technology_Bombay_Logo"/>
       </v:shape>
     </w:pict>
   </w:numPicBullet>
   <w:numPicBullet w:numPicBulletId="5">
     <w:pict>
-      <v:shape id="_x0000_i1157" type="#_x0000_t75" style="width:75.6pt;height:75.6pt;visibility:visible;mso-wrap-style:square" o:bullet="t">
+      <v:shape id="_x0000_i1193" type="#_x0000_t75" style="width:75.6pt;height:75.6pt;visibility:visible;mso-wrap-style:square" o:bullet="t">
         <v:imagedata r:id="rId6" o:title=""/>
       </v:shape>
     </w:pict>

</xml_diff>

<commit_message>
[microsoft] v2 :- skills, 2T and H4J updated (read description)
Note:- These changes were for the immediate next opening at microsoft.

Skills:-
Added Familiar with multithreading

2T:-
Almost entirely updated:-
    1. Collaboratively migrated the backend CI/CD pipeline ...
    2. Fixed unit and e2e tests...
    3. Independently migrated frontend pipeline...

H4J:-
Removed line "Integrated features of a traditional programming language..
</commit_message>
<xml_diff>
--- a/Resume_latest - Copy.docx
+++ b/Resume_latest - Copy.docx
@@ -1055,6 +1055,15 @@
         </w:rPr>
         <w:t>.</w:t>
       </w:r>
+      <w:r>
+        <w:t xml:space="preserve"> </w:t>
+      </w:r>
+      <w:r>
+        <w:rPr>
+          <w:color w:val="auto"/>
+        </w:rPr>
+        <w:t>(Familiar: multithreading)</w:t>
+      </w:r>
     </w:p>
     <w:p>
       <w:pPr>
@@ -1299,21 +1308,7 @@
           <w:color w:val="auto"/>
           <w:szCs w:val="20"/>
         </w:rPr>
-        <w:t xml:space="preserve">Removed 8 unused NAT gateways across production and lower environments via </w:t>
-      </w:r>
-      <w:r>
-        <w:rPr>
-          <w:color w:val="auto"/>
-          <w:szCs w:val="20"/>
-        </w:rPr>
-        <w:t>T</w:t>
-      </w:r>
-      <w:r>
-        <w:rPr>
-          <w:color w:val="auto"/>
-          <w:szCs w:val="20"/>
-        </w:rPr>
-        <w:t xml:space="preserve">erraform </w:t>
+        <w:t xml:space="preserve">Collaboratively </w:t>
       </w:r>
       <w:r>
         <w:rPr>
@@ -1322,30 +1317,10 @@
           <w:color w:val="auto"/>
           <w:szCs w:val="20"/>
         </w:rPr>
-        <w:t xml:space="preserve">saving </w:t>
-      </w:r>
-      <w:r>
-        <w:rPr>
-          <w:b/>
-          <w:bCs/>
-          <w:color w:val="auto"/>
-          <w:szCs w:val="20"/>
-        </w:rPr>
-        <w:t xml:space="preserve">over </w:t>
-      </w:r>
-      <w:r>
-        <w:rPr>
-          <w:b/>
-          <w:bCs/>
-          <w:color w:val="auto"/>
-          <w:szCs w:val="20"/>
-        </w:rPr>
-        <w:t>$3,000</w:t>
-      </w:r>
-      <w:r>
-        <w:rPr>
-          <w:b/>
-          <w:bCs/>
+        <w:t>migrated the backend CI/CD pipeline</w:t>
+      </w:r>
+      <w:r>
+        <w:rPr>
           <w:color w:val="auto"/>
           <w:szCs w:val="20"/>
         </w:rPr>
@@ -1356,37 +1331,46 @@
           <w:color w:val="auto"/>
           <w:szCs w:val="20"/>
         </w:rPr>
-        <w:t>in</w:t>
-      </w:r>
-      <w:r>
-        <w:rPr>
-          <w:b/>
-          <w:bCs/>
-          <w:color w:val="auto"/>
-          <w:szCs w:val="20"/>
-        </w:rPr>
-        <w:t xml:space="preserve"> </w:t>
-      </w:r>
-      <w:r>
-        <w:rPr>
-          <w:color w:val="auto"/>
-          <w:szCs w:val="20"/>
-        </w:rPr>
-        <w:t>annual</w:t>
-      </w:r>
-      <w:r>
-        <w:rPr>
-          <w:color w:val="auto"/>
-          <w:szCs w:val="20"/>
-        </w:rPr>
-        <w:t xml:space="preserve"> infrastructure costs</w:t>
-      </w:r>
-      <w:r>
-        <w:rPr>
-          <w:color w:val="auto"/>
-          <w:szCs w:val="20"/>
-        </w:rPr>
-        <w:t>.</w:t>
+        <w:t xml:space="preserve">from </w:t>
+      </w:r>
+      <w:r>
+        <w:rPr>
+          <w:color w:val="auto"/>
+          <w:szCs w:val="20"/>
+        </w:rPr>
+        <w:t xml:space="preserve">AWS </w:t>
+      </w:r>
+      <w:proofErr w:type="spellStart"/>
+      <w:r>
+        <w:rPr>
+          <w:color w:val="auto"/>
+          <w:szCs w:val="20"/>
+        </w:rPr>
+        <w:t>CodeBuild</w:t>
+      </w:r>
+      <w:proofErr w:type="spellEnd"/>
+      <w:r>
+        <w:rPr>
+          <w:color w:val="auto"/>
+          <w:szCs w:val="20"/>
+        </w:rPr>
+        <w:t xml:space="preserve"> to GitHub Actions, which build docker images and deployed to ECS </w:t>
+      </w:r>
+      <w:proofErr w:type="spellStart"/>
+      <w:r>
+        <w:rPr>
+          <w:color w:val="auto"/>
+          <w:szCs w:val="20"/>
+        </w:rPr>
+        <w:t>sbx</w:t>
+      </w:r>
+      <w:proofErr w:type="spellEnd"/>
+      <w:r>
+        <w:rPr>
+          <w:color w:val="auto"/>
+          <w:szCs w:val="20"/>
+        </w:rPr>
+        <w:t>, dev and prod clusters on basis of automated tests passed.</w:t>
       </w:r>
     </w:p>
     <w:p>
@@ -1409,59 +1393,7 @@
           <w:color w:val="auto"/>
           <w:szCs w:val="20"/>
         </w:rPr>
-        <w:t xml:space="preserve">Migrated the frontend CI/CD pipeline from AWS </w:t>
-      </w:r>
-      <w:proofErr w:type="spellStart"/>
-      <w:r>
-        <w:rPr>
-          <w:color w:val="auto"/>
-          <w:szCs w:val="20"/>
-        </w:rPr>
-        <w:t>CodeBuild</w:t>
-      </w:r>
-      <w:proofErr w:type="spellEnd"/>
-      <w:r>
-        <w:rPr>
-          <w:color w:val="auto"/>
-          <w:szCs w:val="20"/>
-        </w:rPr>
-        <w:t xml:space="preserve"> to GitHub Actions, reducing build time by </w:t>
-      </w:r>
-      <w:r>
-        <w:rPr>
-          <w:b/>
-          <w:bCs/>
-          <w:color w:val="auto"/>
-          <w:szCs w:val="20"/>
-        </w:rPr>
-        <w:t>~20%</w:t>
-      </w:r>
-      <w:r>
-        <w:rPr>
-          <w:color w:val="auto"/>
-          <w:szCs w:val="20"/>
-        </w:rPr>
-        <w:t xml:space="preserve"> </w:t>
-      </w:r>
-      <w:r>
-        <w:rPr>
-          <w:b/>
-          <w:bCs/>
-          <w:color w:val="auto"/>
-        </w:rPr>
-        <w:t xml:space="preserve">(~5 min to ~4 min) </w:t>
-      </w:r>
-      <w:r>
-        <w:rPr>
-          <w:color w:val="auto"/>
-        </w:rPr>
-        <w:t>and eliminating build costs</w:t>
-      </w:r>
-      <w:r>
-        <w:rPr>
-          <w:color w:val="auto"/>
-        </w:rPr>
-        <w:t>.</w:t>
+        <w:t>Fixed unit and e2e tests that controlled backend deployments, diagnosed ECS service downtime caused by EFS volume deletion, and recommended ECS deployment circuit breakers for service reliability.</w:t>
       </w:r>
     </w:p>
     <w:p>
@@ -1484,35 +1416,39 @@
           <w:color w:val="auto"/>
           <w:szCs w:val="20"/>
         </w:rPr>
-        <w:t xml:space="preserve">Enhanced service reliability by fixing unit and integration tests, diagnosing </w:t>
-      </w:r>
-      <w:r>
-        <w:rPr>
-          <w:color w:val="auto"/>
-          <w:szCs w:val="20"/>
-        </w:rPr>
-        <w:t>ECS service downtime cause</w:t>
-      </w:r>
-      <w:r>
-        <w:rPr>
-          <w:color w:val="auto"/>
-          <w:szCs w:val="20"/>
-        </w:rPr>
-        <w:t>d</w:t>
-      </w:r>
-      <w:r>
-        <w:rPr>
-          <w:color w:val="auto"/>
-          <w:szCs w:val="20"/>
-        </w:rPr>
-        <w:t xml:space="preserve"> by EFS volume deletion,</w:t>
-      </w:r>
-      <w:r>
-        <w:rPr>
-          <w:color w:val="auto"/>
-          <w:szCs w:val="20"/>
-        </w:rPr>
-        <w:t xml:space="preserve"> and recommending ECS deployment circuit breakers.</w:t>
+        <w:t xml:space="preserve">Independently migrated the frontend CI/CD pipeline from AWS </w:t>
+      </w:r>
+      <w:proofErr w:type="spellStart"/>
+      <w:r>
+        <w:rPr>
+          <w:color w:val="auto"/>
+          <w:szCs w:val="20"/>
+        </w:rPr>
+        <w:t>CodeBuild</w:t>
+      </w:r>
+      <w:proofErr w:type="spellEnd"/>
+      <w:r>
+        <w:rPr>
+          <w:color w:val="auto"/>
+          <w:szCs w:val="20"/>
+        </w:rPr>
+        <w:t xml:space="preserve"> to GitHub Actions, reducing build time by </w:t>
+      </w:r>
+      <w:r>
+        <w:rPr>
+          <w:b/>
+          <w:bCs/>
+          <w:color w:val="auto"/>
+          <w:szCs w:val="20"/>
+        </w:rPr>
+        <w:t>~20% (~5 min to ~4 min</w:t>
+      </w:r>
+      <w:r>
+        <w:rPr>
+          <w:color w:val="auto"/>
+          <w:szCs w:val="20"/>
+        </w:rPr>
+        <w:t>) and eliminating build costs.</w:t>
       </w:r>
     </w:p>
     <w:p>
@@ -1535,84 +1471,23 @@
           <w:color w:val="auto"/>
           <w:szCs w:val="20"/>
         </w:rPr>
-        <w:t>R</w:t>
-      </w:r>
-      <w:r>
-        <w:rPr>
-          <w:color w:val="auto"/>
-          <w:szCs w:val="20"/>
-        </w:rPr>
-        <w:t xml:space="preserve">esolved </w:t>
-      </w:r>
-      <w:r>
-        <w:rPr>
-          <w:color w:val="auto"/>
-          <w:szCs w:val="20"/>
-        </w:rPr>
-        <w:t xml:space="preserve">multiple </w:t>
-      </w:r>
-      <w:r>
-        <w:rPr>
-          <w:color w:val="auto"/>
-          <w:szCs w:val="20"/>
-        </w:rPr>
-        <w:t xml:space="preserve">CI/CD and </w:t>
-      </w:r>
-      <w:r>
-        <w:rPr>
-          <w:color w:val="auto"/>
-          <w:szCs w:val="20"/>
-        </w:rPr>
-        <w:t>deployment failures by fixing environment variables</w:t>
-      </w:r>
-      <w:r>
-        <w:rPr>
-          <w:color w:val="auto"/>
-          <w:szCs w:val="20"/>
-        </w:rPr>
-        <w:t>,</w:t>
-      </w:r>
-      <w:r>
-        <w:rPr>
-          <w:color w:val="auto"/>
-          <w:szCs w:val="20"/>
-        </w:rPr>
-        <w:t xml:space="preserve"> </w:t>
-      </w:r>
-      <w:r>
-        <w:rPr>
-          <w:color w:val="auto"/>
-          <w:szCs w:val="20"/>
-        </w:rPr>
-        <w:t xml:space="preserve">and </w:t>
-      </w:r>
-      <w:r>
-        <w:rPr>
-          <w:color w:val="auto"/>
-          <w:szCs w:val="20"/>
-        </w:rPr>
-        <w:t>ECS task defin</w:t>
-      </w:r>
-      <w:r>
-        <w:rPr>
-          <w:color w:val="auto"/>
-          <w:szCs w:val="20"/>
-        </w:rPr>
-        <w:t>i</w:t>
-      </w:r>
-      <w:r>
-        <w:rPr>
-          <w:color w:val="auto"/>
-          <w:szCs w:val="20"/>
-        </w:rPr>
-        <w:t>tion</w:t>
-      </w:r>
-      <w:r>
-        <w:rPr>
-          <w:color w:val="auto"/>
-          <w:szCs w:val="20"/>
-        </w:rPr>
-        <w:t xml:space="preserve"> configurations. </w:t>
+        <w:t xml:space="preserve">Removed 8 unused NAT gateways across production and lower environments via Terraform </w:t>
+      </w:r>
+      <w:r>
+        <w:rPr>
+          <w:b/>
+          <w:bCs/>
+          <w:color w:val="auto"/>
+          <w:szCs w:val="20"/>
+        </w:rPr>
+        <w:t>saving over $3,000</w:t>
+      </w:r>
+      <w:r>
+        <w:rPr>
+          <w:color w:val="auto"/>
+          <w:szCs w:val="20"/>
+        </w:rPr>
+        <w:t xml:space="preserve"> in annual infrastructure costs.</w:t>
       </w:r>
     </w:p>
     <w:p>
@@ -1635,70 +1510,23 @@
           <w:color w:val="auto"/>
           <w:szCs w:val="20"/>
         </w:rPr>
-        <w:t xml:space="preserve">Implemented </w:t>
-      </w:r>
-      <w:r>
-        <w:rPr>
-          <w:color w:val="auto"/>
-          <w:szCs w:val="20"/>
-        </w:rPr>
-        <w:t>external availability monitoring</w:t>
-      </w:r>
-      <w:r>
-        <w:rPr>
-          <w:color w:val="auto"/>
-          <w:szCs w:val="20"/>
-        </w:rPr>
-        <w:t xml:space="preserve"> of ECS services</w:t>
-      </w:r>
-      <w:r>
-        <w:rPr>
-          <w:color w:val="auto"/>
-          <w:szCs w:val="20"/>
-        </w:rPr>
-        <w:t xml:space="preserve"> </w:t>
-      </w:r>
-      <w:r>
-        <w:rPr>
-          <w:color w:val="auto"/>
-          <w:szCs w:val="20"/>
-        </w:rPr>
-        <w:t>using Uptime.io</w:t>
-      </w:r>
-      <w:r>
-        <w:rPr>
-          <w:color w:val="auto"/>
-          <w:szCs w:val="20"/>
-        </w:rPr>
-        <w:t>,</w:t>
-      </w:r>
-      <w:r>
-        <w:rPr>
-          <w:color w:val="auto"/>
-          <w:szCs w:val="20"/>
-        </w:rPr>
-        <w:t xml:space="preserve"> providing real-time availability and health </w:t>
-      </w:r>
-      <w:r>
-        <w:rPr>
-          <w:color w:val="auto"/>
-          <w:szCs w:val="20"/>
-        </w:rPr>
-        <w:t xml:space="preserve">status </w:t>
-      </w:r>
-      <w:r>
-        <w:rPr>
-          <w:color w:val="auto"/>
-          <w:szCs w:val="20"/>
-        </w:rPr>
-        <w:t>of all ECS services</w:t>
-      </w:r>
-      <w:r>
-        <w:rPr>
-          <w:color w:val="auto"/>
-          <w:szCs w:val="20"/>
-        </w:rPr>
-        <w:t>.</w:t>
+        <w:t xml:space="preserve">Resolved multiple CI/CD and deployment failures and </w:t>
+      </w:r>
+      <w:r>
+        <w:rPr>
+          <w:b/>
+          <w:bCs/>
+          <w:color w:val="auto"/>
+          <w:szCs w:val="20"/>
+        </w:rPr>
+        <w:t>implemented external availability monitoring</w:t>
+      </w:r>
+      <w:r>
+        <w:rPr>
+          <w:color w:val="auto"/>
+          <w:szCs w:val="20"/>
+        </w:rPr>
+        <w:t xml:space="preserve"> of ECS services using Uptime.io, providing real-time availability and health status of all ECS services.</w:t>
       </w:r>
     </w:p>
     <w:p>
@@ -3454,101 +3282,6 @@
           <w:color w:val="auto"/>
         </w:rPr>
         <w:t>, executes it and displays output.</w:t>
-      </w:r>
-    </w:p>
-    <w:p>
-      <w:pPr>
-        <w:pStyle w:val="ListParagraph"/>
-        <w:numPr>
-          <w:ilvl w:val="0"/>
-          <w:numId w:val="31"/>
-        </w:numPr>
-        <w:spacing w:line="240" w:lineRule="auto"/>
-        <w:ind w:right="0"/>
-        <w:jc w:val="both"/>
-        <w:rPr>
-          <w:color w:val="auto"/>
-        </w:rPr>
-      </w:pPr>
-      <w:r>
-        <w:rPr>
-          <w:color w:val="auto"/>
-        </w:rPr>
-        <w:t xml:space="preserve">Integrated </w:t>
-      </w:r>
-      <w:r>
-        <w:rPr>
-          <w:color w:val="auto"/>
-        </w:rPr>
-        <w:t>features of a traditional programming language</w:t>
-      </w:r>
-      <w:r>
-        <w:rPr>
-          <w:color w:val="auto"/>
-        </w:rPr>
-        <w:t xml:space="preserve"> like </w:t>
-      </w:r>
-      <w:r>
-        <w:rPr>
-          <w:i/>
-          <w:iCs/>
-          <w:color w:val="auto"/>
-        </w:rPr>
-        <w:t>loop</w:t>
-      </w:r>
-      <w:r>
-        <w:rPr>
-          <w:i/>
-          <w:iCs/>
-          <w:color w:val="auto"/>
-        </w:rPr>
-        <w:t>s</w:t>
-      </w:r>
-      <w:r>
-        <w:rPr>
-          <w:i/>
-          <w:iCs/>
-          <w:color w:val="auto"/>
-        </w:rPr>
-        <w:t xml:space="preserve">, conditionals, </w:t>
-      </w:r>
-      <w:r>
-        <w:rPr>
-          <w:i/>
-          <w:iCs/>
-          <w:color w:val="auto"/>
-        </w:rPr>
-        <w:t>operators</w:t>
-      </w:r>
-      <w:r>
-        <w:rPr>
-          <w:i/>
-          <w:iCs/>
-          <w:color w:val="auto"/>
-        </w:rPr>
-        <w:t xml:space="preserve">, </w:t>
-      </w:r>
-      <w:r>
-        <w:rPr>
-          <w:i/>
-          <w:iCs/>
-          <w:color w:val="auto"/>
-        </w:rPr>
-        <w:t xml:space="preserve">datatypes, </w:t>
-      </w:r>
-      <w:r>
-        <w:rPr>
-          <w:i/>
-          <w:iCs/>
-          <w:color w:val="auto"/>
-        </w:rPr>
-        <w:t>etc</w:t>
-      </w:r>
-      <w:r>
-        <w:rPr>
-          <w:color w:val="auto"/>
-        </w:rPr>
-        <w:t>.</w:t>
       </w:r>
     </w:p>
     <w:p>
@@ -4981,42 +4714,42 @@
         <v:path o:extrusionok="f" gradientshapeok="t" o:connecttype="rect"/>
         <o:lock v:ext="edit" aspectratio="t"/>
       </v:shapetype>
-      <v:shape id="_x0000_i1188" type="#_x0000_t75" style="width:512.4pt;height:512.4pt;rotation:180;flip:x y;visibility:visible;mso-wrap-style:square" o:bullet="t">
+      <v:shape id="_x0000_i1152" type="#_x0000_t75" style="width:512.4pt;height:512.4pt;rotation:180;flip:x y;visibility:visible;mso-wrap-style:square" o:bullet="t">
         <v:imagedata r:id="rId1" o:title="107161_circle_github_icon"/>
       </v:shape>
     </w:pict>
   </w:numPicBullet>
   <w:numPicBullet w:numPicBulletId="1">
     <w:pict>
-      <v:shape id="_x0000_i1189" type="#_x0000_t75" style="width:168.6pt;height:168.6pt;visibility:visible;mso-wrap-style:square" o:bullet="t">
+      <v:shape id="_x0000_i1153" type="#_x0000_t75" style="width:168.6pt;height:168.6pt;visibility:visible;mso-wrap-style:square" o:bullet="t">
         <v:imagedata r:id="rId2" o:title="941C13C7"/>
       </v:shape>
     </w:pict>
   </w:numPicBullet>
   <w:numPicBullet w:numPicBulletId="2">
     <w:pict>
-      <v:shape id="_x0000_i1190" type="#_x0000_t75" style="width:28.8pt;height:16.2pt;visibility:visible;mso-wrap-style:square" o:bullet="t">
+      <v:shape id="_x0000_i1154" type="#_x0000_t75" style="width:28.8pt;height:16.2pt;visibility:visible;mso-wrap-style:square" o:bullet="t">
         <v:imagedata r:id="rId3" o:title="107161_circle_github_icon"/>
       </v:shape>
     </w:pict>
   </w:numPicBullet>
   <w:numPicBullet w:numPicBulletId="3">
     <w:pict>
-      <v:shape id="_x0000_i1191" type="#_x0000_t75" style="width:240pt;height:234pt;visibility:visible;mso-wrap-style:square" o:bullet="t">
+      <v:shape id="_x0000_i1155" type="#_x0000_t75" style="width:240pt;height:234pt;visibility:visible;mso-wrap-style:square" o:bullet="t">
         <v:imagedata r:id="rId4" o:title="Indian_Institute_of_Technology_Bombay_Logo"/>
       </v:shape>
     </w:pict>
   </w:numPicBullet>
   <w:numPicBullet w:numPicBulletId="4">
     <w:pict>
-      <v:shape id="_x0000_i1192" type="#_x0000_t75" style="width:23.4pt;height:16.2pt;visibility:visible;mso-wrap-style:square" o:bullet="t">
+      <v:shape id="_x0000_i1156" type="#_x0000_t75" style="width:23.4pt;height:16.2pt;visibility:visible;mso-wrap-style:square" o:bullet="t">
         <v:imagedata r:id="rId5" o:title="Indian_Institute_of_Technology_Bombay_Logo"/>
       </v:shape>
     </w:pict>
   </w:numPicBullet>
   <w:numPicBullet w:numPicBulletId="5">
     <w:pict>
-      <v:shape id="_x0000_i1193" type="#_x0000_t75" style="width:75.6pt;height:75.6pt;visibility:visible;mso-wrap-style:square" o:bullet="t">
+      <v:shape id="_x0000_i1157" type="#_x0000_t75" style="width:75.6pt;height:75.6pt;visibility:visible;mso-wrap-style:square" o:bullet="t">
         <v:imagedata r:id="rId6" o:title=""/>
       </v:shape>
     </w:pict>

</xml_diff>

<commit_message>
t3 - EXP section :- 2T & Hazirs updated
2T:-
1. ... migrated "the" backend CI/CD .......
2. ...on basis of automated tests passed... => on passing automated tests.
3. Rearranged "Independently migrated frontend ..." line

Hazirs:-
Merged everything into oneline.
</commit_message>
<xml_diff>
--- a/Resume_latest - Copy.docx
+++ b/Resume_latest - Copy.docx
@@ -377,25 +377,7 @@
             <w:color w:val="auto"/>
             <w:u w:val="none"/>
           </w:rPr>
-          <w:t>ithub.com/</w:t>
-        </w:r>
-        <w:proofErr w:type="spellStart"/>
-        <w:r>
-          <w:rPr>
-            <w:rStyle w:val="Hyperlink"/>
-            <w:color w:val="auto"/>
-            <w:u w:val="none"/>
-          </w:rPr>
-          <w:t>PrathameshBhagat</w:t>
-        </w:r>
-        <w:proofErr w:type="spellEnd"/>
-        <w:r>
-          <w:rPr>
-            <w:rStyle w:val="Hyperlink"/>
-            <w:color w:val="auto"/>
-            <w:u w:val="none"/>
-          </w:rPr>
-          <w:t xml:space="preserve"> </w:t>
+          <w:t xml:space="preserve">ithub.com/PrathameshBhagat </w:t>
         </w:r>
       </w:hyperlink>
     </w:p>
@@ -523,20 +505,8 @@
             <w:u w:val="none"/>
             <w:shd w:val="clear" w:color="auto" w:fill="FFFFFF"/>
           </w:rPr>
-          <w:t>n.com/in/</w:t>
+          <w:t>n.com/in/prathameshvivekbhagat</w:t>
         </w:r>
-        <w:proofErr w:type="spellStart"/>
-        <w:r>
-          <w:rPr>
-            <w:rStyle w:val="Hyperlink"/>
-            <w:bCs/>
-            <w:color w:val="auto"/>
-            <w:u w:val="none"/>
-            <w:shd w:val="clear" w:color="auto" w:fill="FFFFFF"/>
-          </w:rPr>
-          <w:t>prathameshvivekbhagat</w:t>
-        </w:r>
-        <w:proofErr w:type="spellEnd"/>
       </w:hyperlink>
       <w:r>
         <w:rPr>
@@ -1234,7 +1204,6 @@
         </w:rPr>
       </w:pPr>
       <w:hyperlink r:id="rId21" w:history="1">
-        <w:proofErr w:type="spellStart"/>
         <w:r>
           <w:rPr>
             <w:rStyle w:val="Hyperlink"/>
@@ -1243,18 +1212,7 @@
             <w:color w:val="auto"/>
             <w:u w:val="none"/>
           </w:rPr>
-          <w:t>TutorD</w:t>
-        </w:r>
-        <w:proofErr w:type="spellEnd"/>
-        <w:r>
-          <w:rPr>
-            <w:rStyle w:val="Hyperlink"/>
-            <w:b/>
-            <w:bCs/>
-            <w:color w:val="auto"/>
-            <w:u w:val="none"/>
-          </w:rPr>
-          <w:t xml:space="preserve"> LLC (U.S.), remote | tutord.io</w:t>
+          <w:t>TutorD LLC (U.S.), remote | tutord.io</w:t>
         </w:r>
       </w:hyperlink>
       <w:r>
@@ -1275,14 +1233,12 @@
         </w:rPr>
         <w:t>(</w:t>
       </w:r>
-      <w:proofErr w:type="spellStart"/>
       <w:r>
         <w:rPr>
           <w:color w:val="auto"/>
         </w:rPr>
         <w:t>TutorD</w:t>
       </w:r>
-      <w:proofErr w:type="spellEnd"/>
       <w:r>
         <w:rPr>
           <w:color w:val="auto"/>
@@ -1355,7 +1311,7 @@
           <w:color w:val="auto"/>
           <w:szCs w:val="20"/>
         </w:rPr>
-        <w:t>migrated the backend CI/CD pipeline</w:t>
+        <w:t>migrated backend CI/CD pipeline</w:t>
       </w:r>
       <w:r>
         <w:rPr>
@@ -1390,23 +1346,35 @@
           <w:color w:val="auto"/>
           <w:szCs w:val="20"/>
         </w:rPr>
-        <w:t xml:space="preserve">ocker images and deployed to ECS </w:t>
-      </w:r>
-      <w:proofErr w:type="spellStart"/>
-      <w:r>
-        <w:rPr>
-          <w:color w:val="auto"/>
-          <w:szCs w:val="20"/>
-        </w:rPr>
-        <w:t>sbx</w:t>
-      </w:r>
-      <w:proofErr w:type="spellEnd"/>
-      <w:r>
-        <w:rPr>
-          <w:color w:val="auto"/>
-          <w:szCs w:val="20"/>
-        </w:rPr>
-        <w:t>, dev and prod clusters on basis of automated tests passed.</w:t>
+        <w:t>ocker images and deployed to ECS sbx, dev and prod clusters on</w:t>
+      </w:r>
+      <w:r>
+        <w:rPr>
+          <w:color w:val="auto"/>
+          <w:szCs w:val="20"/>
+        </w:rPr>
+        <w:t xml:space="preserve"> </w:t>
+      </w:r>
+      <w:r>
+        <w:rPr>
+          <w:color w:val="auto"/>
+          <w:szCs w:val="20"/>
+        </w:rPr>
+        <w:t xml:space="preserve">passing </w:t>
+      </w:r>
+      <w:r>
+        <w:rPr>
+          <w:color w:val="auto"/>
+          <w:szCs w:val="20"/>
+        </w:rPr>
+        <w:t>automated tests</w:t>
+      </w:r>
+      <w:r>
+        <w:rPr>
+          <w:color w:val="auto"/>
+          <w:szCs w:val="20"/>
+        </w:rPr>
+        <w:t>.</w:t>
       </w:r>
     </w:p>
     <w:p>
@@ -1468,21 +1436,7 @@
           <w:color w:val="auto"/>
           <w:szCs w:val="20"/>
         </w:rPr>
-        <w:t xml:space="preserve">Independently migrated </w:t>
-      </w:r>
-      <w:r>
-        <w:rPr>
-          <w:color w:val="auto"/>
-          <w:szCs w:val="20"/>
-        </w:rPr>
-        <w:t xml:space="preserve">the </w:t>
-      </w:r>
-      <w:r>
-        <w:rPr>
-          <w:color w:val="auto"/>
-          <w:szCs w:val="20"/>
-        </w:rPr>
-        <w:t xml:space="preserve">frontend CI/CD pipeline to GitHub Actions, reducing build time by </w:t>
+        <w:t>Implemented</w:t>
       </w:r>
       <w:r>
         <w:rPr>
@@ -1491,14 +1445,42 @@
           <w:color w:val="auto"/>
           <w:szCs w:val="20"/>
         </w:rPr>
-        <w:t xml:space="preserve">~20% </w:t>
-      </w:r>
-      <w:r>
-        <w:rPr>
-          <w:color w:val="auto"/>
-          <w:szCs w:val="20"/>
-        </w:rPr>
-        <w:t>(~</w:t>
+        <w:t xml:space="preserve"> external availability monitoring</w:t>
+      </w:r>
+      <w:r>
+        <w:rPr>
+          <w:color w:val="auto"/>
+          <w:szCs w:val="20"/>
+        </w:rPr>
+        <w:t xml:space="preserve"> of </w:t>
+      </w:r>
+      <w:r>
+        <w:rPr>
+          <w:color w:val="auto"/>
+          <w:szCs w:val="20"/>
+        </w:rPr>
+        <w:t xml:space="preserve">all </w:t>
+      </w:r>
+      <w:r>
+        <w:rPr>
+          <w:color w:val="auto"/>
+          <w:szCs w:val="20"/>
+        </w:rPr>
+        <w:t>ECS services using Uptime.io, providing real-time availability and health status of all ECS services</w:t>
+      </w:r>
+      <w:r>
+        <w:rPr>
+          <w:color w:val="auto"/>
+          <w:szCs w:val="20"/>
+        </w:rPr>
+        <w:t xml:space="preserve"> and r</w:t>
+      </w:r>
+      <w:r>
+        <w:rPr>
+          <w:color w:val="auto"/>
+          <w:szCs w:val="20"/>
+        </w:rPr>
+        <w:t xml:space="preserve">emoved 8 unused NAT gateways across production and lower environments via Terraform </w:t>
       </w:r>
       <w:r>
         <w:rPr>
@@ -1507,30 +1489,14 @@
           <w:color w:val="auto"/>
           <w:szCs w:val="20"/>
         </w:rPr>
-        <w:t xml:space="preserve">5 min </w:t>
-      </w:r>
-      <w:r>
-        <w:rPr>
-          <w:color w:val="auto"/>
-          <w:szCs w:val="20"/>
-        </w:rPr>
-        <w:t>to ~</w:t>
-      </w:r>
-      <w:r>
-        <w:rPr>
-          <w:b/>
-          <w:bCs/>
-          <w:color w:val="auto"/>
-          <w:szCs w:val="20"/>
-        </w:rPr>
-        <w:t>4 min</w:t>
-      </w:r>
-      <w:r>
-        <w:rPr>
-          <w:color w:val="auto"/>
-          <w:szCs w:val="20"/>
-        </w:rPr>
-        <w:t>)</w:t>
+        <w:t>saving over $3,000</w:t>
+      </w:r>
+      <w:r>
+        <w:rPr>
+          <w:color w:val="auto"/>
+          <w:szCs w:val="20"/>
+        </w:rPr>
+        <w:t xml:space="preserve"> in annual infrastructure costs</w:t>
       </w:r>
       <w:r>
         <w:rPr>
@@ -1560,7 +1526,21 @@
           <w:color w:val="auto"/>
           <w:szCs w:val="20"/>
         </w:rPr>
-        <w:t>Implemented</w:t>
+        <w:t xml:space="preserve">Independently migrated </w:t>
+      </w:r>
+      <w:r>
+        <w:rPr>
+          <w:color w:val="auto"/>
+          <w:szCs w:val="20"/>
+        </w:rPr>
+        <w:t xml:space="preserve">the </w:t>
+      </w:r>
+      <w:r>
+        <w:rPr>
+          <w:color w:val="auto"/>
+          <w:szCs w:val="20"/>
+        </w:rPr>
+        <w:t xml:space="preserve">frontend CI/CD pipeline to GitHub Actions, reducing build time by </w:t>
       </w:r>
       <w:r>
         <w:rPr>
@@ -1569,42 +1549,14 @@
           <w:color w:val="auto"/>
           <w:szCs w:val="20"/>
         </w:rPr>
-        <w:t xml:space="preserve"> external availability monitoring</w:t>
-      </w:r>
-      <w:r>
-        <w:rPr>
-          <w:color w:val="auto"/>
-          <w:szCs w:val="20"/>
-        </w:rPr>
-        <w:t xml:space="preserve"> of </w:t>
-      </w:r>
-      <w:r>
-        <w:rPr>
-          <w:color w:val="auto"/>
-          <w:szCs w:val="20"/>
-        </w:rPr>
-        <w:t xml:space="preserve">all </w:t>
-      </w:r>
-      <w:r>
-        <w:rPr>
-          <w:color w:val="auto"/>
-          <w:szCs w:val="20"/>
-        </w:rPr>
-        <w:t>ECS services using Uptime.io, providing real-time availability and health status of all ECS services</w:t>
-      </w:r>
-      <w:r>
-        <w:rPr>
-          <w:color w:val="auto"/>
-          <w:szCs w:val="20"/>
-        </w:rPr>
-        <w:t xml:space="preserve"> and r</w:t>
-      </w:r>
-      <w:r>
-        <w:rPr>
-          <w:color w:val="auto"/>
-          <w:szCs w:val="20"/>
-        </w:rPr>
-        <w:t xml:space="preserve">emoved 8 unused NAT gateways across production and lower environments via Terraform </w:t>
+        <w:t xml:space="preserve">~20% </w:t>
+      </w:r>
+      <w:r>
+        <w:rPr>
+          <w:color w:val="auto"/>
+          <w:szCs w:val="20"/>
+        </w:rPr>
+        <w:t>(~</w:t>
       </w:r>
       <w:r>
         <w:rPr>
@@ -1613,14 +1565,30 @@
           <w:color w:val="auto"/>
           <w:szCs w:val="20"/>
         </w:rPr>
-        <w:t>saving over $3,000</w:t>
-      </w:r>
-      <w:r>
-        <w:rPr>
-          <w:color w:val="auto"/>
-          <w:szCs w:val="20"/>
-        </w:rPr>
-        <w:t xml:space="preserve"> in annual infrastructure costs</w:t>
+        <w:t xml:space="preserve">5 min </w:t>
+      </w:r>
+      <w:r>
+        <w:rPr>
+          <w:color w:val="auto"/>
+          <w:szCs w:val="20"/>
+        </w:rPr>
+        <w:t>to ~</w:t>
+      </w:r>
+      <w:r>
+        <w:rPr>
+          <w:b/>
+          <w:bCs/>
+          <w:color w:val="auto"/>
+          <w:szCs w:val="20"/>
+        </w:rPr>
+        <w:t>4 min</w:t>
+      </w:r>
+      <w:r>
+        <w:rPr>
+          <w:color w:val="auto"/>
+          <w:szCs w:val="20"/>
+        </w:rPr>
+        <w:t>)</w:t>
       </w:r>
       <w:r>
         <w:rPr>
@@ -2237,7 +2205,6 @@
         <w:t xml:space="preserve"> | </w:t>
       </w:r>
       <w:hyperlink r:id="rId24" w:history="1">
-        <w:proofErr w:type="spellStart"/>
         <w:r>
           <w:rPr>
             <w:rStyle w:val="Hyperlink"/>
@@ -2246,7 +2213,6 @@
           </w:rPr>
           <w:t>Hazirs</w:t>
         </w:r>
-        <w:proofErr w:type="spellEnd"/>
         <w:r>
           <w:rPr>
             <w:rStyle w:val="Hyperlink"/>
@@ -2327,19 +2293,11 @@
         </w:rPr>
         <w:t>(</w:t>
       </w:r>
-      <w:proofErr w:type="spellStart"/>
-      <w:r>
-        <w:rPr>
-          <w:color w:val="auto"/>
-        </w:rPr>
-        <w:t>Hazirs</w:t>
-      </w:r>
-      <w:proofErr w:type="spellEnd"/>
-      <w:r>
-        <w:rPr>
-          <w:color w:val="auto"/>
-        </w:rPr>
-        <w:t xml:space="preserve"> is an early-stage start</w:t>
+      <w:r>
+        <w:rPr>
+          <w:color w:val="auto"/>
+        </w:rPr>
+        <w:t>Hazirs is an early-stage start</w:t>
       </w:r>
       <w:r>
         <w:rPr>
@@ -2448,7 +2406,6 @@
         </w:rPr>
         <w:t>“</w:t>
       </w:r>
-      <w:proofErr w:type="spellStart"/>
       <w:r>
         <w:rPr>
           <w:color w:val="auto"/>
@@ -2456,7 +2413,6 @@
         </w:rPr>
         <w:t>Hazirs</w:t>
       </w:r>
-      <w:proofErr w:type="spellEnd"/>
       <w:r>
         <w:rPr>
           <w:color w:val="auto"/>
@@ -2551,15 +2507,6 @@
           <w:szCs w:val="20"/>
         </w:rPr>
         <w:t>.</w:t>
-      </w:r>
-      <w:r>
-        <w:rPr>
-          <w:i/>
-          <w:iCs/>
-          <w:color w:val="auto"/>
-          <w:szCs w:val="20"/>
-        </w:rPr>
-        <w:t xml:space="preserve"> </w:t>
       </w:r>
     </w:p>
     <w:p>
@@ -2611,7 +2558,6 @@
         </w:rPr>
       </w:pPr>
       <w:hyperlink r:id="rId25" w:history="1">
-        <w:proofErr w:type="spellStart"/>
         <w:r>
           <w:rPr>
             <w:rStyle w:val="Hyperlink"/>
@@ -2620,18 +2566,7 @@
             <w:color w:val="auto"/>
             <w:u w:val="none"/>
           </w:rPr>
-          <w:t>Catima</w:t>
-        </w:r>
-        <w:proofErr w:type="spellEnd"/>
-        <w:r>
-          <w:rPr>
-            <w:rStyle w:val="Hyperlink"/>
-            <w:b/>
-            <w:bCs/>
-            <w:color w:val="auto"/>
-            <w:u w:val="none"/>
-          </w:rPr>
-          <w:t xml:space="preserve"> Loyalty </w:t>
+          <w:t xml:space="preserve">Catima Loyalty </w:t>
         </w:r>
         <w:r>
           <w:rPr>
@@ -2735,21 +2670,7 @@
         <w:rPr>
           <w:color w:val="auto"/>
         </w:rPr>
-        <w:t>(</w:t>
-      </w:r>
-      <w:proofErr w:type="spellStart"/>
-      <w:r>
-        <w:rPr>
-          <w:color w:val="auto"/>
-        </w:rPr>
-        <w:t>Catima</w:t>
-      </w:r>
-      <w:proofErr w:type="spellEnd"/>
-      <w:r>
-        <w:rPr>
-          <w:color w:val="auto"/>
-        </w:rPr>
-        <w:t xml:space="preserve"> is a</w:t>
+        <w:t>(Catima is a</w:t>
       </w:r>
       <w:r>
         <w:rPr>
@@ -2912,21 +2833,7 @@
         <w:rPr>
           <w:color w:val="auto"/>
         </w:rPr>
-        <w:t xml:space="preserve">multiple interfaces, and </w:t>
-      </w:r>
-      <w:proofErr w:type="spellStart"/>
-      <w:r>
-        <w:rPr>
-          <w:color w:val="auto"/>
-        </w:rPr>
-        <w:t>enums</w:t>
-      </w:r>
-      <w:proofErr w:type="spellEnd"/>
-      <w:r>
-        <w:rPr>
-          <w:color w:val="auto"/>
-        </w:rPr>
-        <w:t xml:space="preserve"> to </w:t>
+        <w:t xml:space="preserve">multiple interfaces, and enums to </w:t>
       </w:r>
       <w:r>
         <w:rPr>
@@ -3255,11 +3162,9 @@
         </w:rPr>
         <w:t xml:space="preserve"> which </w:t>
       </w:r>
-      <w:proofErr w:type="spellStart"/>
       <w:r>
         <w:t>transpiles</w:t>
       </w:r>
-      <w:proofErr w:type="spellEnd"/>
       <w:r>
         <w:t xml:space="preserve"> </w:t>
       </w:r>
@@ -3282,16 +3187,7 @@
         <w:t xml:space="preserve"> using </w:t>
       </w:r>
       <w:r>
-        <w:t>reg</w:t>
-      </w:r>
-      <w:r>
-        <w:t>-</w:t>
-      </w:r>
-      <w:r>
-        <w:t>ex</w:t>
-      </w:r>
-      <w:r>
-        <w:t xml:space="preserve"> and</w:t>
+        <w:t>reg-ex and</w:t>
       </w:r>
       <w:r>
         <w:rPr>
@@ -4431,7 +4327,6 @@
         </w:rPr>
         <w:t xml:space="preserve">% </w:t>
       </w:r>
-      <w:proofErr w:type="spellStart"/>
       <w:r>
         <w:rPr>
           <w:color w:val="auto"/>
@@ -4446,7 +4341,6 @@
         </w:rPr>
         <w:t>r</w:t>
       </w:r>
-      <w:proofErr w:type="spellEnd"/>
       <w:r>
         <w:rPr>
           <w:color w:val="auto"/>
@@ -4730,42 +4624,42 @@
         <v:path o:extrusionok="f" gradientshapeok="t" o:connecttype="rect"/>
         <o:lock v:ext="edit" aspectratio="t"/>
       </v:shapetype>
-      <v:shape id="_x0000_i1332" type="#_x0000_t75" style="width:512.5pt;height:512.5pt;rotation:180;flip:x y;visibility:visible;mso-wrap-style:square" o:bullet="t">
+      <v:shape id="_x0000_i1254" type="#_x0000_t75" style="width:512.5pt;height:512.5pt;rotation:180;flip:x y;visibility:visible;mso-wrap-style:square" o:bullet="t">
         <v:imagedata r:id="rId1" o:title="107161_circle_github_icon"/>
       </v:shape>
     </w:pict>
   </w:numPicBullet>
   <w:numPicBullet w:numPicBulletId="1">
     <w:pict>
-      <v:shape id="_x0000_i1333" type="#_x0000_t75" style="width:168.5pt;height:168.5pt;visibility:visible;mso-wrap-style:square" o:bullet="t">
+      <v:shape id="_x0000_i1255" type="#_x0000_t75" style="width:168.5pt;height:168.5pt;visibility:visible;mso-wrap-style:square" o:bullet="t">
         <v:imagedata r:id="rId2" o:title="941C13C7"/>
       </v:shape>
     </w:pict>
   </w:numPicBullet>
   <w:numPicBullet w:numPicBulletId="2">
     <w:pict>
-      <v:shape id="_x0000_i1334" type="#_x0000_t75" style="width:29pt;height:16pt;visibility:visible;mso-wrap-style:square" o:bullet="t">
+      <v:shape id="_x0000_i1256" type="#_x0000_t75" style="width:29pt;height:16pt;visibility:visible;mso-wrap-style:square" o:bullet="t">
         <v:imagedata r:id="rId3" o:title="107161_circle_github_icon"/>
       </v:shape>
     </w:pict>
   </w:numPicBullet>
   <w:numPicBullet w:numPicBulletId="3">
     <w:pict>
-      <v:shape id="_x0000_i1335" type="#_x0000_t75" style="width:240pt;height:234pt;visibility:visible;mso-wrap-style:square" o:bullet="t">
+      <v:shape id="_x0000_i1257" type="#_x0000_t75" style="width:240pt;height:234pt;visibility:visible;mso-wrap-style:square" o:bullet="t">
         <v:imagedata r:id="rId4" o:title="Indian_Institute_of_Technology_Bombay_Logo"/>
       </v:shape>
     </w:pict>
   </w:numPicBullet>
   <w:numPicBullet w:numPicBulletId="4">
     <w:pict>
-      <v:shape id="_x0000_i1336" type="#_x0000_t75" style="width:23.5pt;height:16pt;visibility:visible;mso-wrap-style:square" o:bullet="t">
+      <v:shape id="_x0000_i1258" type="#_x0000_t75" style="width:23.5pt;height:16pt;visibility:visible;mso-wrap-style:square" o:bullet="t">
         <v:imagedata r:id="rId5" o:title="Indian_Institute_of_Technology_Bombay_Logo"/>
       </v:shape>
     </w:pict>
   </w:numPicBullet>
   <w:numPicBullet w:numPicBulletId="5">
     <w:pict>
-      <v:shape id="_x0000_i1337" type="#_x0000_t75" style="width:75.5pt;height:75.5pt;visibility:visible;mso-wrap-style:square" o:bullet="t">
+      <v:shape id="_x0000_i1259" type="#_x0000_t75" style="width:75.5pt;height:75.5pt;visibility:visible;mso-wrap-style:square" o:bullet="t">
         <v:imagedata r:id="rId6" o:title=""/>
       </v:shape>
     </w:pict>

</xml_diff>

<commit_message>
t4 - removed extraline from skills and moved the NAT point to individual bullet point
</commit_message>
<xml_diff>
--- a/Resume_latest - Copy.docx
+++ b/Resume_latest - Copy.docx
@@ -377,7 +377,25 @@
             <w:color w:val="auto"/>
             <w:u w:val="none"/>
           </w:rPr>
-          <w:t xml:space="preserve">ithub.com/PrathameshBhagat </w:t>
+          <w:t>ithub.com/</w:t>
+        </w:r>
+        <w:proofErr w:type="spellStart"/>
+        <w:r>
+          <w:rPr>
+            <w:rStyle w:val="Hyperlink"/>
+            <w:color w:val="auto"/>
+            <w:u w:val="none"/>
+          </w:rPr>
+          <w:t>PrathameshBhagat</w:t>
+        </w:r>
+        <w:proofErr w:type="spellEnd"/>
+        <w:r>
+          <w:rPr>
+            <w:rStyle w:val="Hyperlink"/>
+            <w:color w:val="auto"/>
+            <w:u w:val="none"/>
+          </w:rPr>
+          <w:t xml:space="preserve"> </w:t>
         </w:r>
       </w:hyperlink>
     </w:p>
@@ -505,8 +523,20 @@
             <w:u w:val="none"/>
             <w:shd w:val="clear" w:color="auto" w:fill="FFFFFF"/>
           </w:rPr>
-          <w:t>n.com/in/prathameshvivekbhagat</w:t>
+          <w:t>n.com/in/</w:t>
         </w:r>
+        <w:proofErr w:type="spellStart"/>
+        <w:r>
+          <w:rPr>
+            <w:rStyle w:val="Hyperlink"/>
+            <w:bCs/>
+            <w:color w:val="auto"/>
+            <w:u w:val="none"/>
+            <w:shd w:val="clear" w:color="auto" w:fill="FFFFFF"/>
+          </w:rPr>
+          <w:t>prathameshvivekbhagat</w:t>
+        </w:r>
+        <w:proofErr w:type="spellEnd"/>
       </w:hyperlink>
       <w:r>
         <w:rPr>
@@ -767,25 +797,6 @@
     </w:p>
     <w:p>
       <w:pPr>
-        <w:pBdr>
-          <w:bottom w:val="single" w:sz="6" w:space="1" w:color="auto"/>
-        </w:pBdr>
-        <w:tabs>
-          <w:tab w:val="right" w:pos="10490"/>
-        </w:tabs>
-        <w:spacing w:line="240" w:lineRule="auto"/>
-        <w:ind w:right="0"/>
-        <w:jc w:val="center"/>
-        <w:rPr>
-          <w:rStyle w:val="Hyperlink"/>
-          <w:bCs/>
-          <w:color w:val="auto"/>
-          <w:u w:val="none"/>
-        </w:rPr>
-      </w:pPr>
-    </w:p>
-    <w:p>
-      <w:pPr>
         <w:spacing w:line="240" w:lineRule="auto"/>
         <w:ind w:right="0"/>
         <w:jc w:val="center"/>
@@ -1204,6 +1215,7 @@
         </w:rPr>
       </w:pPr>
       <w:hyperlink r:id="rId21" w:history="1">
+        <w:proofErr w:type="spellStart"/>
         <w:r>
           <w:rPr>
             <w:rStyle w:val="Hyperlink"/>
@@ -1212,7 +1224,18 @@
             <w:color w:val="auto"/>
             <w:u w:val="none"/>
           </w:rPr>
-          <w:t>TutorD LLC (U.S.), remote | tutord.io</w:t>
+          <w:t>TutorD</w:t>
+        </w:r>
+        <w:proofErr w:type="spellEnd"/>
+        <w:r>
+          <w:rPr>
+            <w:rStyle w:val="Hyperlink"/>
+            <w:b/>
+            <w:bCs/>
+            <w:color w:val="auto"/>
+            <w:u w:val="none"/>
+          </w:rPr>
+          <w:t xml:space="preserve"> LLC (U.S.), remote | tutord.io</w:t>
         </w:r>
       </w:hyperlink>
       <w:r>
@@ -1233,12 +1256,14 @@
         </w:rPr>
         <w:t>(</w:t>
       </w:r>
+      <w:proofErr w:type="spellStart"/>
       <w:r>
         <w:rPr>
           <w:color w:val="auto"/>
         </w:rPr>
         <w:t>TutorD</w:t>
       </w:r>
+      <w:proofErr w:type="spellEnd"/>
       <w:r>
         <w:rPr>
           <w:color w:val="auto"/>
@@ -1346,7 +1371,23 @@
           <w:color w:val="auto"/>
           <w:szCs w:val="20"/>
         </w:rPr>
-        <w:t>ocker images and deployed to ECS sbx, dev and prod clusters on</w:t>
+        <w:t xml:space="preserve">ocker images and deployed to ECS </w:t>
+      </w:r>
+      <w:proofErr w:type="spellStart"/>
+      <w:r>
+        <w:rPr>
+          <w:color w:val="auto"/>
+          <w:szCs w:val="20"/>
+        </w:rPr>
+        <w:t>sbx</w:t>
+      </w:r>
+      <w:proofErr w:type="spellEnd"/>
+      <w:r>
+        <w:rPr>
+          <w:color w:val="auto"/>
+          <w:szCs w:val="20"/>
+        </w:rPr>
+        <w:t>, dev and prod clusters on</w:t>
       </w:r>
       <w:r>
         <w:rPr>
@@ -1473,7 +1514,30 @@
           <w:color w:val="auto"/>
           <w:szCs w:val="20"/>
         </w:rPr>
-        <w:t xml:space="preserve"> and r</w:t>
+        <w:t xml:space="preserve"> </w:t>
+      </w:r>
+    </w:p>
+    <w:p>
+      <w:pPr>
+        <w:pStyle w:val="ListParagraph"/>
+        <w:numPr>
+          <w:ilvl w:val="0"/>
+          <w:numId w:val="32"/>
+        </w:numPr>
+        <w:spacing w:line="240" w:lineRule="auto"/>
+        <w:ind w:right="0"/>
+        <w:jc w:val="both"/>
+        <w:rPr>
+          <w:color w:val="auto"/>
+          <w:szCs w:val="20"/>
+        </w:rPr>
+      </w:pPr>
+      <w:r>
+        <w:rPr>
+          <w:color w:val="auto"/>
+          <w:szCs w:val="20"/>
+        </w:rPr>
+        <w:t>R</w:t>
       </w:r>
       <w:r>
         <w:rPr>
@@ -2205,6 +2269,7 @@
         <w:t xml:space="preserve"> | </w:t>
       </w:r>
       <w:hyperlink r:id="rId24" w:history="1">
+        <w:proofErr w:type="spellStart"/>
         <w:r>
           <w:rPr>
             <w:rStyle w:val="Hyperlink"/>
@@ -2213,6 +2278,7 @@
           </w:rPr>
           <w:t>Hazirs</w:t>
         </w:r>
+        <w:proofErr w:type="spellEnd"/>
         <w:r>
           <w:rPr>
             <w:rStyle w:val="Hyperlink"/>
@@ -2293,11 +2359,19 @@
         </w:rPr>
         <w:t>(</w:t>
       </w:r>
-      <w:r>
-        <w:rPr>
-          <w:color w:val="auto"/>
-        </w:rPr>
-        <w:t>Hazirs is an early-stage start</w:t>
+      <w:proofErr w:type="spellStart"/>
+      <w:r>
+        <w:rPr>
+          <w:color w:val="auto"/>
+        </w:rPr>
+        <w:t>Hazirs</w:t>
+      </w:r>
+      <w:proofErr w:type="spellEnd"/>
+      <w:r>
+        <w:rPr>
+          <w:color w:val="auto"/>
+        </w:rPr>
+        <w:t xml:space="preserve"> is an early-stage start</w:t>
       </w:r>
       <w:r>
         <w:rPr>
@@ -2406,6 +2480,7 @@
         </w:rPr>
         <w:t>“</w:t>
       </w:r>
+      <w:proofErr w:type="spellStart"/>
       <w:r>
         <w:rPr>
           <w:color w:val="auto"/>
@@ -2413,6 +2488,7 @@
         </w:rPr>
         <w:t>Hazirs</w:t>
       </w:r>
+      <w:proofErr w:type="spellEnd"/>
       <w:r>
         <w:rPr>
           <w:color w:val="auto"/>
@@ -2558,6 +2634,7 @@
         </w:rPr>
       </w:pPr>
       <w:hyperlink r:id="rId25" w:history="1">
+        <w:proofErr w:type="spellStart"/>
         <w:r>
           <w:rPr>
             <w:rStyle w:val="Hyperlink"/>
@@ -2566,7 +2643,18 @@
             <w:color w:val="auto"/>
             <w:u w:val="none"/>
           </w:rPr>
-          <w:t xml:space="preserve">Catima Loyalty </w:t>
+          <w:t>Catima</w:t>
+        </w:r>
+        <w:proofErr w:type="spellEnd"/>
+        <w:r>
+          <w:rPr>
+            <w:rStyle w:val="Hyperlink"/>
+            <w:b/>
+            <w:bCs/>
+            <w:color w:val="auto"/>
+            <w:u w:val="none"/>
+          </w:rPr>
+          <w:t xml:space="preserve"> Loyalty </w:t>
         </w:r>
         <w:r>
           <w:rPr>
@@ -2670,7 +2758,21 @@
         <w:rPr>
           <w:color w:val="auto"/>
         </w:rPr>
-        <w:t>(Catima is a</w:t>
+        <w:t>(</w:t>
+      </w:r>
+      <w:proofErr w:type="spellStart"/>
+      <w:r>
+        <w:rPr>
+          <w:color w:val="auto"/>
+        </w:rPr>
+        <w:t>Catima</w:t>
+      </w:r>
+      <w:proofErr w:type="spellEnd"/>
+      <w:r>
+        <w:rPr>
+          <w:color w:val="auto"/>
+        </w:rPr>
+        <w:t xml:space="preserve"> is a</w:t>
       </w:r>
       <w:r>
         <w:rPr>
@@ -2833,7 +2935,21 @@
         <w:rPr>
           <w:color w:val="auto"/>
         </w:rPr>
-        <w:t xml:space="preserve">multiple interfaces, and enums to </w:t>
+        <w:t xml:space="preserve">multiple interfaces, and </w:t>
+      </w:r>
+      <w:proofErr w:type="spellStart"/>
+      <w:r>
+        <w:rPr>
+          <w:color w:val="auto"/>
+        </w:rPr>
+        <w:t>enums</w:t>
+      </w:r>
+      <w:proofErr w:type="spellEnd"/>
+      <w:r>
+        <w:rPr>
+          <w:color w:val="auto"/>
+        </w:rPr>
+        <w:t xml:space="preserve"> to </w:t>
       </w:r>
       <w:r>
         <w:rPr>
@@ -3162,9 +3278,11 @@
         </w:rPr>
         <w:t xml:space="preserve"> which </w:t>
       </w:r>
+      <w:proofErr w:type="spellStart"/>
       <w:r>
         <w:t>transpiles</w:t>
       </w:r>
+      <w:proofErr w:type="spellEnd"/>
       <w:r>
         <w:t xml:space="preserve"> </w:t>
       </w:r>
@@ -4327,6 +4445,7 @@
         </w:rPr>
         <w:t xml:space="preserve">% </w:t>
       </w:r>
+      <w:proofErr w:type="spellStart"/>
       <w:r>
         <w:rPr>
           <w:color w:val="auto"/>
@@ -4341,6 +4460,7 @@
         </w:rPr>
         <w:t>r</w:t>
       </w:r>
+      <w:proofErr w:type="spellEnd"/>
       <w:r>
         <w:rPr>
           <w:color w:val="auto"/>
@@ -4624,42 +4744,42 @@
         <v:path o:extrusionok="f" gradientshapeok="t" o:connecttype="rect"/>
         <o:lock v:ext="edit" aspectratio="t"/>
       </v:shapetype>
-      <v:shape id="_x0000_i1254" type="#_x0000_t75" style="width:512.5pt;height:512.5pt;rotation:180;flip:x y;visibility:visible;mso-wrap-style:square" o:bullet="t">
+      <v:shape id="_x0000_i1260" type="#_x0000_t75" style="width:512.5pt;height:512.5pt;rotation:180;flip:x y;visibility:visible;mso-wrap-style:square" o:bullet="t">
         <v:imagedata r:id="rId1" o:title="107161_circle_github_icon"/>
       </v:shape>
     </w:pict>
   </w:numPicBullet>
   <w:numPicBullet w:numPicBulletId="1">
     <w:pict>
-      <v:shape id="_x0000_i1255" type="#_x0000_t75" style="width:168.5pt;height:168.5pt;visibility:visible;mso-wrap-style:square" o:bullet="t">
+      <v:shape id="_x0000_i1261" type="#_x0000_t75" style="width:168.5pt;height:168.5pt;visibility:visible;mso-wrap-style:square" o:bullet="t">
         <v:imagedata r:id="rId2" o:title="941C13C7"/>
       </v:shape>
     </w:pict>
   </w:numPicBullet>
   <w:numPicBullet w:numPicBulletId="2">
     <w:pict>
-      <v:shape id="_x0000_i1256" type="#_x0000_t75" style="width:29pt;height:16pt;visibility:visible;mso-wrap-style:square" o:bullet="t">
+      <v:shape id="_x0000_i1262" type="#_x0000_t75" style="width:29pt;height:16pt;visibility:visible;mso-wrap-style:square" o:bullet="t">
         <v:imagedata r:id="rId3" o:title="107161_circle_github_icon"/>
       </v:shape>
     </w:pict>
   </w:numPicBullet>
   <w:numPicBullet w:numPicBulletId="3">
     <w:pict>
-      <v:shape id="_x0000_i1257" type="#_x0000_t75" style="width:240pt;height:234pt;visibility:visible;mso-wrap-style:square" o:bullet="t">
+      <v:shape id="_x0000_i1263" type="#_x0000_t75" style="width:240pt;height:234pt;visibility:visible;mso-wrap-style:square" o:bullet="t">
         <v:imagedata r:id="rId4" o:title="Indian_Institute_of_Technology_Bombay_Logo"/>
       </v:shape>
     </w:pict>
   </w:numPicBullet>
   <w:numPicBullet w:numPicBulletId="4">
     <w:pict>
-      <v:shape id="_x0000_i1258" type="#_x0000_t75" style="width:23.5pt;height:16pt;visibility:visible;mso-wrap-style:square" o:bullet="t">
+      <v:shape id="_x0000_i1264" type="#_x0000_t75" style="width:23.5pt;height:16pt;visibility:visible;mso-wrap-style:square" o:bullet="t">
         <v:imagedata r:id="rId5" o:title="Indian_Institute_of_Technology_Bombay_Logo"/>
       </v:shape>
     </w:pict>
   </w:numPicBullet>
   <w:numPicBullet w:numPicBulletId="5">
     <w:pict>
-      <v:shape id="_x0000_i1259" type="#_x0000_t75" style="width:75.5pt;height:75.5pt;visibility:visible;mso-wrap-style:square" o:bullet="t">
+      <v:shape id="_x0000_i1265" type="#_x0000_t75" style="width:75.5pt;height:75.5pt;visibility:visible;mso-wrap-style:square" o:bullet="t">
         <v:imagedata r:id="rId6" o:title=""/>
       </v:shape>
     </w:pict>

</xml_diff>

<commit_message>
t5 - minor changes, "all ECS" removed sbx, dev to fullform, added "accordingly" and missing fullstop (.)
</commit_message>
<xml_diff>
--- a/Resume_latest - Copy.docx
+++ b/Resume_latest - Copy.docx
@@ -377,25 +377,7 @@
             <w:color w:val="auto"/>
             <w:u w:val="none"/>
           </w:rPr>
-          <w:t>ithub.com/</w:t>
-        </w:r>
-        <w:proofErr w:type="spellStart"/>
-        <w:r>
-          <w:rPr>
-            <w:rStyle w:val="Hyperlink"/>
-            <w:color w:val="auto"/>
-            <w:u w:val="none"/>
-          </w:rPr>
-          <w:t>PrathameshBhagat</w:t>
-        </w:r>
-        <w:proofErr w:type="spellEnd"/>
-        <w:r>
-          <w:rPr>
-            <w:rStyle w:val="Hyperlink"/>
-            <w:color w:val="auto"/>
-            <w:u w:val="none"/>
-          </w:rPr>
-          <w:t xml:space="preserve"> </w:t>
+          <w:t xml:space="preserve">ithub.com/PrathameshBhagat </w:t>
         </w:r>
       </w:hyperlink>
     </w:p>
@@ -523,20 +505,8 @@
             <w:u w:val="none"/>
             <w:shd w:val="clear" w:color="auto" w:fill="FFFFFF"/>
           </w:rPr>
-          <w:t>n.com/in/</w:t>
+          <w:t>n.com/in/prathameshvivekbhagat</w:t>
         </w:r>
-        <w:proofErr w:type="spellStart"/>
-        <w:r>
-          <w:rPr>
-            <w:rStyle w:val="Hyperlink"/>
-            <w:bCs/>
-            <w:color w:val="auto"/>
-            <w:u w:val="none"/>
-            <w:shd w:val="clear" w:color="auto" w:fill="FFFFFF"/>
-          </w:rPr>
-          <w:t>prathameshvivekbhagat</w:t>
-        </w:r>
-        <w:proofErr w:type="spellEnd"/>
       </w:hyperlink>
       <w:r>
         <w:rPr>
@@ -1215,7 +1185,6 @@
         </w:rPr>
       </w:pPr>
       <w:hyperlink r:id="rId21" w:history="1">
-        <w:proofErr w:type="spellStart"/>
         <w:r>
           <w:rPr>
             <w:rStyle w:val="Hyperlink"/>
@@ -1224,18 +1193,7 @@
             <w:color w:val="auto"/>
             <w:u w:val="none"/>
           </w:rPr>
-          <w:t>TutorD</w:t>
-        </w:r>
-        <w:proofErr w:type="spellEnd"/>
-        <w:r>
-          <w:rPr>
-            <w:rStyle w:val="Hyperlink"/>
-            <w:b/>
-            <w:bCs/>
-            <w:color w:val="auto"/>
-            <w:u w:val="none"/>
-          </w:rPr>
-          <w:t xml:space="preserve"> LLC (U.S.), remote | tutord.io</w:t>
+          <w:t>TutorD LLC (U.S.), remote | tutord.io</w:t>
         </w:r>
       </w:hyperlink>
       <w:r>
@@ -1256,14 +1214,12 @@
         </w:rPr>
         <w:t>(</w:t>
       </w:r>
-      <w:proofErr w:type="spellStart"/>
       <w:r>
         <w:rPr>
           <w:color w:val="auto"/>
         </w:rPr>
         <w:t>TutorD</w:t>
       </w:r>
-      <w:proofErr w:type="spellEnd"/>
       <w:r>
         <w:rPr>
           <w:color w:val="auto"/>
@@ -1373,21 +1329,61 @@
         </w:rPr>
         <w:t xml:space="preserve">ocker images and deployed to ECS </w:t>
       </w:r>
-      <w:proofErr w:type="spellStart"/>
-      <w:r>
-        <w:rPr>
-          <w:color w:val="auto"/>
-          <w:szCs w:val="20"/>
-        </w:rPr>
-        <w:t>sbx</w:t>
-      </w:r>
-      <w:proofErr w:type="spellEnd"/>
-      <w:r>
-        <w:rPr>
-          <w:color w:val="auto"/>
-          <w:szCs w:val="20"/>
-        </w:rPr>
-        <w:t>, dev and prod clusters on</w:t>
+      <w:r>
+        <w:rPr>
+          <w:color w:val="auto"/>
+          <w:szCs w:val="20"/>
+        </w:rPr>
+        <w:t xml:space="preserve">service to </w:t>
+      </w:r>
+      <w:r>
+        <w:rPr>
+          <w:color w:val="auto"/>
+          <w:szCs w:val="20"/>
+        </w:rPr>
+        <w:t>s</w:t>
+      </w:r>
+      <w:r>
+        <w:rPr>
+          <w:color w:val="auto"/>
+          <w:szCs w:val="20"/>
+        </w:rPr>
+        <w:t>andbox</w:t>
+      </w:r>
+      <w:r>
+        <w:rPr>
+          <w:color w:val="auto"/>
+          <w:szCs w:val="20"/>
+        </w:rPr>
+        <w:t>, de</w:t>
+      </w:r>
+      <w:r>
+        <w:rPr>
+          <w:color w:val="auto"/>
+          <w:szCs w:val="20"/>
+        </w:rPr>
+        <w:t>velopment</w:t>
+      </w:r>
+      <w:r>
+        <w:rPr>
+          <w:color w:val="auto"/>
+          <w:szCs w:val="20"/>
+        </w:rPr>
+        <w:t xml:space="preserve"> and prod</w:t>
+      </w:r>
+      <w:r>
+        <w:rPr>
+          <w:color w:val="auto"/>
+          <w:szCs w:val="20"/>
+        </w:rPr>
+        <w:t>uction</w:t>
+      </w:r>
+      <w:r>
+        <w:rPr>
+          <w:color w:val="auto"/>
+          <w:szCs w:val="20"/>
+        </w:rPr>
+        <w:t xml:space="preserve"> clusters on</w:t>
       </w:r>
       <w:r>
         <w:rPr>
@@ -1409,6 +1405,13 @@
           <w:szCs w:val="20"/>
         </w:rPr>
         <w:t>automated tests</w:t>
+      </w:r>
+      <w:r>
+        <w:rPr>
+          <w:color w:val="auto"/>
+          <w:szCs w:val="20"/>
+        </w:rPr>
+        <w:t xml:space="preserve"> accordingly</w:t>
       </w:r>
       <w:r>
         <w:rPr>
@@ -1493,21 +1496,7 @@
           <w:color w:val="auto"/>
           <w:szCs w:val="20"/>
         </w:rPr>
-        <w:t xml:space="preserve"> of </w:t>
-      </w:r>
-      <w:r>
-        <w:rPr>
-          <w:color w:val="auto"/>
-          <w:szCs w:val="20"/>
-        </w:rPr>
-        <w:t xml:space="preserve">all </w:t>
-      </w:r>
-      <w:r>
-        <w:rPr>
-          <w:color w:val="auto"/>
-          <w:szCs w:val="20"/>
-        </w:rPr>
-        <w:t>ECS services using Uptime.io, providing real-time availability and health status of all ECS services</w:t>
+        <w:t xml:space="preserve"> of</w:t>
       </w:r>
       <w:r>
         <w:rPr>
@@ -1515,6 +1504,20 @@
           <w:szCs w:val="20"/>
         </w:rPr>
         <w:t xml:space="preserve"> </w:t>
+      </w:r>
+      <w:r>
+        <w:rPr>
+          <w:color w:val="auto"/>
+          <w:szCs w:val="20"/>
+        </w:rPr>
+        <w:t>ECS services using Uptime.io, providing real-time availability and health status of ECS services</w:t>
+      </w:r>
+      <w:r>
+        <w:rPr>
+          <w:color w:val="auto"/>
+          <w:szCs w:val="20"/>
+        </w:rPr>
+        <w:t>.</w:t>
       </w:r>
     </w:p>
     <w:p>
@@ -2269,7 +2272,6 @@
         <w:t xml:space="preserve"> | </w:t>
       </w:r>
       <w:hyperlink r:id="rId24" w:history="1">
-        <w:proofErr w:type="spellStart"/>
         <w:r>
           <w:rPr>
             <w:rStyle w:val="Hyperlink"/>
@@ -2278,7 +2280,6 @@
           </w:rPr>
           <w:t>Hazirs</w:t>
         </w:r>
-        <w:proofErr w:type="spellEnd"/>
         <w:r>
           <w:rPr>
             <w:rStyle w:val="Hyperlink"/>
@@ -2359,19 +2360,11 @@
         </w:rPr>
         <w:t>(</w:t>
       </w:r>
-      <w:proofErr w:type="spellStart"/>
-      <w:r>
-        <w:rPr>
-          <w:color w:val="auto"/>
-        </w:rPr>
-        <w:t>Hazirs</w:t>
-      </w:r>
-      <w:proofErr w:type="spellEnd"/>
-      <w:r>
-        <w:rPr>
-          <w:color w:val="auto"/>
-        </w:rPr>
-        <w:t xml:space="preserve"> is an early-stage start</w:t>
+      <w:r>
+        <w:rPr>
+          <w:color w:val="auto"/>
+        </w:rPr>
+        <w:t>Hazirs is an early-stage start</w:t>
       </w:r>
       <w:r>
         <w:rPr>
@@ -2480,7 +2473,6 @@
         </w:rPr>
         <w:t>“</w:t>
       </w:r>
-      <w:proofErr w:type="spellStart"/>
       <w:r>
         <w:rPr>
           <w:color w:val="auto"/>
@@ -2488,7 +2480,6 @@
         </w:rPr>
         <w:t>Hazirs</w:t>
       </w:r>
-      <w:proofErr w:type="spellEnd"/>
       <w:r>
         <w:rPr>
           <w:color w:val="auto"/>
@@ -2634,7 +2625,6 @@
         </w:rPr>
       </w:pPr>
       <w:hyperlink r:id="rId25" w:history="1">
-        <w:proofErr w:type="spellStart"/>
         <w:r>
           <w:rPr>
             <w:rStyle w:val="Hyperlink"/>
@@ -2643,18 +2633,7 @@
             <w:color w:val="auto"/>
             <w:u w:val="none"/>
           </w:rPr>
-          <w:t>Catima</w:t>
-        </w:r>
-        <w:proofErr w:type="spellEnd"/>
-        <w:r>
-          <w:rPr>
-            <w:rStyle w:val="Hyperlink"/>
-            <w:b/>
-            <w:bCs/>
-            <w:color w:val="auto"/>
-            <w:u w:val="none"/>
-          </w:rPr>
-          <w:t xml:space="preserve"> Loyalty </w:t>
+          <w:t xml:space="preserve">Catima Loyalty </w:t>
         </w:r>
         <w:r>
           <w:rPr>
@@ -2758,21 +2737,7 @@
         <w:rPr>
           <w:color w:val="auto"/>
         </w:rPr>
-        <w:t>(</w:t>
-      </w:r>
-      <w:proofErr w:type="spellStart"/>
-      <w:r>
-        <w:rPr>
-          <w:color w:val="auto"/>
-        </w:rPr>
-        <w:t>Catima</w:t>
-      </w:r>
-      <w:proofErr w:type="spellEnd"/>
-      <w:r>
-        <w:rPr>
-          <w:color w:val="auto"/>
-        </w:rPr>
-        <w:t xml:space="preserve"> is a</w:t>
+        <w:t>(Catima is a</w:t>
       </w:r>
       <w:r>
         <w:rPr>
@@ -2935,21 +2900,7 @@
         <w:rPr>
           <w:color w:val="auto"/>
         </w:rPr>
-        <w:t xml:space="preserve">multiple interfaces, and </w:t>
-      </w:r>
-      <w:proofErr w:type="spellStart"/>
-      <w:r>
-        <w:rPr>
-          <w:color w:val="auto"/>
-        </w:rPr>
-        <w:t>enums</w:t>
-      </w:r>
-      <w:proofErr w:type="spellEnd"/>
-      <w:r>
-        <w:rPr>
-          <w:color w:val="auto"/>
-        </w:rPr>
-        <w:t xml:space="preserve"> to </w:t>
+        <w:t xml:space="preserve">multiple interfaces, and enums to </w:t>
       </w:r>
       <w:r>
         <w:rPr>
@@ -3278,11 +3229,9 @@
         </w:rPr>
         <w:t xml:space="preserve"> which </w:t>
       </w:r>
-      <w:proofErr w:type="spellStart"/>
       <w:r>
         <w:t>transpiles</w:t>
       </w:r>
-      <w:proofErr w:type="spellEnd"/>
       <w:r>
         <w:t xml:space="preserve"> </w:t>
       </w:r>
@@ -4445,7 +4394,6 @@
         </w:rPr>
         <w:t xml:space="preserve">% </w:t>
       </w:r>
-      <w:proofErr w:type="spellStart"/>
       <w:r>
         <w:rPr>
           <w:color w:val="auto"/>
@@ -4460,7 +4408,6 @@
         </w:rPr>
         <w:t>r</w:t>
       </w:r>
-      <w:proofErr w:type="spellEnd"/>
       <w:r>
         <w:rPr>
           <w:color w:val="auto"/>
@@ -4744,42 +4691,42 @@
         <v:path o:extrusionok="f" gradientshapeok="t" o:connecttype="rect"/>
         <o:lock v:ext="edit" aspectratio="t"/>
       </v:shapetype>
-      <v:shape id="_x0000_i1260" type="#_x0000_t75" style="width:512.5pt;height:512.5pt;rotation:180;flip:x y;visibility:visible;mso-wrap-style:square" o:bullet="t">
+      <v:shape id="_x0000_i1176" type="#_x0000_t75" style="width:512.5pt;height:512.5pt;rotation:180;flip:x y;visibility:visible;mso-wrap-style:square" o:bullet="t">
         <v:imagedata r:id="rId1" o:title="107161_circle_github_icon"/>
       </v:shape>
     </w:pict>
   </w:numPicBullet>
   <w:numPicBullet w:numPicBulletId="1">
     <w:pict>
-      <v:shape id="_x0000_i1261" type="#_x0000_t75" style="width:168.5pt;height:168.5pt;visibility:visible;mso-wrap-style:square" o:bullet="t">
+      <v:shape id="_x0000_i1177" type="#_x0000_t75" style="width:168.5pt;height:168.5pt;visibility:visible;mso-wrap-style:square" o:bullet="t">
         <v:imagedata r:id="rId2" o:title="941C13C7"/>
       </v:shape>
     </w:pict>
   </w:numPicBullet>
   <w:numPicBullet w:numPicBulletId="2">
     <w:pict>
-      <v:shape id="_x0000_i1262" type="#_x0000_t75" style="width:29pt;height:16pt;visibility:visible;mso-wrap-style:square" o:bullet="t">
+      <v:shape id="_x0000_i1178" type="#_x0000_t75" style="width:29pt;height:16pt;visibility:visible;mso-wrap-style:square" o:bullet="t">
         <v:imagedata r:id="rId3" o:title="107161_circle_github_icon"/>
       </v:shape>
     </w:pict>
   </w:numPicBullet>
   <w:numPicBullet w:numPicBulletId="3">
     <w:pict>
-      <v:shape id="_x0000_i1263" type="#_x0000_t75" style="width:240pt;height:234pt;visibility:visible;mso-wrap-style:square" o:bullet="t">
+      <v:shape id="_x0000_i1179" type="#_x0000_t75" style="width:240pt;height:234pt;visibility:visible;mso-wrap-style:square" o:bullet="t">
         <v:imagedata r:id="rId4" o:title="Indian_Institute_of_Technology_Bombay_Logo"/>
       </v:shape>
     </w:pict>
   </w:numPicBullet>
   <w:numPicBullet w:numPicBulletId="4">
     <w:pict>
-      <v:shape id="_x0000_i1264" type="#_x0000_t75" style="width:23.5pt;height:16pt;visibility:visible;mso-wrap-style:square" o:bullet="t">
+      <v:shape id="_x0000_i1180" type="#_x0000_t75" style="width:23.5pt;height:16pt;visibility:visible;mso-wrap-style:square" o:bullet="t">
         <v:imagedata r:id="rId5" o:title="Indian_Institute_of_Technology_Bombay_Logo"/>
       </v:shape>
     </w:pict>
   </w:numPicBullet>
   <w:numPicBullet w:numPicBulletId="5">
     <w:pict>
-      <v:shape id="_x0000_i1265" type="#_x0000_t75" style="width:75.5pt;height:75.5pt;visibility:visible;mso-wrap-style:square" o:bullet="t">
+      <v:shape id="_x0000_i1181" type="#_x0000_t75" style="width:75.5pt;height:75.5pt;visibility:visible;mso-wrap-style:square" o:bullet="t">
         <v:imagedata r:id="rId6" o:title=""/>
       </v:shape>
     </w:pict>

</xml_diff>

<commit_message>
[infosys] Fundamentals line added in skills section
</commit_message>
<xml_diff>
--- a/Resume_latest - Copy.docx
+++ b/Resume_latest - Copy.docx
@@ -1077,6 +1077,37 @@
     </w:p>
     <w:p>
       <w:pPr>
+        <w:pStyle w:val="ListParagraph"/>
+        <w:numPr>
+          <w:ilvl w:val="0"/>
+          <w:numId w:val="32"/>
+        </w:numPr>
+        <w:spacing w:line="240" w:lineRule="auto"/>
+        <w:ind w:right="0"/>
+        <w:jc w:val="both"/>
+        <w:rPr>
+          <w:bCs/>
+          <w:color w:val="auto"/>
+          <w:szCs w:val="20"/>
+        </w:rPr>
+      </w:pPr>
+      <w:r>
+        <w:rPr>
+          <w:i/>
+          <w:iCs/>
+          <w:color w:val="auto"/>
+        </w:rPr>
+        <w:t>Fundamentals</w:t>
+      </w:r>
+      <w:r>
+        <w:rPr>
+          <w:color w:val="auto"/>
+        </w:rPr>
+        <w:t>: Object Oriented Programming (OOP), Data Structures and Algorithms. (Familiar: multithreading).</w:t>
+      </w:r>
+    </w:p>
+    <w:p>
+      <w:pPr>
         <w:pBdr>
           <w:bottom w:val="single" w:sz="6" w:space="1" w:color="auto"/>
         </w:pBdr>
@@ -4916,42 +4947,42 @@
         <v:path o:extrusionok="f" gradientshapeok="t" o:connecttype="rect"/>
         <o:lock v:ext="edit" aspectratio="t"/>
       </v:shapetype>
-      <v:shape id="_x0000_i1152" type="#_x0000_t75" style="width:512.4pt;height:512.4pt;rotation:180;flip:x y;visibility:visible;mso-wrap-style:square" o:bullet="t">
+      <v:shape id="_x0000_i1722" type="#_x0000_t75" style="width:512.5pt;height:512.5pt;rotation:180;flip:x y;visibility:visible;mso-wrap-style:square" o:bullet="t">
         <v:imagedata r:id="rId1" o:title="107161_circle_github_icon"/>
       </v:shape>
     </w:pict>
   </w:numPicBullet>
   <w:numPicBullet w:numPicBulletId="1">
     <w:pict>
-      <v:shape id="_x0000_i1153" type="#_x0000_t75" style="width:168.6pt;height:168.6pt;visibility:visible;mso-wrap-style:square" o:bullet="t">
+      <v:shape id="_x0000_i1723" type="#_x0000_t75" style="width:168.5pt;height:168.5pt;visibility:visible;mso-wrap-style:square" o:bullet="t">
         <v:imagedata r:id="rId2" o:title="941C13C7"/>
       </v:shape>
     </w:pict>
   </w:numPicBullet>
   <w:numPicBullet w:numPicBulletId="2">
     <w:pict>
-      <v:shape id="_x0000_i1154" type="#_x0000_t75" style="width:28.8pt;height:16.2pt;visibility:visible;mso-wrap-style:square" o:bullet="t">
+      <v:shape id="_x0000_i1724" type="#_x0000_t75" style="width:29pt;height:16pt;visibility:visible;mso-wrap-style:square" o:bullet="t">
         <v:imagedata r:id="rId3" o:title="107161_circle_github_icon"/>
       </v:shape>
     </w:pict>
   </w:numPicBullet>
   <w:numPicBullet w:numPicBulletId="3">
     <w:pict>
-      <v:shape id="_x0000_i1155" type="#_x0000_t75" style="width:240pt;height:234pt;visibility:visible;mso-wrap-style:square" o:bullet="t">
+      <v:shape id="_x0000_i1725" type="#_x0000_t75" style="width:240pt;height:234pt;visibility:visible;mso-wrap-style:square" o:bullet="t">
         <v:imagedata r:id="rId4" o:title="Indian_Institute_of_Technology_Bombay_Logo"/>
       </v:shape>
     </w:pict>
   </w:numPicBullet>
   <w:numPicBullet w:numPicBulletId="4">
     <w:pict>
-      <v:shape id="_x0000_i1156" type="#_x0000_t75" style="width:23.4pt;height:16.2pt;visibility:visible;mso-wrap-style:square" o:bullet="t">
+      <v:shape id="_x0000_i1726" type="#_x0000_t75" style="width:23.5pt;height:16pt;visibility:visible;mso-wrap-style:square" o:bullet="t">
         <v:imagedata r:id="rId5" o:title="Indian_Institute_of_Technology_Bombay_Logo"/>
       </v:shape>
     </w:pict>
   </w:numPicBullet>
   <w:numPicBullet w:numPicBulletId="5">
     <w:pict>
-      <v:shape id="_x0000_i1157" type="#_x0000_t75" style="width:75.6pt;height:75.6pt;visibility:visible;mso-wrap-style:square" o:bullet="t">
+      <v:shape id="_x0000_i1727" type="#_x0000_t75" style="width:75.5pt;height:75.5pt;visibility:visible;mso-wrap-style:square" o:bullet="t">
         <v:imagedata r:id="rId6" o:title=""/>
       </v:shape>
     </w:pict>

</xml_diff>

<commit_message>
[infosys] Fixed thezerodhar webscraping thing
</commit_message>
<xml_diff>
--- a/Resume_latest - Copy.docx
+++ b/Resume_latest - Copy.docx
@@ -377,25 +377,7 @@
             <w:color w:val="auto"/>
             <w:u w:val="none"/>
           </w:rPr>
-          <w:t>ithub.com/</w:t>
-        </w:r>
-        <w:proofErr w:type="spellStart"/>
-        <w:r>
-          <w:rPr>
-            <w:rStyle w:val="Hyperlink"/>
-            <w:color w:val="auto"/>
-            <w:u w:val="none"/>
-          </w:rPr>
-          <w:t>PrathameshBhagat</w:t>
-        </w:r>
-        <w:proofErr w:type="spellEnd"/>
-        <w:r>
-          <w:rPr>
-            <w:rStyle w:val="Hyperlink"/>
-            <w:color w:val="auto"/>
-            <w:u w:val="none"/>
-          </w:rPr>
-          <w:t xml:space="preserve"> </w:t>
+          <w:t xml:space="preserve">ithub.com/PrathameshBhagat </w:t>
         </w:r>
       </w:hyperlink>
     </w:p>
@@ -523,20 +505,8 @@
             <w:u w:val="none"/>
             <w:shd w:val="clear" w:color="auto" w:fill="FFFFFF"/>
           </w:rPr>
-          <w:t>n.com/in/</w:t>
+          <w:t>n.com/in/prathameshvivekbhagat</w:t>
         </w:r>
-        <w:proofErr w:type="spellStart"/>
-        <w:r>
-          <w:rPr>
-            <w:rStyle w:val="Hyperlink"/>
-            <w:bCs/>
-            <w:color w:val="auto"/>
-            <w:u w:val="none"/>
-            <w:shd w:val="clear" w:color="auto" w:fill="FFFFFF"/>
-          </w:rPr>
-          <w:t>prathameshvivekbhagat</w:t>
-        </w:r>
-        <w:proofErr w:type="spellEnd"/>
       </w:hyperlink>
       <w:r>
         <w:rPr>
@@ -1237,7 +1207,6 @@
         </w:rPr>
       </w:pPr>
       <w:hyperlink r:id="rId21" w:history="1">
-        <w:proofErr w:type="spellStart"/>
         <w:r>
           <w:rPr>
             <w:rStyle w:val="Hyperlink"/>
@@ -1246,18 +1215,7 @@
             <w:color w:val="auto"/>
             <w:u w:val="none"/>
           </w:rPr>
-          <w:t>TutorD</w:t>
-        </w:r>
-        <w:proofErr w:type="spellEnd"/>
-        <w:r>
-          <w:rPr>
-            <w:rStyle w:val="Hyperlink"/>
-            <w:b/>
-            <w:bCs/>
-            <w:color w:val="auto"/>
-            <w:u w:val="none"/>
-          </w:rPr>
-          <w:t xml:space="preserve"> LLC (U.S.), remote | tutord.io</w:t>
+          <w:t>TutorD LLC (U.S.), remote | tutord.io</w:t>
         </w:r>
       </w:hyperlink>
       <w:r>
@@ -1278,14 +1236,12 @@
         </w:rPr>
         <w:t>(</w:t>
       </w:r>
-      <w:proofErr w:type="spellStart"/>
       <w:r>
         <w:rPr>
           <w:color w:val="auto"/>
         </w:rPr>
         <w:t>TutorD</w:t>
       </w:r>
-      <w:proofErr w:type="spellEnd"/>
       <w:r>
         <w:rPr>
           <w:color w:val="auto"/>
@@ -1459,23 +1415,7 @@
           <w:color w:val="auto"/>
           <w:szCs w:val="20"/>
         </w:rPr>
-        <w:t xml:space="preserve">Migrated the frontend CI/CD pipeline from AWS </w:t>
-      </w:r>
-      <w:proofErr w:type="spellStart"/>
-      <w:r>
-        <w:rPr>
-          <w:color w:val="auto"/>
-          <w:szCs w:val="20"/>
-        </w:rPr>
-        <w:t>CodeBuild</w:t>
-      </w:r>
-      <w:proofErr w:type="spellEnd"/>
-      <w:r>
-        <w:rPr>
-          <w:color w:val="auto"/>
-          <w:szCs w:val="20"/>
-        </w:rPr>
-        <w:t xml:space="preserve"> to GitHub Actions, reducing build time by </w:t>
+        <w:t xml:space="preserve">Migrated the frontend CI/CD pipeline from AWS CodeBuild to GitHub Actions, reducing build time by </w:t>
       </w:r>
       <w:r>
         <w:rPr>
@@ -2278,7 +2218,6 @@
         <w:t xml:space="preserve"> | </w:t>
       </w:r>
       <w:hyperlink r:id="rId24" w:history="1">
-        <w:proofErr w:type="spellStart"/>
         <w:r>
           <w:rPr>
             <w:rStyle w:val="Hyperlink"/>
@@ -2287,7 +2226,6 @@
           </w:rPr>
           <w:t>Hazirs</w:t>
         </w:r>
-        <w:proofErr w:type="spellEnd"/>
         <w:r>
           <w:rPr>
             <w:rStyle w:val="Hyperlink"/>
@@ -2368,19 +2306,11 @@
         </w:rPr>
         <w:t>(</w:t>
       </w:r>
-      <w:proofErr w:type="spellStart"/>
-      <w:r>
-        <w:rPr>
-          <w:color w:val="auto"/>
-        </w:rPr>
-        <w:t>Hazirs</w:t>
-      </w:r>
-      <w:proofErr w:type="spellEnd"/>
-      <w:r>
-        <w:rPr>
-          <w:color w:val="auto"/>
-        </w:rPr>
-        <w:t xml:space="preserve"> is an early-stage start</w:t>
+      <w:r>
+        <w:rPr>
+          <w:color w:val="auto"/>
+        </w:rPr>
+        <w:t>Hazirs is an early-stage start</w:t>
       </w:r>
       <w:r>
         <w:rPr>
@@ -2502,7 +2432,6 @@
         </w:rPr>
         <w:t xml:space="preserve"> </w:t>
       </w:r>
-      <w:proofErr w:type="spellStart"/>
       <w:r>
         <w:rPr>
           <w:color w:val="auto"/>
@@ -2510,7 +2439,6 @@
         </w:rPr>
         <w:t>Hazirs</w:t>
       </w:r>
-      <w:proofErr w:type="spellEnd"/>
       <w:r>
         <w:rPr>
           <w:color w:val="auto"/>
@@ -2735,7 +2663,6 @@
         </w:rPr>
       </w:pPr>
       <w:hyperlink r:id="rId25" w:history="1">
-        <w:proofErr w:type="spellStart"/>
         <w:r>
           <w:rPr>
             <w:rStyle w:val="Hyperlink"/>
@@ -2744,18 +2671,7 @@
             <w:color w:val="auto"/>
             <w:u w:val="none"/>
           </w:rPr>
-          <w:t>Catima</w:t>
-        </w:r>
-        <w:proofErr w:type="spellEnd"/>
-        <w:r>
-          <w:rPr>
-            <w:rStyle w:val="Hyperlink"/>
-            <w:b/>
-            <w:bCs/>
-            <w:color w:val="auto"/>
-            <w:u w:val="none"/>
-          </w:rPr>
-          <w:t xml:space="preserve"> Loyalty </w:t>
+          <w:t xml:space="preserve">Catima Loyalty </w:t>
         </w:r>
         <w:r>
           <w:rPr>
@@ -2859,21 +2775,7 @@
         <w:rPr>
           <w:color w:val="auto"/>
         </w:rPr>
-        <w:t>(</w:t>
-      </w:r>
-      <w:proofErr w:type="spellStart"/>
-      <w:r>
-        <w:rPr>
-          <w:color w:val="auto"/>
-        </w:rPr>
-        <w:t>Catima</w:t>
-      </w:r>
-      <w:proofErr w:type="spellEnd"/>
-      <w:r>
-        <w:rPr>
-          <w:color w:val="auto"/>
-        </w:rPr>
-        <w:t xml:space="preserve"> is a</w:t>
+        <w:t>(Catima is a</w:t>
       </w:r>
       <w:r>
         <w:rPr>
@@ -3036,21 +2938,7 @@
         <w:rPr>
           <w:color w:val="auto"/>
         </w:rPr>
-        <w:t xml:space="preserve">multiple interfaces, and </w:t>
-      </w:r>
-      <w:proofErr w:type="spellStart"/>
-      <w:r>
-        <w:rPr>
-          <w:color w:val="auto"/>
-        </w:rPr>
-        <w:t>enums</w:t>
-      </w:r>
-      <w:proofErr w:type="spellEnd"/>
-      <w:r>
-        <w:rPr>
-          <w:color w:val="auto"/>
-        </w:rPr>
-        <w:t xml:space="preserve"> to </w:t>
+        <w:t xml:space="preserve">multiple interfaces, and enums to </w:t>
       </w:r>
       <w:r>
         <w:rPr>
@@ -3379,11 +3267,9 @@
         </w:rPr>
         <w:t xml:space="preserve"> which </w:t>
       </w:r>
-      <w:proofErr w:type="spellStart"/>
       <w:r>
         <w:t>transpiles</w:t>
       </w:r>
-      <w:proofErr w:type="spellEnd"/>
       <w:r>
         <w:t xml:space="preserve"> </w:t>
       </w:r>
@@ -3846,23 +3732,7 @@
         <w:rPr>
           <w:color w:val="auto"/>
         </w:rPr>
-        <w:t xml:space="preserve"> and web scraping </w:t>
-      </w:r>
-      <w:proofErr w:type="spellStart"/>
-      <w:r>
-        <w:rPr>
-          <w:b/>
-          <w:bCs/>
-          <w:color w:val="auto"/>
-        </w:rPr>
-        <w:t>Zerodha’s</w:t>
-      </w:r>
-      <w:proofErr w:type="spellEnd"/>
-      <w:r>
-        <w:rPr>
-          <w:color w:val="auto"/>
-        </w:rPr>
-        <w:t xml:space="preserve"> website (also a leading Indian stockbroker).</w:t>
+        <w:t>.</w:t>
       </w:r>
     </w:p>
     <w:p>
@@ -4648,7 +4518,6 @@
         </w:rPr>
         <w:t xml:space="preserve">% </w:t>
       </w:r>
-      <w:proofErr w:type="spellStart"/>
       <w:r>
         <w:rPr>
           <w:color w:val="auto"/>
@@ -4663,7 +4532,6 @@
         </w:rPr>
         <w:t>r</w:t>
       </w:r>
-      <w:proofErr w:type="spellEnd"/>
       <w:r>
         <w:rPr>
           <w:color w:val="auto"/>
@@ -4947,42 +4815,42 @@
         <v:path o:extrusionok="f" gradientshapeok="t" o:connecttype="rect"/>
         <o:lock v:ext="edit" aspectratio="t"/>
       </v:shapetype>
-      <v:shape id="_x0000_i1722" type="#_x0000_t75" style="width:512.5pt;height:512.5pt;rotation:180;flip:x y;visibility:visible;mso-wrap-style:square" o:bullet="t">
+      <v:shape id="_x0000_i1740" type="#_x0000_t75" style="width:512.5pt;height:512.5pt;rotation:180;flip:x y;visibility:visible;mso-wrap-style:square" o:bullet="t">
         <v:imagedata r:id="rId1" o:title="107161_circle_github_icon"/>
       </v:shape>
     </w:pict>
   </w:numPicBullet>
   <w:numPicBullet w:numPicBulletId="1">
     <w:pict>
-      <v:shape id="_x0000_i1723" type="#_x0000_t75" style="width:168.5pt;height:168.5pt;visibility:visible;mso-wrap-style:square" o:bullet="t">
+      <v:shape id="_x0000_i1741" type="#_x0000_t75" style="width:168.5pt;height:168.5pt;visibility:visible;mso-wrap-style:square" o:bullet="t">
         <v:imagedata r:id="rId2" o:title="941C13C7"/>
       </v:shape>
     </w:pict>
   </w:numPicBullet>
   <w:numPicBullet w:numPicBulletId="2">
     <w:pict>
-      <v:shape id="_x0000_i1724" type="#_x0000_t75" style="width:29pt;height:16pt;visibility:visible;mso-wrap-style:square" o:bullet="t">
+      <v:shape id="_x0000_i1742" type="#_x0000_t75" style="width:29pt;height:16pt;visibility:visible;mso-wrap-style:square" o:bullet="t">
         <v:imagedata r:id="rId3" o:title="107161_circle_github_icon"/>
       </v:shape>
     </w:pict>
   </w:numPicBullet>
   <w:numPicBullet w:numPicBulletId="3">
     <w:pict>
-      <v:shape id="_x0000_i1725" type="#_x0000_t75" style="width:240pt;height:234pt;visibility:visible;mso-wrap-style:square" o:bullet="t">
+      <v:shape id="_x0000_i1743" type="#_x0000_t75" style="width:240pt;height:234pt;visibility:visible;mso-wrap-style:square" o:bullet="t">
         <v:imagedata r:id="rId4" o:title="Indian_Institute_of_Technology_Bombay_Logo"/>
       </v:shape>
     </w:pict>
   </w:numPicBullet>
   <w:numPicBullet w:numPicBulletId="4">
     <w:pict>
-      <v:shape id="_x0000_i1726" type="#_x0000_t75" style="width:23.5pt;height:16pt;visibility:visible;mso-wrap-style:square" o:bullet="t">
+      <v:shape id="_x0000_i1744" type="#_x0000_t75" style="width:23.5pt;height:16pt;visibility:visible;mso-wrap-style:square" o:bullet="t">
         <v:imagedata r:id="rId5" o:title="Indian_Institute_of_Technology_Bombay_Logo"/>
       </v:shape>
     </w:pict>
   </w:numPicBullet>
   <w:numPicBullet w:numPicBulletId="5">
     <w:pict>
-      <v:shape id="_x0000_i1727" type="#_x0000_t75" style="width:75.5pt;height:75.5pt;visibility:visible;mso-wrap-style:square" o:bullet="t">
+      <v:shape id="_x0000_i1745" type="#_x0000_t75" style="width:75.5pt;height:75.5pt;visibility:visible;mso-wrap-style:square" o:bullet="t">
         <v:imagedata r:id="rId6" o:title=""/>
       </v:shape>
     </w:pict>

</xml_diff>

<commit_message>
[infosys]  Fixed :- "Independently migrated the frontend..."
</commit_message>
<xml_diff>
--- a/Resume_latest - Copy.docx
+++ b/Resume_latest - Copy.docx
@@ -377,7 +377,25 @@
             <w:color w:val="auto"/>
             <w:u w:val="none"/>
           </w:rPr>
-          <w:t xml:space="preserve">ithub.com/PrathameshBhagat </w:t>
+          <w:t>ithub.com/</w:t>
+        </w:r>
+        <w:proofErr w:type="spellStart"/>
+        <w:r>
+          <w:rPr>
+            <w:rStyle w:val="Hyperlink"/>
+            <w:color w:val="auto"/>
+            <w:u w:val="none"/>
+          </w:rPr>
+          <w:t>PrathameshBhagat</w:t>
+        </w:r>
+        <w:proofErr w:type="spellEnd"/>
+        <w:r>
+          <w:rPr>
+            <w:rStyle w:val="Hyperlink"/>
+            <w:color w:val="auto"/>
+            <w:u w:val="none"/>
+          </w:rPr>
+          <w:t xml:space="preserve"> </w:t>
         </w:r>
       </w:hyperlink>
     </w:p>
@@ -505,8 +523,20 @@
             <w:u w:val="none"/>
             <w:shd w:val="clear" w:color="auto" w:fill="FFFFFF"/>
           </w:rPr>
-          <w:t>n.com/in/prathameshvivekbhagat</w:t>
+          <w:t>n.com/in/</w:t>
         </w:r>
+        <w:proofErr w:type="spellStart"/>
+        <w:r>
+          <w:rPr>
+            <w:rStyle w:val="Hyperlink"/>
+            <w:bCs/>
+            <w:color w:val="auto"/>
+            <w:u w:val="none"/>
+            <w:shd w:val="clear" w:color="auto" w:fill="FFFFFF"/>
+          </w:rPr>
+          <w:t>prathameshvivekbhagat</w:t>
+        </w:r>
+        <w:proofErr w:type="spellEnd"/>
       </w:hyperlink>
       <w:r>
         <w:rPr>
@@ -1207,6 +1237,7 @@
         </w:rPr>
       </w:pPr>
       <w:hyperlink r:id="rId21" w:history="1">
+        <w:proofErr w:type="spellStart"/>
         <w:r>
           <w:rPr>
             <w:rStyle w:val="Hyperlink"/>
@@ -1215,7 +1246,18 @@
             <w:color w:val="auto"/>
             <w:u w:val="none"/>
           </w:rPr>
-          <w:t>TutorD LLC (U.S.), remote | tutord.io</w:t>
+          <w:t>TutorD</w:t>
+        </w:r>
+        <w:proofErr w:type="spellEnd"/>
+        <w:r>
+          <w:rPr>
+            <w:rStyle w:val="Hyperlink"/>
+            <w:b/>
+            <w:bCs/>
+            <w:color w:val="auto"/>
+            <w:u w:val="none"/>
+          </w:rPr>
+          <w:t xml:space="preserve"> LLC (U.S.), remote | tutord.io</w:t>
         </w:r>
       </w:hyperlink>
       <w:r>
@@ -1236,12 +1278,14 @@
         </w:rPr>
         <w:t>(</w:t>
       </w:r>
+      <w:proofErr w:type="spellStart"/>
       <w:r>
         <w:rPr>
           <w:color w:val="auto"/>
         </w:rPr>
         <w:t>TutorD</w:t>
       </w:r>
+      <w:proofErr w:type="spellEnd"/>
       <w:r>
         <w:rPr>
           <w:color w:val="auto"/>
@@ -1415,7 +1459,30 @@
           <w:color w:val="auto"/>
           <w:szCs w:val="20"/>
         </w:rPr>
-        <w:t xml:space="preserve">Migrated the frontend CI/CD pipeline from AWS CodeBuild to GitHub Actions, reducing build time by </w:t>
+        <w:t>Independently m</w:t>
+      </w:r>
+      <w:r>
+        <w:rPr>
+          <w:color w:val="auto"/>
+          <w:szCs w:val="20"/>
+        </w:rPr>
+        <w:t xml:space="preserve">igrated the frontend CI/CD pipeline from AWS </w:t>
+      </w:r>
+      <w:proofErr w:type="spellStart"/>
+      <w:r>
+        <w:rPr>
+          <w:color w:val="auto"/>
+          <w:szCs w:val="20"/>
+        </w:rPr>
+        <w:t>CodeBuild</w:t>
+      </w:r>
+      <w:proofErr w:type="spellEnd"/>
+      <w:r>
+        <w:rPr>
+          <w:color w:val="auto"/>
+          <w:szCs w:val="20"/>
+        </w:rPr>
+        <w:t xml:space="preserve"> to GitHub Actions, reducing build time by </w:t>
       </w:r>
       <w:r>
         <w:rPr>
@@ -1439,16 +1506,12 @@
           <w:bCs/>
           <w:color w:val="auto"/>
         </w:rPr>
-        <w:t xml:space="preserve">(~5 min to ~4 min) </w:t>
-      </w:r>
-      <w:r>
-        <w:rPr>
-          <w:color w:val="auto"/>
-        </w:rPr>
-        <w:t>and eliminating build costs</w:t>
-      </w:r>
-      <w:r>
-        <w:rPr>
+        <w:t>(~5 min to ~4 min)</w:t>
+      </w:r>
+      <w:r>
+        <w:rPr>
+          <w:b/>
+          <w:bCs/>
           <w:color w:val="auto"/>
         </w:rPr>
         <w:t>.</w:t>
@@ -2218,6 +2281,7 @@
         <w:t xml:space="preserve"> | </w:t>
       </w:r>
       <w:hyperlink r:id="rId24" w:history="1">
+        <w:proofErr w:type="spellStart"/>
         <w:r>
           <w:rPr>
             <w:rStyle w:val="Hyperlink"/>
@@ -2226,6 +2290,7 @@
           </w:rPr>
           <w:t>Hazirs</w:t>
         </w:r>
+        <w:proofErr w:type="spellEnd"/>
         <w:r>
           <w:rPr>
             <w:rStyle w:val="Hyperlink"/>
@@ -2306,11 +2371,19 @@
         </w:rPr>
         <w:t>(</w:t>
       </w:r>
-      <w:r>
-        <w:rPr>
-          <w:color w:val="auto"/>
-        </w:rPr>
-        <w:t>Hazirs is an early-stage start</w:t>
+      <w:proofErr w:type="spellStart"/>
+      <w:r>
+        <w:rPr>
+          <w:color w:val="auto"/>
+        </w:rPr>
+        <w:t>Hazirs</w:t>
+      </w:r>
+      <w:proofErr w:type="spellEnd"/>
+      <w:r>
+        <w:rPr>
+          <w:color w:val="auto"/>
+        </w:rPr>
+        <w:t xml:space="preserve"> is an early-stage start</w:t>
       </w:r>
       <w:r>
         <w:rPr>
@@ -2432,6 +2505,7 @@
         </w:rPr>
         <w:t xml:space="preserve"> </w:t>
       </w:r>
+      <w:proofErr w:type="spellStart"/>
       <w:r>
         <w:rPr>
           <w:color w:val="auto"/>
@@ -2439,6 +2513,7 @@
         </w:rPr>
         <w:t>Hazirs</w:t>
       </w:r>
+      <w:proofErr w:type="spellEnd"/>
       <w:r>
         <w:rPr>
           <w:color w:val="auto"/>
@@ -2663,6 +2738,7 @@
         </w:rPr>
       </w:pPr>
       <w:hyperlink r:id="rId25" w:history="1">
+        <w:proofErr w:type="spellStart"/>
         <w:r>
           <w:rPr>
             <w:rStyle w:val="Hyperlink"/>
@@ -2671,7 +2747,18 @@
             <w:color w:val="auto"/>
             <w:u w:val="none"/>
           </w:rPr>
-          <w:t xml:space="preserve">Catima Loyalty </w:t>
+          <w:t>Catima</w:t>
+        </w:r>
+        <w:proofErr w:type="spellEnd"/>
+        <w:r>
+          <w:rPr>
+            <w:rStyle w:val="Hyperlink"/>
+            <w:b/>
+            <w:bCs/>
+            <w:color w:val="auto"/>
+            <w:u w:val="none"/>
+          </w:rPr>
+          <w:t xml:space="preserve"> Loyalty </w:t>
         </w:r>
         <w:r>
           <w:rPr>
@@ -2775,7 +2862,21 @@
         <w:rPr>
           <w:color w:val="auto"/>
         </w:rPr>
-        <w:t>(Catima is a</w:t>
+        <w:t>(</w:t>
+      </w:r>
+      <w:proofErr w:type="spellStart"/>
+      <w:r>
+        <w:rPr>
+          <w:color w:val="auto"/>
+        </w:rPr>
+        <w:t>Catima</w:t>
+      </w:r>
+      <w:proofErr w:type="spellEnd"/>
+      <w:r>
+        <w:rPr>
+          <w:color w:val="auto"/>
+        </w:rPr>
+        <w:t xml:space="preserve"> is a</w:t>
       </w:r>
       <w:r>
         <w:rPr>
@@ -2938,7 +3039,21 @@
         <w:rPr>
           <w:color w:val="auto"/>
         </w:rPr>
-        <w:t xml:space="preserve">multiple interfaces, and enums to </w:t>
+        <w:t xml:space="preserve">multiple interfaces, and </w:t>
+      </w:r>
+      <w:proofErr w:type="spellStart"/>
+      <w:r>
+        <w:rPr>
+          <w:color w:val="auto"/>
+        </w:rPr>
+        <w:t>enums</w:t>
+      </w:r>
+      <w:proofErr w:type="spellEnd"/>
+      <w:r>
+        <w:rPr>
+          <w:color w:val="auto"/>
+        </w:rPr>
+        <w:t xml:space="preserve"> to </w:t>
       </w:r>
       <w:r>
         <w:rPr>
@@ -3267,9 +3382,11 @@
         </w:rPr>
         <w:t xml:space="preserve"> which </w:t>
       </w:r>
+      <w:proofErr w:type="spellStart"/>
       <w:r>
         <w:t>transpiles</w:t>
       </w:r>
+      <w:proofErr w:type="spellEnd"/>
       <w:r>
         <w:t xml:space="preserve"> </w:t>
       </w:r>
@@ -4518,6 +4635,7 @@
         </w:rPr>
         <w:t xml:space="preserve">% </w:t>
       </w:r>
+      <w:proofErr w:type="spellStart"/>
       <w:r>
         <w:rPr>
           <w:color w:val="auto"/>
@@ -4532,6 +4650,7 @@
         </w:rPr>
         <w:t>r</w:t>
       </w:r>
+      <w:proofErr w:type="spellEnd"/>
       <w:r>
         <w:rPr>
           <w:color w:val="auto"/>
@@ -4815,42 +4934,42 @@
         <v:path o:extrusionok="f" gradientshapeok="t" o:connecttype="rect"/>
         <o:lock v:ext="edit" aspectratio="t"/>
       </v:shapetype>
-      <v:shape id="_x0000_i1740" type="#_x0000_t75" style="width:512.5pt;height:512.5pt;rotation:180;flip:x y;visibility:visible;mso-wrap-style:square" o:bullet="t">
+      <v:shape id="_x0000_i1746" type="#_x0000_t75" style="width:512.5pt;height:512.5pt;rotation:180;flip:x y;visibility:visible;mso-wrap-style:square" o:bullet="t">
         <v:imagedata r:id="rId1" o:title="107161_circle_github_icon"/>
       </v:shape>
     </w:pict>
   </w:numPicBullet>
   <w:numPicBullet w:numPicBulletId="1">
     <w:pict>
-      <v:shape id="_x0000_i1741" type="#_x0000_t75" style="width:168.5pt;height:168.5pt;visibility:visible;mso-wrap-style:square" o:bullet="t">
+      <v:shape id="_x0000_i1747" type="#_x0000_t75" style="width:168.5pt;height:168.5pt;visibility:visible;mso-wrap-style:square" o:bullet="t">
         <v:imagedata r:id="rId2" o:title="941C13C7"/>
       </v:shape>
     </w:pict>
   </w:numPicBullet>
   <w:numPicBullet w:numPicBulletId="2">
     <w:pict>
-      <v:shape id="_x0000_i1742" type="#_x0000_t75" style="width:29pt;height:16pt;visibility:visible;mso-wrap-style:square" o:bullet="t">
+      <v:shape id="_x0000_i1748" type="#_x0000_t75" style="width:29pt;height:16pt;visibility:visible;mso-wrap-style:square" o:bullet="t">
         <v:imagedata r:id="rId3" o:title="107161_circle_github_icon"/>
       </v:shape>
     </w:pict>
   </w:numPicBullet>
   <w:numPicBullet w:numPicBulletId="3">
     <w:pict>
-      <v:shape id="_x0000_i1743" type="#_x0000_t75" style="width:240pt;height:234pt;visibility:visible;mso-wrap-style:square" o:bullet="t">
+      <v:shape id="_x0000_i1749" type="#_x0000_t75" style="width:240pt;height:234pt;visibility:visible;mso-wrap-style:square" o:bullet="t">
         <v:imagedata r:id="rId4" o:title="Indian_Institute_of_Technology_Bombay_Logo"/>
       </v:shape>
     </w:pict>
   </w:numPicBullet>
   <w:numPicBullet w:numPicBulletId="4">
     <w:pict>
-      <v:shape id="_x0000_i1744" type="#_x0000_t75" style="width:23.5pt;height:16pt;visibility:visible;mso-wrap-style:square" o:bullet="t">
+      <v:shape id="_x0000_i1750" type="#_x0000_t75" style="width:23.5pt;height:16pt;visibility:visible;mso-wrap-style:square" o:bullet="t">
         <v:imagedata r:id="rId5" o:title="Indian_Institute_of_Technology_Bombay_Logo"/>
       </v:shape>
     </w:pict>
   </w:numPicBullet>
   <w:numPicBullet w:numPicBulletId="5">
     <w:pict>
-      <v:shape id="_x0000_i1745" type="#_x0000_t75" style="width:75.5pt;height:75.5pt;visibility:visible;mso-wrap-style:square" o:bullet="t">
+      <v:shape id="_x0000_i1751" type="#_x0000_t75" style="width:75.5pt;height:75.5pt;visibility:visible;mso-wrap-style:square" o:bullet="t">
         <v:imagedata r:id="rId6" o:title=""/>
       </v:shape>
     </w:pict>

</xml_diff>

<commit_message>
[infosys] added line "Colaboratively migrated backend pipeline...."
</commit_message>
<xml_diff>
--- a/Resume_latest - Copy.docx
+++ b/Resume_latest - Copy.docx
@@ -1537,6 +1537,150 @@
           <w:color w:val="auto"/>
           <w:szCs w:val="20"/>
         </w:rPr>
+        <w:t xml:space="preserve">Collaboratively </w:t>
+      </w:r>
+      <w:r>
+        <w:rPr>
+          <w:b/>
+          <w:bCs/>
+          <w:color w:val="auto"/>
+          <w:szCs w:val="20"/>
+        </w:rPr>
+        <w:t>migrated backend CI/CD pipeline</w:t>
+      </w:r>
+      <w:r>
+        <w:rPr>
+          <w:color w:val="auto"/>
+          <w:szCs w:val="20"/>
+        </w:rPr>
+        <w:t xml:space="preserve"> to GitHub Actions, which buil</w:t>
+      </w:r>
+      <w:r>
+        <w:rPr>
+          <w:color w:val="auto"/>
+          <w:szCs w:val="20"/>
+        </w:rPr>
+        <w:t>t</w:t>
+      </w:r>
+      <w:r>
+        <w:rPr>
+          <w:color w:val="auto"/>
+          <w:szCs w:val="20"/>
+        </w:rPr>
+        <w:t xml:space="preserve"> </w:t>
+      </w:r>
+      <w:r>
+        <w:rPr>
+          <w:color w:val="auto"/>
+          <w:szCs w:val="20"/>
+        </w:rPr>
+        <w:t>D</w:t>
+      </w:r>
+      <w:r>
+        <w:rPr>
+          <w:color w:val="auto"/>
+          <w:szCs w:val="20"/>
+        </w:rPr>
+        <w:t xml:space="preserve">ocker images and deployed to ECS </w:t>
+      </w:r>
+      <w:r>
+        <w:rPr>
+          <w:color w:val="auto"/>
+          <w:szCs w:val="20"/>
+        </w:rPr>
+        <w:t xml:space="preserve">service to </w:t>
+      </w:r>
+      <w:r>
+        <w:rPr>
+          <w:color w:val="auto"/>
+          <w:szCs w:val="20"/>
+        </w:rPr>
+        <w:t>s</w:t>
+      </w:r>
+      <w:r>
+        <w:rPr>
+          <w:color w:val="auto"/>
+          <w:szCs w:val="20"/>
+        </w:rPr>
+        <w:t>andbox</w:t>
+      </w:r>
+      <w:r>
+        <w:rPr>
+          <w:color w:val="auto"/>
+          <w:szCs w:val="20"/>
+        </w:rPr>
+        <w:t>, de</w:t>
+      </w:r>
+      <w:r>
+        <w:rPr>
+          <w:color w:val="auto"/>
+          <w:szCs w:val="20"/>
+        </w:rPr>
+        <w:t>velopment</w:t>
+      </w:r>
+      <w:r>
+        <w:rPr>
+          <w:color w:val="auto"/>
+          <w:szCs w:val="20"/>
+        </w:rPr>
+        <w:t xml:space="preserve"> and prod</w:t>
+      </w:r>
+      <w:r>
+        <w:rPr>
+          <w:color w:val="auto"/>
+          <w:szCs w:val="20"/>
+        </w:rPr>
+        <w:t>uction</w:t>
+      </w:r>
+      <w:r>
+        <w:rPr>
+          <w:color w:val="auto"/>
+          <w:szCs w:val="20"/>
+        </w:rPr>
+        <w:t xml:space="preserve"> clusters on</w:t>
+      </w:r>
+      <w:r>
+        <w:rPr>
+          <w:color w:val="auto"/>
+          <w:szCs w:val="20"/>
+        </w:rPr>
+        <w:t xml:space="preserve"> passing </w:t>
+      </w:r>
+      <w:r>
+        <w:rPr>
+          <w:color w:val="auto"/>
+          <w:szCs w:val="20"/>
+        </w:rPr>
+        <w:t>automated tests</w:t>
+      </w:r>
+      <w:r>
+        <w:rPr>
+          <w:color w:val="auto"/>
+          <w:szCs w:val="20"/>
+        </w:rPr>
+        <w:t xml:space="preserve"> accordingly.</w:t>
+      </w:r>
+    </w:p>
+    <w:p>
+      <w:pPr>
+        <w:pStyle w:val="ListParagraph"/>
+        <w:numPr>
+          <w:ilvl w:val="0"/>
+          <w:numId w:val="32"/>
+        </w:numPr>
+        <w:spacing w:line="240" w:lineRule="auto"/>
+        <w:ind w:right="0"/>
+        <w:jc w:val="both"/>
+        <w:rPr>
+          <w:color w:val="auto"/>
+          <w:szCs w:val="20"/>
+        </w:rPr>
+      </w:pPr>
+      <w:r>
+        <w:rPr>
+          <w:color w:val="auto"/>
+          <w:szCs w:val="20"/>
+        </w:rPr>
         <w:t xml:space="preserve">Enhanced service reliability by fixing unit and integration tests, diagnosing </w:t>
       </w:r>
       <w:r>
@@ -4740,6 +4884,7 @@
           <w:color w:val="auto"/>
           <w:szCs w:val="20"/>
         </w:rPr>
+        <w:lastRenderedPageBreak/>
         <w:t>Achieved an</w:t>
       </w:r>
       <w:r>
@@ -4934,42 +5079,42 @@
         <v:path o:extrusionok="f" gradientshapeok="t" o:connecttype="rect"/>
         <o:lock v:ext="edit" aspectratio="t"/>
       </v:shapetype>
-      <v:shape id="_x0000_i1746" type="#_x0000_t75" style="width:512.5pt;height:512.5pt;rotation:180;flip:x y;visibility:visible;mso-wrap-style:square" o:bullet="t">
+      <v:shape id="_x0000_i1764" type="#_x0000_t75" style="width:512.5pt;height:512.5pt;rotation:180;flip:x y;visibility:visible;mso-wrap-style:square" o:bullet="t">
         <v:imagedata r:id="rId1" o:title="107161_circle_github_icon"/>
       </v:shape>
     </w:pict>
   </w:numPicBullet>
   <w:numPicBullet w:numPicBulletId="1">
     <w:pict>
-      <v:shape id="_x0000_i1747" type="#_x0000_t75" style="width:168.5pt;height:168.5pt;visibility:visible;mso-wrap-style:square" o:bullet="t">
+      <v:shape id="_x0000_i1765" type="#_x0000_t75" style="width:168.5pt;height:168.5pt;visibility:visible;mso-wrap-style:square" o:bullet="t">
         <v:imagedata r:id="rId2" o:title="941C13C7"/>
       </v:shape>
     </w:pict>
   </w:numPicBullet>
   <w:numPicBullet w:numPicBulletId="2">
     <w:pict>
-      <v:shape id="_x0000_i1748" type="#_x0000_t75" style="width:29pt;height:16pt;visibility:visible;mso-wrap-style:square" o:bullet="t">
+      <v:shape id="_x0000_i1766" type="#_x0000_t75" style="width:29pt;height:16pt;visibility:visible;mso-wrap-style:square" o:bullet="t">
         <v:imagedata r:id="rId3" o:title="107161_circle_github_icon"/>
       </v:shape>
     </w:pict>
   </w:numPicBullet>
   <w:numPicBullet w:numPicBulletId="3">
     <w:pict>
-      <v:shape id="_x0000_i1749" type="#_x0000_t75" style="width:240pt;height:234pt;visibility:visible;mso-wrap-style:square" o:bullet="t">
+      <v:shape id="_x0000_i1767" type="#_x0000_t75" style="width:240pt;height:234pt;visibility:visible;mso-wrap-style:square" o:bullet="t">
         <v:imagedata r:id="rId4" o:title="Indian_Institute_of_Technology_Bombay_Logo"/>
       </v:shape>
     </w:pict>
   </w:numPicBullet>
   <w:numPicBullet w:numPicBulletId="4">
     <w:pict>
-      <v:shape id="_x0000_i1750" type="#_x0000_t75" style="width:23.5pt;height:16pt;visibility:visible;mso-wrap-style:square" o:bullet="t">
+      <v:shape id="_x0000_i1768" type="#_x0000_t75" style="width:23.5pt;height:16pt;visibility:visible;mso-wrap-style:square" o:bullet="t">
         <v:imagedata r:id="rId5" o:title="Indian_Institute_of_Technology_Bombay_Logo"/>
       </v:shape>
     </w:pict>
   </w:numPicBullet>
   <w:numPicBullet w:numPicBulletId="5">
     <w:pict>
-      <v:shape id="_x0000_i1751" type="#_x0000_t75" style="width:75.5pt;height:75.5pt;visibility:visible;mso-wrap-style:square" o:bullet="t">
+      <v:shape id="_x0000_i1769" type="#_x0000_t75" style="width:75.5pt;height:75.5pt;visibility:visible;mso-wrap-style:square" o:bullet="t">
         <v:imagedata r:id="rId6" o:title=""/>
       </v:shape>
     </w:pict>

</xml_diff>

<commit_message>
[infosys] Uptime.io line added
</commit_message>
<xml_diff>
--- a/Resume_latest - Copy.docx
+++ b/Resume_latest - Copy.docx
@@ -377,25 +377,7 @@
             <w:color w:val="auto"/>
             <w:u w:val="none"/>
           </w:rPr>
-          <w:t>ithub.com/</w:t>
-        </w:r>
-        <w:proofErr w:type="spellStart"/>
-        <w:r>
-          <w:rPr>
-            <w:rStyle w:val="Hyperlink"/>
-            <w:color w:val="auto"/>
-            <w:u w:val="none"/>
-          </w:rPr>
-          <w:t>PrathameshBhagat</w:t>
-        </w:r>
-        <w:proofErr w:type="spellEnd"/>
-        <w:r>
-          <w:rPr>
-            <w:rStyle w:val="Hyperlink"/>
-            <w:color w:val="auto"/>
-            <w:u w:val="none"/>
-          </w:rPr>
-          <w:t xml:space="preserve"> </w:t>
+          <w:t xml:space="preserve">ithub.com/PrathameshBhagat </w:t>
         </w:r>
       </w:hyperlink>
     </w:p>
@@ -523,20 +505,8 @@
             <w:u w:val="none"/>
             <w:shd w:val="clear" w:color="auto" w:fill="FFFFFF"/>
           </w:rPr>
-          <w:t>n.com/in/</w:t>
+          <w:t>n.com/in/prathameshvivekbhagat</w:t>
         </w:r>
-        <w:proofErr w:type="spellStart"/>
-        <w:r>
-          <w:rPr>
-            <w:rStyle w:val="Hyperlink"/>
-            <w:bCs/>
-            <w:color w:val="auto"/>
-            <w:u w:val="none"/>
-            <w:shd w:val="clear" w:color="auto" w:fill="FFFFFF"/>
-          </w:rPr>
-          <w:t>prathameshvivekbhagat</w:t>
-        </w:r>
-        <w:proofErr w:type="spellEnd"/>
       </w:hyperlink>
       <w:r>
         <w:rPr>
@@ -1237,7 +1207,6 @@
         </w:rPr>
       </w:pPr>
       <w:hyperlink r:id="rId21" w:history="1">
-        <w:proofErr w:type="spellStart"/>
         <w:r>
           <w:rPr>
             <w:rStyle w:val="Hyperlink"/>
@@ -1246,18 +1215,7 @@
             <w:color w:val="auto"/>
             <w:u w:val="none"/>
           </w:rPr>
-          <w:t>TutorD</w:t>
-        </w:r>
-        <w:proofErr w:type="spellEnd"/>
-        <w:r>
-          <w:rPr>
-            <w:rStyle w:val="Hyperlink"/>
-            <w:b/>
-            <w:bCs/>
-            <w:color w:val="auto"/>
-            <w:u w:val="none"/>
-          </w:rPr>
-          <w:t xml:space="preserve"> LLC (U.S.), remote | tutord.io</w:t>
+          <w:t>TutorD LLC (U.S.), remote | tutord.io</w:t>
         </w:r>
       </w:hyperlink>
       <w:r>
@@ -1278,14 +1236,12 @@
         </w:rPr>
         <w:t>(</w:t>
       </w:r>
-      <w:proofErr w:type="spellStart"/>
       <w:r>
         <w:rPr>
           <w:color w:val="auto"/>
         </w:rPr>
         <w:t>TutorD</w:t>
       </w:r>
-      <w:proofErr w:type="spellEnd"/>
       <w:r>
         <w:rPr>
           <w:color w:val="auto"/>
@@ -1466,23 +1422,7 @@
           <w:color w:val="auto"/>
           <w:szCs w:val="20"/>
         </w:rPr>
-        <w:t xml:space="preserve">igrated the frontend CI/CD pipeline from AWS </w:t>
-      </w:r>
-      <w:proofErr w:type="spellStart"/>
-      <w:r>
-        <w:rPr>
-          <w:color w:val="auto"/>
-          <w:szCs w:val="20"/>
-        </w:rPr>
-        <w:t>CodeBuild</w:t>
-      </w:r>
-      <w:proofErr w:type="spellEnd"/>
-      <w:r>
-        <w:rPr>
-          <w:color w:val="auto"/>
-          <w:szCs w:val="20"/>
-        </w:rPr>
-        <w:t xml:space="preserve"> to GitHub Actions, reducing build time by </w:t>
+        <w:t xml:space="preserve">igrated the frontend CI/CD pipeline from AWS CodeBuild to GitHub Actions, reducing build time by </w:t>
       </w:r>
       <w:r>
         <w:rPr>
@@ -1659,6 +1599,66 @@
           <w:szCs w:val="20"/>
         </w:rPr>
         <w:t xml:space="preserve"> accordingly.</w:t>
+      </w:r>
+    </w:p>
+    <w:p>
+      <w:pPr>
+        <w:pStyle w:val="ListParagraph"/>
+        <w:numPr>
+          <w:ilvl w:val="0"/>
+          <w:numId w:val="32"/>
+        </w:numPr>
+        <w:spacing w:line="240" w:lineRule="auto"/>
+        <w:ind w:right="0"/>
+        <w:jc w:val="both"/>
+        <w:rPr>
+          <w:color w:val="auto"/>
+          <w:szCs w:val="20"/>
+        </w:rPr>
+      </w:pPr>
+      <w:r>
+        <w:rPr>
+          <w:color w:val="auto"/>
+          <w:szCs w:val="20"/>
+        </w:rPr>
+        <w:t>Implemented</w:t>
+      </w:r>
+      <w:r>
+        <w:rPr>
+          <w:b/>
+          <w:bCs/>
+          <w:color w:val="auto"/>
+          <w:szCs w:val="20"/>
+        </w:rPr>
+        <w:t xml:space="preserve"> external availability monitoring</w:t>
+      </w:r>
+      <w:r>
+        <w:rPr>
+          <w:color w:val="auto"/>
+          <w:szCs w:val="20"/>
+        </w:rPr>
+        <w:t xml:space="preserve"> of</w:t>
+      </w:r>
+      <w:r>
+        <w:rPr>
+          <w:color w:val="auto"/>
+          <w:szCs w:val="20"/>
+        </w:rPr>
+        <w:t xml:space="preserve"> </w:t>
+      </w:r>
+      <w:r>
+        <w:rPr>
+          <w:color w:val="auto"/>
+          <w:szCs w:val="20"/>
+        </w:rPr>
+        <w:t>ECS services using Uptime.io, providing real-time availability and health status of ECS services</w:t>
+      </w:r>
+      <w:r>
+        <w:rPr>
+          <w:color w:val="auto"/>
+          <w:szCs w:val="20"/>
+        </w:rPr>
+        <w:t>.</w:t>
       </w:r>
     </w:p>
     <w:p>
@@ -2425,7 +2425,6 @@
         <w:t xml:space="preserve"> | </w:t>
       </w:r>
       <w:hyperlink r:id="rId24" w:history="1">
-        <w:proofErr w:type="spellStart"/>
         <w:r>
           <w:rPr>
             <w:rStyle w:val="Hyperlink"/>
@@ -2434,7 +2433,6 @@
           </w:rPr>
           <w:t>Hazirs</w:t>
         </w:r>
-        <w:proofErr w:type="spellEnd"/>
         <w:r>
           <w:rPr>
             <w:rStyle w:val="Hyperlink"/>
@@ -2515,19 +2513,11 @@
         </w:rPr>
         <w:t>(</w:t>
       </w:r>
-      <w:proofErr w:type="spellStart"/>
-      <w:r>
-        <w:rPr>
-          <w:color w:val="auto"/>
-        </w:rPr>
-        <w:t>Hazirs</w:t>
-      </w:r>
-      <w:proofErr w:type="spellEnd"/>
-      <w:r>
-        <w:rPr>
-          <w:color w:val="auto"/>
-        </w:rPr>
-        <w:t xml:space="preserve"> is an early-stage start</w:t>
+      <w:r>
+        <w:rPr>
+          <w:color w:val="auto"/>
+        </w:rPr>
+        <w:t>Hazirs is an early-stage start</w:t>
       </w:r>
       <w:r>
         <w:rPr>
@@ -2649,7 +2639,6 @@
         </w:rPr>
         <w:t xml:space="preserve"> </w:t>
       </w:r>
-      <w:proofErr w:type="spellStart"/>
       <w:r>
         <w:rPr>
           <w:color w:val="auto"/>
@@ -2657,7 +2646,6 @@
         </w:rPr>
         <w:t>Hazirs</w:t>
       </w:r>
-      <w:proofErr w:type="spellEnd"/>
       <w:r>
         <w:rPr>
           <w:color w:val="auto"/>
@@ -2882,7 +2870,6 @@
         </w:rPr>
       </w:pPr>
       <w:hyperlink r:id="rId25" w:history="1">
-        <w:proofErr w:type="spellStart"/>
         <w:r>
           <w:rPr>
             <w:rStyle w:val="Hyperlink"/>
@@ -2891,18 +2878,7 @@
             <w:color w:val="auto"/>
             <w:u w:val="none"/>
           </w:rPr>
-          <w:t>Catima</w:t>
-        </w:r>
-        <w:proofErr w:type="spellEnd"/>
-        <w:r>
-          <w:rPr>
-            <w:rStyle w:val="Hyperlink"/>
-            <w:b/>
-            <w:bCs/>
-            <w:color w:val="auto"/>
-            <w:u w:val="none"/>
-          </w:rPr>
-          <w:t xml:space="preserve"> Loyalty </w:t>
+          <w:t xml:space="preserve">Catima Loyalty </w:t>
         </w:r>
         <w:r>
           <w:rPr>
@@ -3006,21 +2982,7 @@
         <w:rPr>
           <w:color w:val="auto"/>
         </w:rPr>
-        <w:t>(</w:t>
-      </w:r>
-      <w:proofErr w:type="spellStart"/>
-      <w:r>
-        <w:rPr>
-          <w:color w:val="auto"/>
-        </w:rPr>
-        <w:t>Catima</w:t>
-      </w:r>
-      <w:proofErr w:type="spellEnd"/>
-      <w:r>
-        <w:rPr>
-          <w:color w:val="auto"/>
-        </w:rPr>
-        <w:t xml:space="preserve"> is a</w:t>
+        <w:t>(Catima is a</w:t>
       </w:r>
       <w:r>
         <w:rPr>
@@ -3183,21 +3145,7 @@
         <w:rPr>
           <w:color w:val="auto"/>
         </w:rPr>
-        <w:t xml:space="preserve">multiple interfaces, and </w:t>
-      </w:r>
-      <w:proofErr w:type="spellStart"/>
-      <w:r>
-        <w:rPr>
-          <w:color w:val="auto"/>
-        </w:rPr>
-        <w:t>enums</w:t>
-      </w:r>
-      <w:proofErr w:type="spellEnd"/>
-      <w:r>
-        <w:rPr>
-          <w:color w:val="auto"/>
-        </w:rPr>
-        <w:t xml:space="preserve"> to </w:t>
+        <w:t xml:space="preserve">multiple interfaces, and enums to </w:t>
       </w:r>
       <w:r>
         <w:rPr>
@@ -3526,11 +3474,9 @@
         </w:rPr>
         <w:t xml:space="preserve"> which </w:t>
       </w:r>
-      <w:proofErr w:type="spellStart"/>
       <w:r>
         <w:t>transpiles</w:t>
       </w:r>
-      <w:proofErr w:type="spellEnd"/>
       <w:r>
         <w:t xml:space="preserve"> </w:t>
       </w:r>
@@ -4759,6 +4705,7 @@
           <w:color w:val="auto"/>
           <w:szCs w:val="20"/>
         </w:rPr>
+        <w:lastRenderedPageBreak/>
         <w:t xml:space="preserve">Top </w:t>
       </w:r>
       <w:r>
@@ -4779,7 +4726,6 @@
         </w:rPr>
         <w:t xml:space="preserve">% </w:t>
       </w:r>
-      <w:proofErr w:type="spellStart"/>
       <w:r>
         <w:rPr>
           <w:color w:val="auto"/>
@@ -4794,7 +4740,6 @@
         </w:rPr>
         <w:t>r</w:t>
       </w:r>
-      <w:proofErr w:type="spellEnd"/>
       <w:r>
         <w:rPr>
           <w:color w:val="auto"/>
@@ -4884,7 +4829,6 @@
           <w:color w:val="auto"/>
           <w:szCs w:val="20"/>
         </w:rPr>
-        <w:lastRenderedPageBreak/>
         <w:t>Achieved an</w:t>
       </w:r>
       <w:r>
@@ -5079,42 +5023,42 @@
         <v:path o:extrusionok="f" gradientshapeok="t" o:connecttype="rect"/>
         <o:lock v:ext="edit" aspectratio="t"/>
       </v:shapetype>
-      <v:shape id="_x0000_i1764" type="#_x0000_t75" style="width:512.5pt;height:512.5pt;rotation:180;flip:x y;visibility:visible;mso-wrap-style:square" o:bullet="t">
+      <v:shape id="_x0000_i1794" type="#_x0000_t75" style="width:512.5pt;height:512.5pt;rotation:180;flip:x y;visibility:visible;mso-wrap-style:square" o:bullet="t">
         <v:imagedata r:id="rId1" o:title="107161_circle_github_icon"/>
       </v:shape>
     </w:pict>
   </w:numPicBullet>
   <w:numPicBullet w:numPicBulletId="1">
     <w:pict>
-      <v:shape id="_x0000_i1765" type="#_x0000_t75" style="width:168.5pt;height:168.5pt;visibility:visible;mso-wrap-style:square" o:bullet="t">
+      <v:shape id="_x0000_i1795" type="#_x0000_t75" style="width:168.5pt;height:168.5pt;visibility:visible;mso-wrap-style:square" o:bullet="t">
         <v:imagedata r:id="rId2" o:title="941C13C7"/>
       </v:shape>
     </w:pict>
   </w:numPicBullet>
   <w:numPicBullet w:numPicBulletId="2">
     <w:pict>
-      <v:shape id="_x0000_i1766" type="#_x0000_t75" style="width:29pt;height:16pt;visibility:visible;mso-wrap-style:square" o:bullet="t">
+      <v:shape id="_x0000_i1796" type="#_x0000_t75" style="width:29pt;height:16pt;visibility:visible;mso-wrap-style:square" o:bullet="t">
         <v:imagedata r:id="rId3" o:title="107161_circle_github_icon"/>
       </v:shape>
     </w:pict>
   </w:numPicBullet>
   <w:numPicBullet w:numPicBulletId="3">
     <w:pict>
-      <v:shape id="_x0000_i1767" type="#_x0000_t75" style="width:240pt;height:234pt;visibility:visible;mso-wrap-style:square" o:bullet="t">
+      <v:shape id="_x0000_i1797" type="#_x0000_t75" style="width:240pt;height:234pt;visibility:visible;mso-wrap-style:square" o:bullet="t">
         <v:imagedata r:id="rId4" o:title="Indian_Institute_of_Technology_Bombay_Logo"/>
       </v:shape>
     </w:pict>
   </w:numPicBullet>
   <w:numPicBullet w:numPicBulletId="4">
     <w:pict>
-      <v:shape id="_x0000_i1768" type="#_x0000_t75" style="width:23.5pt;height:16pt;visibility:visible;mso-wrap-style:square" o:bullet="t">
+      <v:shape id="_x0000_i1798" type="#_x0000_t75" style="width:23.5pt;height:16pt;visibility:visible;mso-wrap-style:square" o:bullet="t">
         <v:imagedata r:id="rId5" o:title="Indian_Institute_of_Technology_Bombay_Logo"/>
       </v:shape>
     </w:pict>
   </w:numPicBullet>
   <w:numPicBullet w:numPicBulletId="5">
     <w:pict>
-      <v:shape id="_x0000_i1769" type="#_x0000_t75" style="width:75.5pt;height:75.5pt;visibility:visible;mso-wrap-style:square" o:bullet="t">
+      <v:shape id="_x0000_i1799" type="#_x0000_t75" style="width:75.5pt;height:75.5pt;visibility:visible;mso-wrap-style:square" o:bullet="t">
         <v:imagedata r:id="rId6" o:title=""/>
       </v:shape>
     </w:pict>

</xml_diff>

<commit_message>
[infosys] Added the better version of line " Fixed unit and e2e tests..."
</commit_message>
<xml_diff>
--- a/Resume_latest - Copy.docx
+++ b/Resume_latest - Copy.docx
@@ -1681,6 +1681,45 @@
           <w:color w:val="auto"/>
           <w:szCs w:val="20"/>
         </w:rPr>
+        <w:t xml:space="preserve">Fixed unit and e2e tests that controlled backend deployments, diagnosed </w:t>
+      </w:r>
+      <w:r>
+        <w:rPr>
+          <w:b/>
+          <w:bCs/>
+          <w:color w:val="auto"/>
+          <w:szCs w:val="20"/>
+        </w:rPr>
+        <w:t>ECS service downtime</w:t>
+      </w:r>
+      <w:r>
+        <w:rPr>
+          <w:color w:val="auto"/>
+          <w:szCs w:val="20"/>
+        </w:rPr>
+        <w:t xml:space="preserve"> caused by EFS volume deletion, and recommended ECS deployment circuit breakers for service reliability.</w:t>
+      </w:r>
+    </w:p>
+    <w:p>
+      <w:pPr>
+        <w:pStyle w:val="ListParagraph"/>
+        <w:numPr>
+          <w:ilvl w:val="0"/>
+          <w:numId w:val="32"/>
+        </w:numPr>
+        <w:spacing w:line="240" w:lineRule="auto"/>
+        <w:ind w:right="0"/>
+        <w:jc w:val="both"/>
+        <w:rPr>
+          <w:color w:val="auto"/>
+          <w:szCs w:val="20"/>
+        </w:rPr>
+      </w:pPr>
+      <w:r>
+        <w:rPr>
+          <w:color w:val="auto"/>
+          <w:szCs w:val="20"/>
+        </w:rPr>
         <w:t xml:space="preserve">Enhanced service reliability by fixing unit and integration tests, diagnosing </w:t>
       </w:r>
       <w:r>
@@ -4705,7 +4744,6 @@
           <w:color w:val="auto"/>
           <w:szCs w:val="20"/>
         </w:rPr>
-        <w:lastRenderedPageBreak/>
         <w:t xml:space="preserve">Top </w:t>
       </w:r>
       <w:r>
@@ -5023,42 +5061,42 @@
         <v:path o:extrusionok="f" gradientshapeok="t" o:connecttype="rect"/>
         <o:lock v:ext="edit" aspectratio="t"/>
       </v:shapetype>
-      <v:shape id="_x0000_i1794" type="#_x0000_t75" style="width:512.5pt;height:512.5pt;rotation:180;flip:x y;visibility:visible;mso-wrap-style:square" o:bullet="t">
+      <v:shape id="_x0000_i1854" type="#_x0000_t75" style="width:512.5pt;height:512.5pt;rotation:180;flip:x y;visibility:visible;mso-wrap-style:square" o:bullet="t">
         <v:imagedata r:id="rId1" o:title="107161_circle_github_icon"/>
       </v:shape>
     </w:pict>
   </w:numPicBullet>
   <w:numPicBullet w:numPicBulletId="1">
     <w:pict>
-      <v:shape id="_x0000_i1795" type="#_x0000_t75" style="width:168.5pt;height:168.5pt;visibility:visible;mso-wrap-style:square" o:bullet="t">
+      <v:shape id="_x0000_i1855" type="#_x0000_t75" style="width:168.5pt;height:168.5pt;visibility:visible;mso-wrap-style:square" o:bullet="t">
         <v:imagedata r:id="rId2" o:title="941C13C7"/>
       </v:shape>
     </w:pict>
   </w:numPicBullet>
   <w:numPicBullet w:numPicBulletId="2">
     <w:pict>
-      <v:shape id="_x0000_i1796" type="#_x0000_t75" style="width:29pt;height:16pt;visibility:visible;mso-wrap-style:square" o:bullet="t">
+      <v:shape id="_x0000_i1856" type="#_x0000_t75" style="width:29pt;height:16pt;visibility:visible;mso-wrap-style:square" o:bullet="t">
         <v:imagedata r:id="rId3" o:title="107161_circle_github_icon"/>
       </v:shape>
     </w:pict>
   </w:numPicBullet>
   <w:numPicBullet w:numPicBulletId="3">
     <w:pict>
-      <v:shape id="_x0000_i1797" type="#_x0000_t75" style="width:240pt;height:234pt;visibility:visible;mso-wrap-style:square" o:bullet="t">
+      <v:shape id="_x0000_i1857" type="#_x0000_t75" style="width:240pt;height:234pt;visibility:visible;mso-wrap-style:square" o:bullet="t">
         <v:imagedata r:id="rId4" o:title="Indian_Institute_of_Technology_Bombay_Logo"/>
       </v:shape>
     </w:pict>
   </w:numPicBullet>
   <w:numPicBullet w:numPicBulletId="4">
     <w:pict>
-      <v:shape id="_x0000_i1798" type="#_x0000_t75" style="width:23.5pt;height:16pt;visibility:visible;mso-wrap-style:square" o:bullet="t">
+      <v:shape id="_x0000_i1858" type="#_x0000_t75" style="width:23.5pt;height:16pt;visibility:visible;mso-wrap-style:square" o:bullet="t">
         <v:imagedata r:id="rId5" o:title="Indian_Institute_of_Technology_Bombay_Logo"/>
       </v:shape>
     </w:pict>
   </w:numPicBullet>
   <w:numPicBullet w:numPicBulletId="5">
     <w:pict>
-      <v:shape id="_x0000_i1799" type="#_x0000_t75" style="width:75.5pt;height:75.5pt;visibility:visible;mso-wrap-style:square" o:bullet="t">
+      <v:shape id="_x0000_i1859" type="#_x0000_t75" style="width:75.5pt;height:75.5pt;visibility:visible;mso-wrap-style:square" o:bullet="t">
         <v:imagedata r:id="rId6" o:title=""/>
       </v:shape>
     </w:pict>

</xml_diff>